<commit_message>
2026-06-28 15:15:46 - Proposal: Access control
</commit_message>
<xml_diff>
--- a/01_Proposal/Proposal.docx
+++ b/01_Proposal/Proposal.docx
@@ -4,6 +4,49 @@
   <w:body>
     <w:p>
       <w:pPr>
+        <w:pStyle w:val="Title"/>
+        <w:bidi/>
+        <w:rPr>
+          <w:rFonts w:cs="IRANSans"/>
+          <w:b/>
+          <w:bCs/>
+          <w:rtl/>
+          <w:lang w:bidi="fa-IR"/>
+        </w:rPr>
+      </w:pPr>
+      <w:r>
+        <w:rPr>
+          <w:rFonts w:cs="IRANSans"/>
+          <w:b/>
+          <w:bCs/>
+          <w:rtl/>
+          <w:lang w:bidi="fa-IR"/>
+        </w:rPr>
+        <w:t xml:space="preserve">پروژه کنترل تردد </w:t>
+      </w:r>
+      <w:r>
+        <w:rPr>
+          <w:rFonts w:cs="IRANSans"/>
+          <w:b/>
+          <w:bCs/>
+          <w:rtl/>
+          <w:lang w:bidi="fa-IR"/>
+        </w:rPr>
+        <w:t xml:space="preserve">جامع </w:t>
+      </w:r>
+      <w:r>
+        <w:rPr>
+          <w:rFonts w:cs="IRANSans"/>
+          <w:b/>
+          <w:bCs/>
+          <w:rtl/>
+          <w:lang w:bidi="fa-IR"/>
+        </w:rPr>
+        <w:t>مدرسه</w:t>
+      </w:r>
+    </w:p>
+    <w:p>
+      <w:pPr>
         <w:bidi/>
         <w:rPr>
           <w:rFonts w:ascii="IRANSans" w:hAnsi="IRANSans" w:cs="IRANSans"/>
@@ -58,6 +101,10 @@
     <w:p>
       <w:pPr>
         <w:pStyle w:val="Heading1"/>
+        <w:numPr>
+          <w:ilvl w:val="0"/>
+          <w:numId w:val="8"/>
+        </w:numPr>
         <w:rPr>
           <w:rFonts w:cs="IRANSans"/>
           <w:lang w:bidi="fa-IR"/>
@@ -69,30 +116,76 @@
           <w:rtl/>
         </w:rPr>
         <w:lastRenderedPageBreak/>
-        <w:t xml:space="preserve">مقدمه </w:t>
+        <w:t>مقدمه</w:t>
       </w:r>
     </w:p>
     <w:p>
       <w:pPr>
         <w:pStyle w:val="Heading1"/>
+        <w:numPr>
+          <w:ilvl w:val="0"/>
+          <w:numId w:val="8"/>
+        </w:numPr>
+        <w:rPr>
+          <w:rFonts w:cs="IRANSans" w:hint="cs"/>
+          <w:rtl/>
+          <w:lang w:val="en-US" w:bidi="fa-IR"/>
+        </w:rPr>
+      </w:pPr>
+      <w:r>
         <w:rPr>
           <w:rFonts w:cs="IRANSans"/>
           <w:rtl/>
           <w:lang w:val="en-US"/>
         </w:rPr>
-      </w:pPr>
+        <w:t xml:space="preserve">شناخت پروژه </w:t>
+      </w:r>
       <w:r>
         <w:rPr>
-          <w:rFonts w:cs="IRANSans"/>
+          <w:rFonts w:cs="IRANSans" w:hint="cs"/>
           <w:rtl/>
           <w:lang w:val="en-US"/>
         </w:rPr>
-        <w:t xml:space="preserve">شناخت پروژه </w:t>
+        <w:t>و نیازمندی های کنترل تردد مدرس</w:t>
+      </w:r>
+      <w:r>
+        <w:rPr>
+          <w:rFonts w:cs="IRANSans" w:hint="cs"/>
+          <w:rtl/>
+          <w:lang w:val="en-US"/>
+        </w:rPr>
+        <w:t>ه</w:t>
       </w:r>
     </w:p>
     <w:p>
       <w:pPr>
         <w:pStyle w:val="Heading1"/>
+        <w:numPr>
+          <w:ilvl w:val="0"/>
+          <w:numId w:val="8"/>
+        </w:numPr>
+        <w:rPr>
+          <w:rFonts w:cs="IRANSans"/>
+          <w:rtl/>
+          <w:lang w:val="en-US"/>
+        </w:rPr>
+      </w:pPr>
+      <w:r>
+        <w:rPr>
+          <w:rFonts w:cs="IRANSans"/>
+          <w:rtl/>
+          <w:lang w:val="en-US"/>
+        </w:rPr>
+        <w:t>اهداف و نیازمندی‌های اصلی مدرسه</w:t>
+      </w:r>
+    </w:p>
+    <w:p>
+      <w:pPr>
+        <w:pStyle w:val="Heading1"/>
+        <w:numPr>
+          <w:ilvl w:val="0"/>
+          <w:numId w:val="8"/>
+        </w:numPr>
         <w:rPr>
           <w:rFonts w:cs="IRANSans"/>
           <w:rtl/>
@@ -109,6 +202,10 @@
     <w:p>
       <w:pPr>
         <w:pStyle w:val="Heading1"/>
+        <w:numPr>
+          <w:ilvl w:val="0"/>
+          <w:numId w:val="8"/>
+        </w:numPr>
         <w:rPr>
           <w:rFonts w:cs="IRANSans"/>
           <w:rtl/>
@@ -125,6 +222,10 @@
     <w:p>
       <w:pPr>
         <w:pStyle w:val="Heading1"/>
+        <w:numPr>
+          <w:ilvl w:val="0"/>
+          <w:numId w:val="8"/>
+        </w:numPr>
         <w:rPr>
           <w:rFonts w:cs="IRANSans"/>
           <w:rtl/>
@@ -136,250 +237,129 @@
           <w:rtl/>
         </w:rPr>
         <w:t>راهکارهای نرم‌افزاری</w:t>
+      </w:r>
+      <w:r>
+        <w:rPr>
+          <w:rFonts w:cs="IRANSans" w:hint="cs"/>
+          <w:rtl/>
+        </w:rPr>
+        <w:t xml:space="preserve"> پیشنهادی</w:t>
       </w:r>
     </w:p>
     <w:p>
       <w:pPr>
-        <w:pStyle w:val="Heading2"/>
-        <w:bidi/>
-        <w:rPr>
-          <w:rFonts w:cs="IRANSans"/>
-          <w:rtl/>
-          <w:lang w:val="en-US"/>
+        <w:pStyle w:val="Heading1"/>
+        <w:numPr>
+          <w:ilvl w:val="0"/>
+          <w:numId w:val="8"/>
+        </w:numPr>
+        <w:rPr>
+          <w:rFonts w:cs="IRANSans"/>
+          <w:rtl/>
         </w:rPr>
       </w:pPr>
       <w:r>
         <w:rPr>
           <w:rFonts w:cs="IRANSans"/>
           <w:rtl/>
-          <w:lang w:val="en-US"/>
-        </w:rPr>
-        <w:t xml:space="preserve">سامانه کنترل تردد </w:t>
+        </w:rPr>
+        <w:t xml:space="preserve">راهکارهای سخت‌افزاری </w:t>
+      </w:r>
+      <w:r>
+        <w:rPr>
+          <w:rFonts w:cs="IRANSans" w:hint="cs"/>
+          <w:rtl/>
+        </w:rPr>
+        <w:t>پیشنهادی</w:t>
       </w:r>
     </w:p>
     <w:p>
       <w:pPr>
-        <w:pStyle w:val="Heading2"/>
-        <w:bidi/>
-        <w:rPr>
-          <w:rFonts w:cs="IRANSans"/>
-          <w:rtl/>
-          <w:lang w:val="en-US"/>
+        <w:pStyle w:val="Heading1"/>
+        <w:numPr>
+          <w:ilvl w:val="0"/>
+          <w:numId w:val="8"/>
+        </w:numPr>
+        <w:rPr>
+          <w:rFonts w:cs="IRANSans"/>
+          <w:rtl/>
         </w:rPr>
       </w:pPr>
       <w:r>
         <w:rPr>
           <w:rFonts w:cs="IRANSans"/>
           <w:rtl/>
-          <w:lang w:val="en-US"/>
-        </w:rPr>
-        <w:t xml:space="preserve">سامانه تشخیص چهره </w:t>
+        </w:rPr>
+        <w:t>گزینه‌های قابل انتخاب برای کارفرما</w:t>
       </w:r>
     </w:p>
     <w:p>
       <w:pPr>
-        <w:pStyle w:val="Heading2"/>
-        <w:bidi/>
-        <w:rPr>
-          <w:rFonts w:cs="IRANSans"/>
-          <w:rtl/>
-          <w:lang w:val="en-US"/>
+        <w:pStyle w:val="Heading1"/>
+        <w:numPr>
+          <w:ilvl w:val="0"/>
+          <w:numId w:val="8"/>
+        </w:numPr>
+        <w:rPr>
+          <w:rFonts w:cs="IRANSans"/>
+          <w:rtl/>
         </w:rPr>
       </w:pPr>
       <w:r>
         <w:rPr>
           <w:rFonts w:cs="IRANSans"/>
           <w:rtl/>
-          <w:lang w:val="en-US"/>
-        </w:rPr>
-        <w:t xml:space="preserve">سامانه مدیریت مراجعین سامانه مدیریت پارکینگ </w:t>
+        </w:rPr>
+        <w:t>گزینه‌های پیشنهادی پیاده‌سازی</w:t>
       </w:r>
     </w:p>
     <w:p>
       <w:pPr>
-        <w:pStyle w:val="Heading2"/>
-        <w:bidi/>
-        <w:rPr>
-          <w:rFonts w:cs="IRANSans"/>
-          <w:rtl/>
-          <w:lang w:val="en-US"/>
+        <w:pStyle w:val="Heading1"/>
+        <w:numPr>
+          <w:ilvl w:val="0"/>
+          <w:numId w:val="8"/>
+        </w:numPr>
+        <w:rPr>
+          <w:rFonts w:cs="IRANSans"/>
+          <w:rtl/>
         </w:rPr>
       </w:pPr>
       <w:r>
         <w:rPr>
           <w:rFonts w:cs="IRANSans"/>
           <w:rtl/>
-          <w:lang w:val="en-US"/>
-        </w:rPr>
-        <w:t xml:space="preserve">سامانه حراست و مانیتورینگ </w:t>
+        </w:rPr>
+        <w:t>یکپارچه‌سازی با سامانه‌های دیگر</w:t>
       </w:r>
     </w:p>
     <w:p>
       <w:pPr>
-        <w:pStyle w:val="Heading2"/>
-        <w:bidi/>
-        <w:rPr>
-          <w:rFonts w:cs="IRANSans"/>
-          <w:rtl/>
-          <w:lang w:val="en-US"/>
+        <w:pStyle w:val="Heading1"/>
+        <w:numPr>
+          <w:ilvl w:val="0"/>
+          <w:numId w:val="8"/>
+        </w:numPr>
+        <w:rPr>
+          <w:rFonts w:cs="IRANSans"/>
+          <w:rtl/>
         </w:rPr>
       </w:pPr>
       <w:r>
         <w:rPr>
           <w:rFonts w:cs="IRANSans"/>
           <w:rtl/>
-          <w:lang w:val="en-US"/>
-        </w:rPr>
-        <w:t xml:space="preserve">گزارش‌ها و داشبوردهای مدیریتی </w:t>
+        </w:rPr>
+        <w:t>امنیت، مانیتورینگ و گزارش‌گیری</w:t>
       </w:r>
     </w:p>
     <w:p>
       <w:pPr>
         <w:pStyle w:val="Heading1"/>
-        <w:rPr>
-          <w:rFonts w:cs="IRANSans"/>
-          <w:rtl/>
-        </w:rPr>
-      </w:pPr>
-      <w:r>
-        <w:rPr>
-          <w:rFonts w:cs="IRANSans"/>
-          <w:rtl/>
-        </w:rPr>
-        <w:t xml:space="preserve">راهکارهای سخت‌افزاری </w:t>
-      </w:r>
-    </w:p>
-    <w:p>
-      <w:pPr>
-        <w:pStyle w:val="Heading2"/>
-        <w:bidi/>
-        <w:rPr>
-          <w:rFonts w:cs="IRANSans"/>
-          <w:rtl/>
-          <w:lang w:val="en-US"/>
-        </w:rPr>
-      </w:pPr>
-      <w:r>
-        <w:rPr>
-          <w:rFonts w:cs="IRANSans"/>
-          <w:rtl/>
-          <w:lang w:val="en-US"/>
-        </w:rPr>
-        <w:t xml:space="preserve">تجهیزات کنترل تردد </w:t>
-      </w:r>
-    </w:p>
-    <w:p>
-      <w:pPr>
-        <w:pStyle w:val="Heading2"/>
-        <w:bidi/>
-        <w:rPr>
-          <w:rFonts w:cs="IRANSans"/>
-          <w:rtl/>
-          <w:lang w:val="en-US"/>
-        </w:rPr>
-      </w:pPr>
-      <w:r>
-        <w:rPr>
-          <w:rFonts w:cs="IRANSans"/>
-          <w:rtl/>
-          <w:lang w:val="en-US"/>
-        </w:rPr>
-        <w:t xml:space="preserve">گیت‌های کنترل تردد </w:t>
-      </w:r>
-    </w:p>
-    <w:p>
-      <w:pPr>
-        <w:pStyle w:val="Heading2"/>
-        <w:bidi/>
-        <w:rPr>
-          <w:rFonts w:cs="IRANSans"/>
-          <w:rtl/>
-          <w:lang w:val="en-US"/>
-        </w:rPr>
-      </w:pPr>
-      <w:r>
-        <w:rPr>
-          <w:rFonts w:cs="IRANSans"/>
-          <w:rtl/>
-          <w:lang w:val="en-US"/>
-        </w:rPr>
-        <w:t xml:space="preserve">تجهیزات پارکینگ </w:t>
-      </w:r>
-    </w:p>
-    <w:p>
-      <w:pPr>
-        <w:pStyle w:val="Heading2"/>
-        <w:bidi/>
-        <w:rPr>
-          <w:rFonts w:cs="IRANSans"/>
-          <w:rtl/>
-          <w:lang w:val="en-US"/>
-        </w:rPr>
-      </w:pPr>
-      <w:r>
-        <w:rPr>
-          <w:rFonts w:cs="IRANSans"/>
-          <w:rtl/>
-          <w:lang w:val="en-US"/>
-        </w:rPr>
-        <w:t xml:space="preserve">تجهیزات تشخیص چهره </w:t>
-      </w:r>
-    </w:p>
-    <w:p>
-      <w:pPr>
-        <w:pStyle w:val="Heading2"/>
-        <w:bidi/>
-        <w:rPr>
-          <w:rFonts w:cs="IRANSans"/>
-          <w:rtl/>
-          <w:lang w:val="en-US"/>
-        </w:rPr>
-      </w:pPr>
-      <w:r>
-        <w:rPr>
-          <w:rFonts w:cs="IRANSans"/>
-          <w:rtl/>
-          <w:lang w:val="en-US"/>
-        </w:rPr>
-        <w:lastRenderedPageBreak/>
-        <w:t xml:space="preserve">تجهیزات جانبی </w:t>
-      </w:r>
-    </w:p>
-    <w:p>
-      <w:pPr>
-        <w:pStyle w:val="Heading1"/>
-        <w:rPr>
-          <w:rFonts w:cs="IRANSans"/>
-          <w:rtl/>
-        </w:rPr>
-      </w:pPr>
-      <w:r>
-        <w:rPr>
-          <w:rFonts w:cs="IRANSans"/>
-          <w:rtl/>
-        </w:rPr>
-        <w:t xml:space="preserve">یکپارچه‌سازی با سامانه‌های دیگر </w:t>
-      </w:r>
-    </w:p>
-    <w:p>
-      <w:pPr>
-        <w:pStyle w:val="Heading1"/>
-        <w:rPr>
-          <w:rFonts w:cs="IRANSans"/>
-          <w:rtl/>
-        </w:rPr>
-      </w:pPr>
-      <w:r>
-        <w:rPr>
-          <w:rFonts w:cs="IRANSans"/>
-          <w:rtl/>
-        </w:rPr>
-        <w:t xml:space="preserve">گزینه‌های پیشنهادی پیاده‌سازی </w:t>
-      </w:r>
-    </w:p>
-    <w:p>
-      <w:pPr>
-        <w:pStyle w:val="Heading1"/>
+        <w:numPr>
+          <w:ilvl w:val="0"/>
+          <w:numId w:val="8"/>
+        </w:numPr>
         <w:rPr>
           <w:rFonts w:cs="IRANSans"/>
           <w:rtl/>
@@ -396,6 +376,10 @@
     <w:p>
       <w:pPr>
         <w:pStyle w:val="Heading1"/>
+        <w:numPr>
+          <w:ilvl w:val="0"/>
+          <w:numId w:val="8"/>
+        </w:numPr>
         <w:rPr>
           <w:rFonts w:cs="IRANSans"/>
           <w:rtl/>
@@ -406,12 +390,17 @@
           <w:rFonts w:cs="IRANSans"/>
           <w:rtl/>
         </w:rPr>
-        <w:t xml:space="preserve">مزایای راهکار پیشنهادی </w:t>
+        <w:lastRenderedPageBreak/>
+        <w:t>جمع‌بندی</w:t>
       </w:r>
     </w:p>
     <w:p>
       <w:pPr>
         <w:pStyle w:val="Heading1"/>
+        <w:numPr>
+          <w:ilvl w:val="0"/>
+          <w:numId w:val="8"/>
+        </w:numPr>
         <w:rPr>
           <w:rFonts w:cs="IRANSans"/>
           <w:rtl/>
@@ -441,22 +430,10 @@
     <w:p>
       <w:pPr>
         <w:pStyle w:val="Heading1"/>
-        <w:rPr>
-          <w:rFonts w:cs="IRANSans"/>
-          <w:rtl/>
-        </w:rPr>
-      </w:pPr>
-      <w:r>
-        <w:rPr>
-          <w:rFonts w:cs="IRANSans"/>
-          <w:rtl/>
-        </w:rPr>
-        <w:t xml:space="preserve">جمع‌بندی </w:t>
-      </w:r>
-    </w:p>
-    <w:p>
-      <w:pPr>
-        <w:pStyle w:val="Heading1"/>
+        <w:numPr>
+          <w:ilvl w:val="0"/>
+          <w:numId w:val="8"/>
+        </w:numPr>
         <w:rPr>
           <w:rFonts w:cs="IRANSans"/>
           <w:rtl/>
@@ -833,6 +810,96 @@
     </w:lvl>
   </w:abstractNum>
   <w:abstractNum w:abstractNumId="3" w15:restartNumberingAfterBreak="0">
+    <w:nsid w:val="35EE2711"/>
+    <w:multiLevelType w:val="hybridMultilevel"/>
+    <w:tmpl w:val="F552E2E8"/>
+    <w:lvl w:ilvl="0" w:tplc="22EC23D4">
+      <w:start w:val="1"/>
+      <w:numFmt w:val="decimal"/>
+      <w:suff w:val="space"/>
+      <w:lvlText w:val="%1."/>
+      <w:lvlJc w:val="left"/>
+      <w:pPr>
+        <w:ind w:left="720" w:hanging="360"/>
+      </w:pPr>
+      <w:rPr>
+        <w:rFonts w:hint="default"/>
+      </w:rPr>
+    </w:lvl>
+    <w:lvl w:ilvl="1" w:tplc="04070019" w:tentative="1">
+      <w:start w:val="1"/>
+      <w:numFmt w:val="lowerLetter"/>
+      <w:lvlText w:val="%2."/>
+      <w:lvlJc w:val="left"/>
+      <w:pPr>
+        <w:ind w:left="1440" w:hanging="360"/>
+      </w:pPr>
+    </w:lvl>
+    <w:lvl w:ilvl="2" w:tplc="0407001B" w:tentative="1">
+      <w:start w:val="1"/>
+      <w:numFmt w:val="lowerRoman"/>
+      <w:lvlText w:val="%3."/>
+      <w:lvlJc w:val="right"/>
+      <w:pPr>
+        <w:ind w:left="2160" w:hanging="180"/>
+      </w:pPr>
+    </w:lvl>
+    <w:lvl w:ilvl="3" w:tplc="0407000F" w:tentative="1">
+      <w:start w:val="1"/>
+      <w:numFmt w:val="decimal"/>
+      <w:lvlText w:val="%4."/>
+      <w:lvlJc w:val="left"/>
+      <w:pPr>
+        <w:ind w:left="2880" w:hanging="360"/>
+      </w:pPr>
+    </w:lvl>
+    <w:lvl w:ilvl="4" w:tplc="04070019" w:tentative="1">
+      <w:start w:val="1"/>
+      <w:numFmt w:val="lowerLetter"/>
+      <w:lvlText w:val="%5."/>
+      <w:lvlJc w:val="left"/>
+      <w:pPr>
+        <w:ind w:left="3600" w:hanging="360"/>
+      </w:pPr>
+    </w:lvl>
+    <w:lvl w:ilvl="5" w:tplc="0407001B" w:tentative="1">
+      <w:start w:val="1"/>
+      <w:numFmt w:val="lowerRoman"/>
+      <w:lvlText w:val="%6."/>
+      <w:lvlJc w:val="right"/>
+      <w:pPr>
+        <w:ind w:left="4320" w:hanging="180"/>
+      </w:pPr>
+    </w:lvl>
+    <w:lvl w:ilvl="6" w:tplc="0407000F" w:tentative="1">
+      <w:start w:val="1"/>
+      <w:numFmt w:val="decimal"/>
+      <w:lvlText w:val="%7."/>
+      <w:lvlJc w:val="left"/>
+      <w:pPr>
+        <w:ind w:left="5040" w:hanging="360"/>
+      </w:pPr>
+    </w:lvl>
+    <w:lvl w:ilvl="7" w:tplc="04070019" w:tentative="1">
+      <w:start w:val="1"/>
+      <w:numFmt w:val="lowerLetter"/>
+      <w:lvlText w:val="%8."/>
+      <w:lvlJc w:val="left"/>
+      <w:pPr>
+        <w:ind w:left="5760" w:hanging="360"/>
+      </w:pPr>
+    </w:lvl>
+    <w:lvl w:ilvl="8" w:tplc="0407001B" w:tentative="1">
+      <w:start w:val="1"/>
+      <w:numFmt w:val="lowerRoman"/>
+      <w:lvlText w:val="%9."/>
+      <w:lvlJc w:val="right"/>
+      <w:pPr>
+        <w:ind w:left="6480" w:hanging="180"/>
+      </w:pPr>
+    </w:lvl>
+  </w:abstractNum>
+  <w:abstractNum w:abstractNumId="4" w15:restartNumberingAfterBreak="0">
     <w:nsid w:val="3F044D6D"/>
     <w:multiLevelType w:val="multilevel"/>
     <w:tmpl w:val="223C9C56"/>
@@ -945,7 +1012,7 @@
       </w:rPr>
     </w:lvl>
   </w:abstractNum>
-  <w:abstractNum w:abstractNumId="4" w15:restartNumberingAfterBreak="0">
+  <w:abstractNum w:abstractNumId="5" w15:restartNumberingAfterBreak="0">
     <w:nsid w:val="41AD59D4"/>
     <w:multiLevelType w:val="multilevel"/>
     <w:tmpl w:val="CC42A2EC"/>
@@ -1094,7 +1161,7 @@
       </w:rPr>
     </w:lvl>
   </w:abstractNum>
-  <w:abstractNum w:abstractNumId="5" w15:restartNumberingAfterBreak="0">
+  <w:abstractNum w:abstractNumId="6" w15:restartNumberingAfterBreak="0">
     <w:nsid w:val="5384421A"/>
     <w:multiLevelType w:val="multilevel"/>
     <w:tmpl w:val="3A2E5610"/>
@@ -1207,7 +1274,7 @@
       </w:pPr>
     </w:lvl>
   </w:abstractNum>
-  <w:abstractNum w:abstractNumId="6" w15:restartNumberingAfterBreak="0">
+  <w:abstractNum w:abstractNumId="7" w15:restartNumberingAfterBreak="0">
     <w:nsid w:val="7C2322EA"/>
     <w:multiLevelType w:val="multilevel"/>
     <w:tmpl w:val="5DF62C5A"/>
@@ -1360,22 +1427,25 @@
     <w:abstractNumId w:val="2"/>
   </w:num>
   <w:num w:numId="2" w16cid:durableId="2069105288">
-    <w:abstractNumId w:val="3"/>
+    <w:abstractNumId w:val="4"/>
   </w:num>
   <w:num w:numId="3" w16cid:durableId="989938476">
     <w:abstractNumId w:val="0"/>
   </w:num>
   <w:num w:numId="4" w16cid:durableId="1911189105">
-    <w:abstractNumId w:val="4"/>
+    <w:abstractNumId w:val="5"/>
   </w:num>
   <w:num w:numId="5" w16cid:durableId="968318571">
     <w:abstractNumId w:val="1"/>
   </w:num>
   <w:num w:numId="6" w16cid:durableId="1973973578">
+    <w:abstractNumId w:val="7"/>
+  </w:num>
+  <w:num w:numId="7" w16cid:durableId="2082369485">
     <w:abstractNumId w:val="6"/>
   </w:num>
-  <w:num w:numId="7" w16cid:durableId="2082369485">
-    <w:abstractNumId w:val="5"/>
+  <w:num w:numId="8" w16cid:durableId="1071973697">
+    <w:abstractNumId w:val="3"/>
   </w:num>
 </w:numbering>
 </file>
@@ -1984,6 +2054,7 @@
   <w:style w:type="character" w:default="1" w:styleId="DefaultParagraphFont">
     <w:name w:val="Default Paragraph Font"/>
     <w:uiPriority w:val="1"/>
+    <w:semiHidden/>
     <w:unhideWhenUsed/>
   </w:style>
   <w:style w:type="table" w:default="1" w:styleId="TableNormal">
@@ -2133,13 +2204,13 @@
     <w:link w:val="TitleChar"/>
     <w:uiPriority w:val="10"/>
     <w:qFormat/>
-    <w:rsid w:val="00B72467"/>
+    <w:rsid w:val="00A3275C"/>
     <w:pPr>
       <w:spacing w:after="80" w:line="240" w:lineRule="auto"/>
       <w:contextualSpacing/>
     </w:pPr>
     <w:rPr>
-      <w:rFonts w:asciiTheme="majorHAnsi" w:eastAsiaTheme="majorEastAsia" w:hAnsiTheme="majorHAnsi" w:cstheme="majorBidi"/>
+      <w:rFonts w:ascii="IRANSans" w:eastAsiaTheme="majorEastAsia" w:hAnsi="IRANSans" w:cstheme="majorBidi"/>
       <w:spacing w:val="-10"/>
       <w:kern w:val="28"/>
       <w:sz w:val="56"/>
@@ -2151,9 +2222,9 @@
     <w:basedOn w:val="DefaultParagraphFont"/>
     <w:link w:val="Title"/>
     <w:uiPriority w:val="10"/>
-    <w:rsid w:val="00B72467"/>
-    <w:rPr>
-      <w:rFonts w:asciiTheme="majorHAnsi" w:eastAsiaTheme="majorEastAsia" w:hAnsiTheme="majorHAnsi" w:cstheme="majorBidi"/>
+    <w:rsid w:val="00A3275C"/>
+    <w:rPr>
+      <w:rFonts w:ascii="IRANSans" w:eastAsiaTheme="majorEastAsia" w:hAnsi="IRANSans" w:cstheme="majorBidi"/>
       <w:spacing w:val="-10"/>
       <w:kern w:val="28"/>
       <w:sz w:val="56"/>

</xml_diff>

<commit_message>
2026-06-28 15:21:18 - Proposal: Access control
</commit_message>
<xml_diff>
--- a/01_Proposal/Proposal.docx
+++ b/01_Proposal/Proposal.docx
@@ -107,16 +107,670 @@
         </w:numPr>
         <w:rPr>
           <w:rFonts w:cs="IRANSans"/>
-          <w:lang w:bidi="fa-IR"/>
-        </w:rPr>
-      </w:pPr>
-      <w:r>
-        <w:rPr>
-          <w:rFonts w:cs="IRANSans"/>
-          <w:rtl/>
-        </w:rPr>
-        <w:lastRenderedPageBreak/>
+          <w:rtl/>
+        </w:rPr>
+      </w:pPr>
+      <w:r>
+        <w:rPr>
+          <w:rFonts w:cs="IRANSans"/>
+          <w:rtl/>
+        </w:rPr>
         <w:t>مقدمه</w:t>
+      </w:r>
+    </w:p>
+    <w:p>
+      <w:pPr>
+        <w:bidi/>
+        <w:jc w:val="both"/>
+        <w:rPr>
+          <w:rFonts w:ascii="IRANSans" w:hAnsi="IRANSans" w:cs="IRANSans"/>
+          <w:lang w:bidi="fa-IR"/>
+        </w:rPr>
+      </w:pPr>
+      <w:r>
+        <w:rPr>
+          <w:rFonts w:ascii="IRANSans" w:hAnsi="IRANSans" w:cs="IRANSans"/>
+          <w:rtl/>
+          <w:lang w:bidi="fa-IR"/>
+        </w:rPr>
+        <w:t xml:space="preserve">این سند با هدف ارائه نسخه اولیه پیشنهاد </w:t>
+      </w:r>
+      <w:proofErr w:type="spellStart"/>
+      <w:r>
+        <w:rPr>
+          <w:rFonts w:ascii="IRANSans" w:hAnsi="IRANSans" w:cs="IRANSans"/>
+          <w:rtl/>
+          <w:lang w:bidi="fa-IR"/>
+        </w:rPr>
+        <w:t>راهکار</w:t>
+      </w:r>
+      <w:proofErr w:type="spellEnd"/>
+      <w:r>
+        <w:rPr>
+          <w:rFonts w:ascii="IRANSans" w:hAnsi="IRANSans" w:cs="IRANSans"/>
+          <w:rtl/>
+          <w:lang w:bidi="fa-IR"/>
+        </w:rPr>
+        <w:t xml:space="preserve"> یکپارچه کنترل تردد، امنیت فیزیکی، مدیریت مراجعین و مدیریت پارکینگ برای یک مجموعه آموزشی تهیه شده است</w:t>
+      </w:r>
+      <w:r>
+        <w:rPr>
+          <w:rFonts w:ascii="IRANSans" w:hAnsi="IRANSans" w:cs="IRANSans"/>
+          <w:lang w:bidi="fa-IR"/>
+        </w:rPr>
+        <w:t>.</w:t>
+      </w:r>
+    </w:p>
+    <w:p>
+      <w:pPr>
+        <w:bidi/>
+        <w:jc w:val="both"/>
+        <w:rPr>
+          <w:rFonts w:ascii="IRANSans" w:hAnsi="IRANSans" w:cs="IRANSans"/>
+          <w:lang w:bidi="fa-IR"/>
+        </w:rPr>
+      </w:pPr>
+      <w:r>
+        <w:rPr>
+          <w:rFonts w:ascii="IRANSans" w:hAnsi="IRANSans" w:cs="IRANSans"/>
+          <w:rtl/>
+          <w:lang w:bidi="fa-IR"/>
+        </w:rPr>
+        <w:t xml:space="preserve">در این مرحله، تمرکز پیشنهاد بر معرفی </w:t>
+      </w:r>
+      <w:proofErr w:type="spellStart"/>
+      <w:r>
+        <w:rPr>
+          <w:rFonts w:ascii="IRANSans" w:hAnsi="IRANSans" w:cs="IRANSans"/>
+          <w:rtl/>
+          <w:lang w:bidi="fa-IR"/>
+        </w:rPr>
+        <w:t>قابلیت‌ها</w:t>
+      </w:r>
+      <w:proofErr w:type="spellEnd"/>
+      <w:r>
+        <w:rPr>
+          <w:rFonts w:ascii="IRANSans" w:hAnsi="IRANSans" w:cs="IRANSans"/>
+          <w:rtl/>
+          <w:lang w:bidi="fa-IR"/>
+        </w:rPr>
+        <w:t xml:space="preserve">، </w:t>
+      </w:r>
+      <w:proofErr w:type="spellStart"/>
+      <w:r>
+        <w:rPr>
+          <w:rFonts w:ascii="IRANSans" w:hAnsi="IRANSans" w:cs="IRANSans"/>
+          <w:rtl/>
+          <w:lang w:bidi="fa-IR"/>
+        </w:rPr>
+        <w:t>سناریوهای</w:t>
+      </w:r>
+      <w:proofErr w:type="spellEnd"/>
+      <w:r>
+        <w:rPr>
+          <w:rFonts w:ascii="IRANSans" w:hAnsi="IRANSans" w:cs="IRANSans"/>
+          <w:rtl/>
+          <w:lang w:bidi="fa-IR"/>
+        </w:rPr>
+        <w:t xml:space="preserve"> قابل </w:t>
+      </w:r>
+      <w:proofErr w:type="spellStart"/>
+      <w:r>
+        <w:rPr>
+          <w:rFonts w:ascii="IRANSans" w:hAnsi="IRANSans" w:cs="IRANSans"/>
+          <w:rtl/>
+          <w:lang w:bidi="fa-IR"/>
+        </w:rPr>
+        <w:t>پیاده‌سازی</w:t>
+      </w:r>
+      <w:proofErr w:type="spellEnd"/>
+      <w:r>
+        <w:rPr>
+          <w:rFonts w:ascii="IRANSans" w:hAnsi="IRANSans" w:cs="IRANSans"/>
+          <w:rtl/>
+          <w:lang w:bidi="fa-IR"/>
+        </w:rPr>
+        <w:t xml:space="preserve"> و </w:t>
+      </w:r>
+      <w:proofErr w:type="spellStart"/>
+      <w:r>
+        <w:rPr>
+          <w:rFonts w:ascii="IRANSans" w:hAnsi="IRANSans" w:cs="IRANSans"/>
+          <w:rtl/>
+          <w:lang w:bidi="fa-IR"/>
+        </w:rPr>
+        <w:t>گزینه‌های</w:t>
+      </w:r>
+      <w:proofErr w:type="spellEnd"/>
+      <w:r>
+        <w:rPr>
+          <w:rFonts w:ascii="IRANSans" w:hAnsi="IRANSans" w:cs="IRANSans"/>
+          <w:rtl/>
+          <w:lang w:bidi="fa-IR"/>
+        </w:rPr>
+        <w:t xml:space="preserve"> مختلف </w:t>
+      </w:r>
+      <w:proofErr w:type="spellStart"/>
+      <w:r>
+        <w:rPr>
+          <w:rFonts w:ascii="IRANSans" w:hAnsi="IRANSans" w:cs="IRANSans"/>
+          <w:rtl/>
+          <w:lang w:bidi="fa-IR"/>
+        </w:rPr>
+        <w:t>راهکار</w:t>
+      </w:r>
+      <w:proofErr w:type="spellEnd"/>
+      <w:r>
+        <w:rPr>
+          <w:rFonts w:ascii="IRANSans" w:hAnsi="IRANSans" w:cs="IRANSans"/>
+          <w:rtl/>
+          <w:lang w:bidi="fa-IR"/>
+        </w:rPr>
+        <w:t xml:space="preserve"> است. بنابراین این سند شامل قیمت، تعداد قطعی تجهیزات، مدل نهایی </w:t>
+      </w:r>
+      <w:proofErr w:type="spellStart"/>
+      <w:r>
+        <w:rPr>
+          <w:rFonts w:ascii="IRANSans" w:hAnsi="IRANSans" w:cs="IRANSans"/>
+          <w:rtl/>
+          <w:lang w:bidi="fa-IR"/>
+        </w:rPr>
+        <w:t>سخت‌افزارها</w:t>
+      </w:r>
+      <w:proofErr w:type="spellEnd"/>
+      <w:r>
+        <w:rPr>
+          <w:rFonts w:ascii="IRANSans" w:hAnsi="IRANSans" w:cs="IRANSans"/>
+          <w:rtl/>
+          <w:lang w:bidi="fa-IR"/>
+        </w:rPr>
+        <w:t xml:space="preserve"> یا</w:t>
+      </w:r>
+      <w:r>
+        <w:rPr>
+          <w:rFonts w:ascii="IRANSans" w:hAnsi="IRANSans" w:cs="IRANSans"/>
+          <w:lang w:bidi="fa-IR"/>
+        </w:rPr>
+        <w:t xml:space="preserve"> BOQ </w:t>
+      </w:r>
+      <w:r>
+        <w:rPr>
+          <w:rFonts w:ascii="IRANSans" w:hAnsi="IRANSans" w:cs="IRANSans"/>
+          <w:rtl/>
+          <w:lang w:bidi="fa-IR"/>
+        </w:rPr>
+        <w:t xml:space="preserve">نهایی نیست. هدف اصلی این نسخه، ایجاد یک دید مشترک میان کارفرما و </w:t>
+      </w:r>
+      <w:proofErr w:type="spellStart"/>
+      <w:r>
+        <w:rPr>
+          <w:rFonts w:ascii="IRANSans" w:hAnsi="IRANSans" w:cs="IRANSans"/>
+          <w:rtl/>
+          <w:lang w:bidi="fa-IR"/>
+        </w:rPr>
+        <w:t>ارائه‌دهنده</w:t>
+      </w:r>
+      <w:proofErr w:type="spellEnd"/>
+      <w:r>
+        <w:rPr>
+          <w:rFonts w:ascii="IRANSans" w:hAnsi="IRANSans" w:cs="IRANSans"/>
+          <w:rtl/>
+          <w:lang w:bidi="fa-IR"/>
+        </w:rPr>
+        <w:t xml:space="preserve"> </w:t>
+      </w:r>
+      <w:proofErr w:type="spellStart"/>
+      <w:r>
+        <w:rPr>
+          <w:rFonts w:ascii="IRANSans" w:hAnsi="IRANSans" w:cs="IRANSans"/>
+          <w:rtl/>
+          <w:lang w:bidi="fa-IR"/>
+        </w:rPr>
+        <w:t>راهکار</w:t>
+      </w:r>
+      <w:proofErr w:type="spellEnd"/>
+      <w:r>
+        <w:rPr>
+          <w:rFonts w:ascii="IRANSans" w:hAnsi="IRANSans" w:cs="IRANSans"/>
+          <w:rtl/>
+          <w:lang w:bidi="fa-IR"/>
+        </w:rPr>
+        <w:t xml:space="preserve"> درباره نیازهای مدرسه، امکانات قابل ارائه و مسیر پیشنهادی برای طراحی نهایی پروژه است</w:t>
+      </w:r>
+      <w:r>
+        <w:rPr>
+          <w:rFonts w:ascii="IRANSans" w:hAnsi="IRANSans" w:cs="IRANSans"/>
+          <w:lang w:bidi="fa-IR"/>
+        </w:rPr>
+        <w:t>.</w:t>
+      </w:r>
+    </w:p>
+    <w:p>
+      <w:pPr>
+        <w:bidi/>
+        <w:jc w:val="both"/>
+        <w:rPr>
+          <w:rFonts w:ascii="IRANSans" w:hAnsi="IRANSans" w:cs="IRANSans"/>
+          <w:lang w:bidi="fa-IR"/>
+        </w:rPr>
+      </w:pPr>
+      <w:proofErr w:type="spellStart"/>
+      <w:r>
+        <w:rPr>
+          <w:rFonts w:ascii="IRANSans" w:hAnsi="IRANSans" w:cs="IRANSans"/>
+          <w:rtl/>
+          <w:lang w:bidi="fa-IR"/>
+        </w:rPr>
+        <w:t>راهکار</w:t>
+      </w:r>
+      <w:proofErr w:type="spellEnd"/>
+      <w:r>
+        <w:rPr>
+          <w:rFonts w:ascii="IRANSans" w:hAnsi="IRANSans" w:cs="IRANSans"/>
+          <w:rtl/>
+          <w:lang w:bidi="fa-IR"/>
+        </w:rPr>
+        <w:t xml:space="preserve"> پیشنهادی برای محیط آموزشی، بر اساس </w:t>
+      </w:r>
+      <w:proofErr w:type="spellStart"/>
+      <w:r>
+        <w:rPr>
+          <w:rFonts w:ascii="IRANSans" w:hAnsi="IRANSans" w:cs="IRANSans"/>
+          <w:rtl/>
+          <w:lang w:bidi="fa-IR"/>
+        </w:rPr>
+        <w:t>نقش‌ها</w:t>
+      </w:r>
+      <w:proofErr w:type="spellEnd"/>
+      <w:r>
+        <w:rPr>
+          <w:rFonts w:ascii="IRANSans" w:hAnsi="IRANSans" w:cs="IRANSans"/>
+          <w:rtl/>
+          <w:lang w:bidi="fa-IR"/>
+        </w:rPr>
+        <w:t xml:space="preserve"> و </w:t>
+      </w:r>
+      <w:proofErr w:type="spellStart"/>
+      <w:r>
+        <w:rPr>
+          <w:rFonts w:ascii="IRANSans" w:hAnsi="IRANSans" w:cs="IRANSans"/>
+          <w:rtl/>
+          <w:lang w:bidi="fa-IR"/>
+        </w:rPr>
+        <w:t>جریان‌های</w:t>
+      </w:r>
+      <w:proofErr w:type="spellEnd"/>
+      <w:r>
+        <w:rPr>
+          <w:rFonts w:ascii="IRANSans" w:hAnsi="IRANSans" w:cs="IRANSans"/>
+          <w:rtl/>
+          <w:lang w:bidi="fa-IR"/>
+        </w:rPr>
+        <w:t xml:space="preserve"> واقعی مدرسه طراحی </w:t>
+      </w:r>
+      <w:proofErr w:type="spellStart"/>
+      <w:r>
+        <w:rPr>
+          <w:rFonts w:ascii="IRANSans" w:hAnsi="IRANSans" w:cs="IRANSans"/>
+          <w:rtl/>
+          <w:lang w:bidi="fa-IR"/>
+        </w:rPr>
+        <w:t>می‌شود</w:t>
+      </w:r>
+      <w:proofErr w:type="spellEnd"/>
+      <w:r>
+        <w:rPr>
+          <w:rFonts w:ascii="IRANSans" w:hAnsi="IRANSans" w:cs="IRANSans"/>
+          <w:rtl/>
+          <w:lang w:bidi="fa-IR"/>
+        </w:rPr>
+        <w:t xml:space="preserve">؛ از جمله </w:t>
+      </w:r>
+      <w:proofErr w:type="spellStart"/>
+      <w:r>
+        <w:rPr>
+          <w:rFonts w:ascii="IRANSans" w:hAnsi="IRANSans" w:cs="IRANSans"/>
+          <w:rtl/>
+          <w:lang w:bidi="fa-IR"/>
+        </w:rPr>
+        <w:t>دانش‌آموزان</w:t>
+      </w:r>
+      <w:proofErr w:type="spellEnd"/>
+      <w:r>
+        <w:rPr>
+          <w:rFonts w:ascii="IRANSans" w:hAnsi="IRANSans" w:cs="IRANSans"/>
+          <w:rtl/>
+          <w:lang w:bidi="fa-IR"/>
+        </w:rPr>
+        <w:t xml:space="preserve">، معلمان، کارکنان، والدین، مهمانان، </w:t>
+      </w:r>
+      <w:proofErr w:type="spellStart"/>
+      <w:r>
+        <w:rPr>
+          <w:rFonts w:ascii="IRANSans" w:hAnsi="IRANSans" w:cs="IRANSans"/>
+          <w:rtl/>
+          <w:lang w:bidi="fa-IR"/>
+        </w:rPr>
+        <w:t>پیمانکاران</w:t>
+      </w:r>
+      <w:proofErr w:type="spellEnd"/>
+      <w:r>
+        <w:rPr>
+          <w:rFonts w:ascii="IRANSans" w:hAnsi="IRANSans" w:cs="IRANSans"/>
+          <w:rtl/>
+          <w:lang w:bidi="fa-IR"/>
+        </w:rPr>
+        <w:t xml:space="preserve">، خودروها، </w:t>
+      </w:r>
+      <w:proofErr w:type="spellStart"/>
+      <w:r>
+        <w:rPr>
+          <w:rFonts w:ascii="IRANSans" w:hAnsi="IRANSans" w:cs="IRANSans"/>
+          <w:rtl/>
+          <w:lang w:bidi="fa-IR"/>
+        </w:rPr>
+        <w:t>کلاس‌های</w:t>
+      </w:r>
+      <w:proofErr w:type="spellEnd"/>
+      <w:r>
+        <w:rPr>
+          <w:rFonts w:ascii="IRANSans" w:hAnsi="IRANSans" w:cs="IRANSans"/>
+          <w:rtl/>
+          <w:lang w:bidi="fa-IR"/>
+        </w:rPr>
+        <w:t xml:space="preserve"> درس، </w:t>
+      </w:r>
+      <w:proofErr w:type="spellStart"/>
+      <w:r>
+        <w:rPr>
+          <w:rFonts w:ascii="IRANSans" w:hAnsi="IRANSans" w:cs="IRANSans"/>
+          <w:rtl/>
+          <w:lang w:bidi="fa-IR"/>
+        </w:rPr>
+        <w:t>آزمایشگاه‌ها</w:t>
+      </w:r>
+      <w:proofErr w:type="spellEnd"/>
+      <w:r>
+        <w:rPr>
+          <w:rFonts w:ascii="IRANSans" w:hAnsi="IRANSans" w:cs="IRANSans"/>
+          <w:rtl/>
+          <w:lang w:bidi="fa-IR"/>
+        </w:rPr>
+        <w:t xml:space="preserve">، </w:t>
+      </w:r>
+      <w:proofErr w:type="spellStart"/>
+      <w:r>
+        <w:rPr>
+          <w:rFonts w:ascii="IRANSans" w:hAnsi="IRANSans" w:cs="IRANSans"/>
+          <w:rtl/>
+          <w:lang w:bidi="fa-IR"/>
+        </w:rPr>
+        <w:t>ورودی‌ها</w:t>
+      </w:r>
+      <w:proofErr w:type="spellEnd"/>
+      <w:r>
+        <w:rPr>
+          <w:rFonts w:ascii="IRANSans" w:hAnsi="IRANSans" w:cs="IRANSans"/>
+          <w:rtl/>
+          <w:lang w:bidi="fa-IR"/>
+        </w:rPr>
+        <w:t>، پارکینگ و شرایط اضطراری</w:t>
+      </w:r>
+      <w:r>
+        <w:rPr>
+          <w:rFonts w:ascii="IRANSans" w:hAnsi="IRANSans" w:cs="IRANSans"/>
+          <w:lang w:bidi="fa-IR"/>
+        </w:rPr>
+        <w:t>.</w:t>
+      </w:r>
+    </w:p>
+    <w:p>
+      <w:pPr>
+        <w:bidi/>
+        <w:jc w:val="both"/>
+        <w:rPr>
+          <w:rFonts w:ascii="IRANSans" w:hAnsi="IRANSans" w:cs="IRANSans" w:hint="cs"/>
+          <w:rtl/>
+          <w:lang w:bidi="fa-IR"/>
+        </w:rPr>
+      </w:pPr>
+      <w:r>
+        <w:rPr>
+          <w:rFonts w:ascii="IRANSans" w:hAnsi="IRANSans" w:cs="IRANSans"/>
+          <w:rtl/>
+          <w:lang w:bidi="fa-IR"/>
+        </w:rPr>
+        <w:t xml:space="preserve">پس از بررسی این نسخه و دریافت بازخورد کارفرما، محدوده دقیق پروژه، </w:t>
+      </w:r>
+      <w:proofErr w:type="spellStart"/>
+      <w:r>
+        <w:rPr>
+          <w:rFonts w:ascii="IRANSans" w:hAnsi="IRANSans" w:cs="IRANSans"/>
+          <w:rtl/>
+          <w:lang w:bidi="fa-IR"/>
+        </w:rPr>
+        <w:t>اولویت‌ها</w:t>
+      </w:r>
+      <w:proofErr w:type="spellEnd"/>
+      <w:r>
+        <w:rPr>
+          <w:rFonts w:ascii="IRANSans" w:hAnsi="IRANSans" w:cs="IRANSans"/>
+          <w:rtl/>
+          <w:lang w:bidi="fa-IR"/>
+        </w:rPr>
+        <w:t xml:space="preserve">، </w:t>
+      </w:r>
+      <w:proofErr w:type="spellStart"/>
+      <w:r>
+        <w:rPr>
+          <w:rFonts w:ascii="IRANSans" w:hAnsi="IRANSans" w:cs="IRANSans"/>
+          <w:rtl/>
+          <w:lang w:bidi="fa-IR"/>
+        </w:rPr>
+        <w:t>گزینه‌های</w:t>
+      </w:r>
+      <w:proofErr w:type="spellEnd"/>
+      <w:r>
+        <w:rPr>
+          <w:rFonts w:ascii="IRANSans" w:hAnsi="IRANSans" w:cs="IRANSans"/>
+          <w:rtl/>
+          <w:lang w:bidi="fa-IR"/>
+        </w:rPr>
+        <w:t xml:space="preserve"> انتخابی، تعداد تجهیزات، معماری نهایی و پیشنهاد مالی در نسخه بعدی </w:t>
+      </w:r>
+      <w:proofErr w:type="spellStart"/>
+      <w:r>
+        <w:rPr>
+          <w:rFonts w:ascii="IRANSans" w:hAnsi="IRANSans" w:cs="IRANSans"/>
+          <w:rtl/>
+          <w:lang w:bidi="fa-IR"/>
+        </w:rPr>
+        <w:t>پروپوزال</w:t>
+      </w:r>
+      <w:proofErr w:type="spellEnd"/>
+      <w:r>
+        <w:rPr>
+          <w:rFonts w:ascii="IRANSans" w:hAnsi="IRANSans" w:cs="IRANSans"/>
+          <w:rtl/>
+          <w:lang w:bidi="fa-IR"/>
+        </w:rPr>
+        <w:t xml:space="preserve"> تکمیل خواهد شد</w:t>
+      </w:r>
+      <w:r>
+        <w:rPr>
+          <w:rFonts w:ascii="IRANSans" w:hAnsi="IRANSans" w:cs="IRANSans"/>
+          <w:lang w:bidi="fa-IR"/>
+        </w:rPr>
+        <w:t>.</w:t>
+      </w:r>
+    </w:p>
+    <w:p>
+      <w:pPr>
+        <w:bidi/>
+        <w:jc w:val="both"/>
+        <w:rPr>
+          <w:rFonts w:ascii="IRANSans" w:hAnsi="IRANSans" w:cs="IRANSans"/>
+          <w:lang w:bidi="fa-IR"/>
+        </w:rPr>
+      </w:pPr>
+      <w:r>
+        <w:rPr>
+          <w:rFonts w:ascii="IRANSans" w:hAnsi="IRANSans" w:cs="IRANSans"/>
+          <w:rtl/>
+          <w:lang w:bidi="fa-IR"/>
+        </w:rPr>
+        <w:t>این سند توسط</w:t>
+      </w:r>
+      <w:r>
+        <w:rPr>
+          <w:rFonts w:ascii="IRANSans" w:hAnsi="IRANSans" w:cs="IRANSans"/>
+          <w:lang w:bidi="fa-IR"/>
+        </w:rPr>
+        <w:t xml:space="preserve"> HLWL </w:t>
+      </w:r>
+      <w:r>
+        <w:rPr>
+          <w:rFonts w:ascii="IRANSans" w:hAnsi="IRANSans" w:cs="IRANSans" w:hint="cs"/>
+          <w:rtl/>
+          <w:lang w:bidi="fa-IR"/>
+        </w:rPr>
+        <w:t>به</w:t>
+      </w:r>
+      <w:r>
+        <w:rPr>
+          <w:rFonts w:ascii="IRANSans" w:hAnsi="IRANSans" w:cs="IRANSans"/>
+          <w:rtl/>
+          <w:lang w:bidi="fa-IR"/>
+        </w:rPr>
+        <w:t xml:space="preserve"> </w:t>
+      </w:r>
+      <w:r>
+        <w:rPr>
+          <w:rFonts w:ascii="IRANSans" w:hAnsi="IRANSans" w:cs="IRANSans" w:hint="cs"/>
+          <w:rtl/>
+          <w:lang w:bidi="fa-IR"/>
+        </w:rPr>
+        <w:t>عنوان</w:t>
+      </w:r>
+      <w:r>
+        <w:rPr>
+          <w:rFonts w:ascii="IRANSans" w:hAnsi="IRANSans" w:cs="IRANSans"/>
+          <w:rtl/>
+          <w:lang w:bidi="fa-IR"/>
+        </w:rPr>
+        <w:t xml:space="preserve"> </w:t>
+      </w:r>
+      <w:r>
+        <w:rPr>
+          <w:rFonts w:ascii="IRANSans" w:hAnsi="IRANSans" w:cs="IRANSans" w:hint="cs"/>
+          <w:rtl/>
+          <w:lang w:bidi="fa-IR"/>
+        </w:rPr>
+        <w:t>نماینده</w:t>
+      </w:r>
+      <w:r>
+        <w:rPr>
+          <w:rFonts w:ascii="IRANSans" w:hAnsi="IRANSans" w:cs="IRANSans"/>
+          <w:rtl/>
+          <w:lang w:bidi="fa-IR"/>
+        </w:rPr>
+        <w:t xml:space="preserve"> </w:t>
+      </w:r>
+      <w:r>
+        <w:rPr>
+          <w:rFonts w:ascii="IRANSans" w:hAnsi="IRANSans" w:cs="IRANSans" w:hint="cs"/>
+          <w:rtl/>
+          <w:lang w:bidi="fa-IR"/>
+        </w:rPr>
+        <w:t>خاورمیانه</w:t>
+      </w:r>
+      <w:r>
+        <w:rPr>
+          <w:rFonts w:ascii="IRANSans" w:hAnsi="IRANSans" w:cs="IRANSans"/>
+          <w:rtl/>
+          <w:lang w:bidi="fa-IR"/>
+        </w:rPr>
+        <w:t xml:space="preserve"> </w:t>
+      </w:r>
+      <w:proofErr w:type="spellStart"/>
+      <w:r>
+        <w:rPr>
+          <w:rFonts w:ascii="IRANSans" w:hAnsi="IRANSans" w:cs="IRANSans" w:hint="cs"/>
+          <w:rtl/>
+          <w:lang w:bidi="fa-IR"/>
+        </w:rPr>
+        <w:t>راهکار</w:t>
+      </w:r>
+      <w:proofErr w:type="spellEnd"/>
+      <w:r>
+        <w:rPr>
+          <w:rFonts w:ascii="IRANSans" w:hAnsi="IRANSans" w:cs="IRANSans"/>
+          <w:lang w:bidi="fa-IR"/>
+        </w:rPr>
+        <w:t xml:space="preserve"> </w:t>
+      </w:r>
+      <w:proofErr w:type="spellStart"/>
+      <w:r>
+        <w:rPr>
+          <w:rFonts w:ascii="IRANSans" w:hAnsi="IRANSans" w:cs="IRANSans"/>
+          <w:lang w:bidi="fa-IR"/>
+        </w:rPr>
+        <w:t>Syncolony</w:t>
+      </w:r>
+      <w:proofErr w:type="spellEnd"/>
+      <w:r>
+        <w:rPr>
+          <w:rFonts w:ascii="IRANSans" w:hAnsi="IRANSans" w:cs="IRANSans"/>
+          <w:lang w:bidi="fa-IR"/>
+        </w:rPr>
+        <w:t xml:space="preserve"> </w:t>
+      </w:r>
+      <w:r>
+        <w:rPr>
+          <w:rFonts w:ascii="IRANSans" w:hAnsi="IRANSans" w:cs="IRANSans" w:hint="cs"/>
+          <w:rtl/>
+          <w:lang w:bidi="fa-IR"/>
+        </w:rPr>
+        <w:t>تهیه</w:t>
+      </w:r>
+      <w:r>
+        <w:rPr>
+          <w:rFonts w:ascii="IRANSans" w:hAnsi="IRANSans" w:cs="IRANSans"/>
+          <w:rtl/>
+          <w:lang w:bidi="fa-IR"/>
+        </w:rPr>
+        <w:t xml:space="preserve"> </w:t>
+      </w:r>
+      <w:r>
+        <w:rPr>
+          <w:rFonts w:ascii="IRANSans" w:hAnsi="IRANSans" w:cs="IRANSans" w:hint="cs"/>
+          <w:rtl/>
+          <w:lang w:bidi="fa-IR"/>
+        </w:rPr>
+        <w:t>شده</w:t>
+      </w:r>
+      <w:r>
+        <w:rPr>
+          <w:rFonts w:ascii="IRANSans" w:hAnsi="IRANSans" w:cs="IRANSans"/>
+          <w:rtl/>
+          <w:lang w:bidi="fa-IR"/>
+        </w:rPr>
+        <w:t xml:space="preserve"> </w:t>
+      </w:r>
+      <w:r>
+        <w:rPr>
+          <w:rFonts w:ascii="IRANSans" w:hAnsi="IRANSans" w:cs="IRANSans" w:hint="cs"/>
+          <w:rtl/>
+          <w:lang w:bidi="fa-IR"/>
+        </w:rPr>
+        <w:t>است</w:t>
+      </w:r>
+      <w:r>
+        <w:rPr>
+          <w:rFonts w:ascii="IRANSans" w:hAnsi="IRANSans" w:cs="IRANSans"/>
+          <w:lang w:bidi="fa-IR"/>
+        </w:rPr>
+        <w:t>.</w:t>
       </w:r>
     </w:p>
     <w:p>
@@ -127,7 +781,7 @@
           <w:numId w:val="8"/>
         </w:numPr>
         <w:rPr>
-          <w:rFonts w:cs="IRANSans" w:hint="cs"/>
+          <w:rFonts w:cs="IRANSans"/>
           <w:rtl/>
           <w:lang w:val="en-US" w:bidi="fa-IR"/>
         </w:rPr>
@@ -138,6 +792,7 @@
           <w:rtl/>
           <w:lang w:val="en-US"/>
         </w:rPr>
+        <w:lastRenderedPageBreak/>
         <w:t xml:space="preserve">شناخت پروژه </w:t>
       </w:r>
       <w:r>
@@ -390,7 +1045,6 @@
           <w:rFonts w:cs="IRANSans"/>
           <w:rtl/>
         </w:rPr>
-        <w:lastRenderedPageBreak/>
         <w:t>جمع‌بندی</w:t>
       </w:r>
     </w:p>
@@ -411,6 +1065,7 @@
           <w:rFonts w:cs="IRANSans"/>
           <w:rtl/>
         </w:rPr>
+        <w:lastRenderedPageBreak/>
         <w:t xml:space="preserve">معرفی </w:t>
       </w:r>
       <w:r>

</xml_diff>

<commit_message>
2026-06-28 15:29:18 - Proposal: Access control
</commit_message>
<xml_diff>
--- a/01_Proposal/Proposal.docx
+++ b/01_Proposal/Proposal.docx
@@ -529,7 +529,7 @@
         <w:bidi/>
         <w:jc w:val="both"/>
         <w:rPr>
-          <w:rFonts w:ascii="IRANSans" w:hAnsi="IRANSans" w:cs="IRANSans" w:hint="cs"/>
+          <w:rFonts w:ascii="IRANSans" w:hAnsi="IRANSans" w:cs="IRANSans"/>
           <w:rtl/>
           <w:lang w:bidi="fa-IR"/>
         </w:rPr>
@@ -630,140 +630,52 @@
       </w:r>
       <w:r>
         <w:rPr>
-          <w:rFonts w:ascii="IRANSans" w:hAnsi="IRANSans" w:cs="IRANSans" w:hint="cs"/>
-          <w:rtl/>
-          <w:lang w:bidi="fa-IR"/>
-        </w:rPr>
-        <w:t>به</w:t>
-      </w:r>
-      <w:r>
-        <w:rPr>
-          <w:rFonts w:ascii="IRANSans" w:hAnsi="IRANSans" w:cs="IRANSans"/>
-          <w:rtl/>
+          <w:rFonts w:ascii="IRANSans" w:hAnsi="IRANSans" w:cs="IRANSans"/>
+          <w:rtl/>
+          <w:lang w:bidi="fa-IR"/>
+        </w:rPr>
+        <w:t xml:space="preserve">به عنوان نماینده خاورمیانه </w:t>
+      </w:r>
+      <w:proofErr w:type="spellStart"/>
+      <w:r>
+        <w:rPr>
+          <w:rFonts w:ascii="IRANSans" w:hAnsi="IRANSans" w:cs="IRANSans"/>
+          <w:rtl/>
+          <w:lang w:bidi="fa-IR"/>
+        </w:rPr>
+        <w:t>راهکار</w:t>
+      </w:r>
+      <w:proofErr w:type="spellEnd"/>
+      <w:r>
+        <w:rPr>
+          <w:rFonts w:ascii="IRANSans" w:hAnsi="IRANSans" w:cs="IRANSans"/>
           <w:lang w:bidi="fa-IR"/>
         </w:rPr>
         <w:t xml:space="preserve"> </w:t>
       </w:r>
-      <w:r>
-        <w:rPr>
-          <w:rFonts w:ascii="IRANSans" w:hAnsi="IRANSans" w:cs="IRANSans" w:hint="cs"/>
-          <w:rtl/>
-          <w:lang w:bidi="fa-IR"/>
-        </w:rPr>
-        <w:t>عنوان</w:t>
-      </w:r>
-      <w:r>
-        <w:rPr>
-          <w:rFonts w:ascii="IRANSans" w:hAnsi="IRANSans" w:cs="IRANSans"/>
-          <w:rtl/>
+      <w:proofErr w:type="spellStart"/>
+      <w:r>
+        <w:rPr>
+          <w:rFonts w:ascii="IRANSans" w:hAnsi="IRANSans" w:cs="IRANSans"/>
+          <w:lang w:bidi="fa-IR"/>
+        </w:rPr>
+        <w:t>Syncolony</w:t>
+      </w:r>
+      <w:proofErr w:type="spellEnd"/>
+      <w:r>
+        <w:rPr>
+          <w:rFonts w:ascii="IRANSans" w:hAnsi="IRANSans" w:cs="IRANSans"/>
           <w:lang w:bidi="fa-IR"/>
         </w:rPr>
         <w:t xml:space="preserve"> </w:t>
       </w:r>
       <w:r>
         <w:rPr>
-          <w:rFonts w:ascii="IRANSans" w:hAnsi="IRANSans" w:cs="IRANSans" w:hint="cs"/>
-          <w:rtl/>
-          <w:lang w:bidi="fa-IR"/>
-        </w:rPr>
-        <w:t>نماینده</w:t>
-      </w:r>
-      <w:r>
-        <w:rPr>
-          <w:rFonts w:ascii="IRANSans" w:hAnsi="IRANSans" w:cs="IRANSans"/>
-          <w:rtl/>
-          <w:lang w:bidi="fa-IR"/>
-        </w:rPr>
-        <w:t xml:space="preserve"> </w:t>
-      </w:r>
-      <w:r>
-        <w:rPr>
-          <w:rFonts w:ascii="IRANSans" w:hAnsi="IRANSans" w:cs="IRANSans" w:hint="cs"/>
-          <w:rtl/>
-          <w:lang w:bidi="fa-IR"/>
-        </w:rPr>
-        <w:t>خاورمیانه</w:t>
-      </w:r>
-      <w:r>
-        <w:rPr>
-          <w:rFonts w:ascii="IRANSans" w:hAnsi="IRANSans" w:cs="IRANSans"/>
-          <w:rtl/>
-          <w:lang w:bidi="fa-IR"/>
-        </w:rPr>
-        <w:t xml:space="preserve"> </w:t>
-      </w:r>
-      <w:proofErr w:type="spellStart"/>
-      <w:r>
-        <w:rPr>
-          <w:rFonts w:ascii="IRANSans" w:hAnsi="IRANSans" w:cs="IRANSans" w:hint="cs"/>
-          <w:rtl/>
-          <w:lang w:bidi="fa-IR"/>
-        </w:rPr>
-        <w:t>راهکار</w:t>
-      </w:r>
-      <w:proofErr w:type="spellEnd"/>
-      <w:r>
-        <w:rPr>
-          <w:rFonts w:ascii="IRANSans" w:hAnsi="IRANSans" w:cs="IRANSans"/>
-          <w:lang w:bidi="fa-IR"/>
-        </w:rPr>
-        <w:t xml:space="preserve"> </w:t>
-      </w:r>
-      <w:proofErr w:type="spellStart"/>
-      <w:r>
-        <w:rPr>
-          <w:rFonts w:ascii="IRANSans" w:hAnsi="IRANSans" w:cs="IRANSans"/>
-          <w:lang w:bidi="fa-IR"/>
-        </w:rPr>
-        <w:t>Syncolony</w:t>
-      </w:r>
-      <w:proofErr w:type="spellEnd"/>
-      <w:r>
-        <w:rPr>
-          <w:rFonts w:ascii="IRANSans" w:hAnsi="IRANSans" w:cs="IRANSans"/>
-          <w:lang w:bidi="fa-IR"/>
-        </w:rPr>
-        <w:t xml:space="preserve"> </w:t>
-      </w:r>
-      <w:r>
-        <w:rPr>
-          <w:rFonts w:ascii="IRANSans" w:hAnsi="IRANSans" w:cs="IRANSans" w:hint="cs"/>
-          <w:rtl/>
-          <w:lang w:bidi="fa-IR"/>
-        </w:rPr>
-        <w:t>تهیه</w:t>
-      </w:r>
-      <w:r>
-        <w:rPr>
-          <w:rFonts w:ascii="IRANSans" w:hAnsi="IRANSans" w:cs="IRANSans"/>
-          <w:rtl/>
-          <w:lang w:bidi="fa-IR"/>
-        </w:rPr>
-        <w:t xml:space="preserve"> </w:t>
-      </w:r>
-      <w:r>
-        <w:rPr>
-          <w:rFonts w:ascii="IRANSans" w:hAnsi="IRANSans" w:cs="IRANSans" w:hint="cs"/>
-          <w:rtl/>
-          <w:lang w:bidi="fa-IR"/>
-        </w:rPr>
-        <w:t>شده</w:t>
-      </w:r>
-      <w:r>
-        <w:rPr>
-          <w:rFonts w:ascii="IRANSans" w:hAnsi="IRANSans" w:cs="IRANSans"/>
-          <w:rtl/>
-          <w:lang w:bidi="fa-IR"/>
-        </w:rPr>
-        <w:t xml:space="preserve"> </w:t>
-      </w:r>
-      <w:r>
-        <w:rPr>
-          <w:rFonts w:ascii="IRANSans" w:hAnsi="IRANSans" w:cs="IRANSans" w:hint="cs"/>
-          <w:rtl/>
-          <w:lang w:bidi="fa-IR"/>
-        </w:rPr>
-        <w:t>است</w:t>
+          <w:rFonts w:ascii="IRANSans" w:hAnsi="IRANSans" w:cs="IRANSans"/>
+          <w:rtl/>
+          <w:lang w:bidi="fa-IR"/>
+        </w:rPr>
+        <w:t>تهیه شده است</w:t>
       </w:r>
       <w:r>
         <w:rPr>
@@ -783,7 +695,7 @@
         <w:rPr>
           <w:rFonts w:cs="IRANSans"/>
           <w:rtl/>
-          <w:lang w:val="en-US" w:bidi="fa-IR"/>
+          <w:lang w:val="en-US"/>
         </w:rPr>
       </w:pPr>
       <w:r>
@@ -797,7 +709,7 @@
       </w:r>
       <w:r>
         <w:rPr>
-          <w:rFonts w:cs="IRANSans" w:hint="cs"/>
+          <w:rFonts w:cs="IRANSans"/>
           <w:rtl/>
           <w:lang w:val="en-US"/>
         </w:rPr>
@@ -805,12 +717,514 @@
       </w:r>
       <w:r>
         <w:rPr>
-          <w:rFonts w:cs="IRANSans" w:hint="cs"/>
+          <w:rFonts w:cs="IRANSans"/>
           <w:rtl/>
           <w:lang w:val="en-US"/>
         </w:rPr>
         <w:t>ه</w:t>
       </w:r>
+    </w:p>
+    <w:p>
+      <w:pPr>
+        <w:pStyle w:val="Heading1"/>
+        <w:numPr>
+          <w:ilvl w:val="1"/>
+          <w:numId w:val="8"/>
+        </w:numPr>
+        <w:rPr>
+          <w:rFonts w:cs="IRANSans"/>
+          <w:sz w:val="32"/>
+          <w:szCs w:val="32"/>
+          <w:rtl/>
+          <w:lang w:val="en-US"/>
+        </w:rPr>
+      </w:pPr>
+      <w:r>
+        <w:rPr>
+          <w:rFonts w:cs="IRANSans"/>
+          <w:sz w:val="32"/>
+          <w:szCs w:val="32"/>
+          <w:rtl/>
+          <w:lang w:val="en-US"/>
+        </w:rPr>
+        <w:t>معرفی پروژه</w:t>
+      </w:r>
+    </w:p>
+    <w:p>
+      <w:pPr>
+        <w:bidi/>
+        <w:jc w:val="both"/>
+        <w:rPr>
+          <w:rFonts w:ascii="IRANSans" w:hAnsi="IRANSans" w:cs="IRANSans"/>
+          <w:lang w:bidi="fa-IR"/>
+        </w:rPr>
+      </w:pPr>
+      <w:r>
+        <w:rPr>
+          <w:rFonts w:ascii="IRANSans" w:hAnsi="IRANSans" w:cs="IRANSans"/>
+          <w:rtl/>
+          <w:lang w:bidi="fa-IR"/>
+        </w:rPr>
+        <w:t>این پروژه با هدف طراحی و پیاده‌سازی یک راهکار یکپارچه برای مدیریت کنترل تردد، امنیت فیزیکی، مدیریت مراجعین، مدیریت پارکینگ و نظارت بر تردد افراد و وسایل نقلیه در یک مجموعه آموزشی بزرگ تهیه شده است</w:t>
+      </w:r>
+      <w:r>
+        <w:rPr>
+          <w:rFonts w:ascii="IRANSans" w:hAnsi="IRANSans" w:cs="IRANSans"/>
+          <w:lang w:bidi="fa-IR"/>
+        </w:rPr>
+        <w:t>.</w:t>
+      </w:r>
+    </w:p>
+    <w:p>
+      <w:pPr>
+        <w:bidi/>
+        <w:jc w:val="both"/>
+        <w:rPr>
+          <w:rFonts w:ascii="IRANSans" w:hAnsi="IRANSans" w:cs="IRANSans"/>
+          <w:lang w:bidi="fa-IR"/>
+        </w:rPr>
+      </w:pPr>
+      <w:r>
+        <w:rPr>
+          <w:rFonts w:ascii="IRANSans" w:hAnsi="IRANSans" w:cs="IRANSans"/>
+          <w:rtl/>
+          <w:lang w:bidi="fa-IR"/>
+        </w:rPr>
+        <w:t>بر اساس اطلاعات اولیه، مجموعه مورد نظر شامل چندین ساختمان آموزشی، بیش از ۲۰۰ کلاس درس، آزمایشگاه‌ها، فضاهای اداری، کتابخانه، سالن‌های آموزشی، پارکینگ‌ها و ورودی‌های متعدد است که روزانه میزبان تعداد زیادی از دانش‌آموزان، معلمان، کارکنان، والدین، مراجعین و پیمانکاران خواهد بود</w:t>
+      </w:r>
+      <w:r>
+        <w:rPr>
+          <w:rFonts w:ascii="IRANSans" w:hAnsi="IRANSans" w:cs="IRANSans"/>
+          <w:lang w:bidi="fa-IR"/>
+        </w:rPr>
+        <w:t>.</w:t>
+      </w:r>
+    </w:p>
+    <w:p>
+      <w:pPr>
+        <w:pStyle w:val="Heading1"/>
+        <w:numPr>
+          <w:ilvl w:val="1"/>
+          <w:numId w:val="8"/>
+        </w:numPr>
+        <w:rPr>
+          <w:rFonts w:cs="IRANSans"/>
+          <w:sz w:val="32"/>
+          <w:szCs w:val="32"/>
+          <w:lang w:val="en-US"/>
+        </w:rPr>
+      </w:pPr>
+      <w:r>
+        <w:rPr>
+          <w:rFonts w:cs="IRANSans"/>
+          <w:sz w:val="32"/>
+          <w:szCs w:val="32"/>
+          <w:rtl/>
+          <w:lang w:val="en-US"/>
+        </w:rPr>
+        <w:t>اهداف پروژه</w:t>
+      </w:r>
+    </w:p>
+    <w:p>
+      <w:pPr>
+        <w:bidi/>
+        <w:jc w:val="both"/>
+        <w:rPr>
+          <w:rFonts w:ascii="IRANSans" w:hAnsi="IRANSans" w:cs="IRANSans"/>
+          <w:lang w:bidi="fa-IR"/>
+        </w:rPr>
+      </w:pPr>
+      <w:r>
+        <w:rPr>
+          <w:rFonts w:ascii="IRANSans" w:hAnsi="IRANSans" w:cs="IRANSans"/>
+          <w:rtl/>
+          <w:lang w:bidi="fa-IR"/>
+        </w:rPr>
+        <w:t>هدف از اجرای این پروژه، ایجاد بستری یکپارچه برای افزایش امنیت، مدیریت هوشمند تردد، کاهش فرآیندهای دستی، افزایش سرعت دسترسی، ثبت و رهگیری کامل رویدادها و فراهم نمودن امکان مدیریت متمرکز کلیه اجزای امنیت فیزیکی مجموعه است</w:t>
+      </w:r>
+      <w:r>
+        <w:rPr>
+          <w:rFonts w:ascii="IRANSans" w:hAnsi="IRANSans" w:cs="IRANSans"/>
+          <w:lang w:bidi="fa-IR"/>
+        </w:rPr>
+        <w:t>.</w:t>
+      </w:r>
+    </w:p>
+    <w:p>
+      <w:pPr>
+        <w:bidi/>
+        <w:jc w:val="both"/>
+        <w:rPr>
+          <w:rFonts w:ascii="IRANSans" w:hAnsi="IRANSans" w:cs="IRANSans"/>
+          <w:lang w:bidi="fa-IR"/>
+        </w:rPr>
+      </w:pPr>
+      <w:r>
+        <w:rPr>
+          <w:rFonts w:ascii="IRANSans" w:hAnsi="IRANSans" w:cs="IRANSans"/>
+          <w:rtl/>
+          <w:lang w:bidi="fa-IR"/>
+        </w:rPr>
+        <w:t>راهکار پیشنهادی باید علاوه بر پاسخگویی به نیازهای فعلی مدرسه، قابلیت توسعه و انطباق با نیازهای آینده مجموعه را نیز داشته باشد</w:t>
+      </w:r>
+      <w:r>
+        <w:rPr>
+          <w:rFonts w:ascii="IRANSans" w:hAnsi="IRANSans" w:cs="IRANSans"/>
+          <w:lang w:bidi="fa-IR"/>
+        </w:rPr>
+        <w:t>.</w:t>
+      </w:r>
+    </w:p>
+    <w:p>
+      <w:pPr>
+        <w:pStyle w:val="Heading1"/>
+        <w:numPr>
+          <w:ilvl w:val="1"/>
+          <w:numId w:val="8"/>
+        </w:numPr>
+        <w:rPr>
+          <w:rFonts w:cs="IRANSans"/>
+          <w:sz w:val="32"/>
+          <w:szCs w:val="32"/>
+          <w:lang w:val="en-US"/>
+        </w:rPr>
+      </w:pPr>
+      <w:r>
+        <w:rPr>
+          <w:rFonts w:cs="IRANSans"/>
+          <w:sz w:val="32"/>
+          <w:szCs w:val="32"/>
+          <w:rtl/>
+          <w:lang w:val="en-US"/>
+        </w:rPr>
+        <w:t>نیازهای اصلی مجموعه</w:t>
+      </w:r>
+    </w:p>
+    <w:p>
+      <w:pPr>
+        <w:bidi/>
+        <w:jc w:val="both"/>
+        <w:rPr>
+          <w:rFonts w:ascii="IRANSans" w:hAnsi="IRANSans" w:cs="IRANSans"/>
+          <w:lang w:bidi="fa-IR"/>
+        </w:rPr>
+      </w:pPr>
+      <w:r>
+        <w:rPr>
+          <w:rFonts w:ascii="IRANSans" w:hAnsi="IRANSans" w:cs="IRANSans"/>
+          <w:rtl/>
+          <w:lang w:bidi="fa-IR"/>
+        </w:rPr>
+        <w:t>بر اساس اطلاعات اولیه، مهم‌ترین نیازهای پروژه عبارت‌اند از</w:t>
+      </w:r>
+      <w:r>
+        <w:rPr>
+          <w:rFonts w:ascii="IRANSans" w:hAnsi="IRANSans" w:cs="IRANSans"/>
+          <w:lang w:bidi="fa-IR"/>
+        </w:rPr>
+        <w:t>:</w:t>
+      </w:r>
+    </w:p>
+    <w:p>
+      <w:pPr>
+        <w:pStyle w:val="ListParagraph"/>
+        <w:numPr>
+          <w:ilvl w:val="0"/>
+          <w:numId w:val="11"/>
+        </w:numPr>
+        <w:tabs>
+          <w:tab w:val="num" w:pos="720"/>
+        </w:tabs>
+        <w:bidi/>
+        <w:jc w:val="both"/>
+        <w:rPr>
+          <w:rFonts w:ascii="IRANSans" w:hAnsi="IRANSans" w:cs="IRANSans"/>
+          <w:lang w:bidi="fa-IR"/>
+        </w:rPr>
+      </w:pPr>
+      <w:r>
+        <w:rPr>
+          <w:rFonts w:ascii="IRANSans" w:hAnsi="IRANSans" w:cs="IRANSans"/>
+          <w:rtl/>
+          <w:lang w:bidi="fa-IR"/>
+        </w:rPr>
+        <w:t>مدیریت ورود و خروج دانش‌آموزان</w:t>
+      </w:r>
+    </w:p>
+    <w:p>
+      <w:pPr>
+        <w:pStyle w:val="ListParagraph"/>
+        <w:numPr>
+          <w:ilvl w:val="0"/>
+          <w:numId w:val="11"/>
+        </w:numPr>
+        <w:tabs>
+          <w:tab w:val="num" w:pos="720"/>
+        </w:tabs>
+        <w:bidi/>
+        <w:jc w:val="both"/>
+        <w:rPr>
+          <w:rFonts w:ascii="IRANSans" w:hAnsi="IRANSans" w:cs="IRANSans"/>
+          <w:lang w:bidi="fa-IR"/>
+        </w:rPr>
+      </w:pPr>
+      <w:r>
+        <w:rPr>
+          <w:rFonts w:ascii="IRANSans" w:hAnsi="IRANSans" w:cs="IRANSans"/>
+          <w:rtl/>
+          <w:lang w:bidi="fa-IR"/>
+        </w:rPr>
+        <w:t>مدیریت ورود و خروج معلمان و کارکنان</w:t>
+      </w:r>
+    </w:p>
+    <w:p>
+      <w:pPr>
+        <w:pStyle w:val="ListParagraph"/>
+        <w:numPr>
+          <w:ilvl w:val="0"/>
+          <w:numId w:val="11"/>
+        </w:numPr>
+        <w:tabs>
+          <w:tab w:val="num" w:pos="720"/>
+        </w:tabs>
+        <w:bidi/>
+        <w:jc w:val="both"/>
+        <w:rPr>
+          <w:rFonts w:ascii="IRANSans" w:hAnsi="IRANSans" w:cs="IRANSans"/>
+          <w:lang w:bidi="fa-IR"/>
+        </w:rPr>
+      </w:pPr>
+      <w:r>
+        <w:rPr>
+          <w:rFonts w:ascii="IRANSans" w:hAnsi="IRANSans" w:cs="IRANSans"/>
+          <w:rtl/>
+          <w:lang w:bidi="fa-IR"/>
+        </w:rPr>
+        <w:t>کنترل دسترسی کلاس‌های درس، آزمایشگاه‌ها و فضاهای اداری</w:t>
+      </w:r>
+    </w:p>
+    <w:p>
+      <w:pPr>
+        <w:pStyle w:val="ListParagraph"/>
+        <w:numPr>
+          <w:ilvl w:val="0"/>
+          <w:numId w:val="11"/>
+        </w:numPr>
+        <w:tabs>
+          <w:tab w:val="num" w:pos="720"/>
+        </w:tabs>
+        <w:bidi/>
+        <w:jc w:val="both"/>
+        <w:rPr>
+          <w:rFonts w:ascii="IRANSans" w:hAnsi="IRANSans" w:cs="IRANSans"/>
+          <w:lang w:bidi="fa-IR"/>
+        </w:rPr>
+      </w:pPr>
+      <w:r>
+        <w:rPr>
+          <w:rFonts w:ascii="IRANSans" w:hAnsi="IRANSans" w:cs="IRANSans"/>
+          <w:rtl/>
+          <w:lang w:bidi="fa-IR"/>
+        </w:rPr>
+        <w:t>مدیریت ورود والدین، مراجعین و پیمانکاران</w:t>
+      </w:r>
+    </w:p>
+    <w:p>
+      <w:pPr>
+        <w:pStyle w:val="ListParagraph"/>
+        <w:numPr>
+          <w:ilvl w:val="0"/>
+          <w:numId w:val="11"/>
+        </w:numPr>
+        <w:tabs>
+          <w:tab w:val="num" w:pos="720"/>
+        </w:tabs>
+        <w:bidi/>
+        <w:jc w:val="both"/>
+        <w:rPr>
+          <w:rFonts w:ascii="IRANSans" w:hAnsi="IRANSans" w:cs="IRANSans"/>
+          <w:lang w:bidi="fa-IR"/>
+        </w:rPr>
+      </w:pPr>
+      <w:r>
+        <w:rPr>
+          <w:rFonts w:ascii="IRANSans" w:hAnsi="IRANSans" w:cs="IRANSans"/>
+          <w:rtl/>
+          <w:lang w:bidi="fa-IR"/>
+        </w:rPr>
+        <w:t>مدیریت گیت‌های ورودی و خروجی</w:t>
+      </w:r>
+    </w:p>
+    <w:p>
+      <w:pPr>
+        <w:pStyle w:val="ListParagraph"/>
+        <w:numPr>
+          <w:ilvl w:val="0"/>
+          <w:numId w:val="11"/>
+        </w:numPr>
+        <w:tabs>
+          <w:tab w:val="num" w:pos="720"/>
+        </w:tabs>
+        <w:bidi/>
+        <w:jc w:val="both"/>
+        <w:rPr>
+          <w:rFonts w:ascii="IRANSans" w:hAnsi="IRANSans" w:cs="IRANSans"/>
+          <w:lang w:bidi="fa-IR"/>
+        </w:rPr>
+      </w:pPr>
+      <w:r>
+        <w:rPr>
+          <w:rFonts w:ascii="IRANSans" w:hAnsi="IRANSans" w:cs="IRANSans"/>
+          <w:rtl/>
+          <w:lang w:bidi="fa-IR"/>
+        </w:rPr>
+        <w:t>مدیریت پارکینگ و خودروها</w:t>
+      </w:r>
+    </w:p>
+    <w:p>
+      <w:pPr>
+        <w:pStyle w:val="ListParagraph"/>
+        <w:numPr>
+          <w:ilvl w:val="0"/>
+          <w:numId w:val="11"/>
+        </w:numPr>
+        <w:tabs>
+          <w:tab w:val="num" w:pos="720"/>
+        </w:tabs>
+        <w:bidi/>
+        <w:jc w:val="both"/>
+        <w:rPr>
+          <w:rFonts w:ascii="IRANSans" w:hAnsi="IRANSans" w:cs="IRANSans"/>
+          <w:lang w:bidi="fa-IR"/>
+        </w:rPr>
+      </w:pPr>
+      <w:r>
+        <w:rPr>
+          <w:rFonts w:ascii="IRANSans" w:hAnsi="IRANSans" w:cs="IRANSans"/>
+          <w:rtl/>
+          <w:lang w:bidi="fa-IR"/>
+        </w:rPr>
+        <w:lastRenderedPageBreak/>
+        <w:t>یکپارچه‌سازی با سامانه‌های نظارتی و سایر سامانه‌های مرتبط</w:t>
+      </w:r>
+    </w:p>
+    <w:p>
+      <w:pPr>
+        <w:pStyle w:val="ListParagraph"/>
+        <w:numPr>
+          <w:ilvl w:val="0"/>
+          <w:numId w:val="11"/>
+        </w:numPr>
+        <w:tabs>
+          <w:tab w:val="num" w:pos="720"/>
+        </w:tabs>
+        <w:bidi/>
+        <w:jc w:val="both"/>
+        <w:rPr>
+          <w:rFonts w:ascii="IRANSans" w:hAnsi="IRANSans" w:cs="IRANSans"/>
+          <w:lang w:bidi="fa-IR"/>
+        </w:rPr>
+      </w:pPr>
+      <w:r>
+        <w:rPr>
+          <w:rFonts w:ascii="IRANSans" w:hAnsi="IRANSans" w:cs="IRANSans"/>
+          <w:rtl/>
+          <w:lang w:bidi="fa-IR"/>
+        </w:rPr>
+        <w:t>ثبت، مانیتورینگ و گزارش‌گیری از کلیه رویدادهای امنیتی</w:t>
+      </w:r>
+    </w:p>
+    <w:p>
+      <w:pPr>
+        <w:pStyle w:val="Heading1"/>
+        <w:numPr>
+          <w:ilvl w:val="1"/>
+          <w:numId w:val="8"/>
+        </w:numPr>
+        <w:rPr>
+          <w:rFonts w:cs="IRANSans"/>
+          <w:sz w:val="32"/>
+          <w:szCs w:val="32"/>
+          <w:lang w:val="en-US"/>
+        </w:rPr>
+      </w:pPr>
+      <w:r>
+        <w:rPr>
+          <w:rFonts w:cs="IRANSans"/>
+          <w:sz w:val="32"/>
+          <w:szCs w:val="32"/>
+          <w:rtl/>
+          <w:lang w:val="en-US"/>
+        </w:rPr>
+        <w:t>رویکرد ارائه این پیشنهاد</w:t>
+      </w:r>
+    </w:p>
+    <w:p>
+      <w:pPr>
+        <w:bidi/>
+        <w:rPr>
+          <w:rFonts w:ascii="IRANSans" w:hAnsi="IRANSans" w:cs="IRANSans"/>
+        </w:rPr>
+      </w:pPr>
+      <w:r>
+        <w:rPr>
+          <w:rFonts w:ascii="IRANSans" w:hAnsi="IRANSans" w:cs="IRANSans"/>
+          <w:rtl/>
+          <w:lang w:val="en-US"/>
+        </w:rPr>
+        <w:t>از آنجا که اطلاعات تفصیلی پروژه، از جمله نقشه‌های اجرایی، تعداد دقیق ساختمان‌ها، تعداد درب‌ها، ظرفیت کاربران، سیاست‌های امنیتی و الزامات عملیاتی هنوز در حال تکمیل است، این پیشنهاد بر معرفی راهکارهای قابل ارائه، سناریوهای پیشنهادی و گزینه‌های مختلف پیاده‌سازی متمرکز است</w:t>
+      </w:r>
+      <w:r>
+        <w:rPr>
+          <w:rFonts w:ascii="IRANSans" w:hAnsi="IRANSans" w:cs="IRANSans"/>
+        </w:rPr>
+        <w:t>.</w:t>
+      </w:r>
+    </w:p>
+    <w:p>
+      <w:pPr>
+        <w:bidi/>
+        <w:rPr>
+          <w:rFonts w:ascii="IRANSans" w:hAnsi="IRANSans" w:cs="IRANSans"/>
+        </w:rPr>
+      </w:pPr>
+      <w:r>
+        <w:rPr>
+          <w:rFonts w:ascii="IRANSans" w:hAnsi="IRANSans" w:cs="IRANSans"/>
+          <w:rtl/>
+          <w:lang w:val="en-US"/>
+        </w:rPr>
+        <w:t xml:space="preserve">پس از تکمیل اطلاعات پروژه و نهایی شدن نیازمندی‌های کارفرما، نسخه نهایی پیشنهاد شامل معماری تفصیلی، انتخاب تجهیزات، طراحی نهایی، </w:t>
+      </w:r>
+      <w:r>
+        <w:rPr>
+          <w:rFonts w:ascii="IRANSans" w:hAnsi="IRANSans" w:cs="IRANSans"/>
+        </w:rPr>
+        <w:t xml:space="preserve">BOQ </w:t>
+      </w:r>
+      <w:r>
+        <w:rPr>
+          <w:rFonts w:ascii="IRANSans" w:hAnsi="IRANSans" w:cs="IRANSans"/>
+          <w:rtl/>
+          <w:lang w:val="en-US"/>
+        </w:rPr>
+        <w:t>و پیشنهاد مالی تهیه خواهد شد</w:t>
+      </w:r>
+      <w:r>
+        <w:rPr>
+          <w:rFonts w:ascii="IRANSans" w:hAnsi="IRANSans" w:cs="IRANSans"/>
+        </w:rPr>
+        <w:t>.</w:t>
+      </w:r>
+    </w:p>
+    <w:p>
+      <w:pPr>
+        <w:bidi/>
+        <w:rPr>
+          <w:rFonts w:ascii="IRANSans" w:hAnsi="IRANSans" w:cs="IRANSans"/>
+          <w:rtl/>
+        </w:rPr>
+      </w:pPr>
     </w:p>
     <w:p>
       <w:pPr>
@@ -831,6 +1245,7 @@
           <w:rtl/>
           <w:lang w:val="en-US"/>
         </w:rPr>
+        <w:lastRenderedPageBreak/>
         <w:t>اهداف و نیازمندی‌های اصلی مدرسه</w:t>
       </w:r>
     </w:p>
@@ -895,7 +1310,7 @@
       </w:r>
       <w:r>
         <w:rPr>
-          <w:rFonts w:cs="IRANSans" w:hint="cs"/>
+          <w:rFonts w:cs="IRANSans"/>
           <w:rtl/>
         </w:rPr>
         <w:t xml:space="preserve"> پیشنهادی</w:t>
@@ -922,7 +1337,7 @@
       </w:r>
       <w:r>
         <w:rPr>
-          <w:rFonts w:cs="IRANSans" w:hint="cs"/>
+          <w:rFonts w:cs="IRANSans"/>
           <w:rtl/>
         </w:rPr>
         <w:t>پیشنهادی</w:t>
@@ -1065,7 +1480,6 @@
           <w:rFonts w:cs="IRANSans"/>
           <w:rtl/>
         </w:rPr>
-        <w:lastRenderedPageBreak/>
         <w:t xml:space="preserve">معرفی </w:t>
       </w:r>
       <w:r>
@@ -1099,6 +1513,7 @@
           <w:rFonts w:cs="IRANSans"/>
           <w:rtl/>
         </w:rPr>
+        <w:lastRenderedPageBreak/>
         <w:t>پیوست‌ها</w:t>
       </w:r>
     </w:p>
@@ -1238,6 +1653,119 @@
     </w:lvl>
   </w:abstractNum>
   <w:abstractNum w:abstractNumId="1" w15:restartNumberingAfterBreak="0">
+    <w:nsid w:val="157F6BDF"/>
+    <w:multiLevelType w:val="hybridMultilevel"/>
+    <w:tmpl w:val="1BECB06A"/>
+    <w:lvl w:ilvl="0" w:tplc="04070001">
+      <w:start w:val="1"/>
+      <w:numFmt w:val="bullet"/>
+      <w:lvlText w:val=""/>
+      <w:lvlJc w:val="left"/>
+      <w:pPr>
+        <w:ind w:left="720" w:hanging="360"/>
+      </w:pPr>
+      <w:rPr>
+        <w:rFonts w:ascii="Symbol" w:hAnsi="Symbol" w:hint="default"/>
+      </w:rPr>
+    </w:lvl>
+    <w:lvl w:ilvl="1" w:tplc="04070003" w:tentative="1">
+      <w:start w:val="1"/>
+      <w:numFmt w:val="bullet"/>
+      <w:lvlText w:val="o"/>
+      <w:lvlJc w:val="left"/>
+      <w:pPr>
+        <w:ind w:left="1440" w:hanging="360"/>
+      </w:pPr>
+      <w:rPr>
+        <w:rFonts w:ascii="Courier New" w:hAnsi="Courier New" w:cs="Courier New" w:hint="default"/>
+      </w:rPr>
+    </w:lvl>
+    <w:lvl w:ilvl="2" w:tplc="04070005" w:tentative="1">
+      <w:start w:val="1"/>
+      <w:numFmt w:val="bullet"/>
+      <w:lvlText w:val=""/>
+      <w:lvlJc w:val="left"/>
+      <w:pPr>
+        <w:ind w:left="2160" w:hanging="360"/>
+      </w:pPr>
+      <w:rPr>
+        <w:rFonts w:ascii="Wingdings" w:hAnsi="Wingdings" w:hint="default"/>
+      </w:rPr>
+    </w:lvl>
+    <w:lvl w:ilvl="3" w:tplc="04070001" w:tentative="1">
+      <w:start w:val="1"/>
+      <w:numFmt w:val="bullet"/>
+      <w:lvlText w:val=""/>
+      <w:lvlJc w:val="left"/>
+      <w:pPr>
+        <w:ind w:left="2880" w:hanging="360"/>
+      </w:pPr>
+      <w:rPr>
+        <w:rFonts w:ascii="Symbol" w:hAnsi="Symbol" w:hint="default"/>
+      </w:rPr>
+    </w:lvl>
+    <w:lvl w:ilvl="4" w:tplc="04070003" w:tentative="1">
+      <w:start w:val="1"/>
+      <w:numFmt w:val="bullet"/>
+      <w:lvlText w:val="o"/>
+      <w:lvlJc w:val="left"/>
+      <w:pPr>
+        <w:ind w:left="3600" w:hanging="360"/>
+      </w:pPr>
+      <w:rPr>
+        <w:rFonts w:ascii="Courier New" w:hAnsi="Courier New" w:cs="Courier New" w:hint="default"/>
+      </w:rPr>
+    </w:lvl>
+    <w:lvl w:ilvl="5" w:tplc="04070005" w:tentative="1">
+      <w:start w:val="1"/>
+      <w:numFmt w:val="bullet"/>
+      <w:lvlText w:val=""/>
+      <w:lvlJc w:val="left"/>
+      <w:pPr>
+        <w:ind w:left="4320" w:hanging="360"/>
+      </w:pPr>
+      <w:rPr>
+        <w:rFonts w:ascii="Wingdings" w:hAnsi="Wingdings" w:hint="default"/>
+      </w:rPr>
+    </w:lvl>
+    <w:lvl w:ilvl="6" w:tplc="04070001" w:tentative="1">
+      <w:start w:val="1"/>
+      <w:numFmt w:val="bullet"/>
+      <w:lvlText w:val=""/>
+      <w:lvlJc w:val="left"/>
+      <w:pPr>
+        <w:ind w:left="5040" w:hanging="360"/>
+      </w:pPr>
+      <w:rPr>
+        <w:rFonts w:ascii="Symbol" w:hAnsi="Symbol" w:hint="default"/>
+      </w:rPr>
+    </w:lvl>
+    <w:lvl w:ilvl="7" w:tplc="04070003" w:tentative="1">
+      <w:start w:val="1"/>
+      <w:numFmt w:val="bullet"/>
+      <w:lvlText w:val="o"/>
+      <w:lvlJc w:val="left"/>
+      <w:pPr>
+        <w:ind w:left="5760" w:hanging="360"/>
+      </w:pPr>
+      <w:rPr>
+        <w:rFonts w:ascii="Courier New" w:hAnsi="Courier New" w:cs="Courier New" w:hint="default"/>
+      </w:rPr>
+    </w:lvl>
+    <w:lvl w:ilvl="8" w:tplc="04070005" w:tentative="1">
+      <w:start w:val="1"/>
+      <w:numFmt w:val="bullet"/>
+      <w:lvlText w:val=""/>
+      <w:lvlJc w:val="left"/>
+      <w:pPr>
+        <w:ind w:left="6480" w:hanging="360"/>
+      </w:pPr>
+      <w:rPr>
+        <w:rFonts w:ascii="Wingdings" w:hAnsi="Wingdings" w:hint="default"/>
+      </w:rPr>
+    </w:lvl>
+  </w:abstractNum>
+  <w:abstractNum w:abstractNumId="2" w15:restartNumberingAfterBreak="0">
     <w:nsid w:val="2B66280C"/>
     <w:multiLevelType w:val="multilevel"/>
     <w:tmpl w:val="402C2F78"/>
@@ -1350,7 +1878,7 @@
       </w:pPr>
     </w:lvl>
   </w:abstractNum>
-  <w:abstractNum w:abstractNumId="2" w15:restartNumberingAfterBreak="0">
+  <w:abstractNum w:abstractNumId="3" w15:restartNumberingAfterBreak="0">
     <w:nsid w:val="2B983146"/>
     <w:multiLevelType w:val="multilevel"/>
     <w:tmpl w:val="A0EE3C98"/>
@@ -1464,97 +1992,235 @@
       </w:rPr>
     </w:lvl>
   </w:abstractNum>
-  <w:abstractNum w:abstractNumId="3" w15:restartNumberingAfterBreak="0">
+  <w:abstractNum w:abstractNumId="4" w15:restartNumberingAfterBreak="0">
+    <w:nsid w:val="2DB2449A"/>
+    <w:multiLevelType w:val="multilevel"/>
+    <w:tmpl w:val="67163E42"/>
+    <w:lvl w:ilvl="0">
+      <w:start w:val="1"/>
+      <w:numFmt w:val="decimal"/>
+      <w:lvlText w:val="%1."/>
+      <w:lvlJc w:val="left"/>
+      <w:pPr>
+        <w:ind w:left="360" w:hanging="360"/>
+      </w:pPr>
+      <w:rPr>
+        <w:rFonts w:hint="default"/>
+      </w:rPr>
+    </w:lvl>
+    <w:lvl w:ilvl="1">
+      <w:start w:val="1"/>
+      <w:numFmt w:val="decimal"/>
+      <w:lvlText w:val="2.%2."/>
+      <w:lvlJc w:val="left"/>
+      <w:pPr>
+        <w:ind w:left="792" w:hanging="432"/>
+      </w:pPr>
+      <w:rPr>
+        <w:rFonts w:hint="default"/>
+      </w:rPr>
+    </w:lvl>
+    <w:lvl w:ilvl="2">
+      <w:start w:val="1"/>
+      <w:numFmt w:val="decimal"/>
+      <w:lvlText w:val="%1.%2.%3."/>
+      <w:lvlJc w:val="left"/>
+      <w:pPr>
+        <w:ind w:left="1224" w:hanging="504"/>
+      </w:pPr>
+      <w:rPr>
+        <w:rFonts w:hint="default"/>
+      </w:rPr>
+    </w:lvl>
+    <w:lvl w:ilvl="3">
+      <w:start w:val="1"/>
+      <w:numFmt w:val="decimal"/>
+      <w:lvlText w:val="%1.%2.%3.%4."/>
+      <w:lvlJc w:val="left"/>
+      <w:pPr>
+        <w:ind w:left="1728" w:hanging="648"/>
+      </w:pPr>
+      <w:rPr>
+        <w:rFonts w:hint="default"/>
+      </w:rPr>
+    </w:lvl>
+    <w:lvl w:ilvl="4">
+      <w:start w:val="1"/>
+      <w:numFmt w:val="decimal"/>
+      <w:lvlText w:val="%1.%2.%3.%4.%5."/>
+      <w:lvlJc w:val="left"/>
+      <w:pPr>
+        <w:ind w:left="2232" w:hanging="792"/>
+      </w:pPr>
+      <w:rPr>
+        <w:rFonts w:hint="default"/>
+      </w:rPr>
+    </w:lvl>
+    <w:lvl w:ilvl="5">
+      <w:start w:val="1"/>
+      <w:numFmt w:val="decimal"/>
+      <w:lvlText w:val="%1.%2.%3.%4.%5.%6."/>
+      <w:lvlJc w:val="left"/>
+      <w:pPr>
+        <w:ind w:left="2736" w:hanging="936"/>
+      </w:pPr>
+      <w:rPr>
+        <w:rFonts w:hint="default"/>
+      </w:rPr>
+    </w:lvl>
+    <w:lvl w:ilvl="6">
+      <w:start w:val="1"/>
+      <w:numFmt w:val="decimal"/>
+      <w:lvlText w:val="%1.%2.%3.%4.%5.%6.%7."/>
+      <w:lvlJc w:val="left"/>
+      <w:pPr>
+        <w:ind w:left="3240" w:hanging="1080"/>
+      </w:pPr>
+      <w:rPr>
+        <w:rFonts w:hint="default"/>
+      </w:rPr>
+    </w:lvl>
+    <w:lvl w:ilvl="7">
+      <w:start w:val="1"/>
+      <w:numFmt w:val="decimal"/>
+      <w:lvlText w:val="%1.%2.%3.%4.%5.%6.%7.%8."/>
+      <w:lvlJc w:val="left"/>
+      <w:pPr>
+        <w:ind w:left="3744" w:hanging="1224"/>
+      </w:pPr>
+      <w:rPr>
+        <w:rFonts w:hint="default"/>
+      </w:rPr>
+    </w:lvl>
+    <w:lvl w:ilvl="8">
+      <w:start w:val="1"/>
+      <w:numFmt w:val="decimal"/>
+      <w:lvlText w:val="%1.%2.%3.%4.%5.%6.%7.%8.%9."/>
+      <w:lvlJc w:val="left"/>
+      <w:pPr>
+        <w:ind w:left="4320" w:hanging="1440"/>
+      </w:pPr>
+      <w:rPr>
+        <w:rFonts w:hint="default"/>
+      </w:rPr>
+    </w:lvl>
+  </w:abstractNum>
+  <w:abstractNum w:abstractNumId="5" w15:restartNumberingAfterBreak="0">
     <w:nsid w:val="35EE2711"/>
-    <w:multiLevelType w:val="hybridMultilevel"/>
-    <w:tmpl w:val="F552E2E8"/>
-    <w:lvl w:ilvl="0" w:tplc="22EC23D4">
+    <w:multiLevelType w:val="multilevel"/>
+    <w:tmpl w:val="4AE46FAC"/>
+    <w:lvl w:ilvl="0">
       <w:start w:val="1"/>
       <w:numFmt w:val="decimal"/>
       <w:suff w:val="space"/>
       <w:lvlText w:val="%1."/>
       <w:lvlJc w:val="left"/>
       <w:pPr>
-        <w:ind w:left="720" w:hanging="360"/>
+        <w:ind w:left="360" w:hanging="360"/>
       </w:pPr>
       <w:rPr>
         <w:rFonts w:hint="default"/>
       </w:rPr>
     </w:lvl>
-    <w:lvl w:ilvl="1" w:tplc="04070019" w:tentative="1">
-      <w:start w:val="1"/>
-      <w:numFmt w:val="lowerLetter"/>
-      <w:lvlText w:val="%2."/>
-      <w:lvlJc w:val="left"/>
-      <w:pPr>
-        <w:ind w:left="1440" w:hanging="360"/>
-      </w:pPr>
-    </w:lvl>
-    <w:lvl w:ilvl="2" w:tplc="0407001B" w:tentative="1">
-      <w:start w:val="1"/>
-      <w:numFmt w:val="lowerRoman"/>
-      <w:lvlText w:val="%3."/>
-      <w:lvlJc w:val="right"/>
-      <w:pPr>
-        <w:ind w:left="2160" w:hanging="180"/>
-      </w:pPr>
-    </w:lvl>
-    <w:lvl w:ilvl="3" w:tplc="0407000F" w:tentative="1">
-      <w:start w:val="1"/>
-      <w:numFmt w:val="decimal"/>
-      <w:lvlText w:val="%4."/>
-      <w:lvlJc w:val="left"/>
-      <w:pPr>
-        <w:ind w:left="2880" w:hanging="360"/>
-      </w:pPr>
-    </w:lvl>
-    <w:lvl w:ilvl="4" w:tplc="04070019" w:tentative="1">
-      <w:start w:val="1"/>
-      <w:numFmt w:val="lowerLetter"/>
-      <w:lvlText w:val="%5."/>
-      <w:lvlJc w:val="left"/>
-      <w:pPr>
-        <w:ind w:left="3600" w:hanging="360"/>
-      </w:pPr>
-    </w:lvl>
-    <w:lvl w:ilvl="5" w:tplc="0407001B" w:tentative="1">
-      <w:start w:val="1"/>
-      <w:numFmt w:val="lowerRoman"/>
-      <w:lvlText w:val="%6."/>
-      <w:lvlJc w:val="right"/>
-      <w:pPr>
-        <w:ind w:left="4320" w:hanging="180"/>
-      </w:pPr>
-    </w:lvl>
-    <w:lvl w:ilvl="6" w:tplc="0407000F" w:tentative="1">
-      <w:start w:val="1"/>
-      <w:numFmt w:val="decimal"/>
-      <w:lvlText w:val="%7."/>
-      <w:lvlJc w:val="left"/>
-      <w:pPr>
-        <w:ind w:left="5040" w:hanging="360"/>
-      </w:pPr>
-    </w:lvl>
-    <w:lvl w:ilvl="7" w:tplc="04070019" w:tentative="1">
-      <w:start w:val="1"/>
-      <w:numFmt w:val="lowerLetter"/>
-      <w:lvlText w:val="%8."/>
-      <w:lvlJc w:val="left"/>
-      <w:pPr>
-        <w:ind w:left="5760" w:hanging="360"/>
-      </w:pPr>
-    </w:lvl>
-    <w:lvl w:ilvl="8" w:tplc="0407001B" w:tentative="1">
-      <w:start w:val="1"/>
-      <w:numFmt w:val="lowerRoman"/>
-      <w:lvlText w:val="%9."/>
-      <w:lvlJc w:val="right"/>
-      <w:pPr>
-        <w:ind w:left="6480" w:hanging="180"/>
-      </w:pPr>
+    <w:lvl w:ilvl="1">
+      <w:start w:val="1"/>
+      <w:numFmt w:val="decimal"/>
+      <w:suff w:val="space"/>
+      <w:lvlText w:val="%1.%2."/>
+      <w:lvlJc w:val="left"/>
+      <w:pPr>
+        <w:ind w:left="792" w:hanging="432"/>
+      </w:pPr>
+      <w:rPr>
+        <w:rFonts w:hint="default"/>
+      </w:rPr>
+    </w:lvl>
+    <w:lvl w:ilvl="2">
+      <w:start w:val="1"/>
+      <w:numFmt w:val="decimal"/>
+      <w:lvlText w:val="%1.%2.%3."/>
+      <w:lvlJc w:val="left"/>
+      <w:pPr>
+        <w:ind w:left="1224" w:hanging="504"/>
+      </w:pPr>
+      <w:rPr>
+        <w:rFonts w:hint="default"/>
+      </w:rPr>
+    </w:lvl>
+    <w:lvl w:ilvl="3">
+      <w:start w:val="1"/>
+      <w:numFmt w:val="decimal"/>
+      <w:lvlText w:val="%1.%2.%3.%4."/>
+      <w:lvlJc w:val="left"/>
+      <w:pPr>
+        <w:ind w:left="1728" w:hanging="648"/>
+      </w:pPr>
+      <w:rPr>
+        <w:rFonts w:hint="default"/>
+      </w:rPr>
+    </w:lvl>
+    <w:lvl w:ilvl="4">
+      <w:start w:val="1"/>
+      <w:numFmt w:val="decimal"/>
+      <w:lvlText w:val="%1.%2.%3.%4.%5."/>
+      <w:lvlJc w:val="left"/>
+      <w:pPr>
+        <w:ind w:left="2232" w:hanging="792"/>
+      </w:pPr>
+      <w:rPr>
+        <w:rFonts w:hint="default"/>
+      </w:rPr>
+    </w:lvl>
+    <w:lvl w:ilvl="5">
+      <w:start w:val="1"/>
+      <w:numFmt w:val="decimal"/>
+      <w:lvlText w:val="%1.%2.%3.%4.%5.%6."/>
+      <w:lvlJc w:val="left"/>
+      <w:pPr>
+        <w:ind w:left="2736" w:hanging="936"/>
+      </w:pPr>
+      <w:rPr>
+        <w:rFonts w:hint="default"/>
+      </w:rPr>
+    </w:lvl>
+    <w:lvl w:ilvl="6">
+      <w:start w:val="1"/>
+      <w:numFmt w:val="decimal"/>
+      <w:lvlText w:val="%1.%2.%3.%4.%5.%6.%7."/>
+      <w:lvlJc w:val="left"/>
+      <w:pPr>
+        <w:ind w:left="3240" w:hanging="1080"/>
+      </w:pPr>
+      <w:rPr>
+        <w:rFonts w:hint="default"/>
+      </w:rPr>
+    </w:lvl>
+    <w:lvl w:ilvl="7">
+      <w:start w:val="1"/>
+      <w:numFmt w:val="decimal"/>
+      <w:lvlText w:val="%1.%2.%3.%4.%5.%6.%7.%8."/>
+      <w:lvlJc w:val="left"/>
+      <w:pPr>
+        <w:ind w:left="3744" w:hanging="1224"/>
+      </w:pPr>
+      <w:rPr>
+        <w:rFonts w:hint="default"/>
+      </w:rPr>
+    </w:lvl>
+    <w:lvl w:ilvl="8">
+      <w:start w:val="1"/>
+      <w:numFmt w:val="decimal"/>
+      <w:lvlText w:val="%1.%2.%3.%4.%5.%6.%7.%8.%9."/>
+      <w:lvlJc w:val="left"/>
+      <w:pPr>
+        <w:ind w:left="4320" w:hanging="1440"/>
+      </w:pPr>
+      <w:rPr>
+        <w:rFonts w:hint="default"/>
+      </w:rPr>
     </w:lvl>
   </w:abstractNum>
-  <w:abstractNum w:abstractNumId="4" w15:restartNumberingAfterBreak="0">
+  <w:abstractNum w:abstractNumId="6" w15:restartNumberingAfterBreak="0">
     <w:nsid w:val="3F044D6D"/>
     <w:multiLevelType w:val="multilevel"/>
     <w:tmpl w:val="223C9C56"/>
@@ -1667,7 +2333,7 @@
       </w:rPr>
     </w:lvl>
   </w:abstractNum>
-  <w:abstractNum w:abstractNumId="5" w15:restartNumberingAfterBreak="0">
+  <w:abstractNum w:abstractNumId="7" w15:restartNumberingAfterBreak="0">
     <w:nsid w:val="41AD59D4"/>
     <w:multiLevelType w:val="multilevel"/>
     <w:tmpl w:val="CC42A2EC"/>
@@ -1816,7 +2482,7 @@
       </w:rPr>
     </w:lvl>
   </w:abstractNum>
-  <w:abstractNum w:abstractNumId="6" w15:restartNumberingAfterBreak="0">
+  <w:abstractNum w:abstractNumId="8" w15:restartNumberingAfterBreak="0">
     <w:nsid w:val="5384421A"/>
     <w:multiLevelType w:val="multilevel"/>
     <w:tmpl w:val="3A2E5610"/>
@@ -1929,7 +2595,156 @@
       </w:pPr>
     </w:lvl>
   </w:abstractNum>
-  <w:abstractNum w:abstractNumId="7" w15:restartNumberingAfterBreak="0">
+  <w:abstractNum w:abstractNumId="9" w15:restartNumberingAfterBreak="0">
+    <w:nsid w:val="60E923DA"/>
+    <w:multiLevelType w:val="multilevel"/>
+    <w:tmpl w:val="3392DAD8"/>
+    <w:lvl w:ilvl="0">
+      <w:start w:val="1"/>
+      <w:numFmt w:val="bullet"/>
+      <w:lvlText w:val=""/>
+      <w:lvlJc w:val="left"/>
+      <w:pPr>
+        <w:tabs>
+          <w:tab w:val="num" w:pos="720"/>
+        </w:tabs>
+        <w:ind w:left="720" w:hanging="360"/>
+      </w:pPr>
+      <w:rPr>
+        <w:rFonts w:ascii="Symbol" w:hAnsi="Symbol" w:hint="default"/>
+        <w:sz w:val="20"/>
+      </w:rPr>
+    </w:lvl>
+    <w:lvl w:ilvl="1" w:tentative="1">
+      <w:start w:val="1"/>
+      <w:numFmt w:val="bullet"/>
+      <w:lvlText w:val="o"/>
+      <w:lvlJc w:val="left"/>
+      <w:pPr>
+        <w:tabs>
+          <w:tab w:val="num" w:pos="1440"/>
+        </w:tabs>
+        <w:ind w:left="1440" w:hanging="360"/>
+      </w:pPr>
+      <w:rPr>
+        <w:rFonts w:ascii="Courier New" w:hAnsi="Courier New" w:hint="default"/>
+        <w:sz w:val="20"/>
+      </w:rPr>
+    </w:lvl>
+    <w:lvl w:ilvl="2" w:tentative="1">
+      <w:start w:val="1"/>
+      <w:numFmt w:val="bullet"/>
+      <w:lvlText w:val=""/>
+      <w:lvlJc w:val="left"/>
+      <w:pPr>
+        <w:tabs>
+          <w:tab w:val="num" w:pos="2160"/>
+        </w:tabs>
+        <w:ind w:left="2160" w:hanging="360"/>
+      </w:pPr>
+      <w:rPr>
+        <w:rFonts w:ascii="Wingdings" w:hAnsi="Wingdings" w:hint="default"/>
+        <w:sz w:val="20"/>
+      </w:rPr>
+    </w:lvl>
+    <w:lvl w:ilvl="3" w:tentative="1">
+      <w:start w:val="1"/>
+      <w:numFmt w:val="bullet"/>
+      <w:lvlText w:val=""/>
+      <w:lvlJc w:val="left"/>
+      <w:pPr>
+        <w:tabs>
+          <w:tab w:val="num" w:pos="2880"/>
+        </w:tabs>
+        <w:ind w:left="2880" w:hanging="360"/>
+      </w:pPr>
+      <w:rPr>
+        <w:rFonts w:ascii="Wingdings" w:hAnsi="Wingdings" w:hint="default"/>
+        <w:sz w:val="20"/>
+      </w:rPr>
+    </w:lvl>
+    <w:lvl w:ilvl="4" w:tentative="1">
+      <w:start w:val="1"/>
+      <w:numFmt w:val="bullet"/>
+      <w:lvlText w:val=""/>
+      <w:lvlJc w:val="left"/>
+      <w:pPr>
+        <w:tabs>
+          <w:tab w:val="num" w:pos="3600"/>
+        </w:tabs>
+        <w:ind w:left="3600" w:hanging="360"/>
+      </w:pPr>
+      <w:rPr>
+        <w:rFonts w:ascii="Wingdings" w:hAnsi="Wingdings" w:hint="default"/>
+        <w:sz w:val="20"/>
+      </w:rPr>
+    </w:lvl>
+    <w:lvl w:ilvl="5" w:tentative="1">
+      <w:start w:val="1"/>
+      <w:numFmt w:val="bullet"/>
+      <w:lvlText w:val=""/>
+      <w:lvlJc w:val="left"/>
+      <w:pPr>
+        <w:tabs>
+          <w:tab w:val="num" w:pos="4320"/>
+        </w:tabs>
+        <w:ind w:left="4320" w:hanging="360"/>
+      </w:pPr>
+      <w:rPr>
+        <w:rFonts w:ascii="Wingdings" w:hAnsi="Wingdings" w:hint="default"/>
+        <w:sz w:val="20"/>
+      </w:rPr>
+    </w:lvl>
+    <w:lvl w:ilvl="6" w:tentative="1">
+      <w:start w:val="1"/>
+      <w:numFmt w:val="bullet"/>
+      <w:lvlText w:val=""/>
+      <w:lvlJc w:val="left"/>
+      <w:pPr>
+        <w:tabs>
+          <w:tab w:val="num" w:pos="5040"/>
+        </w:tabs>
+        <w:ind w:left="5040" w:hanging="360"/>
+      </w:pPr>
+      <w:rPr>
+        <w:rFonts w:ascii="Wingdings" w:hAnsi="Wingdings" w:hint="default"/>
+        <w:sz w:val="20"/>
+      </w:rPr>
+    </w:lvl>
+    <w:lvl w:ilvl="7" w:tentative="1">
+      <w:start w:val="1"/>
+      <w:numFmt w:val="bullet"/>
+      <w:lvlText w:val=""/>
+      <w:lvlJc w:val="left"/>
+      <w:pPr>
+        <w:tabs>
+          <w:tab w:val="num" w:pos="5760"/>
+        </w:tabs>
+        <w:ind w:left="5760" w:hanging="360"/>
+      </w:pPr>
+      <w:rPr>
+        <w:rFonts w:ascii="Wingdings" w:hAnsi="Wingdings" w:hint="default"/>
+        <w:sz w:val="20"/>
+      </w:rPr>
+    </w:lvl>
+    <w:lvl w:ilvl="8" w:tentative="1">
+      <w:start w:val="1"/>
+      <w:numFmt w:val="bullet"/>
+      <w:lvlText w:val=""/>
+      <w:lvlJc w:val="left"/>
+      <w:pPr>
+        <w:tabs>
+          <w:tab w:val="num" w:pos="6480"/>
+        </w:tabs>
+        <w:ind w:left="6480" w:hanging="360"/>
+      </w:pPr>
+      <w:rPr>
+        <w:rFonts w:ascii="Wingdings" w:hAnsi="Wingdings" w:hint="default"/>
+        <w:sz w:val="20"/>
+      </w:rPr>
+    </w:lvl>
+  </w:abstractNum>
+  <w:abstractNum w:abstractNumId="10" w15:restartNumberingAfterBreak="0">
     <w:nsid w:val="7C2322EA"/>
     <w:multiLevelType w:val="multilevel"/>
     <w:tmpl w:val="5DF62C5A"/>
@@ -2079,28 +2894,37 @@
     </w:lvl>
   </w:abstractNum>
   <w:num w:numId="1" w16cid:durableId="1850869120">
-    <w:abstractNumId w:val="2"/>
+    <w:abstractNumId w:val="3"/>
   </w:num>
   <w:num w:numId="2" w16cid:durableId="2069105288">
-    <w:abstractNumId w:val="4"/>
+    <w:abstractNumId w:val="6"/>
   </w:num>
   <w:num w:numId="3" w16cid:durableId="989938476">
     <w:abstractNumId w:val="0"/>
   </w:num>
   <w:num w:numId="4" w16cid:durableId="1911189105">
+    <w:abstractNumId w:val="7"/>
+  </w:num>
+  <w:num w:numId="5" w16cid:durableId="968318571">
+    <w:abstractNumId w:val="2"/>
+  </w:num>
+  <w:num w:numId="6" w16cid:durableId="1973973578">
+    <w:abstractNumId w:val="10"/>
+  </w:num>
+  <w:num w:numId="7" w16cid:durableId="2082369485">
+    <w:abstractNumId w:val="8"/>
+  </w:num>
+  <w:num w:numId="8" w16cid:durableId="1071973697">
     <w:abstractNumId w:val="5"/>
   </w:num>
-  <w:num w:numId="5" w16cid:durableId="968318571">
+  <w:num w:numId="9" w16cid:durableId="1543639895">
+    <w:abstractNumId w:val="4"/>
+  </w:num>
+  <w:num w:numId="10" w16cid:durableId="322974967">
+    <w:abstractNumId w:val="9"/>
+  </w:num>
+  <w:num w:numId="11" w16cid:durableId="1242829558">
     <w:abstractNumId w:val="1"/>
-  </w:num>
-  <w:num w:numId="6" w16cid:durableId="1973973578">
-    <w:abstractNumId w:val="7"/>
-  </w:num>
-  <w:num w:numId="7" w16cid:durableId="2082369485">
-    <w:abstractNumId w:val="6"/>
-  </w:num>
-  <w:num w:numId="8" w16cid:durableId="1071973697">
-    <w:abstractNumId w:val="3"/>
   </w:num>
 </w:numbering>
 </file>
@@ -2709,7 +3533,6 @@
   <w:style w:type="character" w:default="1" w:styleId="DefaultParagraphFont">
     <w:name w:val="Default Paragraph Font"/>
     <w:uiPriority w:val="1"/>
-    <w:semiHidden/>
     <w:unhideWhenUsed/>
   </w:style>
   <w:style w:type="table" w:default="1" w:styleId="TableNormal">

</xml_diff>

<commit_message>
2026-06-28 15:49:31 - Proposal: Access control
</commit_message>
<xml_diff>
--- a/01_Proposal/Proposal.docx
+++ b/01_Proposal/Proposal.docx
@@ -5,923 +5,519 @@
     <w:p>
       <w:pPr>
         <w:pStyle w:val="Title"/>
-        <w:bidi/>
-        <w:rPr>
-          <w:rFonts w:cs="IRANSans"/>
-          <w:b/>
-          <w:bCs/>
-          <w:rtl/>
-          <w:lang w:bidi="fa-IR"/>
-        </w:rPr>
-      </w:pPr>
-      <w:r>
-        <w:rPr>
-          <w:rFonts w:cs="IRANSans"/>
-          <w:b/>
-          <w:bCs/>
-          <w:rtl/>
-          <w:lang w:bidi="fa-IR"/>
+        <w:rPr>
+          <w:rtl/>
+        </w:rPr>
+      </w:pPr>
+      <w:r>
+        <w:rPr>
+          <w:rtl/>
         </w:rPr>
         <w:t xml:space="preserve">پروژه کنترل تردد </w:t>
       </w:r>
       <w:r>
         <w:rPr>
-          <w:rFonts w:cs="IRANSans"/>
-          <w:b/>
-          <w:bCs/>
-          <w:rtl/>
-          <w:lang w:bidi="fa-IR"/>
+          <w:rtl/>
         </w:rPr>
         <w:t xml:space="preserve">جامع </w:t>
       </w:r>
       <w:r>
         <w:rPr>
-          <w:rFonts w:cs="IRANSans"/>
-          <w:b/>
-          <w:bCs/>
-          <w:rtl/>
-          <w:lang w:bidi="fa-IR"/>
+          <w:rtl/>
         </w:rPr>
         <w:t>مدرسه</w:t>
       </w:r>
     </w:p>
     <w:p>
       <w:pPr>
-        <w:bidi/>
-        <w:rPr>
-          <w:rFonts w:ascii="IRANSans" w:hAnsi="IRANSans" w:cs="IRANSans"/>
-          <w:rtl/>
-          <w:lang w:bidi="fa-IR"/>
-        </w:rPr>
-      </w:pPr>
-    </w:p>
-    <w:p>
-      <w:pPr>
-        <w:bidi/>
-        <w:rPr>
-          <w:rFonts w:ascii="IRANSans" w:hAnsi="IRANSans" w:cs="IRANSans"/>
-          <w:rtl/>
-          <w:lang w:val="en-US" w:bidi="fa-IR"/>
-        </w:rPr>
-      </w:pPr>
-      <w:r>
-        <w:rPr>
-          <w:rFonts w:ascii="IRANSans" w:hAnsi="IRANSans" w:cs="IRANSans"/>
-          <w:rtl/>
-          <w:lang w:bidi="fa-IR"/>
+        <w:rPr>
+          <w:rtl/>
+        </w:rPr>
+      </w:pPr>
+    </w:p>
+    <w:p>
+      <w:pPr>
+        <w:rPr>
+          <w:rtl/>
+          <w:lang w:val="en-US"/>
+        </w:rPr>
+      </w:pPr>
+      <w:r>
+        <w:rPr>
+          <w:rtl/>
         </w:rPr>
         <w:t>شماره ویرایش</w:t>
       </w:r>
       <w:r>
         <w:rPr>
-          <w:rFonts w:ascii="IRANSans" w:hAnsi="IRANSans" w:cs="IRANSans"/>
-          <w:lang w:val="en-US" w:bidi="fa-IR"/>
+          <w:lang w:val="en-US"/>
         </w:rPr>
         <w:t xml:space="preserve">: </w:t>
       </w:r>
       <w:r>
         <w:rPr>
-          <w:rFonts w:ascii="IRANSans" w:hAnsi="IRANSans" w:cs="IRANSans"/>
-          <w:rtl/>
-          <w:lang w:val="en-US" w:bidi="fa-IR"/>
+          <w:rtl/>
+          <w:lang w:val="en-US"/>
         </w:rPr>
         <w:t xml:space="preserve"> 20260628-01</w:t>
       </w:r>
     </w:p>
     <w:p>
       <w:pPr>
-        <w:bidi/>
-        <w:rPr>
-          <w:rFonts w:ascii="IRANSans" w:hAnsi="IRANSans" w:cs="IRANSans"/>
-          <w:rtl/>
-          <w:lang w:val="en-US" w:bidi="fa-IR"/>
+        <w:rPr>
+          <w:rtl/>
+          <w:lang w:val="en-US"/>
         </w:rPr>
       </w:pPr>
     </w:p>
     <w:p>
       <w:pPr>
         <w:pStyle w:val="Heading1"/>
-        <w:numPr>
-          <w:ilvl w:val="0"/>
-          <w:numId w:val="8"/>
-        </w:numPr>
-        <w:rPr>
-          <w:rFonts w:cs="IRANSans"/>
-          <w:rtl/>
-        </w:rPr>
-      </w:pPr>
-      <w:r>
-        <w:rPr>
-          <w:rFonts w:cs="IRANSans"/>
+        <w:rPr>
+          <w:rtl/>
+        </w:rPr>
+      </w:pPr>
+      <w:r>
+        <w:rPr>
           <w:rtl/>
         </w:rPr>
         <w:t>مقدمه</w:t>
       </w:r>
     </w:p>
     <w:p>
-      <w:pPr>
-        <w:bidi/>
-        <w:jc w:val="both"/>
-        <w:rPr>
-          <w:rFonts w:ascii="IRANSans" w:hAnsi="IRANSans" w:cs="IRANSans"/>
-          <w:lang w:bidi="fa-IR"/>
-        </w:rPr>
-      </w:pPr>
-      <w:r>
-        <w:rPr>
-          <w:rFonts w:ascii="IRANSans" w:hAnsi="IRANSans" w:cs="IRANSans"/>
-          <w:rtl/>
-          <w:lang w:bidi="fa-IR"/>
-        </w:rPr>
-        <w:t xml:space="preserve">این سند با هدف ارائه نسخه اولیه پیشنهاد </w:t>
+      <w:r>
+        <w:rPr>
+          <w:rtl/>
+        </w:rPr>
+        <w:t>این سند با هدف ارائه نسخه اولیه پیشنهاد راهکار یکپارچه کنترل تردد، امنیت فیزیکی، مدیریت مراجعین و مدیریت پارکینگ برای یک مجموعه آموزشی تهیه شده است</w:t>
+      </w:r>
+      <w:r>
+        <w:t>.</w:t>
+      </w:r>
+    </w:p>
+    <w:p>
+      <w:r>
+        <w:rPr>
+          <w:rtl/>
+        </w:rPr>
+        <w:t xml:space="preserve">در این مرحله، تمرکز پیشنهاد بر معرفی قابلیت‌ها، </w:t>
       </w:r>
       <w:proofErr w:type="spellStart"/>
       <w:r>
         <w:rPr>
-          <w:rFonts w:ascii="IRANSans" w:hAnsi="IRANSans" w:cs="IRANSans"/>
-          <w:rtl/>
-          <w:lang w:bidi="fa-IR"/>
-        </w:rPr>
-        <w:t>راهکار</w:t>
+          <w:rtl/>
+        </w:rPr>
+        <w:t>سناریوهای</w:t>
       </w:r>
       <w:proofErr w:type="spellEnd"/>
       <w:r>
         <w:rPr>
-          <w:rFonts w:ascii="IRANSans" w:hAnsi="IRANSans" w:cs="IRANSans"/>
-          <w:rtl/>
-          <w:lang w:bidi="fa-IR"/>
-        </w:rPr>
-        <w:t xml:space="preserve"> یکپارچه کنترل تردد، امنیت فیزیکی، مدیریت مراجعین و مدیریت پارکینگ برای یک مجموعه آموزشی تهیه شده است</w:t>
-      </w:r>
-      <w:r>
-        <w:rPr>
-          <w:rFonts w:ascii="IRANSans" w:hAnsi="IRANSans" w:cs="IRANSans"/>
-          <w:lang w:bidi="fa-IR"/>
-        </w:rPr>
+          <w:rtl/>
+        </w:rPr>
+        <w:t xml:space="preserve"> قابل </w:t>
+      </w:r>
+      <w:proofErr w:type="spellStart"/>
+      <w:r>
+        <w:rPr>
+          <w:rtl/>
+        </w:rPr>
+        <w:t>پیاده‌سازی</w:t>
+      </w:r>
+      <w:proofErr w:type="spellEnd"/>
+      <w:r>
+        <w:rPr>
+          <w:rtl/>
+        </w:rPr>
+        <w:t xml:space="preserve"> و </w:t>
+      </w:r>
+      <w:proofErr w:type="spellStart"/>
+      <w:r>
+        <w:rPr>
+          <w:rtl/>
+        </w:rPr>
+        <w:t>گزینه‌های</w:t>
+      </w:r>
+      <w:proofErr w:type="spellEnd"/>
+      <w:r>
+        <w:rPr>
+          <w:rtl/>
+        </w:rPr>
+        <w:t xml:space="preserve"> مختلف راهکار است. بنابراین این سند شامل قیمت، تعداد قطعی تجهیزات، مدل نهایی </w:t>
+      </w:r>
+      <w:proofErr w:type="spellStart"/>
+      <w:r>
+        <w:rPr>
+          <w:rtl/>
+        </w:rPr>
+        <w:t>سخت‌افزارها</w:t>
+      </w:r>
+      <w:proofErr w:type="spellEnd"/>
+      <w:r>
+        <w:rPr>
+          <w:rtl/>
+        </w:rPr>
+        <w:t xml:space="preserve"> یا</w:t>
+      </w:r>
+      <w:r>
+        <w:t xml:space="preserve"> BOQ </w:t>
+      </w:r>
+      <w:r>
+        <w:rPr>
+          <w:rtl/>
+        </w:rPr>
+        <w:t xml:space="preserve">نهایی نیست. هدف اصلی این نسخه، ایجاد یک دید مشترک میان کارفرما و </w:t>
+      </w:r>
+      <w:proofErr w:type="spellStart"/>
+      <w:r>
+        <w:rPr>
+          <w:rtl/>
+        </w:rPr>
+        <w:t>ارائه‌دهنده</w:t>
+      </w:r>
+      <w:proofErr w:type="spellEnd"/>
+      <w:r>
+        <w:rPr>
+          <w:rtl/>
+        </w:rPr>
+        <w:t xml:space="preserve"> راهکار درباره نیازهای مدرسه، امکانات قابل ارائه و مسیر پیشنهادی برای طراحی نهایی پروژه است</w:t>
+      </w:r>
+      <w:r>
         <w:t>.</w:t>
       </w:r>
     </w:p>
     <w:p>
-      <w:pPr>
-        <w:bidi/>
-        <w:jc w:val="both"/>
-        <w:rPr>
-          <w:rFonts w:ascii="IRANSans" w:hAnsi="IRANSans" w:cs="IRANSans"/>
-          <w:lang w:bidi="fa-IR"/>
-        </w:rPr>
-      </w:pPr>
-      <w:r>
-        <w:rPr>
-          <w:rFonts w:ascii="IRANSans" w:hAnsi="IRANSans" w:cs="IRANSans"/>
-          <w:rtl/>
-          <w:lang w:bidi="fa-IR"/>
-        </w:rPr>
-        <w:t xml:space="preserve">در این مرحله، تمرکز پیشنهاد بر معرفی </w:t>
+      <w:r>
+        <w:rPr>
+          <w:rtl/>
+        </w:rPr>
+        <w:t xml:space="preserve">راهکار پیشنهادی برای محیط آموزشی، بر اساس نقش‌ها و </w:t>
       </w:r>
       <w:proofErr w:type="spellStart"/>
       <w:r>
         <w:rPr>
-          <w:rFonts w:ascii="IRANSans" w:hAnsi="IRANSans" w:cs="IRANSans"/>
-          <w:rtl/>
-          <w:lang w:bidi="fa-IR"/>
-        </w:rPr>
-        <w:t>قابلیت‌ها</w:t>
+          <w:rtl/>
+        </w:rPr>
+        <w:t>جریان‌های</w:t>
       </w:r>
       <w:proofErr w:type="spellEnd"/>
       <w:r>
         <w:rPr>
-          <w:rFonts w:ascii="IRANSans" w:hAnsi="IRANSans" w:cs="IRANSans"/>
-          <w:rtl/>
-          <w:lang w:bidi="fa-IR"/>
+          <w:rtl/>
+        </w:rPr>
+        <w:t xml:space="preserve"> واقعی مدرسه طراحی </w:t>
+      </w:r>
+      <w:proofErr w:type="spellStart"/>
+      <w:r>
+        <w:rPr>
+          <w:rtl/>
+        </w:rPr>
+        <w:t>می‌شود</w:t>
+      </w:r>
+      <w:proofErr w:type="spellEnd"/>
+      <w:r>
+        <w:rPr>
+          <w:rtl/>
+        </w:rPr>
+        <w:t xml:space="preserve">؛ از جمله </w:t>
+      </w:r>
+      <w:proofErr w:type="spellStart"/>
+      <w:r>
+        <w:rPr>
+          <w:rtl/>
+        </w:rPr>
+        <w:t>دانش‌آموزان</w:t>
+      </w:r>
+      <w:proofErr w:type="spellEnd"/>
+      <w:r>
+        <w:rPr>
+          <w:rtl/>
+        </w:rPr>
+        <w:t xml:space="preserve">، معلمان، کارکنان، والدین، مهمانان، </w:t>
+      </w:r>
+      <w:proofErr w:type="spellStart"/>
+      <w:r>
+        <w:rPr>
+          <w:rtl/>
+        </w:rPr>
+        <w:t>پیمانکاران</w:t>
+      </w:r>
+      <w:proofErr w:type="spellEnd"/>
+      <w:r>
+        <w:rPr>
+          <w:rtl/>
+        </w:rPr>
+        <w:t xml:space="preserve">، خودروها، </w:t>
+      </w:r>
+      <w:proofErr w:type="spellStart"/>
+      <w:r>
+        <w:rPr>
+          <w:rtl/>
+        </w:rPr>
+        <w:t>کلاس‌های</w:t>
+      </w:r>
+      <w:proofErr w:type="spellEnd"/>
+      <w:r>
+        <w:rPr>
+          <w:rtl/>
+        </w:rPr>
+        <w:t xml:space="preserve"> درس، </w:t>
+      </w:r>
+      <w:proofErr w:type="spellStart"/>
+      <w:r>
+        <w:rPr>
+          <w:rtl/>
+        </w:rPr>
+        <w:t>آزمایشگاه‌ها</w:t>
+      </w:r>
+      <w:proofErr w:type="spellEnd"/>
+      <w:r>
+        <w:rPr>
+          <w:rtl/>
         </w:rPr>
         <w:t xml:space="preserve">، </w:t>
       </w:r>
       <w:proofErr w:type="spellStart"/>
       <w:r>
         <w:rPr>
-          <w:rFonts w:ascii="IRANSans" w:hAnsi="IRANSans" w:cs="IRANSans"/>
-          <w:rtl/>
-          <w:lang w:bidi="fa-IR"/>
-        </w:rPr>
-        <w:t>سناریوهای</w:t>
+          <w:rtl/>
+        </w:rPr>
+        <w:t>ورودی‌ها</w:t>
       </w:r>
       <w:proofErr w:type="spellEnd"/>
       <w:r>
         <w:rPr>
-          <w:rFonts w:ascii="IRANSans" w:hAnsi="IRANSans" w:cs="IRANSans"/>
-          <w:rtl/>
-          <w:lang w:bidi="fa-IR"/>
-        </w:rPr>
-        <w:t xml:space="preserve"> قابل </w:t>
+          <w:rtl/>
+        </w:rPr>
+        <w:t>، پارکینگ و شرایط اضطراری</w:t>
+      </w:r>
+      <w:r>
+        <w:t>.</w:t>
+      </w:r>
+    </w:p>
+    <w:p>
+      <w:pPr>
+        <w:rPr>
+          <w:rtl/>
+        </w:rPr>
+      </w:pPr>
+      <w:r>
+        <w:rPr>
+          <w:rtl/>
+        </w:rPr>
+        <w:t xml:space="preserve">پس از بررسی این نسخه و دریافت بازخورد کارفرما، محدوده دقیق پروژه، </w:t>
       </w:r>
       <w:proofErr w:type="spellStart"/>
       <w:r>
         <w:rPr>
-          <w:rFonts w:ascii="IRANSans" w:hAnsi="IRANSans" w:cs="IRANSans"/>
-          <w:rtl/>
-          <w:lang w:bidi="fa-IR"/>
-        </w:rPr>
-        <w:t>پیاده‌سازی</w:t>
+          <w:rtl/>
+        </w:rPr>
+        <w:t>اولویت‌ها</w:t>
       </w:r>
       <w:proofErr w:type="spellEnd"/>
       <w:r>
         <w:rPr>
-          <w:rFonts w:ascii="IRANSans" w:hAnsi="IRANSans" w:cs="IRANSans"/>
-          <w:rtl/>
-          <w:lang w:bidi="fa-IR"/>
-        </w:rPr>
-        <w:t xml:space="preserve"> و </w:t>
+          <w:rtl/>
+        </w:rPr>
+        <w:t xml:space="preserve">، </w:t>
       </w:r>
       <w:proofErr w:type="spellStart"/>
       <w:r>
         <w:rPr>
-          <w:rFonts w:ascii="IRANSans" w:hAnsi="IRANSans" w:cs="IRANSans"/>
-          <w:rtl/>
-          <w:lang w:bidi="fa-IR"/>
+          <w:rtl/>
         </w:rPr>
         <w:t>گزینه‌های</w:t>
       </w:r>
       <w:proofErr w:type="spellEnd"/>
       <w:r>
         <w:rPr>
-          <w:rFonts w:ascii="IRANSans" w:hAnsi="IRANSans" w:cs="IRANSans"/>
-          <w:rtl/>
-          <w:lang w:bidi="fa-IR"/>
-        </w:rPr>
-        <w:t xml:space="preserve"> مختلف </w:t>
+          <w:rtl/>
+        </w:rPr>
+        <w:t xml:space="preserve"> انتخابی، تعداد تجهیزات، معماری نهایی و پیشنهاد مالی در نسخه بعدی </w:t>
       </w:r>
       <w:proofErr w:type="spellStart"/>
       <w:r>
         <w:rPr>
-          <w:rFonts w:ascii="IRANSans" w:hAnsi="IRANSans" w:cs="IRANSans"/>
-          <w:rtl/>
-          <w:lang w:bidi="fa-IR"/>
-        </w:rPr>
-        <w:t>راهکار</w:t>
+          <w:rtl/>
+        </w:rPr>
+        <w:t>پروپوزال</w:t>
       </w:r>
       <w:proofErr w:type="spellEnd"/>
       <w:r>
         <w:rPr>
-          <w:rFonts w:ascii="IRANSans" w:hAnsi="IRANSans" w:cs="IRANSans"/>
-          <w:rtl/>
-          <w:lang w:bidi="fa-IR"/>
-        </w:rPr>
-        <w:t xml:space="preserve"> است. بنابراین این سند شامل قیمت، تعداد قطعی تجهیزات، مدل نهایی </w:t>
+          <w:rtl/>
+        </w:rPr>
+        <w:t xml:space="preserve"> تکمیل خواهد شد</w:t>
+      </w:r>
+      <w:r>
+        <w:t>.</w:t>
+      </w:r>
+    </w:p>
+    <w:p>
+      <w:r>
+        <w:rPr>
+          <w:rtl/>
+        </w:rPr>
+        <w:t>این سند توسط</w:t>
+      </w:r>
+      <w:r>
+        <w:t xml:space="preserve"> HLWL </w:t>
+      </w:r>
+      <w:r>
+        <w:rPr>
+          <w:rtl/>
+        </w:rPr>
+        <w:t>به عنوان نماینده خاورمیانه راهکار</w:t>
+      </w:r>
+      <w:r>
+        <w:t xml:space="preserve"> </w:t>
       </w:r>
       <w:proofErr w:type="spellStart"/>
       <w:r>
-        <w:rPr>
-          <w:rFonts w:ascii="IRANSans" w:hAnsi="IRANSans" w:cs="IRANSans"/>
-          <w:rtl/>
-          <w:lang w:bidi="fa-IR"/>
-        </w:rPr>
-        <w:t>سخت‌افزارها</w:t>
+        <w:t>Syncolony</w:t>
       </w:r>
       <w:proofErr w:type="spellEnd"/>
       <w:r>
-        <w:rPr>
-          <w:rFonts w:ascii="IRANSans" w:hAnsi="IRANSans" w:cs="IRANSans"/>
-          <w:rtl/>
-          <w:lang w:bidi="fa-IR"/>
-        </w:rPr>
-        <w:t xml:space="preserve"> یا</w:t>
-      </w:r>
-      <w:r>
-        <w:rPr>
-          <w:rFonts w:ascii="IRANSans" w:hAnsi="IRANSans" w:cs="IRANSans"/>
-          <w:lang w:bidi="fa-IR"/>
-        </w:rPr>
-        <w:t xml:space="preserve"> BOQ </w:t>
-      </w:r>
-      <w:r>
-        <w:rPr>
-          <w:rFonts w:ascii="IRANSans" w:hAnsi="IRANSans" w:cs="IRANSans"/>
-          <w:rtl/>
-          <w:lang w:bidi="fa-IR"/>
-        </w:rPr>
-        <w:t xml:space="preserve">نهایی نیست. هدف اصلی این نسخه، ایجاد یک دید مشترک میان کارفرما و </w:t>
-      </w:r>
-      <w:proofErr w:type="spellStart"/>
-      <w:r>
-        <w:rPr>
-          <w:rFonts w:ascii="IRANSans" w:hAnsi="IRANSans" w:cs="IRANSans"/>
-          <w:rtl/>
-          <w:lang w:bidi="fa-IR"/>
-        </w:rPr>
-        <w:t>ارائه‌دهنده</w:t>
-      </w:r>
-      <w:proofErr w:type="spellEnd"/>
-      <w:r>
-        <w:rPr>
-          <w:rFonts w:ascii="IRANSans" w:hAnsi="IRANSans" w:cs="IRANSans"/>
-          <w:rtl/>
-          <w:lang w:bidi="fa-IR"/>
-        </w:rPr>
         <w:t xml:space="preserve"> </w:t>
       </w:r>
-      <w:proofErr w:type="spellStart"/>
-      <w:r>
-        <w:rPr>
-          <w:rFonts w:ascii="IRANSans" w:hAnsi="IRANSans" w:cs="IRANSans"/>
-          <w:rtl/>
-          <w:lang w:bidi="fa-IR"/>
-        </w:rPr>
-        <w:t>راهکار</w:t>
-      </w:r>
-      <w:proofErr w:type="spellEnd"/>
-      <w:r>
-        <w:rPr>
-          <w:rFonts w:ascii="IRANSans" w:hAnsi="IRANSans" w:cs="IRANSans"/>
-          <w:rtl/>
-          <w:lang w:bidi="fa-IR"/>
-        </w:rPr>
-        <w:t xml:space="preserve"> درباره نیازهای مدرسه، امکانات قابل ارائه و مسیر پیشنهادی برای طراحی نهایی پروژه است</w:t>
-      </w:r>
-      <w:r>
-        <w:rPr>
-          <w:rFonts w:ascii="IRANSans" w:hAnsi="IRANSans" w:cs="IRANSans"/>
-          <w:lang w:bidi="fa-IR"/>
-        </w:rPr>
+      <w:r>
+        <w:rPr>
+          <w:rtl/>
+        </w:rPr>
+        <w:t>تهیه شده است</w:t>
+      </w:r>
+      <w:r>
         <w:t>.</w:t>
       </w:r>
     </w:p>
     <w:p>
       <w:pPr>
-        <w:bidi/>
-        <w:jc w:val="both"/>
-        <w:rPr>
-          <w:rFonts w:ascii="IRANSans" w:hAnsi="IRANSans" w:cs="IRANSans"/>
-          <w:lang w:bidi="fa-IR"/>
-        </w:rPr>
-      </w:pPr>
-      <w:proofErr w:type="spellStart"/>
-      <w:r>
-        <w:rPr>
-          <w:rFonts w:ascii="IRANSans" w:hAnsi="IRANSans" w:cs="IRANSans"/>
-          <w:rtl/>
-          <w:lang w:bidi="fa-IR"/>
-        </w:rPr>
-        <w:t>راهکار</w:t>
-      </w:r>
-      <w:proofErr w:type="spellEnd"/>
-      <w:r>
-        <w:rPr>
-          <w:rFonts w:ascii="IRANSans" w:hAnsi="IRANSans" w:cs="IRANSans"/>
-          <w:rtl/>
-          <w:lang w:bidi="fa-IR"/>
-        </w:rPr>
-        <w:t xml:space="preserve"> پیشنهادی برای محیط آموزشی، بر اساس </w:t>
-      </w:r>
-      <w:proofErr w:type="spellStart"/>
-      <w:r>
-        <w:rPr>
-          <w:rFonts w:ascii="IRANSans" w:hAnsi="IRANSans" w:cs="IRANSans"/>
-          <w:rtl/>
-          <w:lang w:bidi="fa-IR"/>
-        </w:rPr>
-        <w:t>نقش‌ها</w:t>
-      </w:r>
-      <w:proofErr w:type="spellEnd"/>
-      <w:r>
-        <w:rPr>
-          <w:rFonts w:ascii="IRANSans" w:hAnsi="IRANSans" w:cs="IRANSans"/>
-          <w:rtl/>
-          <w:lang w:bidi="fa-IR"/>
-        </w:rPr>
-        <w:t xml:space="preserve"> و </w:t>
-      </w:r>
-      <w:proofErr w:type="spellStart"/>
-      <w:r>
-        <w:rPr>
-          <w:rFonts w:ascii="IRANSans" w:hAnsi="IRANSans" w:cs="IRANSans"/>
-          <w:rtl/>
-          <w:lang w:bidi="fa-IR"/>
-        </w:rPr>
-        <w:t>جریان‌های</w:t>
-      </w:r>
-      <w:proofErr w:type="spellEnd"/>
-      <w:r>
-        <w:rPr>
-          <w:rFonts w:ascii="IRANSans" w:hAnsi="IRANSans" w:cs="IRANSans"/>
-          <w:rtl/>
-          <w:lang w:bidi="fa-IR"/>
-        </w:rPr>
-        <w:t xml:space="preserve"> واقعی مدرسه طراحی </w:t>
-      </w:r>
-      <w:proofErr w:type="spellStart"/>
-      <w:r>
-        <w:rPr>
-          <w:rFonts w:ascii="IRANSans" w:hAnsi="IRANSans" w:cs="IRANSans"/>
-          <w:rtl/>
-          <w:lang w:bidi="fa-IR"/>
-        </w:rPr>
-        <w:t>می‌شود</w:t>
-      </w:r>
-      <w:proofErr w:type="spellEnd"/>
-      <w:r>
-        <w:rPr>
-          <w:rFonts w:ascii="IRANSans" w:hAnsi="IRANSans" w:cs="IRANSans"/>
-          <w:rtl/>
-          <w:lang w:bidi="fa-IR"/>
-        </w:rPr>
-        <w:t xml:space="preserve">؛ از جمله </w:t>
-      </w:r>
-      <w:proofErr w:type="spellStart"/>
-      <w:r>
-        <w:rPr>
-          <w:rFonts w:ascii="IRANSans" w:hAnsi="IRANSans" w:cs="IRANSans"/>
-          <w:rtl/>
-          <w:lang w:bidi="fa-IR"/>
-        </w:rPr>
-        <w:t>دانش‌آموزان</w:t>
-      </w:r>
-      <w:proofErr w:type="spellEnd"/>
-      <w:r>
-        <w:rPr>
-          <w:rFonts w:ascii="IRANSans" w:hAnsi="IRANSans" w:cs="IRANSans"/>
-          <w:rtl/>
-          <w:lang w:bidi="fa-IR"/>
-        </w:rPr>
-        <w:t xml:space="preserve">، معلمان، کارکنان، والدین، مهمانان، </w:t>
-      </w:r>
-      <w:proofErr w:type="spellStart"/>
-      <w:r>
-        <w:rPr>
-          <w:rFonts w:ascii="IRANSans" w:hAnsi="IRANSans" w:cs="IRANSans"/>
-          <w:rtl/>
-          <w:lang w:bidi="fa-IR"/>
-        </w:rPr>
-        <w:t>پیمانکاران</w:t>
-      </w:r>
-      <w:proofErr w:type="spellEnd"/>
-      <w:r>
-        <w:rPr>
-          <w:rFonts w:ascii="IRANSans" w:hAnsi="IRANSans" w:cs="IRANSans"/>
-          <w:rtl/>
-          <w:lang w:bidi="fa-IR"/>
-        </w:rPr>
-        <w:t xml:space="preserve">، خودروها، </w:t>
-      </w:r>
-      <w:proofErr w:type="spellStart"/>
-      <w:r>
-        <w:rPr>
-          <w:rFonts w:ascii="IRANSans" w:hAnsi="IRANSans" w:cs="IRANSans"/>
-          <w:rtl/>
-          <w:lang w:bidi="fa-IR"/>
-        </w:rPr>
-        <w:t>کلاس‌های</w:t>
-      </w:r>
-      <w:proofErr w:type="spellEnd"/>
-      <w:r>
-        <w:rPr>
-          <w:rFonts w:ascii="IRANSans" w:hAnsi="IRANSans" w:cs="IRANSans"/>
-          <w:rtl/>
-          <w:lang w:bidi="fa-IR"/>
-        </w:rPr>
-        <w:t xml:space="preserve"> درس، </w:t>
-      </w:r>
-      <w:proofErr w:type="spellStart"/>
-      <w:r>
-        <w:rPr>
-          <w:rFonts w:ascii="IRANSans" w:hAnsi="IRANSans" w:cs="IRANSans"/>
-          <w:rtl/>
-          <w:lang w:bidi="fa-IR"/>
-        </w:rPr>
-        <w:t>آزمایشگاه‌ها</w:t>
-      </w:r>
-      <w:proofErr w:type="spellEnd"/>
-      <w:r>
-        <w:rPr>
-          <w:rFonts w:ascii="IRANSans" w:hAnsi="IRANSans" w:cs="IRANSans"/>
-          <w:rtl/>
-          <w:lang w:bidi="fa-IR"/>
-        </w:rPr>
-        <w:t xml:space="preserve">، </w:t>
-      </w:r>
-      <w:proofErr w:type="spellStart"/>
-      <w:r>
-        <w:rPr>
-          <w:rFonts w:ascii="IRANSans" w:hAnsi="IRANSans" w:cs="IRANSans"/>
-          <w:rtl/>
-          <w:lang w:bidi="fa-IR"/>
-        </w:rPr>
-        <w:t>ورودی‌ها</w:t>
-      </w:r>
-      <w:proofErr w:type="spellEnd"/>
-      <w:r>
-        <w:rPr>
-          <w:rFonts w:ascii="IRANSans" w:hAnsi="IRANSans" w:cs="IRANSans"/>
-          <w:rtl/>
-          <w:lang w:bidi="fa-IR"/>
-        </w:rPr>
-        <w:t>، پارکینگ و شرایط اضطراری</w:t>
-      </w:r>
-      <w:r>
-        <w:rPr>
-          <w:rFonts w:ascii="IRANSans" w:hAnsi="IRANSans" w:cs="IRANSans"/>
-          <w:lang w:bidi="fa-IR"/>
-        </w:rPr>
-        <w:t>.</w:t>
-      </w:r>
-    </w:p>
-    <w:p>
-      <w:pPr>
-        <w:bidi/>
-        <w:jc w:val="both"/>
-        <w:rPr>
-          <w:rFonts w:ascii="IRANSans" w:hAnsi="IRANSans" w:cs="IRANSans"/>
-          <w:rtl/>
-          <w:lang w:bidi="fa-IR"/>
-        </w:rPr>
-      </w:pPr>
-      <w:r>
-        <w:rPr>
-          <w:rFonts w:ascii="IRANSans" w:hAnsi="IRANSans" w:cs="IRANSans"/>
-          <w:rtl/>
-          <w:lang w:bidi="fa-IR"/>
-        </w:rPr>
-        <w:t xml:space="preserve">پس از بررسی این نسخه و دریافت بازخورد کارفرما، محدوده دقیق پروژه، </w:t>
-      </w:r>
-      <w:proofErr w:type="spellStart"/>
-      <w:r>
-        <w:rPr>
-          <w:rFonts w:ascii="IRANSans" w:hAnsi="IRANSans" w:cs="IRANSans"/>
-          <w:rtl/>
-          <w:lang w:bidi="fa-IR"/>
-        </w:rPr>
-        <w:t>اولویت‌ها</w:t>
-      </w:r>
-      <w:proofErr w:type="spellEnd"/>
-      <w:r>
-        <w:rPr>
-          <w:rFonts w:ascii="IRANSans" w:hAnsi="IRANSans" w:cs="IRANSans"/>
-          <w:rtl/>
-          <w:lang w:bidi="fa-IR"/>
-        </w:rPr>
-        <w:t xml:space="preserve">، </w:t>
-      </w:r>
-      <w:proofErr w:type="spellStart"/>
-      <w:r>
-        <w:rPr>
-          <w:rFonts w:ascii="IRANSans" w:hAnsi="IRANSans" w:cs="IRANSans"/>
-          <w:rtl/>
-          <w:lang w:bidi="fa-IR"/>
-        </w:rPr>
-        <w:t>گزینه‌های</w:t>
-      </w:r>
-      <w:proofErr w:type="spellEnd"/>
-      <w:r>
-        <w:rPr>
-          <w:rFonts w:ascii="IRANSans" w:hAnsi="IRANSans" w:cs="IRANSans"/>
-          <w:rtl/>
-          <w:lang w:bidi="fa-IR"/>
-        </w:rPr>
-        <w:t xml:space="preserve"> انتخابی، تعداد تجهیزات، معماری نهایی و پیشنهاد مالی در نسخه بعدی </w:t>
-      </w:r>
-      <w:proofErr w:type="spellStart"/>
-      <w:r>
-        <w:rPr>
-          <w:rFonts w:ascii="IRANSans" w:hAnsi="IRANSans" w:cs="IRANSans"/>
-          <w:rtl/>
-          <w:lang w:bidi="fa-IR"/>
-        </w:rPr>
-        <w:t>پروپوزال</w:t>
-      </w:r>
-      <w:proofErr w:type="spellEnd"/>
-      <w:r>
-        <w:rPr>
-          <w:rFonts w:ascii="IRANSans" w:hAnsi="IRANSans" w:cs="IRANSans"/>
-          <w:rtl/>
-          <w:lang w:bidi="fa-IR"/>
-        </w:rPr>
-        <w:t xml:space="preserve"> تکمیل خواهد شد</w:t>
-      </w:r>
-      <w:r>
-        <w:rPr>
-          <w:rFonts w:ascii="IRANSans" w:hAnsi="IRANSans" w:cs="IRANSans"/>
-          <w:lang w:bidi="fa-IR"/>
-        </w:rPr>
-        <w:t>.</w:t>
-      </w:r>
-    </w:p>
-    <w:p>
-      <w:pPr>
-        <w:bidi/>
-        <w:jc w:val="both"/>
-        <w:rPr>
-          <w:rFonts w:ascii="IRANSans" w:hAnsi="IRANSans" w:cs="IRANSans"/>
-          <w:lang w:bidi="fa-IR"/>
-        </w:rPr>
-      </w:pPr>
-      <w:r>
-        <w:rPr>
-          <w:rFonts w:ascii="IRANSans" w:hAnsi="IRANSans" w:cs="IRANSans"/>
-          <w:rtl/>
-          <w:lang w:bidi="fa-IR"/>
-        </w:rPr>
-        <w:t>این سند توسط</w:t>
-      </w:r>
-      <w:r>
-        <w:rPr>
-          <w:rFonts w:ascii="IRANSans" w:hAnsi="IRANSans" w:cs="IRANSans"/>
-          <w:lang w:bidi="fa-IR"/>
-        </w:rPr>
-        <w:t xml:space="preserve"> HLWL </w:t>
-      </w:r>
-      <w:r>
-        <w:rPr>
-          <w:rFonts w:ascii="IRANSans" w:hAnsi="IRANSans" w:cs="IRANSans"/>
-          <w:rtl/>
-          <w:lang w:bidi="fa-IR"/>
-        </w:rPr>
-        <w:t xml:space="preserve">به عنوان نماینده خاورمیانه </w:t>
-      </w:r>
-      <w:proofErr w:type="spellStart"/>
-      <w:r>
-        <w:rPr>
-          <w:rFonts w:ascii="IRANSans" w:hAnsi="IRANSans" w:cs="IRANSans"/>
-          <w:rtl/>
-          <w:lang w:bidi="fa-IR"/>
-        </w:rPr>
-        <w:t>راهکار</w:t>
-      </w:r>
-      <w:proofErr w:type="spellEnd"/>
-      <w:r>
-        <w:rPr>
-          <w:rFonts w:ascii="IRANSans" w:hAnsi="IRANSans" w:cs="IRANSans"/>
-          <w:lang w:bidi="fa-IR"/>
-        </w:rPr>
-        <w:t xml:space="preserve"> </w:t>
-      </w:r>
-      <w:proofErr w:type="spellStart"/>
-      <w:r>
-        <w:rPr>
-          <w:rFonts w:ascii="IRANSans" w:hAnsi="IRANSans" w:cs="IRANSans"/>
-          <w:lang w:bidi="fa-IR"/>
-        </w:rPr>
-        <w:t>Syncolony</w:t>
-      </w:r>
-      <w:proofErr w:type="spellEnd"/>
-      <w:r>
-        <w:rPr>
-          <w:rFonts w:ascii="IRANSans" w:hAnsi="IRANSans" w:cs="IRANSans"/>
-          <w:lang w:bidi="fa-IR"/>
-        </w:rPr>
-        <w:t xml:space="preserve"> </w:t>
-      </w:r>
-      <w:r>
-        <w:rPr>
-          <w:rFonts w:ascii="IRANSans" w:hAnsi="IRANSans" w:cs="IRANSans"/>
-          <w:rtl/>
-          <w:lang w:bidi="fa-IR"/>
-        </w:rPr>
-        <w:t>تهیه شده است</w:t>
-      </w:r>
-      <w:r>
-        <w:rPr>
-          <w:rFonts w:ascii="IRANSans" w:hAnsi="IRANSans" w:cs="IRANSans"/>
-          <w:lang w:bidi="fa-IR"/>
-        </w:rPr>
-        <w:t>.</w:t>
-      </w:r>
-    </w:p>
-    <w:p>
-      <w:pPr>
         <w:pStyle w:val="Heading1"/>
-        <w:numPr>
-          <w:ilvl w:val="0"/>
-          <w:numId w:val="8"/>
-        </w:numPr>
-        <w:rPr>
-          <w:rFonts w:cs="IRANSans"/>
-          <w:rtl/>
-          <w:lang w:val="en-US"/>
-        </w:rPr>
-      </w:pPr>
-      <w:r>
-        <w:rPr>
-          <w:rFonts w:cs="IRANSans"/>
-          <w:rtl/>
-          <w:lang w:val="en-US"/>
+        <w:rPr>
+          <w:rtl/>
+        </w:rPr>
+      </w:pPr>
+      <w:r>
+        <w:rPr>
+          <w:rtl/>
         </w:rPr>
         <w:lastRenderedPageBreak/>
         <w:t xml:space="preserve">شناخت پروژه </w:t>
       </w:r>
       <w:r>
         <w:rPr>
-          <w:rFonts w:cs="IRANSans"/>
-          <w:rtl/>
-          <w:lang w:val="en-US"/>
+          <w:rtl/>
         </w:rPr>
         <w:t>و نیازمندی های کنترل تردد مدرس</w:t>
       </w:r>
       <w:r>
         <w:rPr>
-          <w:rFonts w:cs="IRANSans"/>
-          <w:rtl/>
-          <w:lang w:val="en-US"/>
+          <w:rtl/>
         </w:rPr>
         <w:t>ه</w:t>
       </w:r>
     </w:p>
     <w:p>
       <w:pPr>
-        <w:pStyle w:val="Heading1"/>
-        <w:numPr>
-          <w:ilvl w:val="1"/>
-          <w:numId w:val="8"/>
-        </w:numPr>
-        <w:rPr>
-          <w:rFonts w:cs="IRANSans"/>
-          <w:sz w:val="32"/>
-          <w:szCs w:val="32"/>
-          <w:rtl/>
-          <w:lang w:val="en-US"/>
-        </w:rPr>
-      </w:pPr>
-      <w:r>
-        <w:rPr>
-          <w:rFonts w:cs="IRANSans"/>
-          <w:sz w:val="32"/>
-          <w:szCs w:val="32"/>
-          <w:rtl/>
-          <w:lang w:val="en-US"/>
+        <w:pStyle w:val="Heading2"/>
+        <w:rPr>
+          <w:rtl/>
+        </w:rPr>
+      </w:pPr>
+      <w:r>
+        <w:rPr>
+          <w:rtl/>
         </w:rPr>
         <w:t>معرفی پروژه</w:t>
       </w:r>
     </w:p>
     <w:p>
-      <w:pPr>
-        <w:bidi/>
-        <w:jc w:val="both"/>
-        <w:rPr>
-          <w:rFonts w:ascii="IRANSans" w:hAnsi="IRANSans" w:cs="IRANSans"/>
-          <w:lang w:bidi="fa-IR"/>
-        </w:rPr>
-      </w:pPr>
-      <w:r>
-        <w:rPr>
-          <w:rFonts w:ascii="IRANSans" w:hAnsi="IRANSans" w:cs="IRANSans"/>
-          <w:rtl/>
-          <w:lang w:bidi="fa-IR"/>
+      <w:r>
+        <w:rPr>
+          <w:rtl/>
         </w:rPr>
         <w:t>این پروژه با هدف طراحی و پیاده‌سازی یک راهکار یکپارچه برای مدیریت کنترل تردد، امنیت فیزیکی، مدیریت مراجعین، مدیریت پارکینگ و نظارت بر تردد افراد و وسایل نقلیه در یک مجموعه آموزشی بزرگ تهیه شده است</w:t>
       </w:r>
       <w:r>
-        <w:rPr>
-          <w:rFonts w:ascii="IRANSans" w:hAnsi="IRANSans" w:cs="IRANSans"/>
-          <w:lang w:bidi="fa-IR"/>
-        </w:rPr>
         <w:t>.</w:t>
       </w:r>
     </w:p>
     <w:p>
-      <w:pPr>
-        <w:bidi/>
-        <w:jc w:val="both"/>
-        <w:rPr>
-          <w:rFonts w:ascii="IRANSans" w:hAnsi="IRANSans" w:cs="IRANSans"/>
-          <w:lang w:bidi="fa-IR"/>
-        </w:rPr>
-      </w:pPr>
-      <w:r>
-        <w:rPr>
-          <w:rFonts w:ascii="IRANSans" w:hAnsi="IRANSans" w:cs="IRANSans"/>
-          <w:rtl/>
-          <w:lang w:bidi="fa-IR"/>
+      <w:r>
+        <w:rPr>
+          <w:rtl/>
         </w:rPr>
         <w:t>بر اساس اطلاعات اولیه، مجموعه مورد نظر شامل چندین ساختمان آموزشی، بیش از ۲۰۰ کلاس درس، آزمایشگاه‌ها، فضاهای اداری، کتابخانه، سالن‌های آموزشی، پارکینگ‌ها و ورودی‌های متعدد است که روزانه میزبان تعداد زیادی از دانش‌آموزان، معلمان، کارکنان، والدین، مراجعین و پیمانکاران خواهد بود</w:t>
       </w:r>
       <w:r>
-        <w:rPr>
-          <w:rFonts w:ascii="IRANSans" w:hAnsi="IRANSans" w:cs="IRANSans"/>
-          <w:lang w:bidi="fa-IR"/>
-        </w:rPr>
         <w:t>.</w:t>
       </w:r>
     </w:p>
     <w:p>
       <w:pPr>
-        <w:pStyle w:val="Heading1"/>
-        <w:numPr>
-          <w:ilvl w:val="1"/>
-          <w:numId w:val="8"/>
-        </w:numPr>
-        <w:rPr>
-          <w:rFonts w:cs="IRANSans"/>
-          <w:sz w:val="32"/>
-          <w:szCs w:val="32"/>
-          <w:lang w:val="en-US"/>
-        </w:rPr>
-      </w:pPr>
-      <w:r>
-        <w:rPr>
-          <w:rFonts w:cs="IRANSans"/>
-          <w:sz w:val="32"/>
-          <w:szCs w:val="32"/>
-          <w:rtl/>
-          <w:lang w:val="en-US"/>
+        <w:pStyle w:val="Heading2"/>
+      </w:pPr>
+      <w:r>
+        <w:rPr>
+          <w:rtl/>
         </w:rPr>
         <w:t>اهداف پروژه</w:t>
       </w:r>
     </w:p>
     <w:p>
-      <w:pPr>
-        <w:bidi/>
-        <w:jc w:val="both"/>
-        <w:rPr>
-          <w:rFonts w:ascii="IRANSans" w:hAnsi="IRANSans" w:cs="IRANSans"/>
-          <w:lang w:bidi="fa-IR"/>
-        </w:rPr>
-      </w:pPr>
-      <w:r>
-        <w:rPr>
-          <w:rFonts w:ascii="IRANSans" w:hAnsi="IRANSans" w:cs="IRANSans"/>
-          <w:rtl/>
-          <w:lang w:bidi="fa-IR"/>
+      <w:r>
+        <w:rPr>
+          <w:rtl/>
         </w:rPr>
         <w:t>هدف از اجرای این پروژه، ایجاد بستری یکپارچه برای افزایش امنیت، مدیریت هوشمند تردد، کاهش فرآیندهای دستی، افزایش سرعت دسترسی، ثبت و رهگیری کامل رویدادها و فراهم نمودن امکان مدیریت متمرکز کلیه اجزای امنیت فیزیکی مجموعه است</w:t>
       </w:r>
       <w:r>
-        <w:rPr>
-          <w:rFonts w:ascii="IRANSans" w:hAnsi="IRANSans" w:cs="IRANSans"/>
-          <w:lang w:bidi="fa-IR"/>
-        </w:rPr>
         <w:t>.</w:t>
       </w:r>
     </w:p>
     <w:p>
-      <w:pPr>
-        <w:bidi/>
-        <w:jc w:val="both"/>
-        <w:rPr>
-          <w:rFonts w:ascii="IRANSans" w:hAnsi="IRANSans" w:cs="IRANSans"/>
-          <w:lang w:bidi="fa-IR"/>
-        </w:rPr>
-      </w:pPr>
-      <w:r>
-        <w:rPr>
-          <w:rFonts w:ascii="IRANSans" w:hAnsi="IRANSans" w:cs="IRANSans"/>
-          <w:rtl/>
-          <w:lang w:bidi="fa-IR"/>
+      <w:r>
+        <w:rPr>
+          <w:rtl/>
         </w:rPr>
         <w:t>راهکار پیشنهادی باید علاوه بر پاسخگویی به نیازهای فعلی مدرسه، قابلیت توسعه و انطباق با نیازهای آینده مجموعه را نیز داشته باشد</w:t>
       </w:r>
       <w:r>
-        <w:rPr>
-          <w:rFonts w:ascii="IRANSans" w:hAnsi="IRANSans" w:cs="IRANSans"/>
-          <w:lang w:bidi="fa-IR"/>
-        </w:rPr>
         <w:t>.</w:t>
       </w:r>
     </w:p>
     <w:p>
       <w:pPr>
-        <w:pStyle w:val="Heading1"/>
-        <w:numPr>
-          <w:ilvl w:val="1"/>
-          <w:numId w:val="8"/>
-        </w:numPr>
-        <w:rPr>
-          <w:rFonts w:cs="IRANSans"/>
-          <w:sz w:val="32"/>
-          <w:szCs w:val="32"/>
-          <w:lang w:val="en-US"/>
-        </w:rPr>
-      </w:pPr>
-      <w:r>
-        <w:rPr>
-          <w:rFonts w:cs="IRANSans"/>
-          <w:sz w:val="32"/>
-          <w:szCs w:val="32"/>
-          <w:rtl/>
-          <w:lang w:val="en-US"/>
+        <w:pStyle w:val="Heading2"/>
+      </w:pPr>
+      <w:r>
+        <w:rPr>
+          <w:rtl/>
         </w:rPr>
         <w:t>نیازهای اصلی مجموعه</w:t>
       </w:r>
     </w:p>
     <w:p>
-      <w:pPr>
-        <w:bidi/>
-        <w:jc w:val="both"/>
-        <w:rPr>
-          <w:rFonts w:ascii="IRANSans" w:hAnsi="IRANSans" w:cs="IRANSans"/>
-          <w:lang w:bidi="fa-IR"/>
-        </w:rPr>
-      </w:pPr>
-      <w:r>
-        <w:rPr>
-          <w:rFonts w:ascii="IRANSans" w:hAnsi="IRANSans" w:cs="IRANSans"/>
-          <w:rtl/>
-          <w:lang w:bidi="fa-IR"/>
-        </w:rPr>
-        <w:t>بر اساس اطلاعات اولیه، مهم‌ترین نیازهای پروژه عبارت‌اند از</w:t>
-      </w:r>
-      <w:r>
-        <w:rPr>
-          <w:rFonts w:ascii="IRANSans" w:hAnsi="IRANSans" w:cs="IRANSans"/>
-          <w:lang w:bidi="fa-IR"/>
-        </w:rPr>
+      <w:r>
+        <w:rPr>
+          <w:rtl/>
+        </w:rPr>
+        <w:t xml:space="preserve">بر اساس اطلاعات اولیه، </w:t>
+      </w:r>
+      <w:proofErr w:type="spellStart"/>
+      <w:r>
+        <w:rPr>
+          <w:rtl/>
+        </w:rPr>
+        <w:t>مهم‌ترین</w:t>
+      </w:r>
+      <w:proofErr w:type="spellEnd"/>
+      <w:r>
+        <w:rPr>
+          <w:rtl/>
+        </w:rPr>
+        <w:t xml:space="preserve"> نیازهای پروژه عبارت‌اند از</w:t>
+      </w:r>
+      <w:r>
         <w:t>:</w:t>
       </w:r>
     </w:p>
@@ -932,21 +528,10 @@
           <w:ilvl w:val="0"/>
           <w:numId w:val="11"/>
         </w:numPr>
-        <w:tabs>
-          <w:tab w:val="num" w:pos="720"/>
-        </w:tabs>
-        <w:bidi/>
-        <w:jc w:val="both"/>
-        <w:rPr>
-          <w:rFonts w:ascii="IRANSans" w:hAnsi="IRANSans" w:cs="IRANSans"/>
-          <w:lang w:bidi="fa-IR"/>
-        </w:rPr>
-      </w:pPr>
-      <w:r>
-        <w:rPr>
-          <w:rFonts w:ascii="IRANSans" w:hAnsi="IRANSans" w:cs="IRANSans"/>
-          <w:rtl/>
-          <w:lang w:bidi="fa-IR"/>
+      </w:pPr>
+      <w:r>
+        <w:rPr>
+          <w:rtl/>
         </w:rPr>
         <w:t>مدیریت ورود و خروج دانش‌آموزان</w:t>
       </w:r>
@@ -958,21 +543,10 @@
           <w:ilvl w:val="0"/>
           <w:numId w:val="11"/>
         </w:numPr>
-        <w:tabs>
-          <w:tab w:val="num" w:pos="720"/>
-        </w:tabs>
-        <w:bidi/>
-        <w:jc w:val="both"/>
-        <w:rPr>
-          <w:rFonts w:ascii="IRANSans" w:hAnsi="IRANSans" w:cs="IRANSans"/>
-          <w:lang w:bidi="fa-IR"/>
-        </w:rPr>
-      </w:pPr>
-      <w:r>
-        <w:rPr>
-          <w:rFonts w:ascii="IRANSans" w:hAnsi="IRANSans" w:cs="IRANSans"/>
-          <w:rtl/>
-          <w:lang w:bidi="fa-IR"/>
+      </w:pPr>
+      <w:r>
+        <w:rPr>
+          <w:rtl/>
         </w:rPr>
         <w:t>مدیریت ورود و خروج معلمان و کارکنان</w:t>
       </w:r>
@@ -984,21 +558,10 @@
           <w:ilvl w:val="0"/>
           <w:numId w:val="11"/>
         </w:numPr>
-        <w:tabs>
-          <w:tab w:val="num" w:pos="720"/>
-        </w:tabs>
-        <w:bidi/>
-        <w:jc w:val="both"/>
-        <w:rPr>
-          <w:rFonts w:ascii="IRANSans" w:hAnsi="IRANSans" w:cs="IRANSans"/>
-          <w:lang w:bidi="fa-IR"/>
-        </w:rPr>
-      </w:pPr>
-      <w:r>
-        <w:rPr>
-          <w:rFonts w:ascii="IRANSans" w:hAnsi="IRANSans" w:cs="IRANSans"/>
-          <w:rtl/>
-          <w:lang w:bidi="fa-IR"/>
+      </w:pPr>
+      <w:r>
+        <w:rPr>
+          <w:rtl/>
         </w:rPr>
         <w:t>کنترل دسترسی کلاس‌های درس، آزمایشگاه‌ها و فضاهای اداری</w:t>
       </w:r>
@@ -1010,21 +573,10 @@
           <w:ilvl w:val="0"/>
           <w:numId w:val="11"/>
         </w:numPr>
-        <w:tabs>
-          <w:tab w:val="num" w:pos="720"/>
-        </w:tabs>
-        <w:bidi/>
-        <w:jc w:val="both"/>
-        <w:rPr>
-          <w:rFonts w:ascii="IRANSans" w:hAnsi="IRANSans" w:cs="IRANSans"/>
-          <w:lang w:bidi="fa-IR"/>
-        </w:rPr>
-      </w:pPr>
-      <w:r>
-        <w:rPr>
-          <w:rFonts w:ascii="IRANSans" w:hAnsi="IRANSans" w:cs="IRANSans"/>
-          <w:rtl/>
-          <w:lang w:bidi="fa-IR"/>
+      </w:pPr>
+      <w:r>
+        <w:rPr>
+          <w:rtl/>
         </w:rPr>
         <w:t>مدیریت ورود والدین، مراجعین و پیمانکاران</w:t>
       </w:r>
@@ -1036,21 +588,10 @@
           <w:ilvl w:val="0"/>
           <w:numId w:val="11"/>
         </w:numPr>
-        <w:tabs>
-          <w:tab w:val="num" w:pos="720"/>
-        </w:tabs>
-        <w:bidi/>
-        <w:jc w:val="both"/>
-        <w:rPr>
-          <w:rFonts w:ascii="IRANSans" w:hAnsi="IRANSans" w:cs="IRANSans"/>
-          <w:lang w:bidi="fa-IR"/>
-        </w:rPr>
-      </w:pPr>
-      <w:r>
-        <w:rPr>
-          <w:rFonts w:ascii="IRANSans" w:hAnsi="IRANSans" w:cs="IRANSans"/>
-          <w:rtl/>
-          <w:lang w:bidi="fa-IR"/>
+      </w:pPr>
+      <w:r>
+        <w:rPr>
+          <w:rtl/>
         </w:rPr>
         <w:t>مدیریت گیت‌های ورودی و خروجی</w:t>
       </w:r>
@@ -1062,21 +603,10 @@
           <w:ilvl w:val="0"/>
           <w:numId w:val="11"/>
         </w:numPr>
-        <w:tabs>
-          <w:tab w:val="num" w:pos="720"/>
-        </w:tabs>
-        <w:bidi/>
-        <w:jc w:val="both"/>
-        <w:rPr>
-          <w:rFonts w:ascii="IRANSans" w:hAnsi="IRANSans" w:cs="IRANSans"/>
-          <w:lang w:bidi="fa-IR"/>
-        </w:rPr>
-      </w:pPr>
-      <w:r>
-        <w:rPr>
-          <w:rFonts w:ascii="IRANSans" w:hAnsi="IRANSans" w:cs="IRANSans"/>
-          <w:rtl/>
-          <w:lang w:bidi="fa-IR"/>
+      </w:pPr>
+      <w:r>
+        <w:rPr>
+          <w:rtl/>
         </w:rPr>
         <w:t>مدیریت پارکینگ و خودروها</w:t>
       </w:r>
@@ -1088,23 +618,11 @@
           <w:ilvl w:val="0"/>
           <w:numId w:val="11"/>
         </w:numPr>
-        <w:tabs>
-          <w:tab w:val="num" w:pos="720"/>
-        </w:tabs>
-        <w:bidi/>
-        <w:jc w:val="both"/>
-        <w:rPr>
-          <w:rFonts w:ascii="IRANSans" w:hAnsi="IRANSans" w:cs="IRANSans"/>
-          <w:lang w:bidi="fa-IR"/>
-        </w:rPr>
-      </w:pPr>
-      <w:r>
-        <w:rPr>
-          <w:rFonts w:ascii="IRANSans" w:hAnsi="IRANSans" w:cs="IRANSans"/>
-          <w:rtl/>
-          <w:lang w:bidi="fa-IR"/>
-        </w:rPr>
-        <w:lastRenderedPageBreak/>
+      </w:pPr>
+      <w:r>
+        <w:rPr>
+          <w:rtl/>
+        </w:rPr>
         <w:t>یکپارچه‌سازی با سامانه‌های نظارتی و سایر سامانه‌های مرتبط</w:t>
       </w:r>
     </w:p>
@@ -1115,309 +633,847 @@
           <w:ilvl w:val="0"/>
           <w:numId w:val="11"/>
         </w:numPr>
-        <w:tabs>
-          <w:tab w:val="num" w:pos="720"/>
-        </w:tabs>
-        <w:bidi/>
-        <w:jc w:val="both"/>
-        <w:rPr>
-          <w:rFonts w:ascii="IRANSans" w:hAnsi="IRANSans" w:cs="IRANSans"/>
-          <w:lang w:bidi="fa-IR"/>
-        </w:rPr>
-      </w:pPr>
-      <w:r>
-        <w:rPr>
-          <w:rFonts w:ascii="IRANSans" w:hAnsi="IRANSans" w:cs="IRANSans"/>
-          <w:rtl/>
-          <w:lang w:bidi="fa-IR"/>
-        </w:rPr>
+      </w:pPr>
+      <w:r>
+        <w:rPr>
+          <w:rtl/>
+        </w:rPr>
+        <w:lastRenderedPageBreak/>
         <w:t>ثبت، مانیتورینگ و گزارش‌گیری از کلیه رویدادهای امنیتی</w:t>
       </w:r>
     </w:p>
     <w:p>
       <w:pPr>
+        <w:pStyle w:val="Heading2"/>
+      </w:pPr>
+      <w:r>
+        <w:rPr>
+          <w:rtl/>
+        </w:rPr>
+        <w:t>رویکرد ارائه این پیشنهاد</w:t>
+      </w:r>
+    </w:p>
+    <w:p>
+      <w:r>
+        <w:rPr>
+          <w:rtl/>
+        </w:rPr>
+        <w:t xml:space="preserve">از آنجا که اطلاعات </w:t>
+      </w:r>
+      <w:proofErr w:type="spellStart"/>
+      <w:r>
+        <w:rPr>
+          <w:rtl/>
+        </w:rPr>
+        <w:t>تفصیلی</w:t>
+      </w:r>
+      <w:proofErr w:type="spellEnd"/>
+      <w:r>
+        <w:rPr>
+          <w:rtl/>
+        </w:rPr>
+        <w:t xml:space="preserve"> پروژه، از جمله نقشه‌های اجرایی، تعداد دقیق ساختمان‌ها، تعداد درب‌ها، ظرفیت کاربران، سیاست‌های امنیتی و الزامات عملیاتی هنوز در حال تکمیل است، این پیشنهاد بر معرفی راهکارهای قابل ارائه، سناریوهای پیشنهادی و گزینه‌های مختلف پیاده‌سازی متمرکز است</w:t>
+      </w:r>
+      <w:r>
+        <w:t>.</w:t>
+      </w:r>
+    </w:p>
+    <w:p>
+      <w:r>
+        <w:rPr>
+          <w:rtl/>
+        </w:rPr>
+        <w:t xml:space="preserve">پس از تکمیل اطلاعات پروژه و نهایی شدن نیازمندی‌های کارفرما، نسخه نهایی پیشنهاد شامل معماری تفصیلی، انتخاب تجهیزات، طراحی نهایی، </w:t>
+      </w:r>
+      <w:r>
+        <w:t xml:space="preserve">BOQ </w:t>
+      </w:r>
+      <w:r>
+        <w:rPr>
+          <w:rtl/>
+        </w:rPr>
+        <w:t>و پیشنهاد مالی تهیه خواهد شد</w:t>
+      </w:r>
+      <w:r>
+        <w:t>.</w:t>
+      </w:r>
+    </w:p>
+    <w:p>
+      <w:pPr>
+        <w:rPr>
+          <w:rtl/>
+          <w:lang w:bidi="ar-SA"/>
+        </w:rPr>
+      </w:pPr>
+    </w:p>
+    <w:p>
+      <w:pPr>
         <w:pStyle w:val="Heading1"/>
-        <w:numPr>
-          <w:ilvl w:val="1"/>
-          <w:numId w:val="8"/>
-        </w:numPr>
-        <w:rPr>
-          <w:rFonts w:cs="IRANSans"/>
-          <w:sz w:val="32"/>
-          <w:szCs w:val="32"/>
-          <w:lang w:val="en-US"/>
-        </w:rPr>
-      </w:pPr>
-      <w:r>
-        <w:rPr>
-          <w:rFonts w:cs="IRANSans"/>
-          <w:sz w:val="32"/>
-          <w:szCs w:val="32"/>
-          <w:rtl/>
-          <w:lang w:val="en-US"/>
-        </w:rPr>
-        <w:t>رویکرد ارائه این پیشنهاد</w:t>
-      </w:r>
-    </w:p>
-    <w:p>
-      <w:pPr>
-        <w:bidi/>
-        <w:rPr>
-          <w:rFonts w:ascii="IRANSans" w:hAnsi="IRANSans" w:cs="IRANSans"/>
-        </w:rPr>
-      </w:pPr>
-      <w:r>
-        <w:rPr>
-          <w:rFonts w:ascii="IRANSans" w:hAnsi="IRANSans" w:cs="IRANSans"/>
-          <w:rtl/>
-          <w:lang w:val="en-US"/>
-        </w:rPr>
-        <w:t>از آنجا که اطلاعات تفصیلی پروژه، از جمله نقشه‌های اجرایی، تعداد دقیق ساختمان‌ها، تعداد درب‌ها، ظرفیت کاربران، سیاست‌های امنیتی و الزامات عملیاتی هنوز در حال تکمیل است، این پیشنهاد بر معرفی راهکارهای قابل ارائه، سناریوهای پیشنهادی و گزینه‌های مختلف پیاده‌سازی متمرکز است</w:t>
-      </w:r>
-      <w:r>
-        <w:rPr>
-          <w:rFonts w:ascii="IRANSans" w:hAnsi="IRANSans" w:cs="IRANSans"/>
-        </w:rPr>
+        <w:rPr>
+          <w:rtl/>
+        </w:rPr>
+      </w:pPr>
+      <w:r>
+        <w:rPr>
+          <w:rtl/>
+        </w:rPr>
+        <w:t>اهداف و نیازمندی‌های اصلی مدرسه</w:t>
+      </w:r>
+    </w:p>
+    <w:p>
+      <w:r>
+        <w:rPr>
+          <w:rtl/>
+        </w:rPr>
+        <w:t xml:space="preserve">هدف این پروژه، ایجاد یک راهکار یکپارچه برای ارتقای امنیت، نظم عملیاتی و مدیریت هوشمند تردد در محیط مدرسه است. در چنین </w:t>
+      </w:r>
+      <w:proofErr w:type="spellStart"/>
+      <w:r>
+        <w:rPr>
+          <w:rtl/>
+        </w:rPr>
+        <w:t>مجموعه‌ای</w:t>
+      </w:r>
+      <w:proofErr w:type="spellEnd"/>
+      <w:r>
+        <w:rPr>
+          <w:rtl/>
+        </w:rPr>
+        <w:t xml:space="preserve">، </w:t>
+      </w:r>
+      <w:proofErr w:type="spellStart"/>
+      <w:r>
+        <w:rPr>
+          <w:rtl/>
+        </w:rPr>
+        <w:t>گروه‌های</w:t>
+      </w:r>
+      <w:proofErr w:type="spellEnd"/>
+      <w:r>
+        <w:rPr>
+          <w:rtl/>
+        </w:rPr>
+        <w:t xml:space="preserve"> مختلفی از افراد شامل </w:t>
+      </w:r>
+      <w:proofErr w:type="spellStart"/>
+      <w:r>
+        <w:rPr>
+          <w:rtl/>
+        </w:rPr>
+        <w:t>دانش‌آموزان</w:t>
+      </w:r>
+      <w:proofErr w:type="spellEnd"/>
+      <w:r>
+        <w:rPr>
+          <w:rtl/>
+        </w:rPr>
+        <w:t xml:space="preserve">، معلمان، کارکنان، والدین، مهمانان و </w:t>
+      </w:r>
+      <w:proofErr w:type="spellStart"/>
+      <w:r>
+        <w:rPr>
+          <w:rtl/>
+        </w:rPr>
+        <w:t>پیمانکاران</w:t>
+      </w:r>
+      <w:proofErr w:type="spellEnd"/>
+      <w:r>
+        <w:rPr>
+          <w:rtl/>
+        </w:rPr>
+        <w:t xml:space="preserve"> </w:t>
+      </w:r>
+      <w:proofErr w:type="spellStart"/>
+      <w:r>
+        <w:rPr>
+          <w:rtl/>
+        </w:rPr>
+        <w:t>به‌صورت</w:t>
+      </w:r>
+      <w:proofErr w:type="spellEnd"/>
+      <w:r>
+        <w:rPr>
+          <w:rtl/>
+        </w:rPr>
+        <w:t xml:space="preserve"> روزانه یا </w:t>
+      </w:r>
+      <w:proofErr w:type="spellStart"/>
+      <w:r>
+        <w:rPr>
+          <w:rtl/>
+        </w:rPr>
+        <w:t>دوره‌ای</w:t>
+      </w:r>
+      <w:proofErr w:type="spellEnd"/>
+      <w:r>
+        <w:rPr>
+          <w:rtl/>
+        </w:rPr>
+        <w:t xml:space="preserve"> در فضاهای مختلف تردد </w:t>
+      </w:r>
+      <w:proofErr w:type="spellStart"/>
+      <w:r>
+        <w:rPr>
+          <w:rtl/>
+        </w:rPr>
+        <w:t>می‌کنند</w:t>
+      </w:r>
+      <w:proofErr w:type="spellEnd"/>
+      <w:r>
+        <w:rPr>
+          <w:rtl/>
+        </w:rPr>
+        <w:t xml:space="preserve">. بنابراین راهکار پیشنهادی باید بتواند ضمن حفظ سهولت استفاده، سطح مناسبی از کنترل، نظارت، ثبت رویداد و </w:t>
+      </w:r>
+      <w:proofErr w:type="spellStart"/>
+      <w:r>
+        <w:rPr>
+          <w:rtl/>
+        </w:rPr>
+        <w:t>گزارش‌گیری</w:t>
+      </w:r>
+      <w:proofErr w:type="spellEnd"/>
+      <w:r>
+        <w:rPr>
+          <w:rtl/>
+        </w:rPr>
+        <w:t xml:space="preserve"> را فراهم کند</w:t>
+      </w:r>
+      <w:r>
         <w:t>.</w:t>
       </w:r>
     </w:p>
     <w:p>
-      <w:pPr>
-        <w:bidi/>
-        <w:rPr>
-          <w:rFonts w:ascii="IRANSans" w:hAnsi="IRANSans" w:cs="IRANSans"/>
-        </w:rPr>
-      </w:pPr>
-      <w:r>
-        <w:rPr>
-          <w:rFonts w:ascii="IRANSans" w:hAnsi="IRANSans" w:cs="IRANSans"/>
-          <w:rtl/>
-          <w:lang w:val="en-US"/>
-        </w:rPr>
-        <w:t xml:space="preserve">پس از تکمیل اطلاعات پروژه و نهایی شدن نیازمندی‌های کارفرما، نسخه نهایی پیشنهاد شامل معماری تفصیلی، انتخاب تجهیزات، طراحی نهایی، </w:t>
-      </w:r>
-      <w:r>
-        <w:rPr>
-          <w:rFonts w:ascii="IRANSans" w:hAnsi="IRANSans" w:cs="IRANSans"/>
-        </w:rPr>
-        <w:t xml:space="preserve">BOQ </w:t>
-      </w:r>
-      <w:r>
-        <w:rPr>
-          <w:rFonts w:ascii="IRANSans" w:hAnsi="IRANSans" w:cs="IRANSans"/>
-          <w:rtl/>
-          <w:lang w:val="en-US"/>
-        </w:rPr>
-        <w:t>و پیشنهاد مالی تهیه خواهد شد</w:t>
-      </w:r>
-      <w:r>
-        <w:rPr>
-          <w:rFonts w:ascii="IRANSans" w:hAnsi="IRANSans" w:cs="IRANSans"/>
-        </w:rPr>
+      <w:r>
+        <w:rPr>
+          <w:rtl/>
+        </w:rPr>
+        <w:t xml:space="preserve">در این مرحله، </w:t>
+      </w:r>
+      <w:proofErr w:type="spellStart"/>
+      <w:r>
+        <w:rPr>
+          <w:rtl/>
+        </w:rPr>
+        <w:t>نیازمندی‌های</w:t>
+      </w:r>
+      <w:proofErr w:type="spellEnd"/>
+      <w:r>
+        <w:rPr>
+          <w:rtl/>
+        </w:rPr>
+        <w:t xml:space="preserve"> پروژه بر اساس اطلاعات اولیه و شناخت کلی از محیط مدرسه تعریف شده‌اند. این نیازمندی‌ها پس از دریافت اطلاعات تکمیلی از کارفرما، بررسی پلان‌ها، مسیرهای تردد، تعداد ورودی‌ها، تعداد ساختمان‌ها و سیاست‌های امنیتی مدرسه، دقیق‌تر و نهایی خواهند شد</w:t>
+      </w:r>
+      <w:r>
         <w:t>.</w:t>
       </w:r>
     </w:p>
     <w:p>
       <w:pPr>
-        <w:bidi/>
-        <w:rPr>
-          <w:rFonts w:ascii="IRANSans" w:hAnsi="IRANSans" w:cs="IRANSans"/>
-          <w:rtl/>
-        </w:rPr>
-      </w:pPr>
-    </w:p>
-    <w:p>
-      <w:pPr>
-        <w:pStyle w:val="Heading1"/>
+        <w:pStyle w:val="Heading2"/>
+      </w:pPr>
+      <w:r>
+        <w:rPr>
+          <w:rtl/>
+        </w:rPr>
+        <w:t>اهداف اصلی پروژه</w:t>
+      </w:r>
+    </w:p>
+    <w:p>
+      <w:r>
+        <w:rPr>
+          <w:rtl/>
+        </w:rPr>
+        <w:t>اهداف اصلی پروژه عبارت‌اند از</w:t>
+      </w:r>
+      <w:r>
+        <w:t>:</w:t>
+      </w:r>
+    </w:p>
+    <w:p>
+      <w:pPr>
+        <w:pStyle w:val="ListParagraph"/>
         <w:numPr>
           <w:ilvl w:val="0"/>
-          <w:numId w:val="8"/>
+          <w:numId w:val="13"/>
         </w:numPr>
-        <w:rPr>
-          <w:rFonts w:cs="IRANSans"/>
-          <w:rtl/>
-          <w:lang w:val="en-US"/>
-        </w:rPr>
-      </w:pPr>
-      <w:r>
-        <w:rPr>
-          <w:rFonts w:cs="IRANSans"/>
-          <w:rtl/>
-          <w:lang w:val="en-US"/>
-        </w:rPr>
-        <w:lastRenderedPageBreak/>
-        <w:t>اهداف و نیازمندی‌های اصلی مدرسه</w:t>
-      </w:r>
-    </w:p>
-    <w:p>
-      <w:pPr>
-        <w:pStyle w:val="Heading1"/>
+      </w:pPr>
+      <w:r>
+        <w:rPr>
+          <w:rtl/>
+        </w:rPr>
+        <w:t>افزایش سطح امنیت فیزیکی مدرسه</w:t>
+      </w:r>
+    </w:p>
+    <w:p>
+      <w:pPr>
+        <w:pStyle w:val="ListParagraph"/>
         <w:numPr>
           <w:ilvl w:val="0"/>
-          <w:numId w:val="8"/>
+          <w:numId w:val="13"/>
         </w:numPr>
-        <w:rPr>
-          <w:rFonts w:cs="IRANSans"/>
-          <w:rtl/>
-        </w:rPr>
-      </w:pPr>
-      <w:r>
-        <w:rPr>
-          <w:rFonts w:cs="IRANSans"/>
-          <w:rtl/>
-        </w:rPr>
-        <w:t xml:space="preserve">راهکار یکپارچه پیشنهادی </w:t>
-      </w:r>
-    </w:p>
-    <w:p>
-      <w:pPr>
-        <w:pStyle w:val="Heading1"/>
+      </w:pPr>
+      <w:r>
+        <w:rPr>
+          <w:rtl/>
+        </w:rPr>
+        <w:lastRenderedPageBreak/>
+        <w:t>مدیریت متمرکز ورود و خروج دانش‌آموزان، معلمان، کارکنان و مراجعین</w:t>
+      </w:r>
+    </w:p>
+    <w:p>
+      <w:pPr>
+        <w:pStyle w:val="ListParagraph"/>
         <w:numPr>
           <w:ilvl w:val="0"/>
-          <w:numId w:val="8"/>
+          <w:numId w:val="13"/>
         </w:numPr>
-        <w:rPr>
-          <w:rFonts w:cs="IRANSans"/>
-          <w:rtl/>
-        </w:rPr>
-      </w:pPr>
-      <w:r>
-        <w:rPr>
-          <w:rFonts w:cs="IRANSans"/>
-          <w:rtl/>
-        </w:rPr>
-        <w:t xml:space="preserve">سناریوهای عملیاتی مدرسه </w:t>
-      </w:r>
-    </w:p>
-    <w:p>
-      <w:pPr>
-        <w:pStyle w:val="Heading1"/>
+      </w:pPr>
+      <w:r>
+        <w:rPr>
+          <w:rtl/>
+        </w:rPr>
+        <w:t>کنترل دسترسی به کلاس‌ها، آزمایشگاه‌ها، دفاتر اداری و فضاهای حساس</w:t>
+      </w:r>
+    </w:p>
+    <w:p>
+      <w:pPr>
+        <w:pStyle w:val="ListParagraph"/>
         <w:numPr>
           <w:ilvl w:val="0"/>
-          <w:numId w:val="8"/>
+          <w:numId w:val="13"/>
         </w:numPr>
-        <w:rPr>
-          <w:rFonts w:cs="IRANSans"/>
-          <w:rtl/>
-        </w:rPr>
-      </w:pPr>
-      <w:r>
-        <w:rPr>
-          <w:rFonts w:cs="IRANSans"/>
-          <w:rtl/>
-        </w:rPr>
-        <w:t>راهکارهای نرم‌افزاری</w:t>
-      </w:r>
-      <w:r>
-        <w:rPr>
-          <w:rFonts w:cs="IRANSans"/>
-          <w:rtl/>
-        </w:rPr>
-        <w:t xml:space="preserve"> پیشنهادی</w:t>
-      </w:r>
-    </w:p>
-    <w:p>
-      <w:pPr>
-        <w:pStyle w:val="Heading1"/>
+      </w:pPr>
+      <w:r>
+        <w:rPr>
+          <w:rtl/>
+        </w:rPr>
+        <w:t>کاهش وابستگی به فرآیندهای دستی و کنترل‌های سنتی</w:t>
+      </w:r>
+    </w:p>
+    <w:p>
+      <w:pPr>
+        <w:pStyle w:val="ListParagraph"/>
         <w:numPr>
           <w:ilvl w:val="0"/>
-          <w:numId w:val="8"/>
+          <w:numId w:val="13"/>
         </w:numPr>
-        <w:rPr>
-          <w:rFonts w:cs="IRANSans"/>
-          <w:rtl/>
-        </w:rPr>
-      </w:pPr>
-      <w:r>
-        <w:rPr>
-          <w:rFonts w:cs="IRANSans"/>
-          <w:rtl/>
-        </w:rPr>
-        <w:t xml:space="preserve">راهکارهای سخت‌افزاری </w:t>
-      </w:r>
-      <w:r>
-        <w:rPr>
-          <w:rFonts w:cs="IRANSans"/>
-          <w:rtl/>
-        </w:rPr>
-        <w:t>پیشنهادی</w:t>
-      </w:r>
-    </w:p>
-    <w:p>
-      <w:pPr>
-        <w:pStyle w:val="Heading1"/>
+      </w:pPr>
+      <w:r>
+        <w:rPr>
+          <w:rtl/>
+        </w:rPr>
+        <w:t>ثبت و رهگیری کامل رویدادهای تردد افراد و خودروها</w:t>
+      </w:r>
+    </w:p>
+    <w:p>
+      <w:pPr>
+        <w:pStyle w:val="ListParagraph"/>
         <w:numPr>
           <w:ilvl w:val="0"/>
-          <w:numId w:val="8"/>
+          <w:numId w:val="13"/>
         </w:numPr>
-        <w:rPr>
-          <w:rFonts w:cs="IRANSans"/>
-          <w:rtl/>
-        </w:rPr>
-      </w:pPr>
-      <w:r>
-        <w:rPr>
-          <w:rFonts w:cs="IRANSans"/>
-          <w:rtl/>
-        </w:rPr>
-        <w:t>گزینه‌های قابل انتخاب برای کارفرما</w:t>
-      </w:r>
-    </w:p>
-    <w:p>
-      <w:pPr>
-        <w:pStyle w:val="Heading1"/>
+      </w:pPr>
+      <w:r>
+        <w:rPr>
+          <w:rtl/>
+        </w:rPr>
+        <w:t>فراهم کردن امکان گزارش‌گیری مدیریتی و امنیتی</w:t>
+      </w:r>
+    </w:p>
+    <w:p>
+      <w:pPr>
+        <w:pStyle w:val="ListParagraph"/>
         <w:numPr>
           <w:ilvl w:val="0"/>
-          <w:numId w:val="8"/>
+          <w:numId w:val="13"/>
         </w:numPr>
-        <w:rPr>
-          <w:rFonts w:cs="IRANSans"/>
-          <w:rtl/>
-        </w:rPr>
-      </w:pPr>
-      <w:r>
-        <w:rPr>
-          <w:rFonts w:cs="IRANSans"/>
-          <w:rtl/>
-        </w:rPr>
-        <w:t>گزینه‌های پیشنهادی پیاده‌سازی</w:t>
-      </w:r>
-    </w:p>
-    <w:p>
-      <w:pPr>
-        <w:pStyle w:val="Heading1"/>
+      </w:pPr>
+      <w:r>
+        <w:rPr>
+          <w:rtl/>
+        </w:rPr>
+        <w:t>مدیریت هوشمند پارکینگ، خودروهای مجاز و خودروهای مهمان</w:t>
+      </w:r>
+    </w:p>
+    <w:p>
+      <w:pPr>
+        <w:pStyle w:val="ListParagraph"/>
         <w:numPr>
           <w:ilvl w:val="0"/>
-          <w:numId w:val="8"/>
+          <w:numId w:val="13"/>
         </w:numPr>
-        <w:rPr>
-          <w:rFonts w:cs="IRANSans"/>
-          <w:rtl/>
-        </w:rPr>
-      </w:pPr>
-      <w:r>
-        <w:rPr>
-          <w:rFonts w:cs="IRANSans"/>
-          <w:rtl/>
-        </w:rPr>
-        <w:t>یکپارچه‌سازی با سامانه‌های دیگر</w:t>
-      </w:r>
-    </w:p>
-    <w:p>
-      <w:pPr>
-        <w:pStyle w:val="Heading1"/>
+      </w:pPr>
+      <w:r>
+        <w:rPr>
+          <w:rtl/>
+        </w:rPr>
+        <w:t>ایجاد امکان یکپارچه‌سازی با سامانه‌های دیگر مدرسه و سامانه‌های امنیتی</w:t>
+      </w:r>
+    </w:p>
+    <w:p>
+      <w:pPr>
+        <w:pStyle w:val="ListParagraph"/>
         <w:numPr>
           <w:ilvl w:val="0"/>
-          <w:numId w:val="8"/>
+          <w:numId w:val="13"/>
         </w:numPr>
-        <w:rPr>
-          <w:rFonts w:cs="IRANSans"/>
-          <w:rtl/>
-        </w:rPr>
-      </w:pPr>
-      <w:r>
-        <w:rPr>
-          <w:rFonts w:cs="IRANSans"/>
+      </w:pPr>
+      <w:r>
+        <w:rPr>
+          <w:rtl/>
+        </w:rPr>
+        <w:t>فراهم نمودن بستری قابل توسعه برای نیازهای آینده مدرسه</w:t>
+      </w:r>
+    </w:p>
+    <w:p>
+      <w:pPr>
+        <w:pStyle w:val="Heading2"/>
+      </w:pPr>
+      <w:r>
+        <w:rPr>
+          <w:rtl/>
+        </w:rPr>
+        <w:t>نیازمندی‌های مرتبط با دانش‌آموزان</w:t>
+      </w:r>
+    </w:p>
+    <w:p>
+      <w:r>
+        <w:rPr>
+          <w:rtl/>
+        </w:rPr>
+        <w:t>یکی از مهم‌ترین بخش‌های پروژه، مدیریت تردد دانش‌آموزان است. راهکار پیشنهادی باید امکان ثبت ورود و خروج دانش‌آموزان، کنترل دسترسی به فضاهای مجاز، مدیریت تأخیرها و ارائه گزارش‌های مرتبط را فراهم کند</w:t>
+      </w:r>
+      <w:r>
+        <w:t>.</w:t>
+      </w:r>
+    </w:p>
+    <w:p>
+      <w:r>
+        <w:rPr>
+          <w:rtl/>
+        </w:rPr>
+        <w:t xml:space="preserve">با توجه به حساسیت محیط آموزشی، هرگونه استفاده از فناوری‌های احراز هویت، از جمله کارت، </w:t>
+      </w:r>
+      <w:r>
+        <w:t>QR Code</w:t>
+      </w:r>
+      <w:r>
+        <w:rPr>
+          <w:rtl/>
+        </w:rPr>
+        <w:t>، تشخیص چهره یا سایر روش‌ها، باید متناسب با سیاست‌های مدرسه، الزامات حریم خصوصی و سطح پذیرش کارفرما انتخاب شود</w:t>
+      </w:r>
+      <w:r>
+        <w:t>.</w:t>
+      </w:r>
+    </w:p>
+    <w:p>
+      <w:pPr>
+        <w:pStyle w:val="Heading2"/>
+      </w:pPr>
+      <w:r>
+        <w:rPr>
+          <w:rtl/>
+        </w:rPr>
+        <w:t>نیازمندی‌های مرتبط با معلمان و کارکنان</w:t>
+      </w:r>
+    </w:p>
+    <w:p>
+      <w:r>
+        <w:rPr>
+          <w:rtl/>
+        </w:rPr>
+        <w:t>معلمان و کارکنان مدرسه نیازمند دسترسی سریع، امن و قابل کنترل به فضاهای مختلف مانند ورودی‌های اصلی، کلاس‌ها، اتاق معلمان، دفاتر اداری، آزمایشگاه‌ها، پارکینگ و سایر بخش‌های مجاز هستند</w:t>
+      </w:r>
+      <w:r>
+        <w:t>.</w:t>
+      </w:r>
+    </w:p>
+    <w:p>
+      <w:r>
+        <w:rPr>
+          <w:rtl/>
+        </w:rPr>
+        <w:t>سامانه باید امکان تعریف سطح دسترسی متفاوت برای گروه‌های مختلف کارکنان را فراهم کند. برای مثال، سطح دسترسی یک معلم، نیروی اداری، نیروی خدماتی، حراست یا مدیر مدرسه می‌تواند متفاوت باشد</w:t>
+      </w:r>
+      <w:r>
+        <w:t>.</w:t>
+      </w:r>
+    </w:p>
+    <w:p>
+      <w:pPr>
+        <w:pStyle w:val="Heading2"/>
+      </w:pPr>
+      <w:r>
+        <w:rPr>
+          <w:rtl/>
+        </w:rPr>
+        <w:lastRenderedPageBreak/>
+        <w:t>نیازمندی‌های مرتبط با والدین، مهمانان و پیمانکاران</w:t>
+      </w:r>
+    </w:p>
+    <w:p>
+      <w:r>
+        <w:rPr>
+          <w:rtl/>
+        </w:rPr>
+        <w:t xml:space="preserve">ورود افراد </w:t>
+      </w:r>
+      <w:proofErr w:type="spellStart"/>
+      <w:r>
+        <w:rPr>
+          <w:rtl/>
+        </w:rPr>
+        <w:t>غیرثابت</w:t>
+      </w:r>
+      <w:proofErr w:type="spellEnd"/>
+      <w:r>
+        <w:rPr>
+          <w:rtl/>
+        </w:rPr>
+        <w:t xml:space="preserve"> به مدرسه باید تحت کنترل و قابل رهگیری باشد. والدین، مهمانان و پیمانکاران ممکن است فقط در زمان‌های مشخص و برای هدف مشخص اجازه ورود داشته باشند</w:t>
+      </w:r>
+      <w:r>
+        <w:t>.</w:t>
+      </w:r>
+    </w:p>
+    <w:p>
+      <w:r>
+        <w:rPr>
+          <w:rtl/>
+        </w:rPr>
+        <w:t>راهکار پیشنهادی باید امکان ثبت درخواست مراجعه، صدور مجوز ورود، تعیین محدوده مجاز تردد، ثبت زمان ورود و خروج، مدیریت خودروهای مهمان و تهیه گزارش‌های مربوط به مراجعین را فراهم کند</w:t>
+      </w:r>
+      <w:r>
+        <w:t>.</w:t>
+      </w:r>
+    </w:p>
+    <w:p>
+      <w:pPr>
+        <w:pStyle w:val="Heading2"/>
+      </w:pPr>
+      <w:r>
+        <w:rPr>
+          <w:rtl/>
+        </w:rPr>
+        <w:t>نیازمندی‌های مرتبط با فضاهای آموزشی و حساس</w:t>
+      </w:r>
+    </w:p>
+    <w:p>
+      <w:r>
+        <w:rPr>
+          <w:rtl/>
+        </w:rPr>
+        <w:t xml:space="preserve">در مدرسه، همه </w:t>
+      </w:r>
+      <w:proofErr w:type="spellStart"/>
+      <w:r>
+        <w:rPr>
+          <w:rtl/>
+        </w:rPr>
+        <w:t>فضاها</w:t>
+      </w:r>
+      <w:proofErr w:type="spellEnd"/>
+      <w:r>
+        <w:rPr>
+          <w:rtl/>
+        </w:rPr>
+        <w:t xml:space="preserve"> سطح امنیتی یکسانی ندارند. کلاس‌های درس، آزمایشگاه‌ها، کتابخانه، دفاتر اداری، اتاق سرور، انبارها، سالن امتحانات و سایر فضاهای حساس ممکن است نیازمند سیاست‌های دسترسی متفاوت باشند</w:t>
+      </w:r>
+      <w:r>
+        <w:t>.</w:t>
+      </w:r>
+    </w:p>
+    <w:p>
+      <w:r>
+        <w:rPr>
+          <w:rtl/>
+        </w:rPr>
+        <w:t>سامانه باید بتواند برای هر فضا یا ناحیه، سطح دسترسی مشخص، زمان‌بندی مجاز و گروه‌های مجاز را تعریف کند. به این ترتیب، ورود افراد به هر بخش بر اساس نقش، زمان، مجوز و سیاست امنیتی مدرسه کنترل خواهد شد</w:t>
+      </w:r>
+      <w:r>
+        <w:t>.</w:t>
+      </w:r>
+    </w:p>
+    <w:p>
+      <w:pPr>
+        <w:pStyle w:val="Heading2"/>
+      </w:pPr>
+      <w:r>
+        <w:rPr>
+          <w:rtl/>
+        </w:rPr>
+        <w:t>نیازمندی‌های مرتبط با پارکینگ و خودروها</w:t>
+      </w:r>
+    </w:p>
+    <w:p>
+      <w:r>
+        <w:rPr>
+          <w:rtl/>
+        </w:rPr>
+        <w:t>مدرسه ممکن است دارای پارکینگ یا مسیرهای تردد خودرو برای معلمان، کارکنان، والدین، مهمانان، پیمانکاران و اتوبوس‌های مدرسه باشد. مدیریت این بخش نیازمند کنترل ورود و خروج خودروها، ثبت اطلاعات خودرو، مدیریت ظرفیت و تفکیک گروه‌های مجاز است</w:t>
+      </w:r>
+      <w:r>
+        <w:t>.</w:t>
+      </w:r>
+    </w:p>
+    <w:p>
+      <w:r>
+        <w:rPr>
+          <w:rtl/>
+        </w:rPr>
+        <w:t xml:space="preserve">بسته به سیاست کارفرما، امکان استفاده از روش‌هایی مانند پلاک‌خوان، </w:t>
+      </w:r>
+      <w:r>
+        <w:t>RFID / UHF</w:t>
+      </w:r>
+      <w:r>
+        <w:rPr>
+          <w:rtl/>
+        </w:rPr>
+        <w:t>، کارت، ثبت دستی یا ترکیبی از این روش‌ها قابل بررسی خواهد بود</w:t>
+      </w:r>
+      <w:r>
+        <w:t>.</w:t>
+      </w:r>
+    </w:p>
+    <w:p>
+      <w:pPr>
+        <w:pStyle w:val="Heading2"/>
+      </w:pPr>
+      <w:r>
+        <w:rPr>
+          <w:rtl/>
+        </w:rPr>
+        <w:t>نیازمندی‌های مرتبط با مانیتورینگ و گزارش‌گیری</w:t>
+      </w:r>
+    </w:p>
+    <w:p>
+      <w:r>
+        <w:rPr>
+          <w:rtl/>
+        </w:rPr>
+        <w:t xml:space="preserve">یکی از اهداف اصلی پروژه، ایجاد دید مدیریتی و امنیتی نسبت به وضعیت تردد در مدرسه است. سامانه باید امکان مشاهده رویدادها، وضعیت درب‌ها و گیت‌ها، </w:t>
+      </w:r>
+      <w:r>
+        <w:rPr>
+          <w:rtl/>
+        </w:rPr>
+        <w:lastRenderedPageBreak/>
+        <w:t>هشدارهای امنیتی، گزارش‌های تردد، گزارش‌های مراجعین و گزارش‌های پارکینگ را فراهم کند</w:t>
+      </w:r>
+      <w:r>
+        <w:t>.</w:t>
+      </w:r>
+    </w:p>
+    <w:p>
+      <w:r>
+        <w:rPr>
+          <w:rtl/>
+        </w:rPr>
+        <w:t>این قابلیت به مدیران مدرسه و تیم امنیتی کمک می‌کند تا تصمیم‌گیری سریع‌تر، دقیق‌تر و مستندتری داشته باشند</w:t>
+      </w:r>
+      <w:r>
+        <w:t>.</w:t>
+      </w:r>
+    </w:p>
+    <w:p>
+      <w:pPr>
+        <w:pStyle w:val="Heading2"/>
+      </w:pPr>
+      <w:r>
+        <w:rPr>
+          <w:rtl/>
+        </w:rPr>
+        <w:t>نیازمندی‌های مرتبط با یکپارچه‌سازی</w:t>
+      </w:r>
+    </w:p>
+    <w:p>
+      <w:r>
+        <w:rPr>
+          <w:rtl/>
+        </w:rPr>
+        <w:t xml:space="preserve">راهکار پیشنهادی باید قابلیت </w:t>
+      </w:r>
+      <w:proofErr w:type="spellStart"/>
+      <w:r>
+        <w:rPr>
+          <w:rtl/>
+        </w:rPr>
+        <w:t>یکپارچه‌سازی</w:t>
+      </w:r>
+      <w:proofErr w:type="spellEnd"/>
+      <w:r>
+        <w:rPr>
+          <w:rtl/>
+        </w:rPr>
+        <w:t xml:space="preserve"> با سامانه‌های دیگر را داشته باشد؛ از جمله سامانه اطلاعات دانش‌آموزان، سامانه منابع انسانی، سامانه پیامک و ایمیل، سامانه نظارت تصویری، سامانه اعلام و اطفای حریق و سایر سامانه‌های مورد نیاز کارفرما</w:t>
+      </w:r>
+      <w:r>
+        <w:t>.</w:t>
+      </w:r>
+    </w:p>
+    <w:p>
+      <w:r>
+        <w:rPr>
+          <w:rtl/>
+        </w:rPr>
+        <w:t>جزئیات این یکپارچه‌سازی‌ها پس از مشخص شدن سامانه‌های موجود، سطح دسترسی مورد نیاز و سیاست‌های فنی کارفرما تعیین خواهد شد</w:t>
+      </w:r>
+      <w:r>
+        <w:t>.</w:t>
+      </w:r>
+    </w:p>
+    <w:p>
+      <w:pPr>
+        <w:pStyle w:val="Heading2"/>
+      </w:pPr>
+      <w:r>
+        <w:rPr>
+          <w:rtl/>
+        </w:rPr>
+        <w:t>جمع‌بندی فصل</w:t>
+      </w:r>
+    </w:p>
+    <w:p>
+      <w:r>
+        <w:rPr>
+          <w:rtl/>
+        </w:rPr>
+        <w:t>نیاز اصلی مدرسه، صرفاً نصب تجهیزات کنترل تردد نیست؛ بلکه ایجاد یک چارچوب یکپارچه برای مدیریت افراد، فضاها، خودروها، رویدادها و گزارش‌ها است. راهکار پیشنهادی باید بتواند امنیت، سهولت استفاده، انعطاف‌پذیری و قابلیت توسعه را هم‌زمان پوشش دهد و متناسب با سیاست‌های عملیاتی مدرسه قابل تنظیم باشد</w:t>
+      </w:r>
+      <w:r>
+        <w:t>.</w:t>
+      </w:r>
+    </w:p>
+    <w:p>
+      <w:pPr>
+        <w:rPr>
+          <w:rtl/>
+        </w:rPr>
+      </w:pPr>
+    </w:p>
+    <w:p>
+      <w:pPr>
+        <w:pStyle w:val="Heading1"/>
+        <w:rPr>
+          <w:rtl/>
+        </w:rPr>
+      </w:pPr>
+      <w:r>
+        <w:rPr>
+          <w:rtl/>
+        </w:rPr>
+        <w:lastRenderedPageBreak/>
+        <w:t xml:space="preserve">راهکار یکپارچه پیشنهادی </w:t>
+      </w:r>
+    </w:p>
+    <w:p>
+      <w:pPr>
+        <w:pStyle w:val="Heading1"/>
+        <w:rPr>
+          <w:rtl/>
+        </w:rPr>
+      </w:pPr>
+      <w:r>
+        <w:rPr>
+          <w:rtl/>
+        </w:rPr>
+        <w:t xml:space="preserve">سناریوهای عملیاتی مدرسه </w:t>
+      </w:r>
+    </w:p>
+    <w:p>
+      <w:pPr>
+        <w:pStyle w:val="Heading1"/>
+        <w:rPr>
+          <w:rtl/>
+        </w:rPr>
+      </w:pPr>
+      <w:r>
+        <w:rPr>
+          <w:rtl/>
+        </w:rPr>
+        <w:t>راهکارهای نرم‌افزاری</w:t>
+      </w:r>
+      <w:r>
+        <w:rPr>
+          <w:rtl/>
+        </w:rPr>
+        <w:t xml:space="preserve"> پیشنهادی</w:t>
+      </w:r>
+    </w:p>
+    <w:p>
+      <w:pPr>
+        <w:pStyle w:val="Heading1"/>
+        <w:rPr>
+          <w:rtl/>
+        </w:rPr>
+      </w:pPr>
+      <w:r>
+        <w:rPr>
+          <w:rtl/>
+        </w:rPr>
+        <w:t xml:space="preserve">راهکارهای سخت‌افزاری </w:t>
+      </w:r>
+      <w:r>
+        <w:rPr>
+          <w:rtl/>
+        </w:rPr>
+        <w:t>پیشنهادی</w:t>
+      </w:r>
+    </w:p>
+    <w:p>
+      <w:pPr>
+        <w:pStyle w:val="Heading1"/>
+        <w:rPr>
+          <w:rtl/>
+        </w:rPr>
+      </w:pPr>
+      <w:r>
+        <w:rPr>
+          <w:rtl/>
+        </w:rPr>
+        <w:t>گزینه‌های قابل انتخاب برای کارفرما</w:t>
+      </w:r>
+    </w:p>
+    <w:p>
+      <w:pPr>
+        <w:pStyle w:val="Heading1"/>
+        <w:rPr>
+          <w:rtl/>
+        </w:rPr>
+      </w:pPr>
+      <w:r>
+        <w:rPr>
+          <w:rtl/>
+        </w:rPr>
+        <w:t>گزینه‌های پیشنهادی پیاده‌سازی</w:t>
+      </w:r>
+    </w:p>
+    <w:p>
+      <w:pPr>
+        <w:pStyle w:val="Heading1"/>
+        <w:rPr>
+          <w:rtl/>
+        </w:rPr>
+      </w:pPr>
+      <w:r>
+        <w:rPr>
+          <w:rtl/>
+        </w:rPr>
+        <w:t>یکپارچه‌سازی با سامانه‌های دیگر</w:t>
+      </w:r>
+    </w:p>
+    <w:p>
+      <w:pPr>
+        <w:pStyle w:val="Heading1"/>
+        <w:rPr>
+          <w:rtl/>
+        </w:rPr>
+      </w:pPr>
+      <w:r>
+        <w:rPr>
           <w:rtl/>
         </w:rPr>
         <w:t>امنیت، مانیتورینگ و گزارش‌گیری</w:t>
@@ -1426,18 +1482,12 @@
     <w:p>
       <w:pPr>
         <w:pStyle w:val="Heading1"/>
-        <w:numPr>
-          <w:ilvl w:val="0"/>
-          <w:numId w:val="8"/>
-        </w:numPr>
-        <w:rPr>
-          <w:rFonts w:cs="IRANSans"/>
-          <w:rtl/>
-        </w:rPr>
-      </w:pPr>
-      <w:r>
-        <w:rPr>
-          <w:rFonts w:cs="IRANSans"/>
+        <w:rPr>
+          <w:rtl/>
+        </w:rPr>
+      </w:pPr>
+      <w:r>
+        <w:rPr>
           <w:rtl/>
         </w:rPr>
         <w:t xml:space="preserve">روش اجرای پروژه </w:t>
@@ -1446,18 +1496,12 @@
     <w:p>
       <w:pPr>
         <w:pStyle w:val="Heading1"/>
-        <w:numPr>
-          <w:ilvl w:val="0"/>
-          <w:numId w:val="8"/>
-        </w:numPr>
-        <w:rPr>
-          <w:rFonts w:cs="IRANSans"/>
-          <w:rtl/>
-        </w:rPr>
-      </w:pPr>
-      <w:r>
-        <w:rPr>
-          <w:rFonts w:cs="IRANSans"/>
+        <w:rPr>
+          <w:rtl/>
+        </w:rPr>
+      </w:pPr>
+      <w:r>
+        <w:rPr>
           <w:rtl/>
         </w:rPr>
         <w:t>جمع‌بندی</w:t>
@@ -1466,31 +1510,21 @@
     <w:p>
       <w:pPr>
         <w:pStyle w:val="Heading1"/>
-        <w:numPr>
-          <w:ilvl w:val="0"/>
-          <w:numId w:val="8"/>
-        </w:numPr>
-        <w:rPr>
-          <w:rFonts w:cs="IRANSans"/>
-          <w:rtl/>
-        </w:rPr>
-      </w:pPr>
-      <w:r>
-        <w:rPr>
-          <w:rFonts w:cs="IRANSans"/>
+        <w:rPr>
+          <w:rtl/>
+        </w:rPr>
+      </w:pPr>
+      <w:r>
+        <w:rPr>
           <w:rtl/>
         </w:rPr>
         <w:t xml:space="preserve">معرفی </w:t>
       </w:r>
       <w:r>
-        <w:rPr>
-          <w:rFonts w:cs="IRANSans"/>
-        </w:rPr>
         <w:t>HLWL</w:t>
       </w:r>
       <w:r>
         <w:rPr>
-          <w:rFonts w:cs="IRANSans"/>
           <w:rtl/>
         </w:rPr>
         <w:t xml:space="preserve"> </w:t>
@@ -1499,31 +1533,22 @@
     <w:p>
       <w:pPr>
         <w:pStyle w:val="Heading1"/>
-        <w:numPr>
-          <w:ilvl w:val="0"/>
-          <w:numId w:val="8"/>
-        </w:numPr>
-        <w:rPr>
-          <w:rFonts w:cs="IRANSans"/>
-          <w:rtl/>
-        </w:rPr>
-      </w:pPr>
-      <w:r>
-        <w:rPr>
-          <w:rFonts w:cs="IRANSans"/>
-          <w:rtl/>
-        </w:rPr>
-        <w:lastRenderedPageBreak/>
+        <w:rPr>
+          <w:rtl/>
+        </w:rPr>
+      </w:pPr>
+      <w:r>
+        <w:rPr>
+          <w:rtl/>
+        </w:rPr>
         <w:t>پیوست‌ها</w:t>
       </w:r>
     </w:p>
     <w:p>
       <w:pPr>
-        <w:bidi/>
-        <w:rPr>
-          <w:rFonts w:ascii="IRANSans" w:hAnsi="IRANSans" w:cs="IRANSans"/>
-          <w:rtl/>
-          <w:lang w:val="en-US" w:bidi="fa-IR"/>
+        <w:rPr>
+          <w:rtl/>
+          <w:lang w:val="en-US"/>
         </w:rPr>
       </w:pPr>
     </w:p>
@@ -2108,10 +2133,11 @@
   <w:abstractNum w:abstractNumId="5" w15:restartNumberingAfterBreak="0">
     <w:nsid w:val="35EE2711"/>
     <w:multiLevelType w:val="multilevel"/>
-    <w:tmpl w:val="4AE46FAC"/>
+    <w:tmpl w:val="C90C4A26"/>
     <w:lvl w:ilvl="0">
       <w:start w:val="1"/>
       <w:numFmt w:val="decimal"/>
+      <w:pStyle w:val="Heading1"/>
       <w:suff w:val="space"/>
       <w:lvlText w:val="%1."/>
       <w:lvlJc w:val="left"/>
@@ -2125,6 +2151,7 @@
     <w:lvl w:ilvl="1">
       <w:start w:val="1"/>
       <w:numFmt w:val="decimal"/>
+      <w:pStyle w:val="Heading2"/>
       <w:suff w:val="space"/>
       <w:lvlText w:val="%1.%2."/>
       <w:lvlJc w:val="left"/>
@@ -2745,6 +2772,268 @@
     </w:lvl>
   </w:abstractNum>
   <w:abstractNum w:abstractNumId="10" w15:restartNumberingAfterBreak="0">
+    <w:nsid w:val="610B1F1B"/>
+    <w:multiLevelType w:val="hybridMultilevel"/>
+    <w:tmpl w:val="FE42F452"/>
+    <w:lvl w:ilvl="0" w:tplc="04070001">
+      <w:start w:val="1"/>
+      <w:numFmt w:val="bullet"/>
+      <w:lvlText w:val=""/>
+      <w:lvlJc w:val="left"/>
+      <w:pPr>
+        <w:ind w:left="720" w:hanging="360"/>
+      </w:pPr>
+      <w:rPr>
+        <w:rFonts w:ascii="Symbol" w:hAnsi="Symbol" w:hint="default"/>
+      </w:rPr>
+    </w:lvl>
+    <w:lvl w:ilvl="1" w:tplc="04070003" w:tentative="1">
+      <w:start w:val="1"/>
+      <w:numFmt w:val="bullet"/>
+      <w:lvlText w:val="o"/>
+      <w:lvlJc w:val="left"/>
+      <w:pPr>
+        <w:ind w:left="1440" w:hanging="360"/>
+      </w:pPr>
+      <w:rPr>
+        <w:rFonts w:ascii="Courier New" w:hAnsi="Courier New" w:cs="Courier New" w:hint="default"/>
+      </w:rPr>
+    </w:lvl>
+    <w:lvl w:ilvl="2" w:tplc="04070005" w:tentative="1">
+      <w:start w:val="1"/>
+      <w:numFmt w:val="bullet"/>
+      <w:lvlText w:val=""/>
+      <w:lvlJc w:val="left"/>
+      <w:pPr>
+        <w:ind w:left="2160" w:hanging="360"/>
+      </w:pPr>
+      <w:rPr>
+        <w:rFonts w:ascii="Wingdings" w:hAnsi="Wingdings" w:hint="default"/>
+      </w:rPr>
+    </w:lvl>
+    <w:lvl w:ilvl="3" w:tplc="04070001" w:tentative="1">
+      <w:start w:val="1"/>
+      <w:numFmt w:val="bullet"/>
+      <w:lvlText w:val=""/>
+      <w:lvlJc w:val="left"/>
+      <w:pPr>
+        <w:ind w:left="2880" w:hanging="360"/>
+      </w:pPr>
+      <w:rPr>
+        <w:rFonts w:ascii="Symbol" w:hAnsi="Symbol" w:hint="default"/>
+      </w:rPr>
+    </w:lvl>
+    <w:lvl w:ilvl="4" w:tplc="04070003" w:tentative="1">
+      <w:start w:val="1"/>
+      <w:numFmt w:val="bullet"/>
+      <w:lvlText w:val="o"/>
+      <w:lvlJc w:val="left"/>
+      <w:pPr>
+        <w:ind w:left="3600" w:hanging="360"/>
+      </w:pPr>
+      <w:rPr>
+        <w:rFonts w:ascii="Courier New" w:hAnsi="Courier New" w:cs="Courier New" w:hint="default"/>
+      </w:rPr>
+    </w:lvl>
+    <w:lvl w:ilvl="5" w:tplc="04070005" w:tentative="1">
+      <w:start w:val="1"/>
+      <w:numFmt w:val="bullet"/>
+      <w:lvlText w:val=""/>
+      <w:lvlJc w:val="left"/>
+      <w:pPr>
+        <w:ind w:left="4320" w:hanging="360"/>
+      </w:pPr>
+      <w:rPr>
+        <w:rFonts w:ascii="Wingdings" w:hAnsi="Wingdings" w:hint="default"/>
+      </w:rPr>
+    </w:lvl>
+    <w:lvl w:ilvl="6" w:tplc="04070001" w:tentative="1">
+      <w:start w:val="1"/>
+      <w:numFmt w:val="bullet"/>
+      <w:lvlText w:val=""/>
+      <w:lvlJc w:val="left"/>
+      <w:pPr>
+        <w:ind w:left="5040" w:hanging="360"/>
+      </w:pPr>
+      <w:rPr>
+        <w:rFonts w:ascii="Symbol" w:hAnsi="Symbol" w:hint="default"/>
+      </w:rPr>
+    </w:lvl>
+    <w:lvl w:ilvl="7" w:tplc="04070003" w:tentative="1">
+      <w:start w:val="1"/>
+      <w:numFmt w:val="bullet"/>
+      <w:lvlText w:val="o"/>
+      <w:lvlJc w:val="left"/>
+      <w:pPr>
+        <w:ind w:left="5760" w:hanging="360"/>
+      </w:pPr>
+      <w:rPr>
+        <w:rFonts w:ascii="Courier New" w:hAnsi="Courier New" w:cs="Courier New" w:hint="default"/>
+      </w:rPr>
+    </w:lvl>
+    <w:lvl w:ilvl="8" w:tplc="04070005" w:tentative="1">
+      <w:start w:val="1"/>
+      <w:numFmt w:val="bullet"/>
+      <w:lvlText w:val=""/>
+      <w:lvlJc w:val="left"/>
+      <w:pPr>
+        <w:ind w:left="6480" w:hanging="360"/>
+      </w:pPr>
+      <w:rPr>
+        <w:rFonts w:ascii="Wingdings" w:hAnsi="Wingdings" w:hint="default"/>
+      </w:rPr>
+    </w:lvl>
+  </w:abstractNum>
+  <w:abstractNum w:abstractNumId="11" w15:restartNumberingAfterBreak="0">
+    <w:nsid w:val="6B9B6F31"/>
+    <w:multiLevelType w:val="multilevel"/>
+    <w:tmpl w:val="09963DC0"/>
+    <w:lvl w:ilvl="0">
+      <w:start w:val="1"/>
+      <w:numFmt w:val="bullet"/>
+      <w:lvlText w:val=""/>
+      <w:lvlJc w:val="left"/>
+      <w:pPr>
+        <w:tabs>
+          <w:tab w:val="num" w:pos="720"/>
+        </w:tabs>
+        <w:ind w:left="720" w:hanging="360"/>
+      </w:pPr>
+      <w:rPr>
+        <w:rFonts w:ascii="Symbol" w:hAnsi="Symbol" w:hint="default"/>
+        <w:sz w:val="20"/>
+      </w:rPr>
+    </w:lvl>
+    <w:lvl w:ilvl="1" w:tentative="1">
+      <w:start w:val="1"/>
+      <w:numFmt w:val="bullet"/>
+      <w:lvlText w:val="o"/>
+      <w:lvlJc w:val="left"/>
+      <w:pPr>
+        <w:tabs>
+          <w:tab w:val="num" w:pos="1440"/>
+        </w:tabs>
+        <w:ind w:left="1440" w:hanging="360"/>
+      </w:pPr>
+      <w:rPr>
+        <w:rFonts w:ascii="Courier New" w:hAnsi="Courier New" w:hint="default"/>
+        <w:sz w:val="20"/>
+      </w:rPr>
+    </w:lvl>
+    <w:lvl w:ilvl="2" w:tentative="1">
+      <w:start w:val="1"/>
+      <w:numFmt w:val="bullet"/>
+      <w:lvlText w:val=""/>
+      <w:lvlJc w:val="left"/>
+      <w:pPr>
+        <w:tabs>
+          <w:tab w:val="num" w:pos="2160"/>
+        </w:tabs>
+        <w:ind w:left="2160" w:hanging="360"/>
+      </w:pPr>
+      <w:rPr>
+        <w:rFonts w:ascii="Wingdings" w:hAnsi="Wingdings" w:hint="default"/>
+        <w:sz w:val="20"/>
+      </w:rPr>
+    </w:lvl>
+    <w:lvl w:ilvl="3" w:tentative="1">
+      <w:start w:val="1"/>
+      <w:numFmt w:val="bullet"/>
+      <w:lvlText w:val=""/>
+      <w:lvlJc w:val="left"/>
+      <w:pPr>
+        <w:tabs>
+          <w:tab w:val="num" w:pos="2880"/>
+        </w:tabs>
+        <w:ind w:left="2880" w:hanging="360"/>
+      </w:pPr>
+      <w:rPr>
+        <w:rFonts w:ascii="Wingdings" w:hAnsi="Wingdings" w:hint="default"/>
+        <w:sz w:val="20"/>
+      </w:rPr>
+    </w:lvl>
+    <w:lvl w:ilvl="4" w:tentative="1">
+      <w:start w:val="1"/>
+      <w:numFmt w:val="bullet"/>
+      <w:lvlText w:val=""/>
+      <w:lvlJc w:val="left"/>
+      <w:pPr>
+        <w:tabs>
+          <w:tab w:val="num" w:pos="3600"/>
+        </w:tabs>
+        <w:ind w:left="3600" w:hanging="360"/>
+      </w:pPr>
+      <w:rPr>
+        <w:rFonts w:ascii="Wingdings" w:hAnsi="Wingdings" w:hint="default"/>
+        <w:sz w:val="20"/>
+      </w:rPr>
+    </w:lvl>
+    <w:lvl w:ilvl="5" w:tentative="1">
+      <w:start w:val="1"/>
+      <w:numFmt w:val="bullet"/>
+      <w:lvlText w:val=""/>
+      <w:lvlJc w:val="left"/>
+      <w:pPr>
+        <w:tabs>
+          <w:tab w:val="num" w:pos="4320"/>
+        </w:tabs>
+        <w:ind w:left="4320" w:hanging="360"/>
+      </w:pPr>
+      <w:rPr>
+        <w:rFonts w:ascii="Wingdings" w:hAnsi="Wingdings" w:hint="default"/>
+        <w:sz w:val="20"/>
+      </w:rPr>
+    </w:lvl>
+    <w:lvl w:ilvl="6" w:tentative="1">
+      <w:start w:val="1"/>
+      <w:numFmt w:val="bullet"/>
+      <w:lvlText w:val=""/>
+      <w:lvlJc w:val="left"/>
+      <w:pPr>
+        <w:tabs>
+          <w:tab w:val="num" w:pos="5040"/>
+        </w:tabs>
+        <w:ind w:left="5040" w:hanging="360"/>
+      </w:pPr>
+      <w:rPr>
+        <w:rFonts w:ascii="Wingdings" w:hAnsi="Wingdings" w:hint="default"/>
+        <w:sz w:val="20"/>
+      </w:rPr>
+    </w:lvl>
+    <w:lvl w:ilvl="7" w:tentative="1">
+      <w:start w:val="1"/>
+      <w:numFmt w:val="bullet"/>
+      <w:lvlText w:val=""/>
+      <w:lvlJc w:val="left"/>
+      <w:pPr>
+        <w:tabs>
+          <w:tab w:val="num" w:pos="5760"/>
+        </w:tabs>
+        <w:ind w:left="5760" w:hanging="360"/>
+      </w:pPr>
+      <w:rPr>
+        <w:rFonts w:ascii="Wingdings" w:hAnsi="Wingdings" w:hint="default"/>
+        <w:sz w:val="20"/>
+      </w:rPr>
+    </w:lvl>
+    <w:lvl w:ilvl="8" w:tentative="1">
+      <w:start w:val="1"/>
+      <w:numFmt w:val="bullet"/>
+      <w:lvlText w:val=""/>
+      <w:lvlJc w:val="left"/>
+      <w:pPr>
+        <w:tabs>
+          <w:tab w:val="num" w:pos="6480"/>
+        </w:tabs>
+        <w:ind w:left="6480" w:hanging="360"/>
+      </w:pPr>
+      <w:rPr>
+        <w:rFonts w:ascii="Wingdings" w:hAnsi="Wingdings" w:hint="default"/>
+        <w:sz w:val="20"/>
+      </w:rPr>
+    </w:lvl>
+  </w:abstractNum>
+  <w:abstractNum w:abstractNumId="12" w15:restartNumberingAfterBreak="0">
     <w:nsid w:val="7C2322EA"/>
     <w:multiLevelType w:val="multilevel"/>
     <w:tmpl w:val="5DF62C5A"/>
@@ -2909,7 +3198,7 @@
     <w:abstractNumId w:val="2"/>
   </w:num>
   <w:num w:numId="6" w16cid:durableId="1973973578">
-    <w:abstractNumId w:val="10"/>
+    <w:abstractNumId w:val="12"/>
   </w:num>
   <w:num w:numId="7" w16cid:durableId="2082369485">
     <w:abstractNumId w:val="8"/>
@@ -2925,6 +3214,12 @@
   </w:num>
   <w:num w:numId="11" w16cid:durableId="1242829558">
     <w:abstractNumId w:val="1"/>
+  </w:num>
+  <w:num w:numId="12" w16cid:durableId="648553934">
+    <w:abstractNumId w:val="11"/>
+  </w:num>
+  <w:num w:numId="13" w16cid:durableId="1561205426">
+    <w:abstractNumId w:val="10"/>
   </w:num>
 </w:numbering>
 </file>
@@ -3329,6 +3624,15 @@
   <w:style w:type="paragraph" w:default="1" w:styleId="Normal">
     <w:name w:val="Normal"/>
     <w:qFormat/>
+    <w:rsid w:val="00E039A9"/>
+    <w:pPr>
+      <w:bidi/>
+      <w:jc w:val="both"/>
+    </w:pPr>
+    <w:rPr>
+      <w:rFonts w:ascii="IRANSans" w:hAnsi="IRANSans" w:cs="IRANSans"/>
+      <w:lang w:bidi="fa-IR"/>
+    </w:rPr>
   </w:style>
   <w:style w:type="paragraph" w:styleId="Heading1">
     <w:name w:val="heading 1"/>
@@ -3337,16 +3641,18 @@
     <w:link w:val="Heading1Char"/>
     <w:uiPriority w:val="9"/>
     <w:qFormat/>
-    <w:rsid w:val="00E6475B"/>
+    <w:rsid w:val="00EF5162"/>
     <w:pPr>
       <w:keepNext/>
       <w:keepLines/>
-      <w:bidi/>
+      <w:numPr>
+        <w:numId w:val="8"/>
+      </w:numPr>
       <w:spacing w:before="360" w:after="80"/>
       <w:outlineLvl w:val="0"/>
     </w:pPr>
     <w:rPr>
-      <w:rFonts w:ascii="IRANSans" w:eastAsiaTheme="majorEastAsia" w:hAnsi="IRANSans" w:cstheme="majorBidi"/>
+      <w:rFonts w:eastAsiaTheme="majorEastAsia"/>
       <w:b/>
       <w:color w:val="0F4761" w:themeColor="accent1" w:themeShade="BF"/>
       <w:sz w:val="40"/>
@@ -3355,24 +3661,24 @@
   </w:style>
   <w:style w:type="paragraph" w:styleId="Heading2">
     <w:name w:val="heading 2"/>
-    <w:basedOn w:val="Normal"/>
+    <w:basedOn w:val="Heading1"/>
     <w:next w:val="Normal"/>
     <w:link w:val="Heading2Char"/>
+    <w:autoRedefine/>
     <w:uiPriority w:val="9"/>
     <w:unhideWhenUsed/>
     <w:qFormat/>
-    <w:rsid w:val="00E6475B"/>
+    <w:rsid w:val="00EF5162"/>
     <w:pPr>
-      <w:keepNext/>
-      <w:keepLines/>
-      <w:spacing w:before="160" w:after="80"/>
+      <w:numPr>
+        <w:ilvl w:val="1"/>
+      </w:numPr>
       <w:outlineLvl w:val="1"/>
     </w:pPr>
     <w:rPr>
-      <w:rFonts w:ascii="IRANSans" w:eastAsiaTheme="majorEastAsia" w:hAnsi="IRANSans" w:cstheme="majorBidi"/>
-      <w:color w:val="0F4761" w:themeColor="accent1" w:themeShade="BF"/>
       <w:sz w:val="32"/>
       <w:szCs w:val="32"/>
+      <w:lang w:val="en-US"/>
     </w:rPr>
   </w:style>
   <w:style w:type="paragraph" w:styleId="Heading3">
@@ -3561,9 +3867,9 @@
     <w:basedOn w:val="DefaultParagraphFont"/>
     <w:link w:val="Heading1"/>
     <w:uiPriority w:val="9"/>
-    <w:rsid w:val="00E6475B"/>
+    <w:rsid w:val="00EF5162"/>
     <w:rPr>
-      <w:rFonts w:ascii="IRANSans" w:eastAsiaTheme="majorEastAsia" w:hAnsi="IRANSans" w:cstheme="majorBidi"/>
+      <w:rFonts w:ascii="IRANSans" w:eastAsiaTheme="majorEastAsia" w:hAnsi="IRANSans" w:cs="IRANSans"/>
       <w:b/>
       <w:color w:val="0F4761" w:themeColor="accent1" w:themeShade="BF"/>
       <w:sz w:val="40"/>
@@ -3575,12 +3881,14 @@
     <w:basedOn w:val="DefaultParagraphFont"/>
     <w:link w:val="Heading2"/>
     <w:uiPriority w:val="9"/>
-    <w:rsid w:val="00E6475B"/>
+    <w:rsid w:val="00EF5162"/>
     <w:rPr>
-      <w:rFonts w:ascii="IRANSans" w:eastAsiaTheme="majorEastAsia" w:hAnsi="IRANSans" w:cstheme="majorBidi"/>
+      <w:rFonts w:ascii="IRANSans" w:eastAsiaTheme="majorEastAsia" w:hAnsi="IRANSans" w:cs="IRANSans"/>
+      <w:b/>
       <w:color w:val="0F4761" w:themeColor="accent1" w:themeShade="BF"/>
       <w:sz w:val="32"/>
       <w:szCs w:val="32"/>
+      <w:lang w:val="en-US"/>
     </w:rPr>
   </w:style>
   <w:style w:type="character" w:customStyle="1" w:styleId="Heading3Char">
@@ -3682,13 +3990,15 @@
     <w:link w:val="TitleChar"/>
     <w:uiPriority w:val="10"/>
     <w:qFormat/>
-    <w:rsid w:val="00A3275C"/>
+    <w:rsid w:val="008A1E58"/>
     <w:pPr>
       <w:spacing w:after="80" w:line="240" w:lineRule="auto"/>
       <w:contextualSpacing/>
     </w:pPr>
     <w:rPr>
-      <w:rFonts w:ascii="IRANSans" w:eastAsiaTheme="majorEastAsia" w:hAnsi="IRANSans" w:cstheme="majorBidi"/>
+      <w:rFonts w:eastAsiaTheme="majorEastAsia"/>
+      <w:b/>
+      <w:bCs/>
       <w:spacing w:val="-10"/>
       <w:kern w:val="28"/>
       <w:sz w:val="56"/>
@@ -3700,13 +4010,16 @@
     <w:basedOn w:val="DefaultParagraphFont"/>
     <w:link w:val="Title"/>
     <w:uiPriority w:val="10"/>
-    <w:rsid w:val="00A3275C"/>
+    <w:rsid w:val="008A1E58"/>
     <w:rPr>
-      <w:rFonts w:ascii="IRANSans" w:eastAsiaTheme="majorEastAsia" w:hAnsi="IRANSans" w:cstheme="majorBidi"/>
+      <w:rFonts w:ascii="IRANSans" w:eastAsiaTheme="majorEastAsia" w:hAnsi="IRANSans" w:cs="IRANSans"/>
+      <w:b/>
+      <w:bCs/>
       <w:spacing w:val="-10"/>
       <w:kern w:val="28"/>
       <w:sz w:val="56"/>
       <w:szCs w:val="56"/>
+      <w:lang w:bidi="fa-IR"/>
     </w:rPr>
   </w:style>
   <w:style w:type="paragraph" w:styleId="Subtitle">

</xml_diff>

<commit_message>
2026-06-28 16:31:29 - Proposal: Access control
</commit_message>
<xml_diff>
--- a/01_Proposal/Proposal.docx
+++ b/01_Proposal/Proposal.docx
@@ -1357,17 +1357,754 @@
     <w:p>
       <w:pPr>
         <w:pStyle w:val="Heading1"/>
-        <w:rPr>
-          <w:rtl/>
-        </w:rPr>
-      </w:pPr>
-      <w:r>
-        <w:rPr>
-          <w:rtl/>
+      </w:pPr>
+      <w:r>
+        <w:rPr>
+          <w:rtl/>
+        </w:rPr>
+        <w:t>راهکار یکپارچه پیشنهادی</w:t>
+      </w:r>
+    </w:p>
+    <w:p>
+      <w:pPr>
+        <w:pStyle w:val="Heading2"/>
+        <w:rPr>
+          <w:lang w:val="de-DE"/>
+        </w:rPr>
+      </w:pPr>
+      <w:r>
+        <w:rPr>
+          <w:rtl/>
+          <w:lang w:bidi="ar-SA"/>
+        </w:rPr>
+        <w:t>مقدمه</w:t>
+      </w:r>
+    </w:p>
+    <w:p>
+      <w:r>
+        <w:rPr>
+          <w:rtl/>
+          <w:lang w:bidi="ar-SA"/>
+        </w:rPr>
+        <w:t>امروزه مدیریت امنیت و کنترل تردد در یک مجموعه آموزشی تنها به نصب چند دستگاه کنترل تردد یا دوربین مداربسته محدود نمی‌شود. یک مدرسه مدرن نیازمند راهکاری یکپارچه است که بتواند تمامی فرآیندهای مرتبط با امنیت، مدیریت تردد، مدیریت مراجعین، مدیریت خودروها، نظارت بر رویدادها و گزارش‌گیری را در قالب یک سامانه متمرکز مدیریت کند</w:t>
+      </w:r>
+      <w:r>
+        <w:t>.</w:t>
+      </w:r>
+    </w:p>
+    <w:p>
+      <w:r>
+        <w:rPr>
+          <w:rtl/>
+          <w:lang w:bidi="ar-SA"/>
         </w:rPr>
         <w:lastRenderedPageBreak/>
-        <w:t xml:space="preserve">راهکار یکپارچه پیشنهادی </w:t>
-      </w:r>
+        <w:t>راهکار پیشنهادی</w:t>
+      </w:r>
+      <w:r>
+        <w:t xml:space="preserve"> HLWL </w:t>
+      </w:r>
+      <w:r>
+        <w:rPr>
+          <w:rtl/>
+          <w:lang w:bidi="ar-SA"/>
+        </w:rPr>
+        <w:t>بر پایه پلتفرم یکپارچه</w:t>
+      </w:r>
+      <w:r>
+        <w:t xml:space="preserve"> </w:t>
+      </w:r>
+      <w:proofErr w:type="spellStart"/>
+      <w:r>
+        <w:t>Syncolony</w:t>
+      </w:r>
+      <w:proofErr w:type="spellEnd"/>
+      <w:r>
+        <w:rPr>
+          <w:rtl/>
+          <w:lang w:bidi="ar-SA"/>
+        </w:rPr>
+        <w:t>، با همین رویکرد طراحی شده است؛ به گونه‌ای که تمامی اجزای امنیت فیزیکی مدرسه در قالب یک سامانه واحد با یکدیگر ارتباط داشته باشند و اطلاعات میان آن‌ها به صورت یکپارچه تبادل شود</w:t>
+      </w:r>
+      <w:r>
+        <w:t>.</w:t>
+      </w:r>
+    </w:p>
+    <w:p>
+      <w:pPr>
+        <w:pStyle w:val="Heading2"/>
+        <w:rPr>
+          <w:lang w:val="de-DE"/>
+        </w:rPr>
+      </w:pPr>
+      <w:r>
+        <w:rPr>
+          <w:rtl/>
+          <w:lang w:bidi="ar-SA"/>
+        </w:rPr>
+        <w:t>رویکرد طراحی راهکار</w:t>
+      </w:r>
+    </w:p>
+    <w:p>
+      <w:r>
+        <w:rPr>
+          <w:rtl/>
+          <w:lang w:bidi="ar-SA"/>
+        </w:rPr>
+        <w:t>در این پروژه، راهکار از دیدگاه عملکردهای مدرسه طراحی می‌شود، نه از دیدگاه تجهیزات</w:t>
+      </w:r>
+      <w:r>
+        <w:t>.</w:t>
+      </w:r>
+    </w:p>
+    <w:p>
+      <w:r>
+        <w:rPr>
+          <w:rtl/>
+          <w:lang w:bidi="ar-SA"/>
+        </w:rPr>
+        <w:t>در این رویکرد، ابتدا فرآیندهای عملیاتی مدرسه، نقش کاربران، نواحی مختلف، سیاست‌های امنیتی و نیازهای مدیریتی بررسی شده و سپس مناسب‌ترین روش پیاده‌سازی برای هر بخش انتخاب می‌شود</w:t>
+      </w:r>
+      <w:r>
+        <w:t>.</w:t>
+      </w:r>
+    </w:p>
+    <w:p>
+      <w:r>
+        <w:rPr>
+          <w:rtl/>
+          <w:lang w:bidi="ar-SA"/>
+        </w:rPr>
+        <w:t>این رویکرد باعث می‌شود تجهیزات، نرم‌افزارها و فناوری‌های مورد استفاده در خدمت اهداف عملیاتی مدرسه قرار گیرند و امکان توسعه سامانه در آینده نیز حفظ شود</w:t>
+      </w:r>
+      <w:r>
+        <w:t>.</w:t>
+      </w:r>
+    </w:p>
+    <w:p>
+      <w:pPr>
+        <w:pStyle w:val="Heading2"/>
+        <w:rPr>
+          <w:lang w:val="de-DE"/>
+        </w:rPr>
+      </w:pPr>
+      <w:r>
+        <w:rPr>
+          <w:rtl/>
+          <w:lang w:bidi="ar-SA"/>
+        </w:rPr>
+        <w:t>اجزای اصلی راهکار</w:t>
+      </w:r>
+    </w:p>
+    <w:p>
+      <w:r>
+        <w:rPr>
+          <w:rtl/>
+          <w:lang w:bidi="ar-SA"/>
+        </w:rPr>
+        <w:t>راهکار پیشنهادی شامل مجموعه‌ای از زیرسامانه‌های یکپارچه است که به صورت متمرکز مدیریت می‌شوند. مهم‌ترین اجزای این راهکار عبارت‌اند از</w:t>
+      </w:r>
+      <w:r>
+        <w:t>:</w:t>
+      </w:r>
+    </w:p>
+    <w:p>
+      <w:pPr>
+        <w:pStyle w:val="ListParagraph"/>
+        <w:numPr>
+          <w:ilvl w:val="0"/>
+          <w:numId w:val="16"/>
+        </w:numPr>
+      </w:pPr>
+      <w:r>
+        <w:rPr>
+          <w:rtl/>
+          <w:lang w:bidi="ar-SA"/>
+        </w:rPr>
+        <w:t>مدیریت کنترل تردد افراد</w:t>
+      </w:r>
+    </w:p>
+    <w:p>
+      <w:pPr>
+        <w:pStyle w:val="ListParagraph"/>
+        <w:numPr>
+          <w:ilvl w:val="0"/>
+          <w:numId w:val="16"/>
+        </w:numPr>
+      </w:pPr>
+      <w:r>
+        <w:rPr>
+          <w:rtl/>
+          <w:lang w:bidi="ar-SA"/>
+        </w:rPr>
+        <w:t>مدیریت کنترل تردد خودروها</w:t>
+      </w:r>
+    </w:p>
+    <w:p>
+      <w:pPr>
+        <w:pStyle w:val="ListParagraph"/>
+        <w:numPr>
+          <w:ilvl w:val="0"/>
+          <w:numId w:val="16"/>
+        </w:numPr>
+      </w:pPr>
+      <w:r>
+        <w:rPr>
+          <w:rtl/>
+          <w:lang w:bidi="ar-SA"/>
+        </w:rPr>
+        <w:t>مدیریت سطوح دسترسی</w:t>
+      </w:r>
+    </w:p>
+    <w:p>
+      <w:pPr>
+        <w:pStyle w:val="ListParagraph"/>
+        <w:numPr>
+          <w:ilvl w:val="0"/>
+          <w:numId w:val="16"/>
+        </w:numPr>
+      </w:pPr>
+      <w:r>
+        <w:rPr>
+          <w:rtl/>
+          <w:lang w:bidi="ar-SA"/>
+        </w:rPr>
+        <w:t>مدیریت دانش‌آموزان</w:t>
+      </w:r>
+    </w:p>
+    <w:p>
+      <w:pPr>
+        <w:pStyle w:val="ListParagraph"/>
+        <w:numPr>
+          <w:ilvl w:val="0"/>
+          <w:numId w:val="16"/>
+        </w:numPr>
+      </w:pPr>
+      <w:r>
+        <w:rPr>
+          <w:rtl/>
+          <w:lang w:bidi="ar-SA"/>
+        </w:rPr>
+        <w:t>مدیریت معلمان و کارکنان</w:t>
+      </w:r>
+    </w:p>
+    <w:p>
+      <w:pPr>
+        <w:pStyle w:val="ListParagraph"/>
+        <w:numPr>
+          <w:ilvl w:val="0"/>
+          <w:numId w:val="16"/>
+        </w:numPr>
+      </w:pPr>
+      <w:r>
+        <w:rPr>
+          <w:rtl/>
+          <w:lang w:bidi="ar-SA"/>
+        </w:rPr>
+        <w:t>مدیریت والدین، مهمانان و پیمانکاران</w:t>
+      </w:r>
+    </w:p>
+    <w:p>
+      <w:pPr>
+        <w:pStyle w:val="ListParagraph"/>
+        <w:numPr>
+          <w:ilvl w:val="0"/>
+          <w:numId w:val="16"/>
+        </w:numPr>
+      </w:pPr>
+      <w:r>
+        <w:rPr>
+          <w:rtl/>
+          <w:lang w:bidi="ar-SA"/>
+        </w:rPr>
+        <w:t>مدیریت کلاس‌ها، آزمایشگاه‌ها و سایر فضاهای حساس</w:t>
+      </w:r>
+    </w:p>
+    <w:p>
+      <w:pPr>
+        <w:pStyle w:val="ListParagraph"/>
+        <w:numPr>
+          <w:ilvl w:val="0"/>
+          <w:numId w:val="16"/>
+        </w:numPr>
+      </w:pPr>
+      <w:r>
+        <w:rPr>
+          <w:rtl/>
+          <w:lang w:bidi="ar-SA"/>
+        </w:rPr>
+        <w:t>مدیریت پارکینگ و خودروها</w:t>
+      </w:r>
+    </w:p>
+    <w:p>
+      <w:pPr>
+        <w:pStyle w:val="ListParagraph"/>
+        <w:numPr>
+          <w:ilvl w:val="0"/>
+          <w:numId w:val="16"/>
+        </w:numPr>
+      </w:pPr>
+      <w:r>
+        <w:rPr>
+          <w:rtl/>
+          <w:lang w:bidi="ar-SA"/>
+        </w:rPr>
+        <w:t>مدیریت گیت‌ها و ورودی‌های مجموعه</w:t>
+      </w:r>
+    </w:p>
+    <w:p>
+      <w:pPr>
+        <w:pStyle w:val="ListParagraph"/>
+        <w:numPr>
+          <w:ilvl w:val="0"/>
+          <w:numId w:val="16"/>
+        </w:numPr>
+      </w:pPr>
+      <w:r>
+        <w:rPr>
+          <w:rtl/>
+          <w:lang w:bidi="ar-SA"/>
+        </w:rPr>
+        <w:t>نظارت و مانیتورینگ مرکزی</w:t>
+      </w:r>
+    </w:p>
+    <w:p>
+      <w:pPr>
+        <w:pStyle w:val="ListParagraph"/>
+        <w:numPr>
+          <w:ilvl w:val="0"/>
+          <w:numId w:val="16"/>
+        </w:numPr>
+      </w:pPr>
+      <w:r>
+        <w:rPr>
+          <w:rtl/>
+          <w:lang w:bidi="ar-SA"/>
+        </w:rPr>
+        <w:t>مدیریت هشدارها و رویدادها</w:t>
+      </w:r>
+    </w:p>
+    <w:p>
+      <w:pPr>
+        <w:pStyle w:val="ListParagraph"/>
+        <w:numPr>
+          <w:ilvl w:val="0"/>
+          <w:numId w:val="16"/>
+        </w:numPr>
+      </w:pPr>
+      <w:r>
+        <w:rPr>
+          <w:rtl/>
+          <w:lang w:bidi="ar-SA"/>
+        </w:rPr>
+        <w:t>گزارش‌گیری و داشبوردهای مدیریتی</w:t>
+      </w:r>
+    </w:p>
+    <w:p>
+      <w:pPr>
+        <w:pStyle w:val="ListParagraph"/>
+        <w:numPr>
+          <w:ilvl w:val="0"/>
+          <w:numId w:val="16"/>
+        </w:numPr>
+      </w:pPr>
+      <w:r>
+        <w:rPr>
+          <w:rtl/>
+          <w:lang w:bidi="ar-SA"/>
+        </w:rPr>
+        <w:t>یکپارچه‌سازی با سامانه‌های دیگر</w:t>
+      </w:r>
+    </w:p>
+    <w:p>
+      <w:r>
+        <w:rPr>
+          <w:rtl/>
+          <w:lang w:bidi="ar-SA"/>
+        </w:rPr>
+        <w:lastRenderedPageBreak/>
+        <w:t>تمام این زیرسامانه‌ها از طریق یک پلتفرم مرکزی مدیریت می‌شوند و اطلاعات ثبت‌شده در هر بخش می‌تواند در سایر بخش‌های سامانه نیز مورد استفاده قرار گیرد</w:t>
+      </w:r>
+      <w:r>
+        <w:t>.</w:t>
+      </w:r>
+    </w:p>
+    <w:p>
+      <w:pPr>
+        <w:pStyle w:val="Heading2"/>
+        <w:rPr>
+          <w:lang w:val="de-DE"/>
+        </w:rPr>
+      </w:pPr>
+      <w:r>
+        <w:rPr>
+          <w:rtl/>
+          <w:lang w:bidi="ar-SA"/>
+        </w:rPr>
+        <w:t>مزایای راهکار یکپارچه</w:t>
+      </w:r>
+    </w:p>
+    <w:p>
+      <w:r>
+        <w:rPr>
+          <w:rtl/>
+          <w:lang w:bidi="ar-SA"/>
+        </w:rPr>
+        <w:t>استفاده از یک سامانه یکپارچه، علاوه بر افزایش امنیت، مزایای عملیاتی متعددی برای مدرسه به همراه خواهد داشت، از جمله</w:t>
+      </w:r>
+      <w:r>
+        <w:t>:</w:t>
+      </w:r>
+    </w:p>
+    <w:p>
+      <w:pPr>
+        <w:pStyle w:val="ListParagraph"/>
+        <w:numPr>
+          <w:ilvl w:val="0"/>
+          <w:numId w:val="17"/>
+        </w:numPr>
+      </w:pPr>
+      <w:r>
+        <w:rPr>
+          <w:rtl/>
+          <w:lang w:bidi="ar-SA"/>
+        </w:rPr>
+        <w:t>حذف سامانه‌های جزیره‌ای و کاهش پیچیدگی مدیریت</w:t>
+      </w:r>
+    </w:p>
+    <w:p>
+      <w:pPr>
+        <w:pStyle w:val="ListParagraph"/>
+        <w:numPr>
+          <w:ilvl w:val="0"/>
+          <w:numId w:val="17"/>
+        </w:numPr>
+      </w:pPr>
+      <w:r>
+        <w:rPr>
+          <w:rtl/>
+          <w:lang w:bidi="ar-SA"/>
+        </w:rPr>
+        <w:t>کاهش ورود اطلاعات تکراری</w:t>
+      </w:r>
+    </w:p>
+    <w:p>
+      <w:pPr>
+        <w:pStyle w:val="ListParagraph"/>
+        <w:numPr>
+          <w:ilvl w:val="0"/>
+          <w:numId w:val="17"/>
+        </w:numPr>
+      </w:pPr>
+      <w:r>
+        <w:rPr>
+          <w:rtl/>
+          <w:lang w:bidi="ar-SA"/>
+        </w:rPr>
+        <w:t>یکپارچگی اطلاعات کاربران و تجهیزات</w:t>
+      </w:r>
+    </w:p>
+    <w:p>
+      <w:pPr>
+        <w:pStyle w:val="ListParagraph"/>
+        <w:numPr>
+          <w:ilvl w:val="0"/>
+          <w:numId w:val="17"/>
+        </w:numPr>
+      </w:pPr>
+      <w:r>
+        <w:rPr>
+          <w:rtl/>
+          <w:lang w:bidi="ar-SA"/>
+        </w:rPr>
+        <w:t>مدیریت متمرکز سیاست‌های امنیتی</w:t>
+      </w:r>
+    </w:p>
+    <w:p>
+      <w:pPr>
+        <w:pStyle w:val="ListParagraph"/>
+        <w:numPr>
+          <w:ilvl w:val="0"/>
+          <w:numId w:val="17"/>
+        </w:numPr>
+      </w:pPr>
+      <w:r>
+        <w:rPr>
+          <w:rtl/>
+          <w:lang w:bidi="ar-SA"/>
+        </w:rPr>
+        <w:t>ثبت کامل رویدادها و امکان رهگیری آن‌ها</w:t>
+      </w:r>
+    </w:p>
+    <w:p>
+      <w:pPr>
+        <w:pStyle w:val="ListParagraph"/>
+        <w:numPr>
+          <w:ilvl w:val="0"/>
+          <w:numId w:val="17"/>
+        </w:numPr>
+      </w:pPr>
+      <w:r>
+        <w:rPr>
+          <w:rtl/>
+          <w:lang w:bidi="ar-SA"/>
+        </w:rPr>
+        <w:t>افزایش سرعت تصمیم‌گیری از طریق داشبوردهای مدیریتی</w:t>
+      </w:r>
+    </w:p>
+    <w:p>
+      <w:pPr>
+        <w:pStyle w:val="ListParagraph"/>
+        <w:numPr>
+          <w:ilvl w:val="0"/>
+          <w:numId w:val="17"/>
+        </w:numPr>
+      </w:pPr>
+      <w:r>
+        <w:rPr>
+          <w:rtl/>
+          <w:lang w:bidi="ar-SA"/>
+        </w:rPr>
+        <w:t>کاهش هزینه‌های نگهداری و توسعه سامانه</w:t>
+      </w:r>
+    </w:p>
+    <w:p>
+      <w:pPr>
+        <w:pStyle w:val="ListParagraph"/>
+        <w:numPr>
+          <w:ilvl w:val="0"/>
+          <w:numId w:val="17"/>
+        </w:numPr>
+      </w:pPr>
+      <w:r>
+        <w:rPr>
+          <w:rtl/>
+          <w:lang w:bidi="ar-SA"/>
+        </w:rPr>
+        <w:t>قابلیت توسعه تدریجی بدون نیاز به تغییر معماری اصلی</w:t>
+      </w:r>
+    </w:p>
+    <w:p>
+      <w:pPr>
+        <w:pStyle w:val="Heading2"/>
+        <w:rPr>
+          <w:lang w:val="de-DE"/>
+        </w:rPr>
+      </w:pPr>
+      <w:r>
+        <w:rPr>
+          <w:rtl/>
+          <w:lang w:bidi="ar-SA"/>
+        </w:rPr>
+        <w:t>معماری مفهومی راهکار</w:t>
+      </w:r>
+    </w:p>
+    <w:p>
+      <w:r>
+        <w:rPr>
+          <w:rtl/>
+          <w:lang w:bidi="ar-SA"/>
+        </w:rPr>
+        <w:t>در معماری پیشنهادی، سامانه مرکزی به عنوان هسته اصلی راهکار عمل می‌کند و تمامی تجهیزات و زیرسامانه‌ها از طریق آن مدیریت می‌شوند</w:t>
+      </w:r>
+      <w:r>
+        <w:t>.</w:t>
+      </w:r>
+    </w:p>
+    <w:p>
+      <w:r>
+        <w:rPr>
+          <w:rtl/>
+          <w:lang w:bidi="ar-SA"/>
+        </w:rPr>
+        <w:t>در این ساختار، اطلاعات کاربران، مجوزهای دسترسی، رویدادهای تردد، هشدارها، گزارش‌ها و ارتباط با سایر سامانه‌ها در یک بستر متمرکز نگهداری و مدیریت خواهد شد</w:t>
+      </w:r>
+      <w:r>
+        <w:t>.</w:t>
+      </w:r>
+    </w:p>
+    <w:p>
+      <w:pPr>
+        <w:pStyle w:val="Heading3"/>
+        <w:rPr>
+          <w:color w:val="EE0000"/>
+          <w:rtl/>
+        </w:rPr>
+      </w:pPr>
+      <w:r>
+        <w:rPr>
+          <w:color w:val="EE0000"/>
+          <w:rtl/>
+        </w:rPr>
+        <w:t>معماری مفهومی راهکار یکپارچه</w:t>
+      </w:r>
+    </w:p>
+    <w:p>
+      <w:pPr>
+        <w:rPr>
+          <w:color w:val="EE0000"/>
+        </w:rPr>
+      </w:pPr>
+      <w:r>
+        <w:rPr>
+          <w:color w:val="EE0000"/>
+        </w:rPr>
+        <w:br/>
+      </w:r>
+      <w:r>
+        <w:rPr>
+          <w:i/>
+          <w:iCs/>
+          <w:color w:val="EE0000"/>
+        </w:rPr>
+        <w:t>(</w:t>
+      </w:r>
+      <w:r>
+        <w:rPr>
+          <w:i/>
+          <w:iCs/>
+          <w:color w:val="EE0000"/>
+          <w:rtl/>
+          <w:lang w:bidi="ar-SA"/>
+        </w:rPr>
+        <w:t>این شکل در نسخه بعدی پروپوزال اضافه خواهد شد</w:t>
+      </w:r>
+      <w:r>
+        <w:rPr>
+          <w:i/>
+          <w:iCs/>
+          <w:color w:val="EE0000"/>
+        </w:rPr>
+        <w:t>.)</w:t>
+      </w:r>
+    </w:p>
+    <w:p>
+      <w:pPr>
+        <w:pStyle w:val="Heading2"/>
+        <w:rPr>
+          <w:lang w:val="de-DE"/>
+        </w:rPr>
+      </w:pPr>
+      <w:r>
+        <w:rPr>
+          <w:rtl/>
+          <w:lang w:bidi="ar-SA"/>
+        </w:rPr>
+        <w:t>انعطاف‌پذیری در انتخاب فناوری</w:t>
+      </w:r>
+    </w:p>
+    <w:p>
+      <w:r>
+        <w:rPr>
+          <w:rtl/>
+          <w:lang w:bidi="ar-SA"/>
+        </w:rPr>
+        <w:t>یکی از ویژگی‌های مهم این راهکار، انعطاف‌پذیری در انتخاب روش‌های پیاده‌سازی است</w:t>
+      </w:r>
+      <w:r>
+        <w:t>.</w:t>
+      </w:r>
+    </w:p>
+    <w:p>
+      <w:r>
+        <w:rPr>
+          <w:rtl/>
+          <w:lang w:bidi="ar-SA"/>
+        </w:rPr>
+        <w:lastRenderedPageBreak/>
+        <w:t xml:space="preserve">با توجه به سیاست‌های امنیتی، بودجه، الزامات اجرایی و ترجیحات کارفرما، امکان استفاده از روش‌های مختلف احراز هویت و کنترل تردد، از جمله کارت هوشمند، </w:t>
+      </w:r>
+      <w:r>
+        <w:t>QR Code</w:t>
+      </w:r>
+      <w:r>
+        <w:rPr>
+          <w:rtl/>
+          <w:lang w:bidi="ar-SA"/>
+        </w:rPr>
+        <w:t xml:space="preserve">، تشخیص چهره، </w:t>
+      </w:r>
+      <w:r>
+        <w:t>RFID</w:t>
+      </w:r>
+      <w:r>
+        <w:rPr>
+          <w:rtl/>
+          <w:lang w:bidi="ar-SA"/>
+        </w:rPr>
+        <w:t xml:space="preserve">، </w:t>
+      </w:r>
+      <w:r>
+        <w:t>UHF</w:t>
+      </w:r>
+      <w:r>
+        <w:rPr>
+          <w:rtl/>
+          <w:lang w:bidi="ar-SA"/>
+        </w:rPr>
+        <w:t>، پلاک‌خوان، گیت‌های کنترل تردد و سایر فناوری‌های مرتبط وجود خواهد داشت</w:t>
+      </w:r>
+      <w:r>
+        <w:t>.</w:t>
+      </w:r>
+    </w:p>
+    <w:p>
+      <w:r>
+        <w:rPr>
+          <w:rtl/>
+          <w:lang w:bidi="ar-SA"/>
+        </w:rPr>
+        <w:t>هدف این پیشنهاد، تحمیل یک فناوری خاص نیست، بلکه معرفی گزینه‌های قابل انتخاب و انتخاب مناسب‌ترین ترکیب بر اساس نیازهای واقعی مدرسه است</w:t>
+      </w:r>
+      <w:r>
+        <w:t>.</w:t>
+      </w:r>
+    </w:p>
+    <w:p>
+      <w:pPr>
+        <w:pStyle w:val="Heading2"/>
+        <w:rPr>
+          <w:lang w:val="de-DE"/>
+        </w:rPr>
+      </w:pPr>
+      <w:r>
+        <w:rPr>
+          <w:rtl/>
+          <w:lang w:bidi="ar-SA"/>
+        </w:rPr>
+        <w:t>جمع‌بندی فصل</w:t>
+      </w:r>
+    </w:p>
+    <w:p>
+      <w:r>
+        <w:rPr>
+          <w:rtl/>
+          <w:lang w:bidi="ar-SA"/>
+        </w:rPr>
+        <w:t>راهکار پیشنهادی، یک سامانه یکپارچه برای مدیریت تمامی فرآیندهای مرتبط با امنیت فیزیکی و کنترل تردد مدرسه است. این راهکار با تمرکز بر نیازهای عملیاتی مجموعه آموزشی طراحی شده و ضمن پاسخ‌گویی به نیازهای فعلی، امکان توسعه و انطباق با نیازهای آینده را نیز فراهم می‌کند</w:t>
+      </w:r>
+      <w:r>
+        <w:t>.</w:t>
+      </w:r>
+    </w:p>
+    <w:p>
+      <w:r>
+        <w:rPr>
+          <w:rtl/>
+          <w:lang w:bidi="ar-SA"/>
+        </w:rPr>
+        <w:t>در فصل‌های بعد، نحوه به‌کارگیری این راهکار در سناریوهای مختلف مدرسه و همچنین قابلیت‌های هر یک از زیرسامانه‌ها به تفصیل تشریح خواهد شد</w:t>
+      </w:r>
+      <w:r>
+        <w:t>.</w:t>
+      </w:r>
+    </w:p>
+    <w:p>
+      <w:pPr>
+        <w:rPr>
+          <w:rtl/>
+        </w:rPr>
+      </w:pPr>
     </w:p>
     <w:p>
       <w:pPr>
@@ -1376,11 +2113,20 @@
           <w:rtl/>
         </w:rPr>
       </w:pPr>
-      <w:r>
-        <w:rPr>
-          <w:rtl/>
-        </w:rPr>
-        <w:t xml:space="preserve">سناریوهای عملیاتی مدرسه </w:t>
+      <w:proofErr w:type="spellStart"/>
+      <w:r>
+        <w:rPr>
+          <w:rtl/>
+        </w:rPr>
+        <w:lastRenderedPageBreak/>
+        <w:t>سناریوهای</w:t>
+      </w:r>
+      <w:proofErr w:type="spellEnd"/>
+      <w:r>
+        <w:rPr>
+          <w:rtl/>
+        </w:rPr>
+        <w:t xml:space="preserve"> عملیاتی مدرسه </w:t>
       </w:r>
     </w:p>
     <w:p>
@@ -1678,6 +2424,268 @@
     </w:lvl>
   </w:abstractNum>
   <w:abstractNum w:abstractNumId="1" w15:restartNumberingAfterBreak="0">
+    <w:nsid w:val="061637A2"/>
+    <w:multiLevelType w:val="multilevel"/>
+    <w:tmpl w:val="ED58FCDE"/>
+    <w:lvl w:ilvl="0">
+      <w:start w:val="1"/>
+      <w:numFmt w:val="bullet"/>
+      <w:lvlText w:val=""/>
+      <w:lvlJc w:val="left"/>
+      <w:pPr>
+        <w:tabs>
+          <w:tab w:val="num" w:pos="720"/>
+        </w:tabs>
+        <w:ind w:left="720" w:hanging="360"/>
+      </w:pPr>
+      <w:rPr>
+        <w:rFonts w:ascii="Symbol" w:hAnsi="Symbol" w:hint="default"/>
+        <w:sz w:val="20"/>
+      </w:rPr>
+    </w:lvl>
+    <w:lvl w:ilvl="1" w:tentative="1">
+      <w:start w:val="1"/>
+      <w:numFmt w:val="bullet"/>
+      <w:lvlText w:val="o"/>
+      <w:lvlJc w:val="left"/>
+      <w:pPr>
+        <w:tabs>
+          <w:tab w:val="num" w:pos="1440"/>
+        </w:tabs>
+        <w:ind w:left="1440" w:hanging="360"/>
+      </w:pPr>
+      <w:rPr>
+        <w:rFonts w:ascii="Courier New" w:hAnsi="Courier New" w:hint="default"/>
+        <w:sz w:val="20"/>
+      </w:rPr>
+    </w:lvl>
+    <w:lvl w:ilvl="2" w:tentative="1">
+      <w:start w:val="1"/>
+      <w:numFmt w:val="bullet"/>
+      <w:lvlText w:val=""/>
+      <w:lvlJc w:val="left"/>
+      <w:pPr>
+        <w:tabs>
+          <w:tab w:val="num" w:pos="2160"/>
+        </w:tabs>
+        <w:ind w:left="2160" w:hanging="360"/>
+      </w:pPr>
+      <w:rPr>
+        <w:rFonts w:ascii="Wingdings" w:hAnsi="Wingdings" w:hint="default"/>
+        <w:sz w:val="20"/>
+      </w:rPr>
+    </w:lvl>
+    <w:lvl w:ilvl="3" w:tentative="1">
+      <w:start w:val="1"/>
+      <w:numFmt w:val="bullet"/>
+      <w:lvlText w:val=""/>
+      <w:lvlJc w:val="left"/>
+      <w:pPr>
+        <w:tabs>
+          <w:tab w:val="num" w:pos="2880"/>
+        </w:tabs>
+        <w:ind w:left="2880" w:hanging="360"/>
+      </w:pPr>
+      <w:rPr>
+        <w:rFonts w:ascii="Wingdings" w:hAnsi="Wingdings" w:hint="default"/>
+        <w:sz w:val="20"/>
+      </w:rPr>
+    </w:lvl>
+    <w:lvl w:ilvl="4" w:tentative="1">
+      <w:start w:val="1"/>
+      <w:numFmt w:val="bullet"/>
+      <w:lvlText w:val=""/>
+      <w:lvlJc w:val="left"/>
+      <w:pPr>
+        <w:tabs>
+          <w:tab w:val="num" w:pos="3600"/>
+        </w:tabs>
+        <w:ind w:left="3600" w:hanging="360"/>
+      </w:pPr>
+      <w:rPr>
+        <w:rFonts w:ascii="Wingdings" w:hAnsi="Wingdings" w:hint="default"/>
+        <w:sz w:val="20"/>
+      </w:rPr>
+    </w:lvl>
+    <w:lvl w:ilvl="5" w:tentative="1">
+      <w:start w:val="1"/>
+      <w:numFmt w:val="bullet"/>
+      <w:lvlText w:val=""/>
+      <w:lvlJc w:val="left"/>
+      <w:pPr>
+        <w:tabs>
+          <w:tab w:val="num" w:pos="4320"/>
+        </w:tabs>
+        <w:ind w:left="4320" w:hanging="360"/>
+      </w:pPr>
+      <w:rPr>
+        <w:rFonts w:ascii="Wingdings" w:hAnsi="Wingdings" w:hint="default"/>
+        <w:sz w:val="20"/>
+      </w:rPr>
+    </w:lvl>
+    <w:lvl w:ilvl="6" w:tentative="1">
+      <w:start w:val="1"/>
+      <w:numFmt w:val="bullet"/>
+      <w:lvlText w:val=""/>
+      <w:lvlJc w:val="left"/>
+      <w:pPr>
+        <w:tabs>
+          <w:tab w:val="num" w:pos="5040"/>
+        </w:tabs>
+        <w:ind w:left="5040" w:hanging="360"/>
+      </w:pPr>
+      <w:rPr>
+        <w:rFonts w:ascii="Wingdings" w:hAnsi="Wingdings" w:hint="default"/>
+        <w:sz w:val="20"/>
+      </w:rPr>
+    </w:lvl>
+    <w:lvl w:ilvl="7" w:tentative="1">
+      <w:start w:val="1"/>
+      <w:numFmt w:val="bullet"/>
+      <w:lvlText w:val=""/>
+      <w:lvlJc w:val="left"/>
+      <w:pPr>
+        <w:tabs>
+          <w:tab w:val="num" w:pos="5760"/>
+        </w:tabs>
+        <w:ind w:left="5760" w:hanging="360"/>
+      </w:pPr>
+      <w:rPr>
+        <w:rFonts w:ascii="Wingdings" w:hAnsi="Wingdings" w:hint="default"/>
+        <w:sz w:val="20"/>
+      </w:rPr>
+    </w:lvl>
+    <w:lvl w:ilvl="8" w:tentative="1">
+      <w:start w:val="1"/>
+      <w:numFmt w:val="bullet"/>
+      <w:lvlText w:val=""/>
+      <w:lvlJc w:val="left"/>
+      <w:pPr>
+        <w:tabs>
+          <w:tab w:val="num" w:pos="6480"/>
+        </w:tabs>
+        <w:ind w:left="6480" w:hanging="360"/>
+      </w:pPr>
+      <w:rPr>
+        <w:rFonts w:ascii="Wingdings" w:hAnsi="Wingdings" w:hint="default"/>
+        <w:sz w:val="20"/>
+      </w:rPr>
+    </w:lvl>
+  </w:abstractNum>
+  <w:abstractNum w:abstractNumId="2" w15:restartNumberingAfterBreak="0">
+    <w:nsid w:val="13670106"/>
+    <w:multiLevelType w:val="hybridMultilevel"/>
+    <w:tmpl w:val="DF543296"/>
+    <w:lvl w:ilvl="0" w:tplc="04070001">
+      <w:start w:val="1"/>
+      <w:numFmt w:val="bullet"/>
+      <w:lvlText w:val=""/>
+      <w:lvlJc w:val="left"/>
+      <w:pPr>
+        <w:ind w:left="720" w:hanging="360"/>
+      </w:pPr>
+      <w:rPr>
+        <w:rFonts w:ascii="Symbol" w:hAnsi="Symbol" w:hint="default"/>
+      </w:rPr>
+    </w:lvl>
+    <w:lvl w:ilvl="1" w:tplc="04070003" w:tentative="1">
+      <w:start w:val="1"/>
+      <w:numFmt w:val="bullet"/>
+      <w:lvlText w:val="o"/>
+      <w:lvlJc w:val="left"/>
+      <w:pPr>
+        <w:ind w:left="1440" w:hanging="360"/>
+      </w:pPr>
+      <w:rPr>
+        <w:rFonts w:ascii="Courier New" w:hAnsi="Courier New" w:cs="Courier New" w:hint="default"/>
+      </w:rPr>
+    </w:lvl>
+    <w:lvl w:ilvl="2" w:tplc="04070005" w:tentative="1">
+      <w:start w:val="1"/>
+      <w:numFmt w:val="bullet"/>
+      <w:lvlText w:val=""/>
+      <w:lvlJc w:val="left"/>
+      <w:pPr>
+        <w:ind w:left="2160" w:hanging="360"/>
+      </w:pPr>
+      <w:rPr>
+        <w:rFonts w:ascii="Wingdings" w:hAnsi="Wingdings" w:hint="default"/>
+      </w:rPr>
+    </w:lvl>
+    <w:lvl w:ilvl="3" w:tplc="04070001" w:tentative="1">
+      <w:start w:val="1"/>
+      <w:numFmt w:val="bullet"/>
+      <w:lvlText w:val=""/>
+      <w:lvlJc w:val="left"/>
+      <w:pPr>
+        <w:ind w:left="2880" w:hanging="360"/>
+      </w:pPr>
+      <w:rPr>
+        <w:rFonts w:ascii="Symbol" w:hAnsi="Symbol" w:hint="default"/>
+      </w:rPr>
+    </w:lvl>
+    <w:lvl w:ilvl="4" w:tplc="04070003" w:tentative="1">
+      <w:start w:val="1"/>
+      <w:numFmt w:val="bullet"/>
+      <w:lvlText w:val="o"/>
+      <w:lvlJc w:val="left"/>
+      <w:pPr>
+        <w:ind w:left="3600" w:hanging="360"/>
+      </w:pPr>
+      <w:rPr>
+        <w:rFonts w:ascii="Courier New" w:hAnsi="Courier New" w:cs="Courier New" w:hint="default"/>
+      </w:rPr>
+    </w:lvl>
+    <w:lvl w:ilvl="5" w:tplc="04070005" w:tentative="1">
+      <w:start w:val="1"/>
+      <w:numFmt w:val="bullet"/>
+      <w:lvlText w:val=""/>
+      <w:lvlJc w:val="left"/>
+      <w:pPr>
+        <w:ind w:left="4320" w:hanging="360"/>
+      </w:pPr>
+      <w:rPr>
+        <w:rFonts w:ascii="Wingdings" w:hAnsi="Wingdings" w:hint="default"/>
+      </w:rPr>
+    </w:lvl>
+    <w:lvl w:ilvl="6" w:tplc="04070001" w:tentative="1">
+      <w:start w:val="1"/>
+      <w:numFmt w:val="bullet"/>
+      <w:lvlText w:val=""/>
+      <w:lvlJc w:val="left"/>
+      <w:pPr>
+        <w:ind w:left="5040" w:hanging="360"/>
+      </w:pPr>
+      <w:rPr>
+        <w:rFonts w:ascii="Symbol" w:hAnsi="Symbol" w:hint="default"/>
+      </w:rPr>
+    </w:lvl>
+    <w:lvl w:ilvl="7" w:tplc="04070003" w:tentative="1">
+      <w:start w:val="1"/>
+      <w:numFmt w:val="bullet"/>
+      <w:lvlText w:val="o"/>
+      <w:lvlJc w:val="left"/>
+      <w:pPr>
+        <w:ind w:left="5760" w:hanging="360"/>
+      </w:pPr>
+      <w:rPr>
+        <w:rFonts w:ascii="Courier New" w:hAnsi="Courier New" w:cs="Courier New" w:hint="default"/>
+      </w:rPr>
+    </w:lvl>
+    <w:lvl w:ilvl="8" w:tplc="04070005" w:tentative="1">
+      <w:start w:val="1"/>
+      <w:numFmt w:val="bullet"/>
+      <w:lvlText w:val=""/>
+      <w:lvlJc w:val="left"/>
+      <w:pPr>
+        <w:ind w:left="6480" w:hanging="360"/>
+      </w:pPr>
+      <w:rPr>
+        <w:rFonts w:ascii="Wingdings" w:hAnsi="Wingdings" w:hint="default"/>
+      </w:rPr>
+    </w:lvl>
+  </w:abstractNum>
+  <w:abstractNum w:abstractNumId="3" w15:restartNumberingAfterBreak="0">
     <w:nsid w:val="157F6BDF"/>
     <w:multiLevelType w:val="hybridMultilevel"/>
     <w:tmpl w:val="1BECB06A"/>
@@ -1790,7 +2798,7 @@
       </w:rPr>
     </w:lvl>
   </w:abstractNum>
-  <w:abstractNum w:abstractNumId="2" w15:restartNumberingAfterBreak="0">
+  <w:abstractNum w:abstractNumId="4" w15:restartNumberingAfterBreak="0">
     <w:nsid w:val="2B66280C"/>
     <w:multiLevelType w:val="multilevel"/>
     <w:tmpl w:val="402C2F78"/>
@@ -1903,7 +2911,7 @@
       </w:pPr>
     </w:lvl>
   </w:abstractNum>
-  <w:abstractNum w:abstractNumId="3" w15:restartNumberingAfterBreak="0">
+  <w:abstractNum w:abstractNumId="5" w15:restartNumberingAfterBreak="0">
     <w:nsid w:val="2B983146"/>
     <w:multiLevelType w:val="multilevel"/>
     <w:tmpl w:val="A0EE3C98"/>
@@ -2017,7 +3025,7 @@
       </w:rPr>
     </w:lvl>
   </w:abstractNum>
-  <w:abstractNum w:abstractNumId="4" w15:restartNumberingAfterBreak="0">
+  <w:abstractNum w:abstractNumId="6" w15:restartNumberingAfterBreak="0">
     <w:nsid w:val="2DB2449A"/>
     <w:multiLevelType w:val="multilevel"/>
     <w:tmpl w:val="67163E42"/>
@@ -2130,7 +3138,156 @@
       </w:rPr>
     </w:lvl>
   </w:abstractNum>
-  <w:abstractNum w:abstractNumId="5" w15:restartNumberingAfterBreak="0">
+  <w:abstractNum w:abstractNumId="7" w15:restartNumberingAfterBreak="0">
+    <w:nsid w:val="3144470D"/>
+    <w:multiLevelType w:val="multilevel"/>
+    <w:tmpl w:val="F6A4B2AE"/>
+    <w:lvl w:ilvl="0">
+      <w:start w:val="1"/>
+      <w:numFmt w:val="bullet"/>
+      <w:lvlText w:val=""/>
+      <w:lvlJc w:val="left"/>
+      <w:pPr>
+        <w:tabs>
+          <w:tab w:val="num" w:pos="720"/>
+        </w:tabs>
+        <w:ind w:left="720" w:hanging="360"/>
+      </w:pPr>
+      <w:rPr>
+        <w:rFonts w:ascii="Symbol" w:hAnsi="Symbol" w:hint="default"/>
+        <w:sz w:val="20"/>
+      </w:rPr>
+    </w:lvl>
+    <w:lvl w:ilvl="1" w:tentative="1">
+      <w:start w:val="1"/>
+      <w:numFmt w:val="bullet"/>
+      <w:lvlText w:val="o"/>
+      <w:lvlJc w:val="left"/>
+      <w:pPr>
+        <w:tabs>
+          <w:tab w:val="num" w:pos="1440"/>
+        </w:tabs>
+        <w:ind w:left="1440" w:hanging="360"/>
+      </w:pPr>
+      <w:rPr>
+        <w:rFonts w:ascii="Courier New" w:hAnsi="Courier New" w:hint="default"/>
+        <w:sz w:val="20"/>
+      </w:rPr>
+    </w:lvl>
+    <w:lvl w:ilvl="2" w:tentative="1">
+      <w:start w:val="1"/>
+      <w:numFmt w:val="bullet"/>
+      <w:lvlText w:val=""/>
+      <w:lvlJc w:val="left"/>
+      <w:pPr>
+        <w:tabs>
+          <w:tab w:val="num" w:pos="2160"/>
+        </w:tabs>
+        <w:ind w:left="2160" w:hanging="360"/>
+      </w:pPr>
+      <w:rPr>
+        <w:rFonts w:ascii="Wingdings" w:hAnsi="Wingdings" w:hint="default"/>
+        <w:sz w:val="20"/>
+      </w:rPr>
+    </w:lvl>
+    <w:lvl w:ilvl="3" w:tentative="1">
+      <w:start w:val="1"/>
+      <w:numFmt w:val="bullet"/>
+      <w:lvlText w:val=""/>
+      <w:lvlJc w:val="left"/>
+      <w:pPr>
+        <w:tabs>
+          <w:tab w:val="num" w:pos="2880"/>
+        </w:tabs>
+        <w:ind w:left="2880" w:hanging="360"/>
+      </w:pPr>
+      <w:rPr>
+        <w:rFonts w:ascii="Wingdings" w:hAnsi="Wingdings" w:hint="default"/>
+        <w:sz w:val="20"/>
+      </w:rPr>
+    </w:lvl>
+    <w:lvl w:ilvl="4" w:tentative="1">
+      <w:start w:val="1"/>
+      <w:numFmt w:val="bullet"/>
+      <w:lvlText w:val=""/>
+      <w:lvlJc w:val="left"/>
+      <w:pPr>
+        <w:tabs>
+          <w:tab w:val="num" w:pos="3600"/>
+        </w:tabs>
+        <w:ind w:left="3600" w:hanging="360"/>
+      </w:pPr>
+      <w:rPr>
+        <w:rFonts w:ascii="Wingdings" w:hAnsi="Wingdings" w:hint="default"/>
+        <w:sz w:val="20"/>
+      </w:rPr>
+    </w:lvl>
+    <w:lvl w:ilvl="5" w:tentative="1">
+      <w:start w:val="1"/>
+      <w:numFmt w:val="bullet"/>
+      <w:lvlText w:val=""/>
+      <w:lvlJc w:val="left"/>
+      <w:pPr>
+        <w:tabs>
+          <w:tab w:val="num" w:pos="4320"/>
+        </w:tabs>
+        <w:ind w:left="4320" w:hanging="360"/>
+      </w:pPr>
+      <w:rPr>
+        <w:rFonts w:ascii="Wingdings" w:hAnsi="Wingdings" w:hint="default"/>
+        <w:sz w:val="20"/>
+      </w:rPr>
+    </w:lvl>
+    <w:lvl w:ilvl="6" w:tentative="1">
+      <w:start w:val="1"/>
+      <w:numFmt w:val="bullet"/>
+      <w:lvlText w:val=""/>
+      <w:lvlJc w:val="left"/>
+      <w:pPr>
+        <w:tabs>
+          <w:tab w:val="num" w:pos="5040"/>
+        </w:tabs>
+        <w:ind w:left="5040" w:hanging="360"/>
+      </w:pPr>
+      <w:rPr>
+        <w:rFonts w:ascii="Wingdings" w:hAnsi="Wingdings" w:hint="default"/>
+        <w:sz w:val="20"/>
+      </w:rPr>
+    </w:lvl>
+    <w:lvl w:ilvl="7" w:tentative="1">
+      <w:start w:val="1"/>
+      <w:numFmt w:val="bullet"/>
+      <w:lvlText w:val=""/>
+      <w:lvlJc w:val="left"/>
+      <w:pPr>
+        <w:tabs>
+          <w:tab w:val="num" w:pos="5760"/>
+        </w:tabs>
+        <w:ind w:left="5760" w:hanging="360"/>
+      </w:pPr>
+      <w:rPr>
+        <w:rFonts w:ascii="Wingdings" w:hAnsi="Wingdings" w:hint="default"/>
+        <w:sz w:val="20"/>
+      </w:rPr>
+    </w:lvl>
+    <w:lvl w:ilvl="8" w:tentative="1">
+      <w:start w:val="1"/>
+      <w:numFmt w:val="bullet"/>
+      <w:lvlText w:val=""/>
+      <w:lvlJc w:val="left"/>
+      <w:pPr>
+        <w:tabs>
+          <w:tab w:val="num" w:pos="6480"/>
+        </w:tabs>
+        <w:ind w:left="6480" w:hanging="360"/>
+      </w:pPr>
+      <w:rPr>
+        <w:rFonts w:ascii="Wingdings" w:hAnsi="Wingdings" w:hint="default"/>
+        <w:sz w:val="20"/>
+      </w:rPr>
+    </w:lvl>
+  </w:abstractNum>
+  <w:abstractNum w:abstractNumId="8" w15:restartNumberingAfterBreak="0">
     <w:nsid w:val="35EE2711"/>
     <w:multiLevelType w:val="multilevel"/>
     <w:tmpl w:val="C90C4A26"/>
@@ -2247,7 +3404,120 @@
       </w:rPr>
     </w:lvl>
   </w:abstractNum>
-  <w:abstractNum w:abstractNumId="6" w15:restartNumberingAfterBreak="0">
+  <w:abstractNum w:abstractNumId="9" w15:restartNumberingAfterBreak="0">
+    <w:nsid w:val="3E590FB3"/>
+    <w:multiLevelType w:val="hybridMultilevel"/>
+    <w:tmpl w:val="041E66FE"/>
+    <w:lvl w:ilvl="0" w:tplc="04070001">
+      <w:start w:val="1"/>
+      <w:numFmt w:val="bullet"/>
+      <w:lvlText w:val=""/>
+      <w:lvlJc w:val="left"/>
+      <w:pPr>
+        <w:ind w:left="720" w:hanging="360"/>
+      </w:pPr>
+      <w:rPr>
+        <w:rFonts w:ascii="Symbol" w:hAnsi="Symbol" w:hint="default"/>
+      </w:rPr>
+    </w:lvl>
+    <w:lvl w:ilvl="1" w:tplc="04070003" w:tentative="1">
+      <w:start w:val="1"/>
+      <w:numFmt w:val="bullet"/>
+      <w:lvlText w:val="o"/>
+      <w:lvlJc w:val="left"/>
+      <w:pPr>
+        <w:ind w:left="1440" w:hanging="360"/>
+      </w:pPr>
+      <w:rPr>
+        <w:rFonts w:ascii="Courier New" w:hAnsi="Courier New" w:cs="Courier New" w:hint="default"/>
+      </w:rPr>
+    </w:lvl>
+    <w:lvl w:ilvl="2" w:tplc="04070005" w:tentative="1">
+      <w:start w:val="1"/>
+      <w:numFmt w:val="bullet"/>
+      <w:lvlText w:val=""/>
+      <w:lvlJc w:val="left"/>
+      <w:pPr>
+        <w:ind w:left="2160" w:hanging="360"/>
+      </w:pPr>
+      <w:rPr>
+        <w:rFonts w:ascii="Wingdings" w:hAnsi="Wingdings" w:hint="default"/>
+      </w:rPr>
+    </w:lvl>
+    <w:lvl w:ilvl="3" w:tplc="04070001" w:tentative="1">
+      <w:start w:val="1"/>
+      <w:numFmt w:val="bullet"/>
+      <w:lvlText w:val=""/>
+      <w:lvlJc w:val="left"/>
+      <w:pPr>
+        <w:ind w:left="2880" w:hanging="360"/>
+      </w:pPr>
+      <w:rPr>
+        <w:rFonts w:ascii="Symbol" w:hAnsi="Symbol" w:hint="default"/>
+      </w:rPr>
+    </w:lvl>
+    <w:lvl w:ilvl="4" w:tplc="04070003" w:tentative="1">
+      <w:start w:val="1"/>
+      <w:numFmt w:val="bullet"/>
+      <w:lvlText w:val="o"/>
+      <w:lvlJc w:val="left"/>
+      <w:pPr>
+        <w:ind w:left="3600" w:hanging="360"/>
+      </w:pPr>
+      <w:rPr>
+        <w:rFonts w:ascii="Courier New" w:hAnsi="Courier New" w:cs="Courier New" w:hint="default"/>
+      </w:rPr>
+    </w:lvl>
+    <w:lvl w:ilvl="5" w:tplc="04070005" w:tentative="1">
+      <w:start w:val="1"/>
+      <w:numFmt w:val="bullet"/>
+      <w:lvlText w:val=""/>
+      <w:lvlJc w:val="left"/>
+      <w:pPr>
+        <w:ind w:left="4320" w:hanging="360"/>
+      </w:pPr>
+      <w:rPr>
+        <w:rFonts w:ascii="Wingdings" w:hAnsi="Wingdings" w:hint="default"/>
+      </w:rPr>
+    </w:lvl>
+    <w:lvl w:ilvl="6" w:tplc="04070001" w:tentative="1">
+      <w:start w:val="1"/>
+      <w:numFmt w:val="bullet"/>
+      <w:lvlText w:val=""/>
+      <w:lvlJc w:val="left"/>
+      <w:pPr>
+        <w:ind w:left="5040" w:hanging="360"/>
+      </w:pPr>
+      <w:rPr>
+        <w:rFonts w:ascii="Symbol" w:hAnsi="Symbol" w:hint="default"/>
+      </w:rPr>
+    </w:lvl>
+    <w:lvl w:ilvl="7" w:tplc="04070003" w:tentative="1">
+      <w:start w:val="1"/>
+      <w:numFmt w:val="bullet"/>
+      <w:lvlText w:val="o"/>
+      <w:lvlJc w:val="left"/>
+      <w:pPr>
+        <w:ind w:left="5760" w:hanging="360"/>
+      </w:pPr>
+      <w:rPr>
+        <w:rFonts w:ascii="Courier New" w:hAnsi="Courier New" w:cs="Courier New" w:hint="default"/>
+      </w:rPr>
+    </w:lvl>
+    <w:lvl w:ilvl="8" w:tplc="04070005" w:tentative="1">
+      <w:start w:val="1"/>
+      <w:numFmt w:val="bullet"/>
+      <w:lvlText w:val=""/>
+      <w:lvlJc w:val="left"/>
+      <w:pPr>
+        <w:ind w:left="6480" w:hanging="360"/>
+      </w:pPr>
+      <w:rPr>
+        <w:rFonts w:ascii="Wingdings" w:hAnsi="Wingdings" w:hint="default"/>
+      </w:rPr>
+    </w:lvl>
+  </w:abstractNum>
+  <w:abstractNum w:abstractNumId="10" w15:restartNumberingAfterBreak="0">
     <w:nsid w:val="3F044D6D"/>
     <w:multiLevelType w:val="multilevel"/>
     <w:tmpl w:val="223C9C56"/>
@@ -2360,7 +3630,7 @@
       </w:rPr>
     </w:lvl>
   </w:abstractNum>
-  <w:abstractNum w:abstractNumId="7" w15:restartNumberingAfterBreak="0">
+  <w:abstractNum w:abstractNumId="11" w15:restartNumberingAfterBreak="0">
     <w:nsid w:val="41AD59D4"/>
     <w:multiLevelType w:val="multilevel"/>
     <w:tmpl w:val="CC42A2EC"/>
@@ -2509,7 +3779,7 @@
       </w:rPr>
     </w:lvl>
   </w:abstractNum>
-  <w:abstractNum w:abstractNumId="8" w15:restartNumberingAfterBreak="0">
+  <w:abstractNum w:abstractNumId="12" w15:restartNumberingAfterBreak="0">
     <w:nsid w:val="5384421A"/>
     <w:multiLevelType w:val="multilevel"/>
     <w:tmpl w:val="3A2E5610"/>
@@ -2622,7 +3892,7 @@
       </w:pPr>
     </w:lvl>
   </w:abstractNum>
-  <w:abstractNum w:abstractNumId="9" w15:restartNumberingAfterBreak="0">
+  <w:abstractNum w:abstractNumId="13" w15:restartNumberingAfterBreak="0">
     <w:nsid w:val="60E923DA"/>
     <w:multiLevelType w:val="multilevel"/>
     <w:tmpl w:val="3392DAD8"/>
@@ -2771,7 +4041,7 @@
       </w:rPr>
     </w:lvl>
   </w:abstractNum>
-  <w:abstractNum w:abstractNumId="10" w15:restartNumberingAfterBreak="0">
+  <w:abstractNum w:abstractNumId="14" w15:restartNumberingAfterBreak="0">
     <w:nsid w:val="610B1F1B"/>
     <w:multiLevelType w:val="hybridMultilevel"/>
     <w:tmpl w:val="FE42F452"/>
@@ -2884,7 +4154,7 @@
       </w:rPr>
     </w:lvl>
   </w:abstractNum>
-  <w:abstractNum w:abstractNumId="11" w15:restartNumberingAfterBreak="0">
+  <w:abstractNum w:abstractNumId="15" w15:restartNumberingAfterBreak="0">
     <w:nsid w:val="6B9B6F31"/>
     <w:multiLevelType w:val="multilevel"/>
     <w:tmpl w:val="09963DC0"/>
@@ -3033,7 +4303,7 @@
       </w:rPr>
     </w:lvl>
   </w:abstractNum>
-  <w:abstractNum w:abstractNumId="12" w15:restartNumberingAfterBreak="0">
+  <w:abstractNum w:abstractNumId="16" w15:restartNumberingAfterBreak="0">
     <w:nsid w:val="7C2322EA"/>
     <w:multiLevelType w:val="multilevel"/>
     <w:tmpl w:val="5DF62C5A"/>
@@ -3183,43 +4453,55 @@
     </w:lvl>
   </w:abstractNum>
   <w:num w:numId="1" w16cid:durableId="1850869120">
-    <w:abstractNumId w:val="3"/>
+    <w:abstractNumId w:val="5"/>
   </w:num>
   <w:num w:numId="2" w16cid:durableId="2069105288">
-    <w:abstractNumId w:val="6"/>
+    <w:abstractNumId w:val="10"/>
   </w:num>
   <w:num w:numId="3" w16cid:durableId="989938476">
     <w:abstractNumId w:val="0"/>
   </w:num>
   <w:num w:numId="4" w16cid:durableId="1911189105">
+    <w:abstractNumId w:val="11"/>
+  </w:num>
+  <w:num w:numId="5" w16cid:durableId="968318571">
+    <w:abstractNumId w:val="4"/>
+  </w:num>
+  <w:num w:numId="6" w16cid:durableId="1973973578">
+    <w:abstractNumId w:val="16"/>
+  </w:num>
+  <w:num w:numId="7" w16cid:durableId="2082369485">
+    <w:abstractNumId w:val="12"/>
+  </w:num>
+  <w:num w:numId="8" w16cid:durableId="1071973697">
+    <w:abstractNumId w:val="8"/>
+  </w:num>
+  <w:num w:numId="9" w16cid:durableId="1543639895">
+    <w:abstractNumId w:val="6"/>
+  </w:num>
+  <w:num w:numId="10" w16cid:durableId="322974967">
+    <w:abstractNumId w:val="13"/>
+  </w:num>
+  <w:num w:numId="11" w16cid:durableId="1242829558">
+    <w:abstractNumId w:val="3"/>
+  </w:num>
+  <w:num w:numId="12" w16cid:durableId="648553934">
+    <w:abstractNumId w:val="15"/>
+  </w:num>
+  <w:num w:numId="13" w16cid:durableId="1561205426">
+    <w:abstractNumId w:val="14"/>
+  </w:num>
+  <w:num w:numId="14" w16cid:durableId="960766227">
     <w:abstractNumId w:val="7"/>
   </w:num>
-  <w:num w:numId="5" w16cid:durableId="968318571">
+  <w:num w:numId="15" w16cid:durableId="952323295">
+    <w:abstractNumId w:val="1"/>
+  </w:num>
+  <w:num w:numId="16" w16cid:durableId="427892381">
     <w:abstractNumId w:val="2"/>
   </w:num>
-  <w:num w:numId="6" w16cid:durableId="1973973578">
-    <w:abstractNumId w:val="12"/>
-  </w:num>
-  <w:num w:numId="7" w16cid:durableId="2082369485">
-    <w:abstractNumId w:val="8"/>
-  </w:num>
-  <w:num w:numId="8" w16cid:durableId="1071973697">
-    <w:abstractNumId w:val="5"/>
-  </w:num>
-  <w:num w:numId="9" w16cid:durableId="1543639895">
-    <w:abstractNumId w:val="4"/>
-  </w:num>
-  <w:num w:numId="10" w16cid:durableId="322974967">
+  <w:num w:numId="17" w16cid:durableId="132603511">
     <w:abstractNumId w:val="9"/>
-  </w:num>
-  <w:num w:numId="11" w16cid:durableId="1242829558">
-    <w:abstractNumId w:val="1"/>
-  </w:num>
-  <w:num w:numId="12" w16cid:durableId="648553934">
-    <w:abstractNumId w:val="11"/>
-  </w:num>
-  <w:num w:numId="13" w16cid:durableId="1561205426">
-    <w:abstractNumId w:val="10"/>
   </w:num>
 </w:numbering>
 </file>
@@ -3687,21 +4969,16 @@
     <w:next w:val="Normal"/>
     <w:link w:val="Heading3Char"/>
     <w:uiPriority w:val="9"/>
-    <w:semiHidden/>
     <w:unhideWhenUsed/>
     <w:qFormat/>
-    <w:rsid w:val="00B72467"/>
+    <w:rsid w:val="007A19D2"/>
     <w:pPr>
-      <w:keepNext/>
-      <w:keepLines/>
-      <w:spacing w:before="160" w:after="80"/>
       <w:outlineLvl w:val="2"/>
     </w:pPr>
     <w:rPr>
-      <w:rFonts w:eastAsiaTheme="majorEastAsia" w:cstheme="majorBidi"/>
-      <w:color w:val="0F4761" w:themeColor="accent1" w:themeShade="BF"/>
-      <w:sz w:val="28"/>
-      <w:szCs w:val="28"/>
+      <w:b/>
+      <w:bCs/>
+      <w:lang w:bidi="ar-SA"/>
     </w:rPr>
   </w:style>
   <w:style w:type="paragraph" w:styleId="Heading4">
@@ -3896,13 +5173,11 @@
     <w:basedOn w:val="DefaultParagraphFont"/>
     <w:link w:val="Heading3"/>
     <w:uiPriority w:val="9"/>
-    <w:semiHidden/>
-    <w:rsid w:val="00B72467"/>
+    <w:rsid w:val="007A19D2"/>
     <w:rPr>
-      <w:rFonts w:eastAsiaTheme="majorEastAsia" w:cstheme="majorBidi"/>
-      <w:color w:val="0F4761" w:themeColor="accent1" w:themeShade="BF"/>
-      <w:sz w:val="28"/>
-      <w:szCs w:val="28"/>
+      <w:rFonts w:ascii="IRANSans" w:hAnsi="IRANSans" w:cs="IRANSans"/>
+      <w:b/>
+      <w:bCs/>
     </w:rPr>
   </w:style>
   <w:style w:type="character" w:customStyle="1" w:styleId="Heading4Char">

</xml_diff>

<commit_message>
2026-06-28 17:51:27 - Proposal: Access control
</commit_message>
<xml_diff>
--- a/01_Proposal/Proposal.docx
+++ b/01_Proposal/Proposal.docx
@@ -1925,57 +1925,135 @@
     </w:p>
     <w:p>
       <w:pPr>
-        <w:pStyle w:val="Heading3"/>
-        <w:rPr>
-          <w:color w:val="EE0000"/>
-          <w:rtl/>
-        </w:rPr>
-      </w:pPr>
-      <w:r>
-        <w:rPr>
-          <w:color w:val="EE0000"/>
-          <w:rtl/>
-        </w:rPr>
-        <w:t>معماری مفهومی راهکار یکپارچه</w:t>
-      </w:r>
-    </w:p>
-    <w:p>
-      <w:pPr>
-        <w:rPr>
-          <w:color w:val="EE0000"/>
-        </w:rPr>
-      </w:pPr>
-      <w:r>
-        <w:rPr>
-          <w:color w:val="EE0000"/>
-        </w:rPr>
-        <w:br/>
-      </w:r>
-      <w:r>
-        <w:rPr>
-          <w:i/>
-          <w:iCs/>
-          <w:color w:val="EE0000"/>
-        </w:rPr>
-        <w:t>(</w:t>
-      </w:r>
-      <w:r>
-        <w:rPr>
-          <w:i/>
-          <w:iCs/>
-          <w:color w:val="EE0000"/>
+        <w:jc w:val="center"/>
+      </w:pPr>
+      <w:r>
+        <w:rPr>
+          <w:noProof/>
+        </w:rPr>
+        <w:lastRenderedPageBreak/>
+        <w:drawing>
+          <wp:inline distT="0" distB="0" distL="0" distR="0" wp14:anchorId="5FA37582" wp14:editId="18E39D0C">
+            <wp:extent cx="5731510" cy="3820795"/>
+            <wp:effectExtent l="0" t="0" r="2540" b="8255"/>
+            <wp:docPr id="418857074" name="Picture 1"/>
+            <wp:cNvGraphicFramePr>
+              <a:graphicFrameLocks xmlns:a="http://schemas.openxmlformats.org/drawingml/2006/main" noChangeAspect="1"/>
+            </wp:cNvGraphicFramePr>
+            <a:graphic xmlns:a="http://schemas.openxmlformats.org/drawingml/2006/main">
+              <a:graphicData uri="http://schemas.openxmlformats.org/drawingml/2006/picture">
+                <pic:pic xmlns:pic="http://schemas.openxmlformats.org/drawingml/2006/picture">
+                  <pic:nvPicPr>
+                    <pic:cNvPr id="418857074" name="Picture 418857074"/>
+                    <pic:cNvPicPr/>
+                  </pic:nvPicPr>
+                  <pic:blipFill>
+                    <a:blip r:embed="rId6" cstate="print">
+                      <a:extLst>
+                        <a:ext uri="{28A0092B-C50C-407E-A947-70E740481C1C}">
+                          <a14:useLocalDpi xmlns:a14="http://schemas.microsoft.com/office/drawing/2010/main" val="0"/>
+                        </a:ext>
+                      </a:extLst>
+                    </a:blip>
+                    <a:stretch>
+                      <a:fillRect/>
+                    </a:stretch>
+                  </pic:blipFill>
+                  <pic:spPr>
+                    <a:xfrm>
+                      <a:off x="0" y="0"/>
+                      <a:ext cx="5731510" cy="3820795"/>
+                    </a:xfrm>
+                    <a:prstGeom prst="rect">
+                      <a:avLst/>
+                    </a:prstGeom>
+                  </pic:spPr>
+                </pic:pic>
+              </a:graphicData>
+            </a:graphic>
+          </wp:inline>
+        </w:drawing>
+      </w:r>
+    </w:p>
+    <w:p>
+      <w:pPr>
+        <w:pStyle w:val="Heading2"/>
+        <w:rPr>
+          <w:lang w:val="de-DE"/>
+        </w:rPr>
+      </w:pPr>
+      <w:r>
+        <w:rPr>
           <w:rtl/>
           <w:lang w:bidi="ar-SA"/>
         </w:rPr>
-        <w:t>این شکل در نسخه بعدی پروپوزال اضافه خواهد شد</w:t>
-      </w:r>
-      <w:r>
-        <w:rPr>
-          <w:i/>
-          <w:iCs/>
-          <w:color w:val="EE0000"/>
-        </w:rPr>
-        <w:t>.)</w:t>
+        <w:t>انعطاف‌پذیری در انتخاب فناوری</w:t>
+      </w:r>
+    </w:p>
+    <w:p>
+      <w:r>
+        <w:rPr>
+          <w:rtl/>
+          <w:lang w:bidi="ar-SA"/>
+        </w:rPr>
+        <w:t>یکی از ویژگی‌های مهم این راهکار، انعطاف‌پذیری در انتخاب روش‌های پیاده‌سازی است</w:t>
+      </w:r>
+      <w:r>
+        <w:t>.</w:t>
+      </w:r>
+    </w:p>
+    <w:p>
+      <w:r>
+        <w:rPr>
+          <w:rtl/>
+          <w:lang w:bidi="ar-SA"/>
+        </w:rPr>
+        <w:t xml:space="preserve">با توجه به سیاست‌های امنیتی، بودجه، الزامات اجرایی و ترجیحات کارفرما، امکان استفاده از روش‌های مختلف احراز هویت و کنترل تردد، از جمله کارت هوشمند، </w:t>
+      </w:r>
+      <w:r>
+        <w:t>QR Code</w:t>
+      </w:r>
+      <w:r>
+        <w:rPr>
+          <w:rtl/>
+          <w:lang w:bidi="ar-SA"/>
+        </w:rPr>
+        <w:t xml:space="preserve">، تشخیص چهره، </w:t>
+      </w:r>
+      <w:r>
+        <w:t>RFID</w:t>
+      </w:r>
+      <w:r>
+        <w:rPr>
+          <w:rtl/>
+          <w:lang w:bidi="ar-SA"/>
+        </w:rPr>
+        <w:t xml:space="preserve">، </w:t>
+      </w:r>
+      <w:r>
+        <w:t>UHF</w:t>
+      </w:r>
+      <w:r>
+        <w:rPr>
+          <w:rtl/>
+          <w:lang w:bidi="ar-SA"/>
+        </w:rPr>
+        <w:t>، پلاک‌خوان، گیت‌های کنترل تردد و سایر فناوری‌های مرتبط وجود خواهد داشت</w:t>
+      </w:r>
+      <w:r>
+        <w:t>.</w:t>
+      </w:r>
+    </w:p>
+    <w:p>
+      <w:r>
+        <w:rPr>
+          <w:rtl/>
+          <w:lang w:bidi="ar-SA"/>
+        </w:rPr>
+        <w:t>هدف این پیشنهاد، تحمیل یک فناوری خاص نیست، بلکه معرفی گزینه‌های قابل انتخاب و انتخاب مناسب‌ترین ترکیب بر اساس نیازهای واقعی مدرسه است</w:t>
+      </w:r>
+      <w:r>
+        <w:t>.</w:t>
       </w:r>
     </w:p>
     <w:p>
@@ -1990,7 +2068,7 @@
           <w:rtl/>
           <w:lang w:bidi="ar-SA"/>
         </w:rPr>
-        <w:t>انعطاف‌پذیری در انتخاب فناوری</w:t>
+        <w:t>جمع‌بندی فصل</w:t>
       </w:r>
     </w:p>
     <w:p>
@@ -1999,112 +2077,11 @@
           <w:rtl/>
           <w:lang w:bidi="ar-SA"/>
         </w:rPr>
-        <w:t>یکی از ویژگی‌های مهم این راهکار، انعطاف‌پذیری در انتخاب روش‌های پیاده‌سازی است</w:t>
+        <w:t>راهکار پیشنهادی، یک سامانه یکپارچه برای مدیریت تمامی فرآیندهای مرتبط با امنیت فیزیکی و کنترل تردد مدرسه است. این راهکار با تمرکز بر نیازهای عملیاتی مجموعه آموزشی طراحی شده و ضمن پاسخ‌گویی به نیازهای فعلی، امکان توسعه و انطباق با نیازهای آینده را نیز فراهم می‌کند</w:t>
       </w:r>
       <w:r>
         <w:t>.</w:t>
       </w:r>
-    </w:p>
-    <w:p>
-      <w:r>
-        <w:rPr>
-          <w:rtl/>
-          <w:lang w:bidi="ar-SA"/>
-        </w:rPr>
-        <w:lastRenderedPageBreak/>
-        <w:t xml:space="preserve">با توجه به سیاست‌های امنیتی، بودجه، الزامات اجرایی و ترجیحات کارفرما، امکان استفاده از روش‌های مختلف احراز هویت و کنترل تردد، از جمله کارت هوشمند، </w:t>
-      </w:r>
-      <w:r>
-        <w:t>QR Code</w:t>
-      </w:r>
-      <w:r>
-        <w:rPr>
-          <w:rtl/>
-          <w:lang w:bidi="ar-SA"/>
-        </w:rPr>
-        <w:t xml:space="preserve">، تشخیص چهره، </w:t>
-      </w:r>
-      <w:r>
-        <w:t>RFID</w:t>
-      </w:r>
-      <w:r>
-        <w:rPr>
-          <w:rtl/>
-          <w:lang w:bidi="ar-SA"/>
-        </w:rPr>
-        <w:t xml:space="preserve">، </w:t>
-      </w:r>
-      <w:r>
-        <w:t>UHF</w:t>
-      </w:r>
-      <w:r>
-        <w:rPr>
-          <w:rtl/>
-          <w:lang w:bidi="ar-SA"/>
-        </w:rPr>
-        <w:t>، پلاک‌خوان، گیت‌های کنترل تردد و سایر فناوری‌های مرتبط وجود خواهد داشت</w:t>
-      </w:r>
-      <w:r>
-        <w:t>.</w:t>
-      </w:r>
-    </w:p>
-    <w:p>
-      <w:r>
-        <w:rPr>
-          <w:rtl/>
-          <w:lang w:bidi="ar-SA"/>
-        </w:rPr>
-        <w:t>هدف این پیشنهاد، تحمیل یک فناوری خاص نیست، بلکه معرفی گزینه‌های قابل انتخاب و انتخاب مناسب‌ترین ترکیب بر اساس نیازهای واقعی مدرسه است</w:t>
-      </w:r>
-      <w:r>
-        <w:t>.</w:t>
-      </w:r>
-    </w:p>
-    <w:p>
-      <w:pPr>
-        <w:pStyle w:val="Heading2"/>
-        <w:rPr>
-          <w:lang w:val="de-DE"/>
-        </w:rPr>
-      </w:pPr>
-      <w:r>
-        <w:rPr>
-          <w:rtl/>
-          <w:lang w:bidi="ar-SA"/>
-        </w:rPr>
-        <w:t>جمع‌بندی فصل</w:t>
-      </w:r>
-    </w:p>
-    <w:p>
-      <w:r>
-        <w:rPr>
-          <w:rtl/>
-          <w:lang w:bidi="ar-SA"/>
-        </w:rPr>
-        <w:t>راهکار پیشنهادی، یک سامانه یکپارچه برای مدیریت تمامی فرآیندهای مرتبط با امنیت فیزیکی و کنترل تردد مدرسه است. این راهکار با تمرکز بر نیازهای عملیاتی مجموعه آموزشی طراحی شده و ضمن پاسخ‌گویی به نیازهای فعلی، امکان توسعه و انطباق با نیازهای آینده را نیز فراهم می‌کند</w:t>
-      </w:r>
-      <w:r>
-        <w:t>.</w:t>
-      </w:r>
-    </w:p>
-    <w:p>
-      <w:r>
-        <w:rPr>
-          <w:rtl/>
-          <w:lang w:bidi="ar-SA"/>
-        </w:rPr>
-        <w:t>در فصل‌های بعد، نحوه به‌کارگیری این راهکار در سناریوهای مختلف مدرسه و همچنین قابلیت‌های هر یک از زیرسامانه‌ها به تفصیل تشریح خواهد شد</w:t>
-      </w:r>
-      <w:r>
-        <w:t>.</w:t>
-      </w:r>
-    </w:p>
-    <w:p>
-      <w:pPr>
-        <w:rPr>
-          <w:rtl/>
-        </w:rPr>
-      </w:pPr>
     </w:p>
     <w:p>
       <w:pPr>
@@ -2126,8 +2103,1870 @@
         <w:rPr>
           <w:rtl/>
         </w:rPr>
-        <w:t xml:space="preserve"> عملیاتی مدرسه </w:t>
-      </w:r>
+        <w:t xml:space="preserve"> عملیاتی مدرسه</w:t>
+      </w:r>
+    </w:p>
+    <w:p>
+      <w:pPr>
+        <w:rPr>
+          <w:rFonts w:ascii="Times New Roman" w:hAnsi="Times New Roman" w:cs="Times New Roman"/>
+          <w:lang w:bidi="ar-SA"/>
+        </w:rPr>
+      </w:pPr>
+      <w:r>
+        <w:rPr>
+          <w:rStyle w:val="asoktext"/>
+          <w:rtl/>
+        </w:rPr>
+        <w:t xml:space="preserve">هدف از تعریف </w:t>
+      </w:r>
+      <w:proofErr w:type="spellStart"/>
+      <w:r>
+        <w:rPr>
+          <w:rStyle w:val="asoktext"/>
+          <w:rtl/>
+        </w:rPr>
+        <w:t>سناریوهای</w:t>
+      </w:r>
+      <w:proofErr w:type="spellEnd"/>
+      <w:r>
+        <w:rPr>
+          <w:rStyle w:val="asoktext"/>
+          <w:rtl/>
+        </w:rPr>
+        <w:t xml:space="preserve"> عملیاتی، نشان دادن نحوه عملکرد راهکار پیشنهادی در شرایط واقعی مدرسه است. این </w:t>
+      </w:r>
+      <w:proofErr w:type="spellStart"/>
+      <w:r>
+        <w:rPr>
+          <w:rStyle w:val="asoktext"/>
+          <w:rtl/>
+        </w:rPr>
+        <w:t>سناریوها</w:t>
+      </w:r>
+      <w:proofErr w:type="spellEnd"/>
+      <w:r>
+        <w:rPr>
+          <w:rStyle w:val="asoktext"/>
+          <w:rtl/>
+        </w:rPr>
+        <w:t xml:space="preserve"> مبنای طراحی معماری سیستم، تعیین نقاط کنترل، انتخاب تجهیزات، تعریف سطح </w:t>
+      </w:r>
+      <w:proofErr w:type="spellStart"/>
+      <w:r>
+        <w:rPr>
+          <w:rStyle w:val="asoktext"/>
+          <w:rtl/>
+        </w:rPr>
+        <w:t>دسترسی‌ها</w:t>
+      </w:r>
+      <w:proofErr w:type="spellEnd"/>
+      <w:r>
+        <w:rPr>
+          <w:rStyle w:val="asoktext"/>
+          <w:rtl/>
+        </w:rPr>
+        <w:t xml:space="preserve">، طراحی </w:t>
+      </w:r>
+      <w:proofErr w:type="spellStart"/>
+      <w:r>
+        <w:rPr>
+          <w:rStyle w:val="asoktext"/>
+          <w:rtl/>
+        </w:rPr>
+        <w:t>گزارش‌ها</w:t>
+      </w:r>
+      <w:proofErr w:type="spellEnd"/>
+      <w:r>
+        <w:rPr>
+          <w:rStyle w:val="asoktext"/>
+          <w:rtl/>
+        </w:rPr>
+        <w:t xml:space="preserve"> و در مراحل بعدی تهیه </w:t>
+      </w:r>
+      <w:proofErr w:type="spellStart"/>
+      <w:r>
+        <w:rPr>
+          <w:rStyle w:val="asoktext"/>
+        </w:rPr>
+        <w:t>BoQ</w:t>
+      </w:r>
+      <w:proofErr w:type="spellEnd"/>
+      <w:r>
+        <w:rPr>
+          <w:rStyle w:val="asoktext"/>
+          <w:rtl/>
+        </w:rPr>
+        <w:t xml:space="preserve"> خواهند بود.</w:t>
+      </w:r>
+    </w:p>
+    <w:p>
+      <w:pPr>
+        <w:rPr>
+          <w:rtl/>
+        </w:rPr>
+      </w:pPr>
+      <w:r>
+        <w:rPr>
+          <w:rStyle w:val="asoktext"/>
+          <w:rtl/>
+        </w:rPr>
+        <w:t xml:space="preserve">در این پروژه، کنترل تردد صرفاً به معنی باز و بسته شدن یک درب یا گیت نیست؛ بلکه هدف اصلی، مدیریت هوشمند حضور افراد و خودروها در زمان مجاز، مکان مجاز و با سطح دسترسی مجاز است. بنابراین هر رخداد تردد باید در سیستم ثبت شود، قابل </w:t>
+      </w:r>
+      <w:proofErr w:type="spellStart"/>
+      <w:r>
+        <w:rPr>
+          <w:rStyle w:val="asoktext"/>
+          <w:rtl/>
+        </w:rPr>
+        <w:t>گزارش‌گیری</w:t>
+      </w:r>
+      <w:proofErr w:type="spellEnd"/>
+      <w:r>
+        <w:rPr>
+          <w:rStyle w:val="asoktext"/>
+          <w:rtl/>
+        </w:rPr>
+        <w:t xml:space="preserve"> باشد و در صورت نقض </w:t>
+      </w:r>
+      <w:proofErr w:type="spellStart"/>
+      <w:r>
+        <w:rPr>
+          <w:rStyle w:val="asoktext"/>
+          <w:rtl/>
+        </w:rPr>
+        <w:t>سیاست‌های</w:t>
+      </w:r>
+      <w:proofErr w:type="spellEnd"/>
+      <w:r>
+        <w:rPr>
+          <w:rStyle w:val="asoktext"/>
+          <w:rtl/>
+        </w:rPr>
+        <w:t xml:space="preserve"> مدرسه، امکان ایجاد هشدار یا اقدام </w:t>
+      </w:r>
+      <w:proofErr w:type="spellStart"/>
+      <w:r>
+        <w:rPr>
+          <w:rStyle w:val="asoktext"/>
+          <w:rtl/>
+        </w:rPr>
+        <w:t>اپراتور</w:t>
+      </w:r>
+      <w:proofErr w:type="spellEnd"/>
+      <w:r>
+        <w:rPr>
+          <w:rStyle w:val="asoktext"/>
+          <w:rtl/>
+        </w:rPr>
+        <w:t xml:space="preserve"> وجود داشته باشد.</w:t>
+      </w:r>
+    </w:p>
+    <w:p>
+      <w:pPr>
+        <w:pStyle w:val="Heading2"/>
+        <w:rPr>
+          <w:rtl/>
+          <w:lang w:bidi="ar-SA"/>
+        </w:rPr>
+      </w:pPr>
+      <w:r>
+        <w:rPr>
+          <w:rtl/>
+          <w:lang w:bidi="ar-SA"/>
+        </w:rPr>
+        <w:t>سناریوی ورود دانش‌آموزان به مدرسه</w:t>
+      </w:r>
+    </w:p>
+    <w:p>
+      <w:pPr>
+        <w:rPr>
+          <w:rtl/>
+        </w:rPr>
+      </w:pPr>
+      <w:r>
+        <w:rPr>
+          <w:rStyle w:val="asoktext"/>
+          <w:rtl/>
+        </w:rPr>
+        <w:t xml:space="preserve">در ابتدای روز، </w:t>
+      </w:r>
+      <w:proofErr w:type="spellStart"/>
+      <w:r>
+        <w:rPr>
+          <w:rStyle w:val="asoktext"/>
+          <w:rtl/>
+        </w:rPr>
+        <w:t>دانش‌آموزان</w:t>
+      </w:r>
+      <w:proofErr w:type="spellEnd"/>
+      <w:r>
+        <w:rPr>
+          <w:rStyle w:val="asoktext"/>
+          <w:rtl/>
+        </w:rPr>
+        <w:t xml:space="preserve"> از </w:t>
+      </w:r>
+      <w:proofErr w:type="spellStart"/>
+      <w:r>
+        <w:rPr>
+          <w:rStyle w:val="asoktext"/>
+          <w:rtl/>
+        </w:rPr>
+        <w:t>ورودی‌های</w:t>
+      </w:r>
+      <w:proofErr w:type="spellEnd"/>
+      <w:r>
+        <w:rPr>
+          <w:rStyle w:val="asoktext"/>
+          <w:rtl/>
+        </w:rPr>
+        <w:t xml:space="preserve"> </w:t>
+      </w:r>
+      <w:proofErr w:type="spellStart"/>
+      <w:r>
+        <w:rPr>
+          <w:rStyle w:val="asoktext"/>
+          <w:rtl/>
+        </w:rPr>
+        <w:t>تعریف‌شده</w:t>
+      </w:r>
+      <w:proofErr w:type="spellEnd"/>
+      <w:r>
+        <w:rPr>
+          <w:rStyle w:val="asoktext"/>
+          <w:rtl/>
+        </w:rPr>
+        <w:t xml:space="preserve"> وارد مدرسه </w:t>
+      </w:r>
+      <w:proofErr w:type="spellStart"/>
+      <w:r>
+        <w:rPr>
+          <w:rStyle w:val="asoktext"/>
+          <w:rtl/>
+        </w:rPr>
+        <w:t>می‌شوند</w:t>
+      </w:r>
+      <w:proofErr w:type="spellEnd"/>
+      <w:r>
+        <w:rPr>
+          <w:rStyle w:val="asoktext"/>
+          <w:rtl/>
+        </w:rPr>
+        <w:t xml:space="preserve">. سیستم باید هویت </w:t>
+      </w:r>
+      <w:proofErr w:type="spellStart"/>
+      <w:r>
+        <w:rPr>
+          <w:rStyle w:val="asoktext"/>
+          <w:rtl/>
+        </w:rPr>
+        <w:t>دانش‌آموز</w:t>
+      </w:r>
+      <w:proofErr w:type="spellEnd"/>
+      <w:r>
+        <w:rPr>
+          <w:rStyle w:val="asoktext"/>
+          <w:rtl/>
+        </w:rPr>
+        <w:t xml:space="preserve"> را از طریق </w:t>
+      </w:r>
+      <w:proofErr w:type="spellStart"/>
+      <w:r>
+        <w:rPr>
+          <w:rStyle w:val="asoktext"/>
+          <w:rtl/>
+        </w:rPr>
+        <w:t>روش‌های</w:t>
+      </w:r>
+      <w:proofErr w:type="spellEnd"/>
+      <w:r>
+        <w:rPr>
+          <w:rStyle w:val="asoktext"/>
+          <w:rtl/>
+        </w:rPr>
+        <w:t xml:space="preserve"> </w:t>
+      </w:r>
+      <w:proofErr w:type="spellStart"/>
+      <w:r>
+        <w:rPr>
+          <w:rStyle w:val="asoktext"/>
+          <w:rtl/>
+        </w:rPr>
+        <w:t>تعریف‌شده</w:t>
+      </w:r>
+      <w:proofErr w:type="spellEnd"/>
+      <w:r>
+        <w:rPr>
+          <w:rStyle w:val="asoktext"/>
+          <w:rtl/>
+        </w:rPr>
+        <w:t xml:space="preserve"> مانند تشخیص چهره، کارت </w:t>
+      </w:r>
+      <w:r>
+        <w:rPr>
+          <w:rStyle w:val="asoktext"/>
+        </w:rPr>
+        <w:t>RFID</w:t>
+      </w:r>
+      <w:r>
+        <w:rPr>
+          <w:rStyle w:val="asoktext"/>
+          <w:rtl/>
+        </w:rPr>
+        <w:t xml:space="preserve"> یا سایر </w:t>
+      </w:r>
+      <w:proofErr w:type="spellStart"/>
+      <w:r>
+        <w:rPr>
+          <w:rStyle w:val="asoktext"/>
+        </w:rPr>
+        <w:t>Credential</w:t>
+      </w:r>
+      <w:proofErr w:type="spellEnd"/>
+      <w:r>
+        <w:rPr>
+          <w:rStyle w:val="asoktext"/>
+          <w:rtl/>
+        </w:rPr>
+        <w:t xml:space="preserve">های مجاز شناسایی کند. پس از شناسایی، </w:t>
+      </w:r>
+      <w:proofErr w:type="spellStart"/>
+      <w:r>
+        <w:rPr>
+          <w:rStyle w:val="asoktext"/>
+          <w:rtl/>
+        </w:rPr>
+        <w:t>نرم‌افزار</w:t>
+      </w:r>
+      <w:proofErr w:type="spellEnd"/>
+      <w:r>
+        <w:rPr>
+          <w:rStyle w:val="asoktext"/>
+          <w:rtl/>
+        </w:rPr>
+        <w:t xml:space="preserve"> مرکزی وضعیت </w:t>
+      </w:r>
+      <w:proofErr w:type="spellStart"/>
+      <w:r>
+        <w:rPr>
+          <w:rStyle w:val="asoktext"/>
+          <w:rtl/>
+        </w:rPr>
+        <w:t>دانش‌آموز</w:t>
+      </w:r>
+      <w:proofErr w:type="spellEnd"/>
+      <w:r>
+        <w:rPr>
+          <w:rStyle w:val="asoktext"/>
+          <w:rtl/>
+        </w:rPr>
+        <w:t xml:space="preserve">، زمان ورود، گروه آموزشی، بخش مربوطه و سطح دسترسی او را بررسی </w:t>
+      </w:r>
+      <w:proofErr w:type="spellStart"/>
+      <w:r>
+        <w:rPr>
+          <w:rStyle w:val="asoktext"/>
+          <w:rtl/>
+        </w:rPr>
+        <w:t>می‌کند</w:t>
+      </w:r>
+      <w:proofErr w:type="spellEnd"/>
+      <w:r>
+        <w:rPr>
+          <w:rStyle w:val="asoktext"/>
+          <w:rtl/>
+        </w:rPr>
+        <w:t>.</w:t>
+      </w:r>
+    </w:p>
+    <w:p>
+      <w:pPr>
+        <w:rPr>
+          <w:rtl/>
+        </w:rPr>
+      </w:pPr>
+      <w:r>
+        <w:rPr>
+          <w:rStyle w:val="asoktext"/>
+          <w:rtl/>
+        </w:rPr>
+        <w:t xml:space="preserve">در صورت مجاز بودن ورود، گیت یا درب مربوطه باز شده و رخداد ورود در سیستم ثبت </w:t>
+      </w:r>
+      <w:proofErr w:type="spellStart"/>
+      <w:r>
+        <w:rPr>
+          <w:rStyle w:val="asoktext"/>
+          <w:rtl/>
+        </w:rPr>
+        <w:t>می‌شود</w:t>
+      </w:r>
+      <w:proofErr w:type="spellEnd"/>
+      <w:r>
+        <w:rPr>
+          <w:rStyle w:val="asoktext"/>
+          <w:rtl/>
+        </w:rPr>
+        <w:t xml:space="preserve">. در صورت ورود خارج از زمان مجاز، استفاده از مجوز </w:t>
+      </w:r>
+      <w:proofErr w:type="spellStart"/>
+      <w:r>
+        <w:rPr>
+          <w:rStyle w:val="asoktext"/>
+          <w:rtl/>
+        </w:rPr>
+        <w:t>نامعتبر</w:t>
+      </w:r>
+      <w:proofErr w:type="spellEnd"/>
+      <w:r>
+        <w:rPr>
+          <w:rStyle w:val="asoktext"/>
+          <w:rtl/>
+        </w:rPr>
+        <w:t xml:space="preserve"> یا تلاش برای ورود از مسیر غیرمجاز، رخداد ثبت شده و بر اساس سیاست مدرسه </w:t>
+      </w:r>
+      <w:proofErr w:type="spellStart"/>
+      <w:r>
+        <w:rPr>
+          <w:rStyle w:val="asoktext"/>
+          <w:rtl/>
+        </w:rPr>
+        <w:t>می‌تواند</w:t>
+      </w:r>
+      <w:proofErr w:type="spellEnd"/>
+      <w:r>
+        <w:rPr>
+          <w:rStyle w:val="asoktext"/>
+          <w:rtl/>
+        </w:rPr>
+        <w:t xml:space="preserve"> به عنوان هشدار برای </w:t>
+      </w:r>
+      <w:proofErr w:type="spellStart"/>
+      <w:r>
+        <w:rPr>
+          <w:rStyle w:val="asoktext"/>
+          <w:rtl/>
+        </w:rPr>
+        <w:t>اپراتور</w:t>
+      </w:r>
+      <w:proofErr w:type="spellEnd"/>
+      <w:r>
+        <w:rPr>
+          <w:rStyle w:val="asoktext"/>
+          <w:rtl/>
+        </w:rPr>
+        <w:t xml:space="preserve"> نمایش داده شود.</w:t>
+      </w:r>
+    </w:p>
+    <w:p>
+      <w:pPr>
+        <w:rPr>
+          <w:rtl/>
+        </w:rPr>
+      </w:pPr>
+      <w:r>
+        <w:rPr>
+          <w:rStyle w:val="asoktext"/>
+          <w:rtl/>
+        </w:rPr>
+        <w:t xml:space="preserve">خروجی این </w:t>
+      </w:r>
+      <w:proofErr w:type="spellStart"/>
+      <w:r>
+        <w:rPr>
+          <w:rStyle w:val="asoktext"/>
+          <w:rtl/>
+        </w:rPr>
+        <w:t>سناریو</w:t>
+      </w:r>
+      <w:proofErr w:type="spellEnd"/>
+      <w:r>
+        <w:rPr>
+          <w:rStyle w:val="asoktext"/>
+          <w:rtl/>
+        </w:rPr>
+        <w:t xml:space="preserve"> شامل ثبت دقیق ورود روزانه </w:t>
+      </w:r>
+      <w:proofErr w:type="spellStart"/>
+      <w:r>
+        <w:rPr>
+          <w:rStyle w:val="asoktext"/>
+          <w:rtl/>
+        </w:rPr>
+        <w:t>دانش‌آموزان</w:t>
+      </w:r>
+      <w:proofErr w:type="spellEnd"/>
+      <w:r>
+        <w:rPr>
+          <w:rStyle w:val="asoktext"/>
+          <w:rtl/>
+        </w:rPr>
+        <w:t xml:space="preserve">، امکان </w:t>
+      </w:r>
+      <w:proofErr w:type="spellStart"/>
+      <w:r>
+        <w:rPr>
+          <w:rStyle w:val="asoktext"/>
+          <w:rtl/>
+        </w:rPr>
+        <w:t>گزارش‌گیری</w:t>
+      </w:r>
+      <w:proofErr w:type="spellEnd"/>
+      <w:r>
+        <w:rPr>
+          <w:rStyle w:val="asoktext"/>
+          <w:rtl/>
+        </w:rPr>
+        <w:t xml:space="preserve"> برای مدیریت مدرسه و در صورت تأیید دامنه پروژه، امکان </w:t>
+      </w:r>
+      <w:proofErr w:type="spellStart"/>
+      <w:r>
+        <w:rPr>
+          <w:rStyle w:val="asoktext"/>
+          <w:rtl/>
+        </w:rPr>
+        <w:t>اطلاع‌رسانی</w:t>
+      </w:r>
+      <w:proofErr w:type="spellEnd"/>
+      <w:r>
+        <w:rPr>
+          <w:rStyle w:val="asoktext"/>
+          <w:rtl/>
+        </w:rPr>
+        <w:t xml:space="preserve"> به والدین خواهد بود.</w:t>
+      </w:r>
+    </w:p>
+    <w:p>
+      <w:pPr>
+        <w:pStyle w:val="Heading2"/>
+        <w:rPr>
+          <w:rtl/>
+        </w:rPr>
+      </w:pPr>
+      <w:r>
+        <w:rPr>
+          <w:rtl/>
+        </w:rPr>
+        <w:lastRenderedPageBreak/>
+        <w:t>سناریوی خروج دانش‌آموزان از مدرسه</w:t>
+      </w:r>
+    </w:p>
+    <w:p>
+      <w:pPr>
+        <w:rPr>
+          <w:rtl/>
+        </w:rPr>
+      </w:pPr>
+      <w:r>
+        <w:rPr>
+          <w:rStyle w:val="asoktext"/>
+          <w:rtl/>
+        </w:rPr>
+        <w:t xml:space="preserve">خروج </w:t>
+      </w:r>
+      <w:proofErr w:type="spellStart"/>
+      <w:r>
+        <w:rPr>
+          <w:rStyle w:val="asoktext"/>
+          <w:rtl/>
+        </w:rPr>
+        <w:t>دانش‌آموزان</w:t>
+      </w:r>
+      <w:proofErr w:type="spellEnd"/>
+      <w:r>
+        <w:rPr>
+          <w:rStyle w:val="asoktext"/>
+          <w:rtl/>
+        </w:rPr>
+        <w:t xml:space="preserve"> باید بر اساس برنامه زمانی مدرسه، </w:t>
+      </w:r>
+      <w:proofErr w:type="spellStart"/>
+      <w:r>
+        <w:rPr>
+          <w:rStyle w:val="asoktext"/>
+          <w:rtl/>
+        </w:rPr>
+        <w:t>سیاست‌های</w:t>
+      </w:r>
+      <w:proofErr w:type="spellEnd"/>
+      <w:r>
+        <w:rPr>
+          <w:rStyle w:val="asoktext"/>
+          <w:rtl/>
+        </w:rPr>
+        <w:t xml:space="preserve"> خروج و مجوزهای </w:t>
+      </w:r>
+      <w:proofErr w:type="spellStart"/>
+      <w:r>
+        <w:rPr>
+          <w:rStyle w:val="asoktext"/>
+          <w:rtl/>
+        </w:rPr>
+        <w:t>تعریف‌شده</w:t>
+      </w:r>
+      <w:proofErr w:type="spellEnd"/>
+      <w:r>
+        <w:rPr>
+          <w:rStyle w:val="asoktext"/>
+          <w:rtl/>
+        </w:rPr>
+        <w:t xml:space="preserve"> کنترل شود. در ساعات عادی پایان مدرسه، خروج </w:t>
+      </w:r>
+      <w:proofErr w:type="spellStart"/>
+      <w:r>
+        <w:rPr>
+          <w:rStyle w:val="asoktext"/>
+          <w:rtl/>
+        </w:rPr>
+        <w:t>دانش‌آموز</w:t>
+      </w:r>
+      <w:proofErr w:type="spellEnd"/>
+      <w:r>
+        <w:rPr>
+          <w:rStyle w:val="asoktext"/>
+          <w:rtl/>
+        </w:rPr>
+        <w:t xml:space="preserve"> از مسیرهای مشخص ثبت </w:t>
+      </w:r>
+      <w:proofErr w:type="spellStart"/>
+      <w:r>
+        <w:rPr>
+          <w:rStyle w:val="asoktext"/>
+          <w:rtl/>
+        </w:rPr>
+        <w:t>می‌شود</w:t>
+      </w:r>
+      <w:proofErr w:type="spellEnd"/>
+      <w:r>
+        <w:rPr>
+          <w:rStyle w:val="asoktext"/>
+          <w:rtl/>
+        </w:rPr>
+        <w:t xml:space="preserve"> و درب یا گیت خروجی اجازه عبور را صادر </w:t>
+      </w:r>
+      <w:proofErr w:type="spellStart"/>
+      <w:r>
+        <w:rPr>
+          <w:rStyle w:val="asoktext"/>
+          <w:rtl/>
+        </w:rPr>
+        <w:t>می‌کند</w:t>
+      </w:r>
+      <w:proofErr w:type="spellEnd"/>
+      <w:r>
+        <w:rPr>
+          <w:rStyle w:val="asoktext"/>
+          <w:rtl/>
+        </w:rPr>
+        <w:t>.</w:t>
+      </w:r>
+    </w:p>
+    <w:p>
+      <w:pPr>
+        <w:rPr>
+          <w:rtl/>
+        </w:rPr>
+      </w:pPr>
+      <w:r>
+        <w:rPr>
+          <w:rStyle w:val="asoktext"/>
+          <w:rtl/>
+        </w:rPr>
+        <w:t xml:space="preserve">در صورتی که </w:t>
+      </w:r>
+      <w:proofErr w:type="spellStart"/>
+      <w:r>
+        <w:rPr>
+          <w:rStyle w:val="asoktext"/>
+          <w:rtl/>
+        </w:rPr>
+        <w:t>دانش‌آموز</w:t>
+      </w:r>
+      <w:proofErr w:type="spellEnd"/>
+      <w:r>
+        <w:rPr>
+          <w:rStyle w:val="asoktext"/>
+          <w:rtl/>
+        </w:rPr>
+        <w:t xml:space="preserve"> قبل از زمان مجاز قصد خروج داشته باشد، سیستم باید امکان جلوگیری از خروج، ثبت رخداد، نمایش هشدار به </w:t>
+      </w:r>
+      <w:proofErr w:type="spellStart"/>
+      <w:r>
+        <w:rPr>
+          <w:rStyle w:val="asoktext"/>
+          <w:rtl/>
+        </w:rPr>
+        <w:t>اپراتور</w:t>
+      </w:r>
+      <w:proofErr w:type="spellEnd"/>
+      <w:r>
+        <w:rPr>
+          <w:rStyle w:val="asoktext"/>
+          <w:rtl/>
+        </w:rPr>
+        <w:t xml:space="preserve"> یا نیاز به تأیید مسئول مدرسه را فراهم کند. این سیاست </w:t>
+      </w:r>
+      <w:proofErr w:type="spellStart"/>
+      <w:r>
+        <w:rPr>
+          <w:rStyle w:val="asoktext"/>
+          <w:rtl/>
+        </w:rPr>
+        <w:t>می‌تواند</w:t>
+      </w:r>
+      <w:proofErr w:type="spellEnd"/>
+      <w:r>
+        <w:rPr>
+          <w:rStyle w:val="asoktext"/>
+          <w:rtl/>
+        </w:rPr>
+        <w:t xml:space="preserve"> برای مقاطع، </w:t>
+      </w:r>
+      <w:proofErr w:type="spellStart"/>
+      <w:r>
+        <w:rPr>
+          <w:rStyle w:val="asoktext"/>
+          <w:rtl/>
+        </w:rPr>
+        <w:t>پایه‌ها</w:t>
+      </w:r>
+      <w:proofErr w:type="spellEnd"/>
+      <w:r>
+        <w:rPr>
+          <w:rStyle w:val="asoktext"/>
+          <w:rtl/>
+        </w:rPr>
+        <w:t xml:space="preserve"> یا </w:t>
+      </w:r>
+      <w:proofErr w:type="spellStart"/>
+      <w:r>
+        <w:rPr>
+          <w:rStyle w:val="asoktext"/>
+          <w:rtl/>
+        </w:rPr>
+        <w:t>گروه‌های</w:t>
+      </w:r>
+      <w:proofErr w:type="spellEnd"/>
+      <w:r>
+        <w:rPr>
+          <w:rStyle w:val="asoktext"/>
+          <w:rtl/>
+        </w:rPr>
+        <w:t xml:space="preserve"> مختلف متفاوت تعریف شود.</w:t>
+      </w:r>
+    </w:p>
+    <w:p>
+      <w:pPr>
+        <w:rPr>
+          <w:rtl/>
+        </w:rPr>
+      </w:pPr>
+      <w:r>
+        <w:rPr>
+          <w:rStyle w:val="asoktext"/>
+          <w:rtl/>
+        </w:rPr>
+        <w:t xml:space="preserve">این </w:t>
+      </w:r>
+      <w:proofErr w:type="spellStart"/>
+      <w:r>
+        <w:rPr>
+          <w:rStyle w:val="asoktext"/>
+          <w:rtl/>
+        </w:rPr>
+        <w:t>سناریو</w:t>
+      </w:r>
+      <w:proofErr w:type="spellEnd"/>
+      <w:r>
+        <w:rPr>
+          <w:rStyle w:val="asoktext"/>
+          <w:rtl/>
+        </w:rPr>
+        <w:t xml:space="preserve"> امکان کنترل خروج غیرمجاز، ثبت کامل سوابق خروج و ایجاد گزارش برای مدیریت مدرسه را فراهم </w:t>
+      </w:r>
+      <w:proofErr w:type="spellStart"/>
+      <w:r>
+        <w:rPr>
+          <w:rStyle w:val="asoktext"/>
+          <w:rtl/>
+        </w:rPr>
+        <w:t>می‌کند</w:t>
+      </w:r>
+      <w:proofErr w:type="spellEnd"/>
+      <w:r>
+        <w:rPr>
+          <w:rStyle w:val="asoktext"/>
+          <w:rtl/>
+        </w:rPr>
+        <w:t>.</w:t>
+      </w:r>
+    </w:p>
+    <w:p>
+      <w:pPr>
+        <w:pStyle w:val="Heading2"/>
+        <w:rPr>
+          <w:rtl/>
+        </w:rPr>
+      </w:pPr>
+      <w:r>
+        <w:rPr>
+          <w:rtl/>
+        </w:rPr>
+        <w:t>سناریوی دسترسی دانش‌آموز به کلاس مجاز</w:t>
+      </w:r>
+    </w:p>
+    <w:p>
+      <w:pPr>
+        <w:rPr>
+          <w:rtl/>
+        </w:rPr>
+      </w:pPr>
+      <w:r>
+        <w:rPr>
+          <w:rStyle w:val="asoktext"/>
+          <w:rtl/>
+        </w:rPr>
+        <w:t>هر دانش‌آموز باید فقط به کلاس یا فضاهایی دسترسی داشته باشد که برای او تعریف شده است. این دسترسی می‌تواند ثابت باشد یا بر اساس برنامه هفتگی، ساعت کلاس، پایه تحصیلی، بخش مدرسه یا سیاست‌های امنیتی تغییر کند.</w:t>
+      </w:r>
+    </w:p>
+    <w:p>
+      <w:pPr>
+        <w:rPr>
+          <w:rtl/>
+        </w:rPr>
+      </w:pPr>
+      <w:r>
+        <w:rPr>
+          <w:rStyle w:val="asoktext"/>
+          <w:rtl/>
+        </w:rPr>
+        <w:t>هنگام مراجعه دانش‌آموز به کلاس، سیستم هویت او را بررسی کرده و نرم‌افزار مرکزی تعیین می‌کند که آیا دانش‌آموز در آن زمان مجاز به ورود به آن کلاس است یا خیر. در صورت مجاز بودن، درب باز شده و رخداد ورود ثبت می‌شود. در صورت عدم مجوز، دسترسی رد شده و رخداد به عنوان تلاش ناموفق ثبت می‌شود.</w:t>
+      </w:r>
+    </w:p>
+    <w:p>
+      <w:pPr>
+        <w:rPr>
+          <w:rtl/>
+        </w:rPr>
+      </w:pPr>
+      <w:r>
+        <w:rPr>
+          <w:rStyle w:val="asoktext"/>
+          <w:rtl/>
+        </w:rPr>
+        <w:t>در صورت تصمیم مدرسه، ورود به کلاس اشتباه می‌تواند فقط به عنوان رخداد انضباطی ثبت شود یا به عنوان هشدار برای اپراتور ارسال گردد.</w:t>
+      </w:r>
+    </w:p>
+    <w:p>
+      <w:pPr>
+        <w:pStyle w:val="Heading2"/>
+        <w:rPr>
+          <w:rtl/>
+          <w:lang w:bidi="ar-SA"/>
+        </w:rPr>
+      </w:pPr>
+      <w:r>
+        <w:rPr>
+          <w:rtl/>
+          <w:lang w:bidi="ar-SA"/>
+        </w:rPr>
+        <w:t>سناریوی دسترسی به آزمایشگاه‌ها و فضاهای تخصصی</w:t>
+      </w:r>
+    </w:p>
+    <w:p>
+      <w:pPr>
+        <w:rPr>
+          <w:rtl/>
+        </w:rPr>
+      </w:pPr>
+      <w:r>
+        <w:rPr>
+          <w:rStyle w:val="asoktext"/>
+          <w:rtl/>
+        </w:rPr>
+        <w:t xml:space="preserve">آزمایشگاه‌ها و فضاهای تخصصی مانند </w:t>
+      </w:r>
+      <w:proofErr w:type="spellStart"/>
+      <w:r>
+        <w:rPr>
+          <w:rStyle w:val="asoktext"/>
+        </w:rPr>
+        <w:t>Biology</w:t>
+      </w:r>
+      <w:proofErr w:type="spellEnd"/>
+      <w:r>
+        <w:rPr>
+          <w:rStyle w:val="asoktext"/>
+        </w:rPr>
+        <w:t xml:space="preserve"> Lab</w:t>
+      </w:r>
+      <w:r>
+        <w:rPr>
+          <w:rStyle w:val="asoktext"/>
+          <w:rtl/>
+        </w:rPr>
+        <w:t xml:space="preserve">، </w:t>
+      </w:r>
+      <w:r>
+        <w:rPr>
+          <w:rStyle w:val="asoktext"/>
+        </w:rPr>
+        <w:t>Chemistry Lab</w:t>
+      </w:r>
+      <w:r>
+        <w:rPr>
+          <w:rStyle w:val="asoktext"/>
+          <w:rtl/>
+        </w:rPr>
+        <w:t xml:space="preserve">، </w:t>
+      </w:r>
+      <w:r>
+        <w:rPr>
+          <w:rStyle w:val="asoktext"/>
+        </w:rPr>
+        <w:t>Physics Lab</w:t>
+      </w:r>
+      <w:r>
+        <w:rPr>
+          <w:rStyle w:val="asoktext"/>
+          <w:rtl/>
+        </w:rPr>
+        <w:t xml:space="preserve">، </w:t>
+      </w:r>
+      <w:r>
+        <w:rPr>
+          <w:rStyle w:val="asoktext"/>
+        </w:rPr>
+        <w:t>Computer Lab</w:t>
+      </w:r>
+      <w:r>
+        <w:rPr>
+          <w:rStyle w:val="asoktext"/>
+          <w:rtl/>
+        </w:rPr>
+        <w:t xml:space="preserve">، </w:t>
+      </w:r>
+      <w:r>
+        <w:rPr>
+          <w:rStyle w:val="asoktext"/>
+        </w:rPr>
+        <w:t>IT Room</w:t>
+      </w:r>
+      <w:r>
+        <w:rPr>
+          <w:rStyle w:val="asoktext"/>
+          <w:rtl/>
+        </w:rPr>
+        <w:t xml:space="preserve"> و سایر فضاهای حساس باید دارای کنترل دسترسی دقیق‌تر باشند. ورود به این فضاها می‌تواند بر اساس نقش فرد، برنامه درسی، حضور معلم، زمان مجاز یا سطح دسترسی خاص کنترل شود.</w:t>
+      </w:r>
+    </w:p>
+    <w:p>
+      <w:pPr>
+        <w:rPr>
+          <w:rtl/>
+        </w:rPr>
+      </w:pPr>
+      <w:r>
+        <w:rPr>
+          <w:rStyle w:val="asoktext"/>
+          <w:rtl/>
+        </w:rPr>
+        <w:lastRenderedPageBreak/>
+        <w:t>برای دانش‌آموزان، سیستم باید بررسی کند که آیا ورود به آزمایشگاه در آن ساعت و برای آن گروه آموزشی مجاز است یا خیر. برای معلمان و پرسنل، دسترسی بر اساس نقش و سطح مجوز تعریف‌شده کنترل می‌شود.</w:t>
+      </w:r>
+    </w:p>
+    <w:p>
+      <w:pPr>
+        <w:rPr>
+          <w:rtl/>
+        </w:rPr>
+      </w:pPr>
+      <w:r>
+        <w:rPr>
+          <w:rStyle w:val="asoktext"/>
+          <w:rtl/>
+        </w:rPr>
+        <w:t>این سناریو به کاهش ورود غیرمجاز به فضاهای حساس، افزایش ایمنی دانش‌آموزان و ثبت دقیق تردد در فضاهای تخصصی کمک می‌کند.</w:t>
+      </w:r>
+    </w:p>
+    <w:p>
+      <w:pPr>
+        <w:pStyle w:val="Heading2"/>
+        <w:rPr>
+          <w:rtl/>
+        </w:rPr>
+      </w:pPr>
+      <w:r>
+        <w:rPr>
+          <w:rtl/>
+        </w:rPr>
+        <w:t>سناریوی کنترل راهروها، طبقات و نواحی غیرمجاز</w:t>
+      </w:r>
+    </w:p>
+    <w:p>
+      <w:pPr>
+        <w:rPr>
+          <w:rtl/>
+        </w:rPr>
+      </w:pPr>
+      <w:r>
+        <w:rPr>
+          <w:rStyle w:val="asoktext"/>
+          <w:rtl/>
+        </w:rPr>
+        <w:t xml:space="preserve">در راهروها، طبقات، مسیرهای ارتباطی و نقاط حساس مدرسه، سیستم می‌تواند برای پایش حضور افراد و تشخیص حضور در ناحیه غیرمجاز استفاده شود. این کنترل </w:t>
+      </w:r>
+      <w:proofErr w:type="spellStart"/>
+      <w:r>
+        <w:rPr>
+          <w:rStyle w:val="asoktext"/>
+          <w:rtl/>
+        </w:rPr>
+        <w:t>می‌تواند</w:t>
+      </w:r>
+      <w:proofErr w:type="spellEnd"/>
+      <w:r>
+        <w:rPr>
+          <w:rStyle w:val="asoktext"/>
+          <w:rtl/>
+        </w:rPr>
+        <w:t xml:space="preserve"> از طریق دوربین</w:t>
+      </w:r>
+      <w:r>
+        <w:rPr>
+          <w:rStyle w:val="asoktext"/>
+        </w:rPr>
+        <w:t xml:space="preserve"> </w:t>
+      </w:r>
+      <w:r>
+        <w:rPr>
+          <w:rStyle w:val="asoktext"/>
+          <w:rFonts w:hint="cs"/>
+          <w:rtl/>
+        </w:rPr>
+        <w:t xml:space="preserve"> های مدار بسته تحت شبکه و پردازش تص</w:t>
+      </w:r>
+      <w:r>
+        <w:rPr>
+          <w:rStyle w:val="asoktext"/>
+          <w:rFonts w:hint="cs"/>
+          <w:rtl/>
+        </w:rPr>
+        <w:t>ا</w:t>
+      </w:r>
+      <w:r>
+        <w:rPr>
+          <w:rStyle w:val="asoktext"/>
+          <w:rFonts w:hint="cs"/>
+          <w:rtl/>
+        </w:rPr>
+        <w:t>ویر</w:t>
+      </w:r>
+      <w:r>
+        <w:rPr>
+          <w:rStyle w:val="asoktext"/>
+          <w:rFonts w:hint="cs"/>
+          <w:rtl/>
+        </w:rPr>
+        <w:t xml:space="preserve"> آن</w:t>
+      </w:r>
+      <w:r>
+        <w:rPr>
+          <w:rStyle w:val="asoktext"/>
+          <w:rFonts w:hint="cs"/>
+          <w:rtl/>
+        </w:rPr>
+        <w:t xml:space="preserve"> توسط سامانه نرم افزاری</w:t>
+      </w:r>
+      <w:r>
+        <w:rPr>
+          <w:rStyle w:val="asoktext"/>
+          <w:rFonts w:hint="cs"/>
+          <w:rtl/>
+        </w:rPr>
+        <w:t xml:space="preserve"> </w:t>
+      </w:r>
+      <w:proofErr w:type="spellStart"/>
+      <w:r>
+        <w:rPr>
+          <w:rStyle w:val="asoktext"/>
+          <w:rFonts w:hint="cs"/>
+          <w:rtl/>
+        </w:rPr>
+        <w:t>منترل</w:t>
+      </w:r>
+      <w:proofErr w:type="spellEnd"/>
+      <w:r>
+        <w:rPr>
+          <w:rStyle w:val="asoktext"/>
+          <w:rFonts w:hint="cs"/>
+          <w:rtl/>
+        </w:rPr>
+        <w:t xml:space="preserve"> تردد</w:t>
+      </w:r>
+      <w:r>
+        <w:rPr>
+          <w:rStyle w:val="asoktext"/>
+          <w:rtl/>
+        </w:rPr>
+        <w:t xml:space="preserve"> انجام شود.</w:t>
+      </w:r>
+    </w:p>
+    <w:p>
+      <w:pPr>
+        <w:rPr>
+          <w:rtl/>
+        </w:rPr>
+      </w:pPr>
+      <w:r>
+        <w:rPr>
+          <w:rStyle w:val="asoktext"/>
+          <w:rtl/>
+        </w:rPr>
+        <w:t>در صورت شناسایی فرد در ناحیه‌ای که برای او مجاز نیست، رخداد در نرم‌افزار ثبت شده و بر اساس سطح اهمیت ناحیه، هشدار برای اپراتور ایجاد می‌شود. برای مثال، حضور دانش‌آموز در طبقه، بخش یا راهروی غیرمجاز می‌تواند به صورت رخداد قابل پیگیری ثبت شود.</w:t>
+      </w:r>
+    </w:p>
+    <w:p>
+      <w:pPr>
+        <w:rPr>
+          <w:rtl/>
+        </w:rPr>
+      </w:pPr>
+      <w:r>
+        <w:rPr>
+          <w:rStyle w:val="asoktext"/>
+          <w:rtl/>
+        </w:rPr>
+        <w:t xml:space="preserve">اجرای این سناریو وابسته به تعیین نواحی حساس، سیاست مدرسه و تصمیم نهایی درباره استفاده از </w:t>
+      </w:r>
+      <w:r>
+        <w:rPr>
+          <w:rStyle w:val="asoktext"/>
+          <w:rFonts w:hint="cs"/>
+          <w:rtl/>
+        </w:rPr>
+        <w:t>دوربین های در این نواحی</w:t>
+      </w:r>
+      <w:r>
+        <w:rPr>
+          <w:rStyle w:val="asoktext"/>
+          <w:rtl/>
+        </w:rPr>
+        <w:t xml:space="preserve"> خواهد بود.</w:t>
+      </w:r>
+    </w:p>
+    <w:p>
+      <w:pPr>
+        <w:pStyle w:val="Heading2"/>
+        <w:rPr>
+          <w:rtl/>
+        </w:rPr>
+      </w:pPr>
+      <w:r>
+        <w:rPr>
+          <w:rtl/>
+        </w:rPr>
+        <w:t>سناریوی ورود و خروج پرسنل، معلمان و مدیران</w:t>
+      </w:r>
+    </w:p>
+    <w:p>
+      <w:pPr>
+        <w:rPr>
+          <w:rtl/>
+        </w:rPr>
+      </w:pPr>
+      <w:r>
+        <w:rPr>
+          <w:rStyle w:val="asoktext"/>
+          <w:rtl/>
+        </w:rPr>
+        <w:t>پرسنل، معلمان، مدیران و نیروهای خدماتی باید بر اساس نقش، زمان کاری و سطح دسترسی تعریف‌شده بتوانند وارد فضاهای مجاز شوند. دسترسی معلمان می‌تواند محدود به کلاس‌ها، آزمایشگاه‌ها و فضاهای آموزشی مرتبط باشد. دسترسی پرسنل اداری، خدماتی و مدیریتی نیز باید بر اساس وظیفه سازمانی و سیاست مدرسه تعریف شود.</w:t>
+      </w:r>
+    </w:p>
+    <w:p>
+      <w:pPr>
+        <w:rPr>
+          <w:rtl/>
+        </w:rPr>
+      </w:pPr>
+      <w:r>
+        <w:rPr>
+          <w:rStyle w:val="asoktext"/>
+          <w:rtl/>
+        </w:rPr>
+        <w:t>در هر تردد، هویت فرد بررسی می‌شود و نرم‌افزار مرکزی سطح دسترسی او را کنترل می‌کند. در صورت مجاز بودن، تردد ثبت شده و مسیر باز می‌شود. در صورت عدم مجوز، رخداد ثبت شده و در صورت نیاز به اپراتور اعلام می‌شود.</w:t>
+      </w:r>
+    </w:p>
+    <w:p>
+      <w:pPr>
+        <w:rPr>
+          <w:rtl/>
+        </w:rPr>
+      </w:pPr>
+      <w:r>
+        <w:rPr>
+          <w:rStyle w:val="asoktext"/>
+          <w:rtl/>
+        </w:rPr>
+        <w:lastRenderedPageBreak/>
+        <w:t>در صورت قرار گرفتن حضور و غیاب پرسنل در دامنه پروژه، داده‌های تردد می‌توانند به عنوان ورودی گزارش‌های حضور و غیاب نیز استفاده شوند.</w:t>
+      </w:r>
+    </w:p>
+    <w:p>
+      <w:pPr>
+        <w:pStyle w:val="Heading2"/>
+        <w:rPr>
+          <w:rtl/>
+        </w:rPr>
+      </w:pPr>
+      <w:r>
+        <w:rPr>
+          <w:rtl/>
+        </w:rPr>
+        <w:t>سناریوی ورود والدین، مهمانان و مراجعان</w:t>
+      </w:r>
+    </w:p>
+    <w:p>
+      <w:pPr>
+        <w:rPr>
+          <w:rtl/>
+        </w:rPr>
+      </w:pPr>
+      <w:r>
+        <w:rPr>
+          <w:rStyle w:val="asoktext"/>
+          <w:rtl/>
+        </w:rPr>
+        <w:t xml:space="preserve">والدین، مهمانان و مراجعان نباید امکان تردد آزاد در مدرسه داشته باشند. این افراد باید ابتدا در </w:t>
+      </w:r>
+      <w:r>
+        <w:rPr>
+          <w:rStyle w:val="asoktext"/>
+        </w:rPr>
+        <w:t>Reception</w:t>
+      </w:r>
+      <w:r>
+        <w:rPr>
+          <w:rStyle w:val="asoktext"/>
+          <w:rtl/>
+        </w:rPr>
+        <w:t xml:space="preserve"> یا </w:t>
+      </w:r>
+      <w:r>
+        <w:rPr>
+          <w:rStyle w:val="asoktext"/>
+        </w:rPr>
+        <w:t>Guard Room</w:t>
+      </w:r>
+      <w:r>
+        <w:rPr>
+          <w:rStyle w:val="asoktext"/>
+          <w:rtl/>
+        </w:rPr>
+        <w:t xml:space="preserve"> ثبت شوند. اطلاعاتی مانند نام، مشخصات هویتی، هدف مراجعه، شخص میزبان، زمان مراجعه و محدوده مجاز در سیستم ثبت می‌شود.</w:t>
+      </w:r>
+    </w:p>
+    <w:p>
+      <w:pPr>
+        <w:rPr>
+          <w:rtl/>
+        </w:rPr>
+      </w:pPr>
+      <w:r>
+        <w:rPr>
+          <w:rStyle w:val="asoktext"/>
+          <w:rtl/>
+        </w:rPr>
+        <w:t xml:space="preserve">پس از تأیید توسط مسئول مربوطه یا میزبان، مجوز موقت برای مراجعه‌کننده صادر می‌شود. این مجوز می‌تواند به صورت کارت موقت، </w:t>
+      </w:r>
+      <w:r>
+        <w:rPr>
+          <w:rStyle w:val="asoktext"/>
+        </w:rPr>
+        <w:t>QR Code</w:t>
+      </w:r>
+      <w:r>
+        <w:rPr>
+          <w:rStyle w:val="asoktext"/>
+          <w:rtl/>
+        </w:rPr>
+        <w:t xml:space="preserve"> یا روش دیگر تعریف شود. مراجعه‌کننده فقط می‌تواند از مسیرها و نقاط مجاز عبور کند و خروج او نیز باید در سیستم ثبت شود.</w:t>
+      </w:r>
+    </w:p>
+    <w:p>
+      <w:pPr>
+        <w:rPr>
+          <w:rtl/>
+        </w:rPr>
+      </w:pPr>
+      <w:r>
+        <w:rPr>
+          <w:rStyle w:val="asoktext"/>
+          <w:rtl/>
+        </w:rPr>
+        <w:t>این سناریو باعث کنترل دقیق ورود افراد غیرمقیم، ثبت سوابق مراجعه و جلوگیری از حضور غیرمجاز در فضاهای آموزشی و حساس مدرسه می‌شود.</w:t>
+      </w:r>
+    </w:p>
+    <w:p>
+      <w:pPr>
+        <w:pStyle w:val="Heading2"/>
+        <w:rPr>
+          <w:rtl/>
+        </w:rPr>
+      </w:pPr>
+      <w:r>
+        <w:rPr>
+          <w:rtl/>
+        </w:rPr>
+        <w:t>سناریوی گزارش ورود و خروج دانش‌آموز برای والدین</w:t>
+      </w:r>
+    </w:p>
+    <w:p>
+      <w:pPr>
+        <w:rPr>
+          <w:rtl/>
+        </w:rPr>
+      </w:pPr>
+      <w:r>
+        <w:rPr>
+          <w:rStyle w:val="asoktext"/>
+          <w:rtl/>
+        </w:rPr>
+        <w:t xml:space="preserve">در صورت تأیید دامنه پروژه، سیستم می‌تواند امکان مشاهده یا ارسال گزارش ورود و خروج دانش‌آموز را برای والدین فراهم کند. این قابلیت می‌تواند از طریق پنل نرم‌افزار، اتصال به سامانه مدرسه، </w:t>
+      </w:r>
+      <w:r>
+        <w:rPr>
+          <w:rStyle w:val="asoktext"/>
+        </w:rPr>
+        <w:t>API</w:t>
+      </w:r>
+      <w:r>
+        <w:rPr>
+          <w:rStyle w:val="asoktext"/>
+          <w:rtl/>
+        </w:rPr>
+        <w:t>، پیامک، اپلیکیشن یا سایر روش‌های مورد تأیید کارفرما پیاده‌سازی شود.</w:t>
+      </w:r>
+    </w:p>
+    <w:p>
+      <w:pPr>
+        <w:rPr>
+          <w:rtl/>
+        </w:rPr>
+      </w:pPr>
+      <w:r>
+        <w:rPr>
+          <w:rStyle w:val="asoktext"/>
+          <w:rtl/>
+        </w:rPr>
+        <w:t xml:space="preserve">در این سناریو، رخداد ورود یا خروج دانش‌آموز در نرم‌افزار مرکزی ثبت می‌شود و در صورت وجود </w:t>
+      </w:r>
+      <w:r>
+        <w:rPr>
+          <w:rStyle w:val="asoktext"/>
+        </w:rPr>
+        <w:t>Integration</w:t>
+      </w:r>
+      <w:r>
+        <w:rPr>
+          <w:rStyle w:val="asoktext"/>
+          <w:rtl/>
+        </w:rPr>
+        <w:t>، اطلاعات به سامانه مدرسه یا کانال اطلاع‌رسانی والدین منتقل می‌گردد.</w:t>
+      </w:r>
+    </w:p>
+    <w:p>
+      <w:pPr>
+        <w:rPr>
+          <w:rtl/>
+        </w:rPr>
+      </w:pPr>
+      <w:r>
+        <w:rPr>
+          <w:rStyle w:val="asoktext"/>
+          <w:rtl/>
+        </w:rPr>
+        <w:t>سطح اطلاعات قابل نمایش برای والدین باید به صورت دقیق توسط مدرسه تعیین شود. پیشنهاد می‌شود در فاز اولیه، تمرکز بر گزارش ورود و خروج اصلی مدرسه باشد و نمایش تردد داخلی دانش‌آموزان فقط در صورت تأیید سیاست‌های مدرسه فعال شود.</w:t>
+      </w:r>
+    </w:p>
+    <w:p>
+      <w:pPr>
+        <w:pStyle w:val="Heading2"/>
+        <w:rPr>
+          <w:rtl/>
+        </w:rPr>
+      </w:pPr>
+      <w:r>
+        <w:rPr>
+          <w:rtl/>
+        </w:rPr>
+        <w:lastRenderedPageBreak/>
+        <w:t>سناریوی مدیریت پارکینگ و خودروهای مجاز</w:t>
+      </w:r>
+    </w:p>
+    <w:p>
+      <w:pPr>
+        <w:rPr>
+          <w:rtl/>
+        </w:rPr>
+      </w:pPr>
+      <w:r>
+        <w:rPr>
+          <w:rStyle w:val="asoktext"/>
+          <w:rtl/>
+        </w:rPr>
+        <w:t xml:space="preserve">ورود و خروج خودروهای پرسنل، مدیران، مهمانان، خودروهای خدماتی و سرویس مدارس باید از طریق سامانه مدیریت پارکینگ کنترل شود. روش‌های پیشنهادی برای شناسایی خودرو شامل </w:t>
+      </w:r>
+      <w:r>
+        <w:rPr>
+          <w:rStyle w:val="asoktext"/>
+        </w:rPr>
+        <w:t>ANPR</w:t>
+      </w:r>
+      <w:r>
+        <w:rPr>
+          <w:rStyle w:val="asoktext"/>
+          <w:rtl/>
+        </w:rPr>
+        <w:t xml:space="preserve">، </w:t>
+      </w:r>
+      <w:r>
+        <w:rPr>
+          <w:rStyle w:val="asoktext"/>
+        </w:rPr>
+        <w:t>RFID</w:t>
+      </w:r>
+      <w:r>
+        <w:rPr>
+          <w:rStyle w:val="asoktext"/>
+          <w:rtl/>
+        </w:rPr>
+        <w:t xml:space="preserve">، </w:t>
+      </w:r>
+      <w:r>
+        <w:rPr>
+          <w:rStyle w:val="asoktext"/>
+        </w:rPr>
+        <w:t>UHF Tag</w:t>
+      </w:r>
+      <w:r>
+        <w:rPr>
+          <w:rStyle w:val="asoktext"/>
+          <w:rtl/>
+        </w:rPr>
+        <w:t xml:space="preserve"> یا تأیید دستی اپراتور در موارد خاص است.</w:t>
+      </w:r>
+    </w:p>
+    <w:p>
+      <w:pPr>
+        <w:rPr>
+          <w:rtl/>
+        </w:rPr>
+      </w:pPr>
+      <w:r>
+        <w:rPr>
+          <w:rStyle w:val="asoktext"/>
+          <w:rtl/>
+        </w:rPr>
+        <w:t xml:space="preserve">هنگام ورود خودرو به پارکینگ، سیستم پلاک، کارت یا تگ خودرو را بررسی می‌کند. نرم‌افزار مرکزی تعیین می‌کند که خودرو یا مالک آن مجوز ورود دارد یا خیر. در صورت مجاز بودن، </w:t>
+      </w:r>
+      <w:r>
+        <w:rPr>
+          <w:rStyle w:val="asoktext"/>
+        </w:rPr>
+        <w:t>Barrier Gate</w:t>
+      </w:r>
+      <w:r>
+        <w:rPr>
+          <w:rStyle w:val="asoktext"/>
+          <w:rtl/>
+        </w:rPr>
+        <w:t xml:space="preserve"> باز شده و رخداد ورود ثبت می‌شود. در صورت غیرمجاز بودن، ورود رد شده و در صورت نیاز هشدار ایجاد می‌شود.</w:t>
+      </w:r>
+    </w:p>
+    <w:p>
+      <w:pPr>
+        <w:rPr>
+          <w:rtl/>
+        </w:rPr>
+      </w:pPr>
+      <w:r>
+        <w:rPr>
+          <w:rStyle w:val="asoktext"/>
+          <w:rtl/>
+        </w:rPr>
+        <w:t>این سناریو امکان کنترل خودروهای مجاز، ثبت سوابق ورود و خروج، تفکیک خودروهای پرسنل و مهمان و مدیریت بهتر ظرفیت و امنیت پارکینگ را فراهم می‌کند.</w:t>
+      </w:r>
+    </w:p>
+    <w:p>
+      <w:pPr>
+        <w:pStyle w:val="Heading2"/>
+        <w:rPr>
+          <w:rtl/>
+        </w:rPr>
+      </w:pPr>
+      <w:r>
+        <w:rPr>
+          <w:rtl/>
+        </w:rPr>
+        <w:t>سناریوی سرویس مدارس</w:t>
+      </w:r>
+    </w:p>
+    <w:p>
+      <w:pPr>
+        <w:rPr>
+          <w:rtl/>
+        </w:rPr>
+      </w:pPr>
+      <w:r>
+        <w:rPr>
+          <w:rStyle w:val="asoktext"/>
+          <w:rtl/>
+        </w:rPr>
+        <w:t>سرویس‌های مدرسه باید به عنوان یک گروه مستقل در سیستم تعریف شوند. برای هر سرویس می‌توان اطلاعات خودرو، راننده، زمان ورود و خروج، مسیر مجاز و محدوده توقف را ثبت کرد.</w:t>
+      </w:r>
+    </w:p>
+    <w:p>
+      <w:pPr>
+        <w:rPr>
+          <w:rtl/>
+        </w:rPr>
+      </w:pPr>
+      <w:r>
+        <w:rPr>
+          <w:rStyle w:val="asoktext"/>
+          <w:rtl/>
+        </w:rPr>
+        <w:t>هنگام ورود سرویس، سیستم خودرو یا راننده را شناسایی کرده و مجوز ورود را بررسی می‌کند. در صورت مجاز بودن، ورود ثبت می‌شود و در صورت غیرمجاز بودن یا ورود خارج از زمان تعریف‌شده، رخداد ثبت و در صورت نیاز هشدار ایجاد می‌شود.</w:t>
+      </w:r>
+    </w:p>
+    <w:p>
+      <w:pPr>
+        <w:rPr>
+          <w:rtl/>
+        </w:rPr>
+      </w:pPr>
+      <w:r>
+        <w:rPr>
+          <w:rStyle w:val="asoktext"/>
+          <w:rtl/>
+        </w:rPr>
+        <w:t>این سناریو به کنترل سرویس‌ها، جلوگیری از ورود خودروهای ناشناس و ایجاد سوابق قابل پیگیری برای مدیریت مدرسه کمک می‌کند.</w:t>
+      </w:r>
+    </w:p>
+    <w:p>
+      <w:pPr>
+        <w:pStyle w:val="Heading2"/>
+        <w:rPr>
+          <w:rtl/>
+        </w:rPr>
+      </w:pPr>
+      <w:r>
+        <w:rPr>
+          <w:rtl/>
+        </w:rPr>
+        <w:t xml:space="preserve">سناریوی جلوگیری از عبور غیرمجاز و </w:t>
+      </w:r>
+      <w:r>
+        <w:t>Tailgating</w:t>
+      </w:r>
+    </w:p>
+    <w:p>
+      <w:pPr>
+        <w:rPr>
+          <w:rtl/>
+        </w:rPr>
+      </w:pPr>
+      <w:r>
+        <w:rPr>
+          <w:rStyle w:val="asoktext"/>
+          <w:rtl/>
+        </w:rPr>
+        <w:t>در ورودی‌های اصلی و نقاط حساس، ممکن است فردی با مجوز معتبر عبور کند اما فرد دیگری بدون مجوز همراه او وارد شود. برای کنترل این ریسک، استفاده از گیت مناسب، سنسور عبور، دوربین یا منطق هشدار نرم‌افزاری قابل بررسی است.</w:t>
+      </w:r>
+    </w:p>
+    <w:p>
+      <w:pPr>
+        <w:rPr>
+          <w:rtl/>
+        </w:rPr>
+      </w:pPr>
+      <w:r>
+        <w:rPr>
+          <w:rStyle w:val="asoktext"/>
+          <w:rtl/>
+        </w:rPr>
+        <w:lastRenderedPageBreak/>
+        <w:t>در صورت تشخیص عبور بیش از یک نفر با یک مجوز، سیستم باید رخداد را ثبت کند و در نقاط حساس، هشدار برای اپراتور ایجاد نماید. سطح کنترل این سناریو باید بر اساس اهمیت هر نقطه و نوع تجهیز نهایی تعیین شود.</w:t>
+      </w:r>
+    </w:p>
+    <w:p>
+      <w:pPr>
+        <w:pStyle w:val="Heading2"/>
+        <w:rPr>
+          <w:rtl/>
+        </w:rPr>
+      </w:pPr>
+      <w:r>
+        <w:rPr>
+          <w:rtl/>
+        </w:rPr>
+        <w:t>سناریوی هشدار و پاسخ اپراتور</w:t>
+      </w:r>
+    </w:p>
+    <w:p>
+      <w:pPr>
+        <w:rPr>
+          <w:rtl/>
+        </w:rPr>
+      </w:pPr>
+      <w:r>
+        <w:rPr>
+          <w:rStyle w:val="asoktext"/>
+          <w:rtl/>
+        </w:rPr>
+        <w:t>سیستم باید رخدادهای مهم امنیتی و عملیاتی را ثبت کرده و در صورت نیاز برای اپراتور هشدار ایجاد کند. نمونه این رخدادها شامل تلاش برای ورود غیرمجاز، ورود خارج از زمان مجاز، ورود به ناحیه غیرمجاز، ورود دانش‌آموز به کلاس اشتباه، باز ماندن درب، قطع ارتباط دستگاه، عبور چند نفر با یک مجوز و ورود خودرو غیرمجاز است.</w:t>
+      </w:r>
+    </w:p>
+    <w:p>
+      <w:pPr>
+        <w:rPr>
+          <w:rtl/>
+        </w:rPr>
+      </w:pPr>
+      <w:r>
+        <w:rPr>
+          <w:rStyle w:val="asoktext"/>
+          <w:rtl/>
+        </w:rPr>
+        <w:t>اپراتور باید بتواند هشدار را در نرم‌افزار مشاهده کند، وضعیت رخداد را بررسی نماید و اقدام انجام‌شده را ثبت کند. این موضوع باعث می‌شود سوابق امنیتی مدرسه فقط به رخداد خام محدود نباشد، بلکه فرآیند پیگیری و پاسخ نیز قابل مستندسازی باشد.</w:t>
+      </w:r>
+    </w:p>
+    <w:p>
+      <w:pPr>
+        <w:pStyle w:val="Heading2"/>
+        <w:rPr>
+          <w:rtl/>
+        </w:rPr>
+      </w:pPr>
+      <w:r>
+        <w:rPr>
+          <w:rtl/>
+        </w:rPr>
+        <w:t>سناریوی شرایط اضطراری و اعلام حریق</w:t>
+      </w:r>
+    </w:p>
+    <w:p>
+      <w:pPr>
+        <w:rPr>
+          <w:rtl/>
+        </w:rPr>
+      </w:pPr>
+      <w:r>
+        <w:rPr>
+          <w:rStyle w:val="asoktext"/>
+          <w:rtl/>
+        </w:rPr>
+        <w:t>در شرایط اضطراری مانند اعلام حریق، سیستم باید با سیاست‌های ایمنی مدرسه هماهنگ باشد. در صورت اتصال به سیستم اعلام حریق، درب‌ها و گیت‌های تعریف‌شده باید بتوانند در حالت اضطراری آزاد یا باز شوند تا مسیر تخلیه افراد مسدود نشود.</w:t>
+      </w:r>
+    </w:p>
+    <w:p>
+      <w:pPr>
+        <w:rPr>
+          <w:rtl/>
+        </w:rPr>
+      </w:pPr>
+      <w:r>
+        <w:rPr>
+          <w:rStyle w:val="asoktext"/>
+          <w:rtl/>
+        </w:rPr>
+        <w:t>رخداد اضطراری باید در نرم‌افزار ثبت شود و پس از پایان وضعیت اضطراری، سیستم به حالت عادی بازگردد. تعیین دقیق درب‌ها و گیت‌هایی که در حالت اضطراری باید آزاد شوند، باید در مرحله طراحی تفصیلی و با هماهنگی مسئول ایمنی مدرسه انجام شود.</w:t>
+      </w:r>
+    </w:p>
+    <w:p>
+      <w:pPr>
+        <w:pStyle w:val="Heading2"/>
+        <w:rPr>
+          <w:rtl/>
+        </w:rPr>
+      </w:pPr>
+      <w:r>
+        <w:rPr>
+          <w:rtl/>
+        </w:rPr>
+        <w:t>سناریوی یکپارچه‌سازی با سامانه مدرسه</w:t>
+      </w:r>
+    </w:p>
+    <w:p>
+      <w:pPr>
+        <w:rPr>
+          <w:rtl/>
+        </w:rPr>
+      </w:pPr>
+      <w:r>
+        <w:rPr>
+          <w:rStyle w:val="asoktext"/>
+          <w:rtl/>
+        </w:rPr>
+        <w:t xml:space="preserve">در صورت وجود سامانه دانش‌آموزی، </w:t>
+      </w:r>
+      <w:r>
+        <w:rPr>
+          <w:rStyle w:val="asoktext"/>
+        </w:rPr>
+        <w:t>HR</w:t>
+      </w:r>
+      <w:r>
+        <w:rPr>
+          <w:rStyle w:val="asoktext"/>
+          <w:rtl/>
+        </w:rPr>
+        <w:t xml:space="preserve">، </w:t>
+      </w:r>
+      <w:r>
+        <w:rPr>
+          <w:rStyle w:val="asoktext"/>
+        </w:rPr>
+        <w:t>ERP</w:t>
+      </w:r>
+      <w:r>
+        <w:rPr>
+          <w:rStyle w:val="asoktext"/>
+          <w:rtl/>
+        </w:rPr>
+        <w:t xml:space="preserve"> یا هر سامانه عملیاتی دیگر در مدرسه، راهکار پیشنهادی می‌تواند از طریق </w:t>
+      </w:r>
+      <w:r>
+        <w:rPr>
+          <w:rStyle w:val="asoktext"/>
+        </w:rPr>
+        <w:t>API</w:t>
+      </w:r>
+      <w:r>
+        <w:rPr>
+          <w:rStyle w:val="asoktext"/>
+          <w:rtl/>
+        </w:rPr>
+        <w:t xml:space="preserve"> یا </w:t>
+      </w:r>
+      <w:r>
+        <w:rPr>
+          <w:rStyle w:val="asoktext"/>
+        </w:rPr>
+        <w:t>Web Service</w:t>
+      </w:r>
+      <w:r>
+        <w:rPr>
+          <w:rStyle w:val="asoktext"/>
+          <w:rtl/>
+        </w:rPr>
+        <w:t xml:space="preserve"> با آن تبادل داده داشته باشد. اطلاعات پایه دانش‌آموزان، پرسنل، کلاس‌ها، برنامه‌ها و گروه‌ها می‌تواند از سامانه مدرسه دریافت شود و رخدادهای تردد نیز در صورت نیاز به آن بازگردانده شود.</w:t>
+      </w:r>
+    </w:p>
+    <w:p>
+      <w:pPr>
+        <w:rPr>
+          <w:rtl/>
+        </w:rPr>
+      </w:pPr>
+      <w:r>
+        <w:rPr>
+          <w:rStyle w:val="asoktext"/>
+          <w:rtl/>
+        </w:rPr>
+        <w:t xml:space="preserve">این سناریو باعث کاهش ورود دستی اطلاعات، کاهش خطای انسانی، هماهنگی بهتر داده‌ها و ایجاد گزارش‌های یکپارچه می‌شود. پیش از نهایی‌سازی این بخش، لازم است </w:t>
+      </w:r>
+      <w:r>
+        <w:rPr>
+          <w:rStyle w:val="asoktext"/>
+          <w:rtl/>
+        </w:rPr>
+        <w:lastRenderedPageBreak/>
+        <w:t xml:space="preserve">وضعیت </w:t>
+      </w:r>
+      <w:r>
+        <w:rPr>
+          <w:rStyle w:val="asoktext"/>
+        </w:rPr>
+        <w:t>API</w:t>
+      </w:r>
+      <w:r>
+        <w:rPr>
+          <w:rStyle w:val="asoktext"/>
+          <w:rtl/>
+        </w:rPr>
+        <w:t>، مالکیت داده‌ها، سطح دسترسی و مسئولیت نگهداری اطلاعات توسط کارفرما مشخص شود.</w:t>
+      </w:r>
+    </w:p>
+    <w:p>
+      <w:pPr>
+        <w:pStyle w:val="Heading2"/>
+        <w:rPr>
+          <w:rtl/>
+        </w:rPr>
+      </w:pPr>
+      <w:r>
+        <w:rPr>
+          <w:rtl/>
+        </w:rPr>
+        <w:t>جمع‌بندی سناریوهای عملیاتی</w:t>
+      </w:r>
+    </w:p>
+    <w:p>
+      <w:pPr>
+        <w:rPr>
+          <w:rtl/>
+        </w:rPr>
+      </w:pPr>
+      <w:r>
+        <w:rPr>
+          <w:rStyle w:val="asoktext"/>
+          <w:rtl/>
+        </w:rPr>
+        <w:t>سناریوهای فوق نشان می‌دهند که راهکار پیشنهادی برای مدرسه باید یک سیستم یکپارچه، چندلایه و قابل توسعه باشد. این سیستم باید بتواند افراد، خودروها، نواحی، زمان‌ها، مجوزها، رخدادها و هشدارها را به صورت متمرکز مدیریت کند.</w:t>
+      </w:r>
+    </w:p>
+    <w:p>
+      <w:pPr>
+        <w:rPr>
+          <w:rtl/>
+        </w:rPr>
+      </w:pPr>
+      <w:r>
+        <w:rPr>
+          <w:rtl/>
+        </w:rPr>
+        <w:t>در این مرحله، هدف از ارائه سناریوها، قطعی کردن مدل تجهیزات یا تعداد نهایی آن‌ها نیست؛ بلکه هدف، تعریف رفتار مورد انتظار سیستم در شرایط عملیاتی مدرسه است. پس از تأیید این سناریوها، می‌توان وارد مرحله جانمایی دقیق تجهیزات، طراحی تفصیلی، تعیین مدل تجهیزات و تهیه</w:t>
+      </w:r>
+      <w:r>
+        <w:t xml:space="preserve"> </w:t>
+      </w:r>
+      <w:proofErr w:type="spellStart"/>
+      <w:r>
+        <w:t>BoQ</w:t>
+      </w:r>
+      <w:proofErr w:type="spellEnd"/>
+      <w:r>
+        <w:t xml:space="preserve"> </w:t>
+      </w:r>
+      <w:r>
+        <w:rPr>
+          <w:rtl/>
+        </w:rPr>
+        <w:t>شد</w:t>
+      </w:r>
+      <w:r>
+        <w:t>.</w:t>
+      </w:r>
+    </w:p>
+    <w:p>
+      <w:pPr>
+        <w:rPr>
+          <w:rtl/>
+          <w:lang w:bidi="ar-SA"/>
+        </w:rPr>
+      </w:pPr>
     </w:p>
     <w:p>
       <w:pPr>
@@ -2140,6 +3979,7 @@
         <w:rPr>
           <w:rtl/>
         </w:rPr>
+        <w:lastRenderedPageBreak/>
         <w:t>راهکارهای نرم‌افزاری</w:t>
       </w:r>
       <w:r>
@@ -4502,6 +6342,18 @@
   </w:num>
   <w:num w:numId="17" w16cid:durableId="132603511">
     <w:abstractNumId w:val="9"/>
+  </w:num>
+  <w:num w:numId="18" w16cid:durableId="984428273">
+    <w:abstractNumId w:val="8"/>
+  </w:num>
+  <w:num w:numId="19" w16cid:durableId="1005329745">
+    <w:abstractNumId w:val="8"/>
+  </w:num>
+  <w:num w:numId="20" w16cid:durableId="1921133003">
+    <w:abstractNumId w:val="8"/>
+  </w:num>
+  <w:num w:numId="21" w16cid:durableId="22220198">
+    <w:abstractNumId w:val="8"/>
   </w:num>
 </w:numbering>
 </file>
@@ -5434,6 +7286,46 @@
       <w:spacing w:val="5"/>
     </w:rPr>
   </w:style>
+  <w:style w:type="paragraph" w:customStyle="1" w:styleId="fontsetimportantgpt">
+    <w:name w:val="fontsetimportantgpt"/>
+    <w:basedOn w:val="Normal"/>
+    <w:rsid w:val="00C657C5"/>
+    <w:pPr>
+      <w:bidi w:val="0"/>
+      <w:spacing w:before="100" w:beforeAutospacing="1" w:after="100" w:afterAutospacing="1" w:line="240" w:lineRule="auto"/>
+      <w:jc w:val="left"/>
+    </w:pPr>
+    <w:rPr>
+      <w:rFonts w:ascii="Times New Roman" w:eastAsia="Times New Roman" w:hAnsi="Times New Roman" w:cs="Times New Roman"/>
+      <w:kern w:val="0"/>
+      <w:lang w:eastAsia="de-DE" w:bidi="ar-SA"/>
+      <w14:ligatures w14:val="none"/>
+    </w:rPr>
+  </w:style>
+  <w:style w:type="character" w:customStyle="1" w:styleId="asoktext">
+    <w:name w:val="asoktext"/>
+    <w:basedOn w:val="DefaultParagraphFont"/>
+    <w:rsid w:val="00C657C5"/>
+  </w:style>
+  <w:style w:type="paragraph" w:styleId="NormalWeb">
+    <w:name w:val="Normal (Web)"/>
+    <w:basedOn w:val="Normal"/>
+    <w:uiPriority w:val="99"/>
+    <w:semiHidden/>
+    <w:unhideWhenUsed/>
+    <w:rsid w:val="00C657C5"/>
+    <w:pPr>
+      <w:bidi w:val="0"/>
+      <w:spacing w:before="100" w:beforeAutospacing="1" w:after="100" w:afterAutospacing="1" w:line="240" w:lineRule="auto"/>
+      <w:jc w:val="left"/>
+    </w:pPr>
+    <w:rPr>
+      <w:rFonts w:ascii="Times New Roman" w:eastAsia="Times New Roman" w:hAnsi="Times New Roman" w:cs="Times New Roman"/>
+      <w:kern w:val="0"/>
+      <w:lang w:eastAsia="de-DE" w:bidi="ar-SA"/>
+      <w14:ligatures w14:val="none"/>
+    </w:rPr>
+  </w:style>
 </w:styles>
 </file>
 

</xml_diff>

<commit_message>
2026-06-29 12:32:23 - Proposal: Access control
</commit_message>
<xml_diff>
--- a/01_Proposal/Proposal.docx
+++ b/01_Proposal/Proposal.docx
@@ -33461,6 +33461,2058 @@
     <w:p>
       <w:pPr>
         <w:rPr>
+          <w:b/>
+          <w:bCs/>
+        </w:rPr>
+      </w:pPr>
+    </w:p>
+    <w:p>
+      <w:pPr>
+        <w:pStyle w:val="Heading2"/>
+        <w:rPr>
+          <w:lang w:val="de-DE"/>
+        </w:rPr>
+      </w:pPr>
+      <w:r>
+        <w:rPr>
+          <w:rtl/>
+          <w:lang w:bidi="ar-SA"/>
+        </w:rPr>
+        <w:t>مقدمه</w:t>
+      </w:r>
+    </w:p>
+    <w:p>
+      <w:r>
+        <w:rPr>
+          <w:rtl/>
+          <w:lang w:bidi="ar-SA"/>
+        </w:rPr>
+        <w:t>یکی از مهم‌ترین ویژگی‌های راهکار پیشنهادی، قابلیت یکپارچه‌سازی با سامانه‌های موجود و آینده سازمان است. در یک مجموعه آموزشی بزرگ، سامانه کنترل تردد نباید به‌عنوان یک نرم‌افزار مستقل عمل کند، بلکه باید به‌عنوان بخشی از اکوسیستم دیجیتال مدرسه، امکان تبادل اطلاعات با سایر سامانه‌های مدیریتی، آموزشی، امنیتی و فناوری اطلاعات را فراهم نماید</w:t>
+      </w:r>
+      <w:r>
+        <w:t>.</w:t>
+      </w:r>
+    </w:p>
+    <w:p>
+      <w:r>
+        <w:rPr>
+          <w:rtl/>
+          <w:lang w:bidi="ar-SA"/>
+        </w:rPr>
+        <w:t>هدف از یکپارچه‌سازی، حذف ورود تکراری اطلاعات، افزایش صحت داده‌ها، کاهش فرآیندهای دستی، افزایش سرعت تبادل اطلاعات و ایجاد بستری یکپارچه برای مدیریت امنیت، تردد و عملیات مدرسه است</w:t>
+      </w:r>
+      <w:r>
+        <w:t>.</w:t>
+      </w:r>
+    </w:p>
+    <w:p>
+      <w:r>
+        <w:rPr>
+          <w:rtl/>
+          <w:lang w:bidi="ar-SA"/>
+        </w:rPr>
+        <w:t xml:space="preserve">معماری پیشنهادی این پروژه بر پایه سرویس‌های استاندارد، </w:t>
+      </w:r>
+      <w:r>
+        <w:t xml:space="preserve">API </w:t>
+      </w:r>
+      <w:r>
+        <w:rPr>
+          <w:rtl/>
+          <w:lang w:bidi="ar-SA"/>
+        </w:rPr>
+        <w:t>و</w:t>
+      </w:r>
+      <w:r>
+        <w:t xml:space="preserve"> Web Service </w:t>
+      </w:r>
+      <w:r>
+        <w:rPr>
+          <w:rtl/>
+          <w:lang w:bidi="ar-SA"/>
+        </w:rPr>
+        <w:t>طراحی شده است تا ضمن حفظ استقلال سامانه‌ها، امکان تبادل ایمن و کنترل‌شده اطلاعات بین آن‌ها فراهم شود</w:t>
+      </w:r>
+      <w:r>
+        <w:t>.</w:t>
+      </w:r>
+    </w:p>
+    <w:p>
+      <w:pPr>
+        <w:pStyle w:val="Heading2"/>
+        <w:rPr>
+          <w:lang w:val="de-DE"/>
+        </w:rPr>
+      </w:pPr>
+      <w:r>
+        <w:rPr>
+          <w:rtl/>
+          <w:lang w:bidi="ar-SA"/>
+        </w:rPr>
+        <w:t>اصول معماری یکپارچه‌سازی</w:t>
+      </w:r>
+    </w:p>
+    <w:p>
+      <w:r>
+        <w:rPr>
+          <w:rtl/>
+          <w:lang w:bidi="ar-SA"/>
+        </w:rPr>
+        <w:t>در طراحی این پروژه، اصول زیر به‌عنوان مبنای یکپارچه‌سازی سامانه‌ها در نظر گرفته شده است</w:t>
+      </w:r>
+      <w:r>
+        <w:t>:</w:t>
+      </w:r>
+    </w:p>
+    <w:p>
+      <w:pPr>
+        <w:numPr>
+          <w:ilvl w:val="0"/>
+          <w:numId w:val="58"/>
+        </w:numPr>
+      </w:pPr>
+      <w:r>
+        <w:rPr>
+          <w:rtl/>
+          <w:lang w:bidi="ar-SA"/>
+        </w:rPr>
+        <w:t>استفاده از رابط‌های استاندارد</w:t>
+      </w:r>
+      <w:r>
+        <w:t xml:space="preserve"> API </w:t>
+      </w:r>
+      <w:r>
+        <w:rPr>
+          <w:rtl/>
+          <w:lang w:bidi="ar-SA"/>
+        </w:rPr>
+        <w:t>و</w:t>
+      </w:r>
+      <w:r>
+        <w:t xml:space="preserve"> Web Service </w:t>
+      </w:r>
+      <w:r>
+        <w:rPr>
+          <w:rtl/>
+          <w:lang w:bidi="ar-SA"/>
+        </w:rPr>
+        <w:t>برای تبادل اطلاعات</w:t>
+      </w:r>
+    </w:p>
+    <w:p>
+      <w:pPr>
+        <w:numPr>
+          <w:ilvl w:val="0"/>
+          <w:numId w:val="58"/>
+        </w:numPr>
+      </w:pPr>
+      <w:r>
+        <w:rPr>
+          <w:rtl/>
+          <w:lang w:bidi="ar-SA"/>
+        </w:rPr>
+        <w:t>امکان تبادل اطلاعات به‌صورت دوطرفه</w:t>
+      </w:r>
+      <w:r>
+        <w:t xml:space="preserve"> (</w:t>
+      </w:r>
+      <w:proofErr w:type="spellStart"/>
+      <w:r>
+        <w:t>Bidirectional</w:t>
+      </w:r>
+      <w:proofErr w:type="spellEnd"/>
+      <w:r>
+        <w:t>)</w:t>
+      </w:r>
+    </w:p>
+    <w:p>
+      <w:pPr>
+        <w:numPr>
+          <w:ilvl w:val="0"/>
+          <w:numId w:val="58"/>
+        </w:numPr>
+      </w:pPr>
+      <w:r>
+        <w:rPr>
+          <w:rtl/>
+          <w:lang w:bidi="ar-SA"/>
+        </w:rPr>
+        <w:t>تعیین سامانه مرجع</w:t>
+      </w:r>
+      <w:r>
+        <w:t xml:space="preserve"> (Master System) </w:t>
+      </w:r>
+      <w:r>
+        <w:rPr>
+          <w:rtl/>
+          <w:lang w:bidi="ar-SA"/>
+        </w:rPr>
+        <w:t>برای هر نوع اطلاعات</w:t>
+      </w:r>
+    </w:p>
+    <w:p>
+      <w:pPr>
+        <w:numPr>
+          <w:ilvl w:val="0"/>
+          <w:numId w:val="58"/>
+        </w:numPr>
+      </w:pPr>
+      <w:r>
+        <w:rPr>
+          <w:rtl/>
+          <w:lang w:bidi="ar-SA"/>
+        </w:rPr>
+        <w:t>جلوگیری از ثبت مجدد اطلاعات کاربران و خودروها</w:t>
+      </w:r>
+    </w:p>
+    <w:p>
+      <w:pPr>
+        <w:numPr>
+          <w:ilvl w:val="0"/>
+          <w:numId w:val="58"/>
+        </w:numPr>
+      </w:pPr>
+      <w:r>
+        <w:rPr>
+          <w:rtl/>
+          <w:lang w:bidi="ar-SA"/>
+        </w:rPr>
+        <w:t>ثبت و نگهداری کامل سوابق تبادل اطلاعات</w:t>
+      </w:r>
+    </w:p>
+    <w:p>
+      <w:pPr>
+        <w:numPr>
+          <w:ilvl w:val="0"/>
+          <w:numId w:val="58"/>
+        </w:numPr>
+      </w:pPr>
+      <w:r>
+        <w:rPr>
+          <w:rtl/>
+          <w:lang w:bidi="ar-SA"/>
+        </w:rPr>
+        <w:t>امکان توسعه و افزودن سامانه‌های جدید بدون تغییرات اساسی در ساختار نرم‌افزار</w:t>
+      </w:r>
+    </w:p>
+    <w:p>
+      <w:pPr>
+        <w:numPr>
+          <w:ilvl w:val="0"/>
+          <w:numId w:val="58"/>
+        </w:numPr>
+      </w:pPr>
+      <w:r>
+        <w:rPr>
+          <w:rtl/>
+          <w:lang w:bidi="ar-SA"/>
+        </w:rPr>
+        <w:lastRenderedPageBreak/>
+        <w:t>استفاده از ارتباطات امن و مکانیزم‌های احراز هویت برای تمامی سرویس‌ها</w:t>
+      </w:r>
+    </w:p>
+    <w:p>
+      <w:pPr>
+        <w:numPr>
+          <w:ilvl w:val="0"/>
+          <w:numId w:val="58"/>
+        </w:numPr>
+      </w:pPr>
+      <w:r>
+        <w:rPr>
+          <w:rtl/>
+          <w:lang w:bidi="ar-SA"/>
+        </w:rPr>
+        <w:t>طراحی ماژولار به‌منظور فعال‌سازی تدریجی قابلیت‌های یکپارچه‌سازی</w:t>
+      </w:r>
+    </w:p>
+    <w:p>
+      <w:pPr>
+        <w:pStyle w:val="Heading2"/>
+        <w:rPr>
+          <w:lang w:val="de-DE"/>
+        </w:rPr>
+      </w:pPr>
+      <w:r>
+        <w:rPr>
+          <w:rtl/>
+          <w:lang w:bidi="ar-SA"/>
+        </w:rPr>
+        <w:t>یکپارچه‌سازی با سامانه اطلاعات مدرسه</w:t>
+      </w:r>
+      <w:r>
+        <w:rPr>
+          <w:lang w:val="de-DE"/>
+        </w:rPr>
+        <w:t xml:space="preserve"> (School Management System)</w:t>
+      </w:r>
+    </w:p>
+    <w:p>
+      <w:r>
+        <w:rPr>
+          <w:rtl/>
+          <w:lang w:bidi="ar-SA"/>
+        </w:rPr>
+        <w:t>در بسیاری از مدارس، اطلاعات دانش‌آموزان، کلاس‌ها، برنامه‌های آموزشی و والدین در سامانه مدیریت مدرسه نگهداری می‌شود. به‌منظور جلوگیری از ورود مجدد اطلاعات، امکان تبادل داده با این سامانه پیش‌بینی شده است</w:t>
+      </w:r>
+      <w:r>
+        <w:t>.</w:t>
+      </w:r>
+    </w:p>
+    <w:p>
+      <w:r>
+        <w:rPr>
+          <w:rtl/>
+          <w:lang w:bidi="ar-SA"/>
+        </w:rPr>
+        <w:t>نمونه اطلاعات قابل دریافت از سامانه مدرسه عبارت است از</w:t>
+      </w:r>
+      <w:r>
+        <w:t>:</w:t>
+      </w:r>
+    </w:p>
+    <w:p>
+      <w:pPr>
+        <w:numPr>
+          <w:ilvl w:val="0"/>
+          <w:numId w:val="59"/>
+        </w:numPr>
+      </w:pPr>
+      <w:r>
+        <w:rPr>
+          <w:rtl/>
+          <w:lang w:bidi="ar-SA"/>
+        </w:rPr>
+        <w:t>اطلاعات هویتی دانش‌آموزان</w:t>
+      </w:r>
+    </w:p>
+    <w:p>
+      <w:pPr>
+        <w:numPr>
+          <w:ilvl w:val="0"/>
+          <w:numId w:val="59"/>
+        </w:numPr>
+      </w:pPr>
+      <w:r>
+        <w:rPr>
+          <w:rtl/>
+          <w:lang w:bidi="ar-SA"/>
+        </w:rPr>
+        <w:t>شماره دانش‌آموزی</w:t>
+      </w:r>
+    </w:p>
+    <w:p>
+      <w:pPr>
+        <w:numPr>
+          <w:ilvl w:val="0"/>
+          <w:numId w:val="59"/>
+        </w:numPr>
+      </w:pPr>
+      <w:r>
+        <w:rPr>
+          <w:rtl/>
+          <w:lang w:bidi="ar-SA"/>
+        </w:rPr>
+        <w:t>کلاس و پایه تحصیلی</w:t>
+      </w:r>
+    </w:p>
+    <w:p>
+      <w:pPr>
+        <w:numPr>
+          <w:ilvl w:val="0"/>
+          <w:numId w:val="59"/>
+        </w:numPr>
+      </w:pPr>
+      <w:r>
+        <w:rPr>
+          <w:rtl/>
+          <w:lang w:bidi="ar-SA"/>
+        </w:rPr>
+        <w:t>گروه آموزشی</w:t>
+      </w:r>
+    </w:p>
+    <w:p>
+      <w:pPr>
+        <w:numPr>
+          <w:ilvl w:val="0"/>
+          <w:numId w:val="59"/>
+        </w:numPr>
+      </w:pPr>
+      <w:r>
+        <w:rPr>
+          <w:rtl/>
+          <w:lang w:bidi="ar-SA"/>
+        </w:rPr>
+        <w:t>وضعیت فعال یا غیرفعال بودن</w:t>
+      </w:r>
+    </w:p>
+    <w:p>
+      <w:pPr>
+        <w:numPr>
+          <w:ilvl w:val="0"/>
+          <w:numId w:val="59"/>
+        </w:numPr>
+      </w:pPr>
+      <w:r>
+        <w:rPr>
+          <w:rtl/>
+          <w:lang w:bidi="ar-SA"/>
+        </w:rPr>
+        <w:t>اطلاعات والدین</w:t>
+      </w:r>
+    </w:p>
+    <w:p>
+      <w:pPr>
+        <w:numPr>
+          <w:ilvl w:val="0"/>
+          <w:numId w:val="59"/>
+        </w:numPr>
+      </w:pPr>
+      <w:r>
+        <w:rPr>
+          <w:rtl/>
+          <w:lang w:bidi="ar-SA"/>
+        </w:rPr>
+        <w:t>تصویر پرسنلی</w:t>
+      </w:r>
+    </w:p>
+    <w:p>
+      <w:pPr>
+        <w:numPr>
+          <w:ilvl w:val="0"/>
+          <w:numId w:val="59"/>
+        </w:numPr>
+      </w:pPr>
+      <w:r>
+        <w:rPr>
+          <w:rtl/>
+          <w:lang w:bidi="ar-SA"/>
+        </w:rPr>
+        <w:t>برنامه آموزشی و کلاس‌های مجاز (در صورت وجود)</w:t>
+      </w:r>
+    </w:p>
+    <w:p>
+      <w:r>
+        <w:rPr>
+          <w:rtl/>
+          <w:lang w:bidi="ar-SA"/>
+        </w:rPr>
+        <w:t>همچنین سامانه کنترل تردد می‌تواند اطلاعات زیر را به سامانه مدرسه ارسال نماید</w:t>
+      </w:r>
+      <w:r>
+        <w:t>:</w:t>
+      </w:r>
+    </w:p>
+    <w:p>
+      <w:pPr>
+        <w:numPr>
+          <w:ilvl w:val="0"/>
+          <w:numId w:val="60"/>
+        </w:numPr>
+      </w:pPr>
+      <w:r>
+        <w:rPr>
+          <w:rtl/>
+          <w:lang w:bidi="ar-SA"/>
+        </w:rPr>
+        <w:t>ورود و خروج روزانه دانش‌آموزان</w:t>
+      </w:r>
+    </w:p>
+    <w:p>
+      <w:pPr>
+        <w:numPr>
+          <w:ilvl w:val="0"/>
+          <w:numId w:val="60"/>
+        </w:numPr>
+      </w:pPr>
+      <w:r>
+        <w:rPr>
+          <w:rtl/>
+          <w:lang w:bidi="ar-SA"/>
+        </w:rPr>
+        <w:t>خروج زودهنگام یا غیرمجاز</w:t>
+      </w:r>
+    </w:p>
+    <w:p>
+      <w:pPr>
+        <w:numPr>
+          <w:ilvl w:val="0"/>
+          <w:numId w:val="60"/>
+        </w:numPr>
+      </w:pPr>
+      <w:r>
+        <w:rPr>
+          <w:rtl/>
+          <w:lang w:bidi="ar-SA"/>
+        </w:rPr>
+        <w:t>رخدادهای امنیتی مرتبط با تردد</w:t>
+      </w:r>
+    </w:p>
+    <w:p>
+      <w:pPr>
+        <w:numPr>
+          <w:ilvl w:val="0"/>
+          <w:numId w:val="60"/>
+        </w:numPr>
+        <w:rPr>
+          <w:rtl/>
+        </w:rPr>
+      </w:pPr>
+      <w:r>
+        <w:rPr>
+          <w:rtl/>
+          <w:lang w:bidi="ar-SA"/>
+        </w:rPr>
+        <w:t>سوابق حضور در نواحی مجاز (در صورت تعریف در محدوده پروژه)</w:t>
+      </w:r>
+    </w:p>
+    <w:p>
+      <w:pPr>
+        <w:pStyle w:val="Heading2"/>
+        <w:rPr>
+          <w:lang w:val="de-DE"/>
+        </w:rPr>
+      </w:pPr>
+      <w:r>
+        <w:rPr>
+          <w:rtl/>
+          <w:lang w:bidi="ar-SA"/>
+        </w:rPr>
+        <w:lastRenderedPageBreak/>
+        <w:t>یکپارچه‌سازی با سامانه منابع انسانی و حضور و غیاب</w:t>
+      </w:r>
+    </w:p>
+    <w:p>
+      <w:r>
+        <w:rPr>
+          <w:rtl/>
+          <w:lang w:bidi="ar-SA"/>
+        </w:rPr>
+        <w:t>برای کارکنان، معلمان و مدیران، امکان ارتباط با سامانه منابع انسانی یا حضور و غیاب سازمان پیش‌بینی شده است</w:t>
+      </w:r>
+      <w:r>
+        <w:t>.</w:t>
+      </w:r>
+    </w:p>
+    <w:p>
+      <w:r>
+        <w:rPr>
+          <w:rtl/>
+          <w:lang w:bidi="ar-SA"/>
+        </w:rPr>
+        <w:t>این ارتباط می‌تواند شامل موارد زیر باشد</w:t>
+      </w:r>
+      <w:r>
+        <w:t>:</w:t>
+      </w:r>
+    </w:p>
+    <w:p>
+      <w:pPr>
+        <w:numPr>
+          <w:ilvl w:val="0"/>
+          <w:numId w:val="61"/>
+        </w:numPr>
+      </w:pPr>
+      <w:r>
+        <w:rPr>
+          <w:rtl/>
+          <w:lang w:bidi="ar-SA"/>
+        </w:rPr>
+        <w:t>دریافت اطلاعات پرسنلی</w:t>
+      </w:r>
+    </w:p>
+    <w:p>
+      <w:pPr>
+        <w:numPr>
+          <w:ilvl w:val="0"/>
+          <w:numId w:val="61"/>
+        </w:numPr>
+      </w:pPr>
+      <w:r>
+        <w:rPr>
+          <w:rtl/>
+          <w:lang w:bidi="ar-SA"/>
+        </w:rPr>
+        <w:t>دریافت ساختار سازمانی</w:t>
+      </w:r>
+    </w:p>
+    <w:p>
+      <w:pPr>
+        <w:numPr>
+          <w:ilvl w:val="0"/>
+          <w:numId w:val="61"/>
+        </w:numPr>
+      </w:pPr>
+      <w:r>
+        <w:rPr>
+          <w:rtl/>
+          <w:lang w:bidi="ar-SA"/>
+        </w:rPr>
+        <w:t>دریافت سمت و واحد سازمانی</w:t>
+      </w:r>
+    </w:p>
+    <w:p>
+      <w:pPr>
+        <w:numPr>
+          <w:ilvl w:val="0"/>
+          <w:numId w:val="61"/>
+        </w:numPr>
+      </w:pPr>
+      <w:r>
+        <w:rPr>
+          <w:rtl/>
+          <w:lang w:bidi="ar-SA"/>
+        </w:rPr>
+        <w:t>همگام‌سازی وضعیت اشتغال</w:t>
+      </w:r>
+    </w:p>
+    <w:p>
+      <w:pPr>
+        <w:numPr>
+          <w:ilvl w:val="0"/>
+          <w:numId w:val="61"/>
+        </w:numPr>
+      </w:pPr>
+      <w:r>
+        <w:rPr>
+          <w:rtl/>
+          <w:lang w:bidi="ar-SA"/>
+        </w:rPr>
+        <w:t>تخصیص خودکار سطوح دسترسی</w:t>
+      </w:r>
+    </w:p>
+    <w:p>
+      <w:pPr>
+        <w:numPr>
+          <w:ilvl w:val="0"/>
+          <w:numId w:val="61"/>
+        </w:numPr>
+      </w:pPr>
+      <w:r>
+        <w:rPr>
+          <w:rtl/>
+          <w:lang w:bidi="ar-SA"/>
+        </w:rPr>
+        <w:t>ارسال اطلاعات ورود و خروج</w:t>
+      </w:r>
+    </w:p>
+    <w:p>
+      <w:pPr>
+        <w:numPr>
+          <w:ilvl w:val="0"/>
+          <w:numId w:val="61"/>
+        </w:numPr>
+      </w:pPr>
+      <w:r>
+        <w:rPr>
+          <w:rtl/>
+          <w:lang w:bidi="ar-SA"/>
+        </w:rPr>
+        <w:t>ارسال اطلاعات حضور و غیاب</w:t>
+      </w:r>
+    </w:p>
+    <w:p>
+      <w:pPr>
+        <w:numPr>
+          <w:ilvl w:val="0"/>
+          <w:numId w:val="61"/>
+        </w:numPr>
+      </w:pPr>
+      <w:r>
+        <w:rPr>
+          <w:rtl/>
+          <w:lang w:bidi="ar-SA"/>
+        </w:rPr>
+        <w:t>ارسال رخدادهای تأخیر یا تردد خارج از برنامه کاری</w:t>
+      </w:r>
+    </w:p>
+    <w:p>
+      <w:r>
+        <w:rPr>
+          <w:rtl/>
+          <w:lang w:bidi="ar-SA"/>
+        </w:rPr>
+        <w:t>این یکپارچه‌سازی موجب حذف ورود تکراری اطلاعات و افزایش دقت فرآیندهای اداری خواهد شد</w:t>
+      </w:r>
+      <w:r>
+        <w:t>.</w:t>
+      </w:r>
+    </w:p>
+    <w:p>
+      <w:pPr>
+        <w:pStyle w:val="Heading2"/>
+        <w:rPr>
+          <w:lang w:val="de-DE"/>
+        </w:rPr>
+      </w:pPr>
+      <w:r>
+        <w:rPr>
+          <w:rtl/>
+          <w:lang w:bidi="ar-SA"/>
+        </w:rPr>
+        <w:t>یکپارچه‌سازی با سامانه مدیریت والدین و خدمات الکترونیکی مدرسه</w:t>
+      </w:r>
+    </w:p>
+    <w:p>
+      <w:r>
+        <w:rPr>
+          <w:rtl/>
+          <w:lang w:bidi="ar-SA"/>
+        </w:rPr>
+        <w:t>در صورت استفاده مدرسه از پرتال یا اپلیکیشن والدین، امکان تبادل اطلاعات با این سامانه نیز قابل پیش‌بینی است</w:t>
+      </w:r>
+      <w:r>
+        <w:t>.</w:t>
+      </w:r>
+    </w:p>
+    <w:p>
+      <w:r>
+        <w:rPr>
+          <w:rtl/>
+          <w:lang w:bidi="ar-SA"/>
+        </w:rPr>
+        <w:t>نمونه خدمات قابل ارائه عبارت‌اند از</w:t>
+      </w:r>
+      <w:r>
+        <w:t>:</w:t>
+      </w:r>
+    </w:p>
+    <w:p>
+      <w:pPr>
+        <w:numPr>
+          <w:ilvl w:val="0"/>
+          <w:numId w:val="62"/>
+        </w:numPr>
+      </w:pPr>
+      <w:r>
+        <w:rPr>
+          <w:rtl/>
+          <w:lang w:bidi="ar-SA"/>
+        </w:rPr>
+        <w:t>اطلاع‌رسانی ورود دانش‌آموز به مدرسه</w:t>
+      </w:r>
+    </w:p>
+    <w:p>
+      <w:pPr>
+        <w:numPr>
+          <w:ilvl w:val="0"/>
+          <w:numId w:val="62"/>
+        </w:numPr>
+      </w:pPr>
+      <w:r>
+        <w:rPr>
+          <w:rtl/>
+          <w:lang w:bidi="ar-SA"/>
+        </w:rPr>
+        <w:t>اطلاع‌رسانی خروج از مدرسه</w:t>
+      </w:r>
+    </w:p>
+    <w:p>
+      <w:pPr>
+        <w:numPr>
+          <w:ilvl w:val="0"/>
+          <w:numId w:val="62"/>
+        </w:numPr>
+      </w:pPr>
+      <w:r>
+        <w:rPr>
+          <w:rtl/>
+          <w:lang w:bidi="ar-SA"/>
+        </w:rPr>
+        <w:t>اطلاع‌رسانی خروج خارج از زمان مجاز</w:t>
+      </w:r>
+    </w:p>
+    <w:p>
+      <w:pPr>
+        <w:numPr>
+          <w:ilvl w:val="0"/>
+          <w:numId w:val="62"/>
+        </w:numPr>
+      </w:pPr>
+      <w:r>
+        <w:rPr>
+          <w:rtl/>
+          <w:lang w:bidi="ar-SA"/>
+        </w:rPr>
+        <w:t>اطلاع‌رسانی درخواست خروج با مجوز</w:t>
+      </w:r>
+    </w:p>
+    <w:p>
+      <w:pPr>
+        <w:numPr>
+          <w:ilvl w:val="0"/>
+          <w:numId w:val="62"/>
+        </w:numPr>
+      </w:pPr>
+      <w:r>
+        <w:rPr>
+          <w:rtl/>
+          <w:lang w:bidi="ar-SA"/>
+        </w:rPr>
+        <w:lastRenderedPageBreak/>
+        <w:t>مشاهده وضعیت حضور روزانه</w:t>
+      </w:r>
+    </w:p>
+    <w:p>
+      <w:pPr>
+        <w:numPr>
+          <w:ilvl w:val="0"/>
+          <w:numId w:val="62"/>
+        </w:numPr>
+      </w:pPr>
+      <w:r>
+        <w:rPr>
+          <w:rtl/>
+          <w:lang w:bidi="ar-SA"/>
+        </w:rPr>
+        <w:t>ثبت درخواست ملاقات والدین</w:t>
+      </w:r>
+    </w:p>
+    <w:p>
+      <w:pPr>
+        <w:numPr>
+          <w:ilvl w:val="0"/>
+          <w:numId w:val="62"/>
+        </w:numPr>
+      </w:pPr>
+      <w:r>
+        <w:rPr>
+          <w:rtl/>
+          <w:lang w:bidi="ar-SA"/>
+        </w:rPr>
+        <w:t>پیش‌ثبت‌نام مراجعه والدین</w:t>
+      </w:r>
+    </w:p>
+    <w:p>
+      <w:r>
+        <w:rPr>
+          <w:rtl/>
+          <w:lang w:bidi="ar-SA"/>
+        </w:rPr>
+        <w:t>نوع اطلاعات قابل نمایش برای والدین، مطابق سیاست‌های امنیتی و حریم خصوصی کارفرما تعیین خواهد شد</w:t>
+      </w:r>
+      <w:r>
+        <w:t>.</w:t>
+      </w:r>
+    </w:p>
+    <w:p>
+      <w:pPr>
+        <w:pStyle w:val="Heading2"/>
+        <w:rPr>
+          <w:lang w:val="de-DE"/>
+        </w:rPr>
+      </w:pPr>
+      <w:r>
+        <w:rPr>
+          <w:rtl/>
+          <w:lang w:bidi="ar-SA"/>
+        </w:rPr>
+        <w:t>یکپارچه‌سازی با سامانه مدیریت مراجعین</w:t>
+      </w:r>
+    </w:p>
+    <w:p>
+      <w:r>
+        <w:rPr>
+          <w:rtl/>
+          <w:lang w:bidi="ar-SA"/>
+        </w:rPr>
+        <w:t>ماژول مدیریت مراجعین می‌تواند با سایر سامانه‌های سازمان ارتباط برقرار نماید تا فرآیند ورود مهمانان، والدین، پیمانکاران و بازدیدکنندگان به‌صورت یکپارچه مدیریت شود</w:t>
+      </w:r>
+      <w:r>
+        <w:t>.</w:t>
+      </w:r>
+    </w:p>
+    <w:p>
+      <w:r>
+        <w:rPr>
+          <w:rtl/>
+          <w:lang w:bidi="ar-SA"/>
+        </w:rPr>
+        <w:t>نمونه قابلیت‌های قابل پیاده‌سازی عبارت‌اند از</w:t>
+      </w:r>
+      <w:r>
+        <w:t>:</w:t>
+      </w:r>
+    </w:p>
+    <w:p>
+      <w:pPr>
+        <w:numPr>
+          <w:ilvl w:val="0"/>
+          <w:numId w:val="63"/>
+        </w:numPr>
+      </w:pPr>
+      <w:r>
+        <w:rPr>
+          <w:rtl/>
+          <w:lang w:bidi="ar-SA"/>
+        </w:rPr>
+        <w:t>پیش‌ثبت‌نام مهمان</w:t>
+      </w:r>
+    </w:p>
+    <w:p>
+      <w:pPr>
+        <w:numPr>
+          <w:ilvl w:val="0"/>
+          <w:numId w:val="63"/>
+        </w:numPr>
+      </w:pPr>
+      <w:r>
+        <w:rPr>
+          <w:rtl/>
+          <w:lang w:bidi="ar-SA"/>
+        </w:rPr>
+        <w:t>ثبت درخواست ملاقات</w:t>
+      </w:r>
+    </w:p>
+    <w:p>
+      <w:pPr>
+        <w:numPr>
+          <w:ilvl w:val="0"/>
+          <w:numId w:val="63"/>
+        </w:numPr>
+      </w:pPr>
+      <w:r>
+        <w:rPr>
+          <w:rtl/>
+          <w:lang w:bidi="ar-SA"/>
+        </w:rPr>
+        <w:t>تأیید توسط میزبان</w:t>
+      </w:r>
+    </w:p>
+    <w:p>
+      <w:pPr>
+        <w:numPr>
+          <w:ilvl w:val="0"/>
+          <w:numId w:val="63"/>
+        </w:numPr>
+      </w:pPr>
+      <w:r>
+        <w:rPr>
+          <w:rtl/>
+          <w:lang w:bidi="ar-SA"/>
+        </w:rPr>
+        <w:t>تخصیص محدوده دسترسی</w:t>
+      </w:r>
+    </w:p>
+    <w:p>
+      <w:pPr>
+        <w:numPr>
+          <w:ilvl w:val="0"/>
+          <w:numId w:val="63"/>
+        </w:numPr>
+      </w:pPr>
+      <w:r>
+        <w:rPr>
+          <w:rtl/>
+          <w:lang w:bidi="ar-SA"/>
+        </w:rPr>
+        <w:t>صدور مجوز ورود موقت</w:t>
+      </w:r>
+    </w:p>
+    <w:p>
+      <w:pPr>
+        <w:numPr>
+          <w:ilvl w:val="0"/>
+          <w:numId w:val="63"/>
+        </w:numPr>
+      </w:pPr>
+      <w:r>
+        <w:rPr>
+          <w:rtl/>
+          <w:lang w:bidi="ar-SA"/>
+        </w:rPr>
+        <w:t>صدور</w:t>
+      </w:r>
+      <w:r>
+        <w:t xml:space="preserve"> QR Code </w:t>
+      </w:r>
+      <w:r>
+        <w:rPr>
+          <w:rtl/>
+          <w:lang w:bidi="ar-SA"/>
+        </w:rPr>
+        <w:t>یا کارت موقت</w:t>
+      </w:r>
+    </w:p>
+    <w:p>
+      <w:pPr>
+        <w:numPr>
+          <w:ilvl w:val="0"/>
+          <w:numId w:val="63"/>
+        </w:numPr>
+      </w:pPr>
+      <w:r>
+        <w:rPr>
+          <w:rtl/>
+          <w:lang w:bidi="ar-SA"/>
+        </w:rPr>
+        <w:t>ثبت ورود و خروج</w:t>
+      </w:r>
+    </w:p>
+    <w:p>
+      <w:pPr>
+        <w:numPr>
+          <w:ilvl w:val="0"/>
+          <w:numId w:val="63"/>
+        </w:numPr>
+      </w:pPr>
+      <w:r>
+        <w:rPr>
+          <w:rtl/>
+          <w:lang w:bidi="ar-SA"/>
+        </w:rPr>
+        <w:t>مدیریت خودروهای مهمان</w:t>
+      </w:r>
+    </w:p>
+    <w:p>
+      <w:pPr>
+        <w:numPr>
+          <w:ilvl w:val="0"/>
+          <w:numId w:val="63"/>
+        </w:numPr>
+      </w:pPr>
+      <w:r>
+        <w:rPr>
+          <w:rtl/>
+          <w:lang w:bidi="ar-SA"/>
+        </w:rPr>
+        <w:t>ثبت کالاهای همراه</w:t>
+      </w:r>
+    </w:p>
+    <w:p>
+      <w:pPr>
+        <w:numPr>
+          <w:ilvl w:val="0"/>
+          <w:numId w:val="63"/>
+        </w:numPr>
+      </w:pPr>
+      <w:r>
+        <w:rPr>
+          <w:rtl/>
+          <w:lang w:bidi="ar-SA"/>
+        </w:rPr>
+        <w:t>ثبت سوابق مراجعات</w:t>
+      </w:r>
+    </w:p>
+    <w:p>
+      <w:pPr>
+        <w:pStyle w:val="Heading2"/>
+        <w:rPr>
+          <w:lang w:val="de-DE"/>
+        </w:rPr>
+      </w:pPr>
+      <w:r>
+        <w:rPr>
+          <w:rtl/>
+          <w:lang w:bidi="ar-SA"/>
+        </w:rPr>
+        <w:lastRenderedPageBreak/>
+        <w:t>یکپارچه‌سازی با سامانه نظارت تصویری</w:t>
+      </w:r>
+      <w:r>
+        <w:rPr>
+          <w:lang w:val="de-DE"/>
+        </w:rPr>
+        <w:t xml:space="preserve"> (CCTV / VMS)</w:t>
+      </w:r>
+    </w:p>
+    <w:p>
+      <w:r>
+        <w:rPr>
+          <w:rtl/>
+          <w:lang w:bidi="ar-SA"/>
+        </w:rPr>
+        <w:t>به‌منظور افزایش سطح امنیت، سامانه کنترل تردد قابلیت ارتباط با سامانه‌های نظارت تصویری را خواهد داشت</w:t>
+      </w:r>
+      <w:r>
+        <w:t>.</w:t>
+      </w:r>
+    </w:p>
+    <w:p>
+      <w:r>
+        <w:rPr>
+          <w:rtl/>
+          <w:lang w:bidi="ar-SA"/>
+        </w:rPr>
+        <w:t>نمونه قابلیت‌های قابل پیاده‌سازی عبارت‌اند از</w:t>
+      </w:r>
+      <w:r>
+        <w:t>:</w:t>
+      </w:r>
+    </w:p>
+    <w:p>
+      <w:pPr>
+        <w:numPr>
+          <w:ilvl w:val="0"/>
+          <w:numId w:val="64"/>
+        </w:numPr>
+      </w:pPr>
+      <w:r>
+        <w:rPr>
+          <w:rtl/>
+          <w:lang w:bidi="ar-SA"/>
+        </w:rPr>
+        <w:t>نمایش تصویر مرتبط با رخدادهای تردد</w:t>
+      </w:r>
+    </w:p>
+    <w:p>
+      <w:pPr>
+        <w:numPr>
+          <w:ilvl w:val="0"/>
+          <w:numId w:val="64"/>
+        </w:numPr>
+      </w:pPr>
+      <w:r>
+        <w:rPr>
+          <w:rtl/>
+          <w:lang w:bidi="ar-SA"/>
+        </w:rPr>
+        <w:t>ثبت تصویر هنگام ورود یا خروج</w:t>
+      </w:r>
+    </w:p>
+    <w:p>
+      <w:pPr>
+        <w:numPr>
+          <w:ilvl w:val="0"/>
+          <w:numId w:val="64"/>
+        </w:numPr>
+      </w:pPr>
+      <w:r>
+        <w:rPr>
+          <w:rtl/>
+          <w:lang w:bidi="ar-SA"/>
+        </w:rPr>
+        <w:t>نمایش تصویر افراد در گزارش‌های تردد</w:t>
+      </w:r>
+    </w:p>
+    <w:p>
+      <w:pPr>
+        <w:numPr>
+          <w:ilvl w:val="0"/>
+          <w:numId w:val="64"/>
+        </w:numPr>
+      </w:pPr>
+      <w:r>
+        <w:rPr>
+          <w:rtl/>
+          <w:lang w:bidi="ar-SA"/>
+        </w:rPr>
+        <w:t>فراخوانی خودکار تصویر دوربین هنگام وقوع هشدار</w:t>
+      </w:r>
+    </w:p>
+    <w:p>
+      <w:pPr>
+        <w:numPr>
+          <w:ilvl w:val="0"/>
+          <w:numId w:val="64"/>
+        </w:numPr>
+      </w:pPr>
+      <w:r>
+        <w:rPr>
+          <w:rtl/>
+          <w:lang w:bidi="ar-SA"/>
+        </w:rPr>
+        <w:t>ارتباط میان رخدادهای امنیتی و تصاویر ضبط‌شده</w:t>
+      </w:r>
+    </w:p>
+    <w:p>
+      <w:pPr>
+        <w:numPr>
+          <w:ilvl w:val="0"/>
+          <w:numId w:val="64"/>
+        </w:numPr>
+      </w:pPr>
+      <w:r>
+        <w:rPr>
+          <w:rtl/>
+          <w:lang w:bidi="ar-SA"/>
+        </w:rPr>
+        <w:t>استفاده از دوربین‌های تشخیص چهره در نقاط موردنیاز پروژه</w:t>
+      </w:r>
+    </w:p>
+    <w:p>
+      <w:r>
+        <w:rPr>
+          <w:rtl/>
+          <w:lang w:bidi="ar-SA"/>
+        </w:rPr>
+        <w:t>این یکپارچه‌سازی موجب افزایش سرعت بررسی رخدادهای امنیتی و تسهیل فرآیندهای نظارتی خواهد شد</w:t>
+      </w:r>
+      <w:r>
+        <w:t>.</w:t>
+      </w:r>
+    </w:p>
+    <w:p>
+      <w:pPr>
+        <w:pStyle w:val="Heading2"/>
+        <w:rPr>
+          <w:lang w:val="de-DE"/>
+        </w:rPr>
+      </w:pPr>
+      <w:r>
+        <w:rPr>
+          <w:rtl/>
+          <w:lang w:bidi="ar-SA"/>
+        </w:rPr>
+        <w:t>یکپارچه‌سازی با سامانه اعلام و اطفای حریق</w:t>
+      </w:r>
+    </w:p>
+    <w:p>
+      <w:r>
+        <w:rPr>
+          <w:rtl/>
+          <w:lang w:bidi="ar-SA"/>
+        </w:rPr>
+        <w:t>به‌منظور رعایت الزامات ایمنی، امکان ارتباط سامانه کنترل تردد با سیستم اعلام و اطفای حریق در نظر گرفته شده است</w:t>
+      </w:r>
+      <w:r>
+        <w:t>.</w:t>
+      </w:r>
+    </w:p>
+    <w:p>
+      <w:r>
+        <w:rPr>
+          <w:rtl/>
+          <w:lang w:bidi="ar-SA"/>
+        </w:rPr>
+        <w:t>در شرایط اضطراری، سامانه می‌تواند مطابق سیاست‌های تعریف‌شده اقدامات زیر را انجام دهد</w:t>
+      </w:r>
+      <w:r>
+        <w:t>:</w:t>
+      </w:r>
+    </w:p>
+    <w:p>
+      <w:pPr>
+        <w:numPr>
+          <w:ilvl w:val="0"/>
+          <w:numId w:val="65"/>
+        </w:numPr>
+      </w:pPr>
+      <w:r>
+        <w:rPr>
+          <w:rtl/>
+          <w:lang w:bidi="ar-SA"/>
+        </w:rPr>
+        <w:t>دریافت سیگنال اضطراری</w:t>
+      </w:r>
+    </w:p>
+    <w:p>
+      <w:pPr>
+        <w:numPr>
+          <w:ilvl w:val="0"/>
+          <w:numId w:val="65"/>
+        </w:numPr>
+      </w:pPr>
+      <w:r>
+        <w:rPr>
+          <w:rtl/>
+          <w:lang w:bidi="ar-SA"/>
+        </w:rPr>
+        <w:t>آزادسازی درب‌های تعیین‌شده</w:t>
+      </w:r>
+    </w:p>
+    <w:p>
+      <w:pPr>
+        <w:numPr>
+          <w:ilvl w:val="0"/>
+          <w:numId w:val="65"/>
+        </w:numPr>
+      </w:pPr>
+      <w:r>
+        <w:rPr>
+          <w:rtl/>
+          <w:lang w:bidi="ar-SA"/>
+        </w:rPr>
+        <w:t>باز نمودن گیت‌های خروج اضطراری</w:t>
+      </w:r>
+    </w:p>
+    <w:p>
+      <w:pPr>
+        <w:numPr>
+          <w:ilvl w:val="0"/>
+          <w:numId w:val="65"/>
+        </w:numPr>
+      </w:pPr>
+      <w:r>
+        <w:rPr>
+          <w:rtl/>
+          <w:lang w:bidi="ar-SA"/>
+        </w:rPr>
+        <w:t>ثبت کامل رخداد در سامانه</w:t>
+      </w:r>
+    </w:p>
+    <w:p>
+      <w:pPr>
+        <w:numPr>
+          <w:ilvl w:val="0"/>
+          <w:numId w:val="65"/>
+        </w:numPr>
+      </w:pPr>
+      <w:r>
+        <w:rPr>
+          <w:rtl/>
+          <w:lang w:bidi="ar-SA"/>
+        </w:rPr>
+        <w:t>اعلام وضعیت تجهیزات به مرکز کنترل</w:t>
+      </w:r>
+    </w:p>
+    <w:p>
+      <w:pPr>
+        <w:numPr>
+          <w:ilvl w:val="0"/>
+          <w:numId w:val="65"/>
+        </w:numPr>
+      </w:pPr>
+      <w:r>
+        <w:rPr>
+          <w:rtl/>
+          <w:lang w:bidi="ar-SA"/>
+        </w:rPr>
+        <w:lastRenderedPageBreak/>
+        <w:t>بازگشت سامانه به وضعیت عادی پس از رفع شرایط اضطراری</w:t>
+      </w:r>
+    </w:p>
+    <w:p>
+      <w:r>
+        <w:rPr>
+          <w:rtl/>
+          <w:lang w:bidi="ar-SA"/>
+        </w:rPr>
+        <w:t>نحوه عملکرد این بخش مطابق ضوابط ایمنی ساختمان و سیاست‌های بهره‌بردار تنظیم خواهد شد</w:t>
+      </w:r>
+      <w:r>
+        <w:t>.</w:t>
+      </w:r>
+    </w:p>
+    <w:p>
+      <w:pPr>
+        <w:pStyle w:val="Heading2"/>
+        <w:rPr>
+          <w:lang w:val="de-DE"/>
+        </w:rPr>
+      </w:pPr>
+      <w:r>
+        <w:rPr>
+          <w:rtl/>
+          <w:lang w:bidi="ar-SA"/>
+        </w:rPr>
+        <w:t>یکپارچه‌سازی با سامانه مدیریت پارکینگ</w:t>
+      </w:r>
+    </w:p>
+    <w:p>
+      <w:r>
+        <w:rPr>
+          <w:rtl/>
+          <w:lang w:bidi="ar-SA"/>
+        </w:rPr>
+        <w:t>به‌منظور مدیریت یکپارچه خودروها، امکان ارتباط میان سامانه کنترل تردد و سامانه مدیریت پارکینگ پیش‌بینی شده است</w:t>
+      </w:r>
+      <w:r>
+        <w:t>.</w:t>
+      </w:r>
+    </w:p>
+    <w:p>
+      <w:r>
+        <w:rPr>
+          <w:rtl/>
+          <w:lang w:bidi="ar-SA"/>
+        </w:rPr>
+        <w:t>نمونه قابلیت‌ها عبارت‌اند از</w:t>
+      </w:r>
+      <w:r>
+        <w:t>:</w:t>
+      </w:r>
+    </w:p>
+    <w:p>
+      <w:pPr>
+        <w:numPr>
+          <w:ilvl w:val="0"/>
+          <w:numId w:val="66"/>
+        </w:numPr>
+      </w:pPr>
+      <w:r>
+        <w:rPr>
+          <w:rtl/>
+          <w:lang w:bidi="ar-SA"/>
+        </w:rPr>
+        <w:t>ارتباط خودرو با مالک</w:t>
+      </w:r>
+    </w:p>
+    <w:p>
+      <w:pPr>
+        <w:numPr>
+          <w:ilvl w:val="0"/>
+          <w:numId w:val="66"/>
+        </w:numPr>
+      </w:pPr>
+      <w:r>
+        <w:rPr>
+          <w:rtl/>
+          <w:lang w:bidi="ar-SA"/>
+        </w:rPr>
+        <w:t>مدیریت خودروهای دانش‌آموزان مجاز (در صورت وجود)</w:t>
+      </w:r>
+    </w:p>
+    <w:p>
+      <w:pPr>
+        <w:numPr>
+          <w:ilvl w:val="0"/>
+          <w:numId w:val="66"/>
+        </w:numPr>
+      </w:pPr>
+      <w:r>
+        <w:rPr>
+          <w:rtl/>
+          <w:lang w:bidi="ar-SA"/>
+        </w:rPr>
+        <w:t>مدیریت خودروهای کارکنان</w:t>
+      </w:r>
+    </w:p>
+    <w:p>
+      <w:pPr>
+        <w:numPr>
+          <w:ilvl w:val="0"/>
+          <w:numId w:val="66"/>
+        </w:numPr>
+      </w:pPr>
+      <w:r>
+        <w:rPr>
+          <w:rtl/>
+          <w:lang w:bidi="ar-SA"/>
+        </w:rPr>
+        <w:t>مدیریت خودروهای والدین</w:t>
+      </w:r>
+    </w:p>
+    <w:p>
+      <w:pPr>
+        <w:numPr>
+          <w:ilvl w:val="0"/>
+          <w:numId w:val="66"/>
+        </w:numPr>
+      </w:pPr>
+      <w:r>
+        <w:rPr>
+          <w:rtl/>
+          <w:lang w:bidi="ar-SA"/>
+        </w:rPr>
+        <w:t>مدیریت خودروهای سرویس مدارس</w:t>
+      </w:r>
+    </w:p>
+    <w:p>
+      <w:pPr>
+        <w:numPr>
+          <w:ilvl w:val="0"/>
+          <w:numId w:val="66"/>
+        </w:numPr>
+      </w:pPr>
+      <w:r>
+        <w:rPr>
+          <w:rtl/>
+          <w:lang w:bidi="ar-SA"/>
+        </w:rPr>
+        <w:t>مدیریت خودروهای پیمانکاران</w:t>
+      </w:r>
+    </w:p>
+    <w:p>
+      <w:pPr>
+        <w:numPr>
+          <w:ilvl w:val="0"/>
+          <w:numId w:val="66"/>
+        </w:numPr>
+      </w:pPr>
+      <w:r>
+        <w:rPr>
+          <w:rtl/>
+          <w:lang w:bidi="ar-SA"/>
+        </w:rPr>
+        <w:t>کنترل خودروهای مهمان</w:t>
+      </w:r>
+    </w:p>
+    <w:p>
+      <w:pPr>
+        <w:numPr>
+          <w:ilvl w:val="0"/>
+          <w:numId w:val="66"/>
+        </w:numPr>
+      </w:pPr>
+      <w:r>
+        <w:rPr>
+          <w:rtl/>
+          <w:lang w:bidi="ar-SA"/>
+        </w:rPr>
+        <w:t>ارتباط با سامانه پلاک‌خوان</w:t>
+      </w:r>
+      <w:r>
+        <w:t xml:space="preserve"> (ANPR)</w:t>
+      </w:r>
+    </w:p>
+    <w:p>
+      <w:pPr>
+        <w:numPr>
+          <w:ilvl w:val="0"/>
+          <w:numId w:val="66"/>
+        </w:numPr>
+      </w:pPr>
+      <w:r>
+        <w:rPr>
+          <w:rtl/>
+          <w:lang w:bidi="ar-SA"/>
+        </w:rPr>
+        <w:t>ارتباط با تجهیزات</w:t>
+      </w:r>
+      <w:r>
+        <w:t xml:space="preserve"> RFID </w:t>
+      </w:r>
+      <w:r>
+        <w:rPr>
+          <w:rtl/>
+          <w:lang w:bidi="ar-SA"/>
+        </w:rPr>
+        <w:t>یا</w:t>
+      </w:r>
+      <w:r>
+        <w:t xml:space="preserve"> UHF</w:t>
+      </w:r>
+    </w:p>
+    <w:p>
+      <w:pPr>
+        <w:numPr>
+          <w:ilvl w:val="0"/>
+          <w:numId w:val="66"/>
+        </w:numPr>
+      </w:pPr>
+      <w:r>
+        <w:rPr>
+          <w:rtl/>
+          <w:lang w:bidi="ar-SA"/>
+        </w:rPr>
+        <w:t>ثبت کامل ورود و خروج خودروها</w:t>
+      </w:r>
+    </w:p>
+    <w:p>
+      <w:pPr>
+        <w:pStyle w:val="Heading2"/>
+        <w:rPr>
+          <w:lang w:val="de-DE"/>
+        </w:rPr>
+      </w:pPr>
+      <w:r>
+        <w:rPr>
+          <w:rtl/>
+          <w:lang w:bidi="ar-SA"/>
+        </w:rPr>
+        <w:t>یکپارچه‌سازی با سامانه مدیریت هویت و زیرساخت فناوری اطلاعات</w:t>
+      </w:r>
+    </w:p>
+    <w:p>
+      <w:r>
+        <w:rPr>
+          <w:rtl/>
+          <w:lang w:bidi="ar-SA"/>
+        </w:rPr>
+        <w:t>به‌منظور مدیریت کاربران نرم‌افزار و افزایش امنیت، امکان ارتباط با سامانه‌های مدیریت هویت سازمان وجود خواهد داشت</w:t>
+      </w:r>
+      <w:r>
+        <w:t>.</w:t>
+      </w:r>
+    </w:p>
+    <w:p>
+      <w:r>
+        <w:rPr>
+          <w:rtl/>
+          <w:lang w:bidi="ar-SA"/>
+        </w:rPr>
+        <w:t>نمونه قابلیت‌ها عبارت‌اند از</w:t>
+      </w:r>
+      <w:r>
+        <w:t>:</w:t>
+      </w:r>
+    </w:p>
+    <w:p>
+      <w:pPr>
+        <w:numPr>
+          <w:ilvl w:val="0"/>
+          <w:numId w:val="67"/>
+        </w:numPr>
+      </w:pPr>
+      <w:r>
+        <w:rPr>
+          <w:rtl/>
+          <w:lang w:bidi="ar-SA"/>
+        </w:rPr>
+        <w:lastRenderedPageBreak/>
+        <w:t>ورود یکپارچه کاربران</w:t>
+      </w:r>
+    </w:p>
+    <w:p>
+      <w:pPr>
+        <w:numPr>
+          <w:ilvl w:val="0"/>
+          <w:numId w:val="67"/>
+        </w:numPr>
+      </w:pPr>
+      <w:r>
+        <w:rPr>
+          <w:rtl/>
+          <w:lang w:bidi="ar-SA"/>
+        </w:rPr>
+        <w:t>استفاده از</w:t>
+      </w:r>
+      <w:r>
+        <w:t xml:space="preserve"> Active Directory</w:t>
+      </w:r>
+    </w:p>
+    <w:p>
+      <w:pPr>
+        <w:numPr>
+          <w:ilvl w:val="0"/>
+          <w:numId w:val="67"/>
+        </w:numPr>
+      </w:pPr>
+      <w:r>
+        <w:rPr>
+          <w:rtl/>
+          <w:lang w:bidi="ar-SA"/>
+        </w:rPr>
+        <w:t>همگام‌سازی کاربران نرم‌افزار</w:t>
+      </w:r>
+    </w:p>
+    <w:p>
+      <w:pPr>
+        <w:numPr>
+          <w:ilvl w:val="0"/>
+          <w:numId w:val="67"/>
+        </w:numPr>
+      </w:pPr>
+      <w:r>
+        <w:rPr>
+          <w:rtl/>
+          <w:lang w:bidi="ar-SA"/>
+        </w:rPr>
+        <w:t>مدیریت نقش‌های سازمانی</w:t>
+      </w:r>
+    </w:p>
+    <w:p>
+      <w:pPr>
+        <w:numPr>
+          <w:ilvl w:val="0"/>
+          <w:numId w:val="67"/>
+        </w:numPr>
+      </w:pPr>
+      <w:r>
+        <w:rPr>
+          <w:rtl/>
+          <w:lang w:bidi="ar-SA"/>
+        </w:rPr>
+        <w:t>تخصیص خودکار سطح دسترسی</w:t>
+      </w:r>
+    </w:p>
+    <w:p>
+      <w:pPr>
+        <w:numPr>
+          <w:ilvl w:val="0"/>
+          <w:numId w:val="67"/>
+        </w:numPr>
+      </w:pPr>
+      <w:r>
+        <w:rPr>
+          <w:rtl/>
+          <w:lang w:bidi="ar-SA"/>
+        </w:rPr>
+        <w:t>ثبت فعالیت کاربران</w:t>
+      </w:r>
+    </w:p>
+    <w:p>
+      <w:pPr>
+        <w:numPr>
+          <w:ilvl w:val="0"/>
+          <w:numId w:val="67"/>
+        </w:numPr>
+      </w:pPr>
+      <w:r>
+        <w:rPr>
+          <w:rtl/>
+          <w:lang w:bidi="ar-SA"/>
+        </w:rPr>
+        <w:t>ارسال رویدادها به سامانه‌های مانیتورینگ امنیتی</w:t>
+      </w:r>
+    </w:p>
+    <w:p>
+      <w:pPr>
+        <w:numPr>
+          <w:ilvl w:val="0"/>
+          <w:numId w:val="67"/>
+        </w:numPr>
+      </w:pPr>
+      <w:r>
+        <w:rPr>
+          <w:rtl/>
+          <w:lang w:bidi="ar-SA"/>
+        </w:rPr>
+        <w:t>پشتیبانی از ثبت لاگ و ممیزی فعالیت‌ها</w:t>
+      </w:r>
+    </w:p>
+    <w:p>
+      <w:pPr>
+        <w:pStyle w:val="Heading2"/>
+        <w:rPr>
+          <w:lang w:val="de-DE"/>
+        </w:rPr>
+      </w:pPr>
+      <w:r>
+        <w:rPr>
+          <w:rtl/>
+          <w:lang w:bidi="ar-SA"/>
+        </w:rPr>
+        <w:t>یکپارچه‌سازی با سامانه‌های اطلاع‌رسانی</w:t>
+      </w:r>
+    </w:p>
+    <w:p>
+      <w:r>
+        <w:rPr>
+          <w:rtl/>
+          <w:lang w:bidi="ar-SA"/>
+        </w:rPr>
+        <w:t>سامانه می‌تواند از طریق سرویس‌های پیام‌رسان، ایمیل یا سایر زیرساخت‌های اطلاع‌رسانی، رویدادهای مهم را به افراد ذی‌ربط ارسال نماید</w:t>
+      </w:r>
+      <w:r>
+        <w:t>.</w:t>
+      </w:r>
+    </w:p>
+    <w:p>
+      <w:r>
+        <w:rPr>
+          <w:rtl/>
+          <w:lang w:bidi="ar-SA"/>
+        </w:rPr>
+        <w:t>نمونه کاربردها عبارت‌اند از</w:t>
+      </w:r>
+      <w:r>
+        <w:t>:</w:t>
+      </w:r>
+    </w:p>
+    <w:p>
+      <w:pPr>
+        <w:numPr>
+          <w:ilvl w:val="0"/>
+          <w:numId w:val="68"/>
+        </w:numPr>
+      </w:pPr>
+      <w:r>
+        <w:rPr>
+          <w:rtl/>
+          <w:lang w:bidi="ar-SA"/>
+        </w:rPr>
+        <w:t>اطلاع‌رسانی ورود و خروج دانش‌آموز</w:t>
+      </w:r>
+    </w:p>
+    <w:p>
+      <w:pPr>
+        <w:numPr>
+          <w:ilvl w:val="0"/>
+          <w:numId w:val="68"/>
+        </w:numPr>
+      </w:pPr>
+      <w:r>
+        <w:rPr>
+          <w:rtl/>
+          <w:lang w:bidi="ar-SA"/>
+        </w:rPr>
+        <w:t>اطلاع‌رسانی ورود مهمان به میزبان</w:t>
+      </w:r>
+    </w:p>
+    <w:p>
+      <w:pPr>
+        <w:numPr>
+          <w:ilvl w:val="0"/>
+          <w:numId w:val="68"/>
+        </w:numPr>
+      </w:pPr>
+      <w:r>
+        <w:rPr>
+          <w:rtl/>
+          <w:lang w:bidi="ar-SA"/>
+        </w:rPr>
+        <w:t>هشدار ورود غیرمجاز</w:t>
+      </w:r>
+    </w:p>
+    <w:p>
+      <w:pPr>
+        <w:numPr>
+          <w:ilvl w:val="0"/>
+          <w:numId w:val="68"/>
+        </w:numPr>
+      </w:pPr>
+      <w:r>
+        <w:rPr>
+          <w:rtl/>
+          <w:lang w:bidi="ar-SA"/>
+        </w:rPr>
+        <w:t>هشدار باز ماندن درب</w:t>
+      </w:r>
+    </w:p>
+    <w:p>
+      <w:pPr>
+        <w:numPr>
+          <w:ilvl w:val="0"/>
+          <w:numId w:val="68"/>
+        </w:numPr>
+      </w:pPr>
+      <w:r>
+        <w:rPr>
+          <w:rtl/>
+          <w:lang w:bidi="ar-SA"/>
+        </w:rPr>
+        <w:t>هشدار قطع ارتباط تجهیزات</w:t>
+      </w:r>
+    </w:p>
+    <w:p>
+      <w:pPr>
+        <w:numPr>
+          <w:ilvl w:val="0"/>
+          <w:numId w:val="68"/>
+        </w:numPr>
+      </w:pPr>
+      <w:r>
+        <w:rPr>
+          <w:rtl/>
+          <w:lang w:bidi="ar-SA"/>
+        </w:rPr>
+        <w:t>اطلاع‌رسانی رخدادهای اضطراری</w:t>
+      </w:r>
+    </w:p>
+    <w:p>
+      <w:pPr>
+        <w:numPr>
+          <w:ilvl w:val="0"/>
+          <w:numId w:val="68"/>
+        </w:numPr>
+      </w:pPr>
+      <w:r>
+        <w:rPr>
+          <w:rtl/>
+          <w:lang w:bidi="ar-SA"/>
+        </w:rPr>
+        <w:t>ارسال گزارش‌های مدیریتی دوره‌ای</w:t>
+      </w:r>
+    </w:p>
+    <w:p>
+      <w:r>
+        <w:rPr>
+          <w:rtl/>
+          <w:lang w:bidi="ar-SA"/>
+        </w:rPr>
+        <w:t>نوع سرویس اطلاع‌رسانی بر اساس زیرساخت مورد استفاده کارفرما تعیین خواهد شد</w:t>
+      </w:r>
+      <w:r>
+        <w:t>.</w:t>
+      </w:r>
+    </w:p>
+    <w:p>
+      <w:pPr>
+        <w:pStyle w:val="Heading2"/>
+        <w:rPr>
+          <w:lang w:val="de-DE"/>
+        </w:rPr>
+      </w:pPr>
+      <w:r>
+        <w:rPr>
+          <w:rtl/>
+          <w:lang w:bidi="ar-SA"/>
+        </w:rPr>
+        <w:lastRenderedPageBreak/>
+        <w:t>الزامات امنیتی و حریم خصوصی</w:t>
+      </w:r>
+    </w:p>
+    <w:p>
+      <w:r>
+        <w:rPr>
+          <w:rtl/>
+          <w:lang w:bidi="ar-SA"/>
+        </w:rPr>
+        <w:t>با توجه به ماهیت اطلاعات ذخیره‌شده در سامانه، تمامی یکپارچه‌سازی‌ها باید مطابق الزامات امنیت اطلاعات و سیاست‌های حریم خصوصی کارفرما انجام شوند</w:t>
+      </w:r>
+      <w:r>
+        <w:t>.</w:t>
+      </w:r>
+    </w:p>
+    <w:p>
+      <w:r>
+        <w:rPr>
+          <w:rtl/>
+          <w:lang w:bidi="ar-SA"/>
+        </w:rPr>
+        <w:t>در این راستا موارد زیر پیشنهاد می‌شود</w:t>
+      </w:r>
+      <w:r>
+        <w:t>:</w:t>
+      </w:r>
+    </w:p>
+    <w:p>
+      <w:pPr>
+        <w:numPr>
+          <w:ilvl w:val="0"/>
+          <w:numId w:val="69"/>
+        </w:numPr>
+      </w:pPr>
+      <w:r>
+        <w:rPr>
+          <w:rtl/>
+          <w:lang w:bidi="ar-SA"/>
+        </w:rPr>
+        <w:t>استفاده از ارتباطات رمزنگاری‌شده</w:t>
+      </w:r>
+    </w:p>
+    <w:p>
+      <w:pPr>
+        <w:numPr>
+          <w:ilvl w:val="0"/>
+          <w:numId w:val="69"/>
+        </w:numPr>
+      </w:pPr>
+      <w:r>
+        <w:rPr>
+          <w:rtl/>
+          <w:lang w:bidi="ar-SA"/>
+        </w:rPr>
+        <w:t>احراز هویت سرویس‌ها</w:t>
+      </w:r>
+    </w:p>
+    <w:p>
+      <w:pPr>
+        <w:numPr>
+          <w:ilvl w:val="0"/>
+          <w:numId w:val="69"/>
+        </w:numPr>
+      </w:pPr>
+      <w:r>
+        <w:rPr>
+          <w:rtl/>
+          <w:lang w:bidi="ar-SA"/>
+        </w:rPr>
+        <w:t>کنترل سطح دسترسی</w:t>
+      </w:r>
+      <w:r>
+        <w:t xml:space="preserve"> API</w:t>
+      </w:r>
+    </w:p>
+    <w:p>
+      <w:pPr>
+        <w:numPr>
+          <w:ilvl w:val="0"/>
+          <w:numId w:val="69"/>
+        </w:numPr>
+      </w:pPr>
+      <w:r>
+        <w:rPr>
+          <w:rtl/>
+          <w:lang w:bidi="ar-SA"/>
+        </w:rPr>
+        <w:t>ثبت کامل رویدادهای تبادل اطلاعات</w:t>
+      </w:r>
+    </w:p>
+    <w:p>
+      <w:pPr>
+        <w:numPr>
+          <w:ilvl w:val="0"/>
+          <w:numId w:val="69"/>
+        </w:numPr>
+      </w:pPr>
+      <w:r>
+        <w:rPr>
+          <w:rtl/>
+          <w:lang w:bidi="ar-SA"/>
+        </w:rPr>
+        <w:t>امکان ممیزی تمامی عملیات</w:t>
+      </w:r>
+    </w:p>
+    <w:p>
+      <w:pPr>
+        <w:numPr>
+          <w:ilvl w:val="0"/>
+          <w:numId w:val="69"/>
+        </w:numPr>
+      </w:pPr>
+      <w:r>
+        <w:rPr>
+          <w:rtl/>
+          <w:lang w:bidi="ar-SA"/>
+        </w:rPr>
+        <w:t>تعیین دوره نگهداری اطلاعات</w:t>
+      </w:r>
+    </w:p>
+    <w:p>
+      <w:pPr>
+        <w:numPr>
+          <w:ilvl w:val="0"/>
+          <w:numId w:val="69"/>
+        </w:numPr>
+      </w:pPr>
+      <w:r>
+        <w:rPr>
+          <w:rtl/>
+          <w:lang w:bidi="ar-SA"/>
+        </w:rPr>
+        <w:t>رعایت محرمانگی اطلاعات کاربران</w:t>
+      </w:r>
+    </w:p>
+    <w:p>
+      <w:pPr>
+        <w:numPr>
+          <w:ilvl w:val="0"/>
+          <w:numId w:val="69"/>
+        </w:numPr>
+      </w:pPr>
+      <w:r>
+        <w:rPr>
+          <w:rtl/>
+          <w:lang w:bidi="ar-SA"/>
+        </w:rPr>
+        <w:t>رعایت سیاست‌های مربوط به تصاویر، داده‌های بیومتریک و اطلاعات دانش‌آموزان</w:t>
+      </w:r>
+    </w:p>
+    <w:p>
+      <w:pPr>
+        <w:pStyle w:val="Heading2"/>
+        <w:rPr>
+          <w:lang w:val="de-DE"/>
+        </w:rPr>
+      </w:pPr>
+      <w:r>
+        <w:rPr>
+          <w:rtl/>
+          <w:lang w:bidi="ar-SA"/>
+        </w:rPr>
+        <w:t>جمع‌بندی</w:t>
+      </w:r>
+    </w:p>
+    <w:p>
+      <w:r>
+        <w:rPr>
+          <w:rtl/>
+          <w:lang w:bidi="ar-SA"/>
+        </w:rPr>
+        <w:t>راهکار پیشنهادی با بهره‌گیری از معماری باز و ماژولار، امکان یکپارچه‌سازی با سامانه‌های مدیریتی، آموزشی، امنیتی و فناوری اطلاعات را فراهم می‌کند. این معماری ضمن کاهش ورود تکراری اطلاعات، موجب افزایش دقت، سرعت تبادل داده‌ها، ارتقاء امنیت، بهبود فرآیندهای عملیاتی و فراهم شدن بستری مناسب برای توسعه‌های آتی خواهد شد</w:t>
+      </w:r>
+      <w:r>
+        <w:t>.</w:t>
+      </w:r>
+    </w:p>
+    <w:p>
+      <w:r>
+        <w:rPr>
+          <w:rtl/>
+          <w:lang w:bidi="ar-SA"/>
+        </w:rPr>
+        <w:t>نوع سامانه‌های متصل، محدوده تبادل اطلاعات و جزئیات هر یک از یکپارچه‌سازی‌ها در مرحله طراحی تفصیلی و پس از بررسی زیرساخت‌های موجود و تأیید کارفرما نهایی خواهد شد</w:t>
+      </w:r>
+      <w:r>
+        <w:t>.</w:t>
+      </w:r>
+    </w:p>
+    <w:p>
+      <w:pPr>
+        <w:rPr>
           <w:rtl/>
         </w:rPr>
       </w:pPr>
@@ -33476,6 +35528,7 @@
         <w:rPr>
           <w:rtl/>
         </w:rPr>
+        <w:lastRenderedPageBreak/>
         <w:t>امنیت، مانیتورینگ و گزارش‌گیری</w:t>
       </w:r>
     </w:p>
@@ -34798,6 +36851,155 @@
     </w:lvl>
   </w:abstractNum>
   <w:abstractNum w:abstractNumId="9" w15:restartNumberingAfterBreak="0">
+    <w:nsid w:val="169E640C"/>
+    <w:multiLevelType w:val="multilevel"/>
+    <w:tmpl w:val="F144497C"/>
+    <w:lvl w:ilvl="0">
+      <w:start w:val="1"/>
+      <w:numFmt w:val="bullet"/>
+      <w:lvlText w:val=""/>
+      <w:lvlJc w:val="left"/>
+      <w:pPr>
+        <w:tabs>
+          <w:tab w:val="num" w:pos="720"/>
+        </w:tabs>
+        <w:ind w:left="720" w:hanging="360"/>
+      </w:pPr>
+      <w:rPr>
+        <w:rFonts w:ascii="Symbol" w:hAnsi="Symbol" w:hint="default"/>
+        <w:sz w:val="20"/>
+      </w:rPr>
+    </w:lvl>
+    <w:lvl w:ilvl="1" w:tentative="1">
+      <w:start w:val="1"/>
+      <w:numFmt w:val="bullet"/>
+      <w:lvlText w:val="o"/>
+      <w:lvlJc w:val="left"/>
+      <w:pPr>
+        <w:tabs>
+          <w:tab w:val="num" w:pos="1440"/>
+        </w:tabs>
+        <w:ind w:left="1440" w:hanging="360"/>
+      </w:pPr>
+      <w:rPr>
+        <w:rFonts w:ascii="Courier New" w:hAnsi="Courier New" w:hint="default"/>
+        <w:sz w:val="20"/>
+      </w:rPr>
+    </w:lvl>
+    <w:lvl w:ilvl="2" w:tentative="1">
+      <w:start w:val="1"/>
+      <w:numFmt w:val="bullet"/>
+      <w:lvlText w:val=""/>
+      <w:lvlJc w:val="left"/>
+      <w:pPr>
+        <w:tabs>
+          <w:tab w:val="num" w:pos="2160"/>
+        </w:tabs>
+        <w:ind w:left="2160" w:hanging="360"/>
+      </w:pPr>
+      <w:rPr>
+        <w:rFonts w:ascii="Wingdings" w:hAnsi="Wingdings" w:hint="default"/>
+        <w:sz w:val="20"/>
+      </w:rPr>
+    </w:lvl>
+    <w:lvl w:ilvl="3" w:tentative="1">
+      <w:start w:val="1"/>
+      <w:numFmt w:val="bullet"/>
+      <w:lvlText w:val=""/>
+      <w:lvlJc w:val="left"/>
+      <w:pPr>
+        <w:tabs>
+          <w:tab w:val="num" w:pos="2880"/>
+        </w:tabs>
+        <w:ind w:left="2880" w:hanging="360"/>
+      </w:pPr>
+      <w:rPr>
+        <w:rFonts w:ascii="Wingdings" w:hAnsi="Wingdings" w:hint="default"/>
+        <w:sz w:val="20"/>
+      </w:rPr>
+    </w:lvl>
+    <w:lvl w:ilvl="4" w:tentative="1">
+      <w:start w:val="1"/>
+      <w:numFmt w:val="bullet"/>
+      <w:lvlText w:val=""/>
+      <w:lvlJc w:val="left"/>
+      <w:pPr>
+        <w:tabs>
+          <w:tab w:val="num" w:pos="3600"/>
+        </w:tabs>
+        <w:ind w:left="3600" w:hanging="360"/>
+      </w:pPr>
+      <w:rPr>
+        <w:rFonts w:ascii="Wingdings" w:hAnsi="Wingdings" w:hint="default"/>
+        <w:sz w:val="20"/>
+      </w:rPr>
+    </w:lvl>
+    <w:lvl w:ilvl="5" w:tentative="1">
+      <w:start w:val="1"/>
+      <w:numFmt w:val="bullet"/>
+      <w:lvlText w:val=""/>
+      <w:lvlJc w:val="left"/>
+      <w:pPr>
+        <w:tabs>
+          <w:tab w:val="num" w:pos="4320"/>
+        </w:tabs>
+        <w:ind w:left="4320" w:hanging="360"/>
+      </w:pPr>
+      <w:rPr>
+        <w:rFonts w:ascii="Wingdings" w:hAnsi="Wingdings" w:hint="default"/>
+        <w:sz w:val="20"/>
+      </w:rPr>
+    </w:lvl>
+    <w:lvl w:ilvl="6" w:tentative="1">
+      <w:start w:val="1"/>
+      <w:numFmt w:val="bullet"/>
+      <w:lvlText w:val=""/>
+      <w:lvlJc w:val="left"/>
+      <w:pPr>
+        <w:tabs>
+          <w:tab w:val="num" w:pos="5040"/>
+        </w:tabs>
+        <w:ind w:left="5040" w:hanging="360"/>
+      </w:pPr>
+      <w:rPr>
+        <w:rFonts w:ascii="Wingdings" w:hAnsi="Wingdings" w:hint="default"/>
+        <w:sz w:val="20"/>
+      </w:rPr>
+    </w:lvl>
+    <w:lvl w:ilvl="7" w:tentative="1">
+      <w:start w:val="1"/>
+      <w:numFmt w:val="bullet"/>
+      <w:lvlText w:val=""/>
+      <w:lvlJc w:val="left"/>
+      <w:pPr>
+        <w:tabs>
+          <w:tab w:val="num" w:pos="5760"/>
+        </w:tabs>
+        <w:ind w:left="5760" w:hanging="360"/>
+      </w:pPr>
+      <w:rPr>
+        <w:rFonts w:ascii="Wingdings" w:hAnsi="Wingdings" w:hint="default"/>
+        <w:sz w:val="20"/>
+      </w:rPr>
+    </w:lvl>
+    <w:lvl w:ilvl="8" w:tentative="1">
+      <w:start w:val="1"/>
+      <w:numFmt w:val="bullet"/>
+      <w:lvlText w:val=""/>
+      <w:lvlJc w:val="left"/>
+      <w:pPr>
+        <w:tabs>
+          <w:tab w:val="num" w:pos="6480"/>
+        </w:tabs>
+        <w:ind w:left="6480" w:hanging="360"/>
+      </w:pPr>
+      <w:rPr>
+        <w:rFonts w:ascii="Wingdings" w:hAnsi="Wingdings" w:hint="default"/>
+        <w:sz w:val="20"/>
+      </w:rPr>
+    </w:lvl>
+  </w:abstractNum>
+  <w:abstractNum w:abstractNumId="10" w15:restartNumberingAfterBreak="0">
     <w:nsid w:val="1A805649"/>
     <w:multiLevelType w:val="multilevel"/>
     <w:tmpl w:val="1094604A"/>
@@ -34946,7 +37148,156 @@
       </w:rPr>
     </w:lvl>
   </w:abstractNum>
-  <w:abstractNum w:abstractNumId="10" w15:restartNumberingAfterBreak="0">
+  <w:abstractNum w:abstractNumId="11" w15:restartNumberingAfterBreak="0">
+    <w:nsid w:val="1B1E02A6"/>
+    <w:multiLevelType w:val="multilevel"/>
+    <w:tmpl w:val="962EE0AC"/>
+    <w:lvl w:ilvl="0">
+      <w:start w:val="1"/>
+      <w:numFmt w:val="bullet"/>
+      <w:lvlText w:val=""/>
+      <w:lvlJc w:val="left"/>
+      <w:pPr>
+        <w:tabs>
+          <w:tab w:val="num" w:pos="720"/>
+        </w:tabs>
+        <w:ind w:left="720" w:hanging="360"/>
+      </w:pPr>
+      <w:rPr>
+        <w:rFonts w:ascii="Symbol" w:hAnsi="Symbol" w:hint="default"/>
+        <w:sz w:val="20"/>
+      </w:rPr>
+    </w:lvl>
+    <w:lvl w:ilvl="1" w:tentative="1">
+      <w:start w:val="1"/>
+      <w:numFmt w:val="bullet"/>
+      <w:lvlText w:val="o"/>
+      <w:lvlJc w:val="left"/>
+      <w:pPr>
+        <w:tabs>
+          <w:tab w:val="num" w:pos="1440"/>
+        </w:tabs>
+        <w:ind w:left="1440" w:hanging="360"/>
+      </w:pPr>
+      <w:rPr>
+        <w:rFonts w:ascii="Courier New" w:hAnsi="Courier New" w:hint="default"/>
+        <w:sz w:val="20"/>
+      </w:rPr>
+    </w:lvl>
+    <w:lvl w:ilvl="2" w:tentative="1">
+      <w:start w:val="1"/>
+      <w:numFmt w:val="bullet"/>
+      <w:lvlText w:val=""/>
+      <w:lvlJc w:val="left"/>
+      <w:pPr>
+        <w:tabs>
+          <w:tab w:val="num" w:pos="2160"/>
+        </w:tabs>
+        <w:ind w:left="2160" w:hanging="360"/>
+      </w:pPr>
+      <w:rPr>
+        <w:rFonts w:ascii="Wingdings" w:hAnsi="Wingdings" w:hint="default"/>
+        <w:sz w:val="20"/>
+      </w:rPr>
+    </w:lvl>
+    <w:lvl w:ilvl="3" w:tentative="1">
+      <w:start w:val="1"/>
+      <w:numFmt w:val="bullet"/>
+      <w:lvlText w:val=""/>
+      <w:lvlJc w:val="left"/>
+      <w:pPr>
+        <w:tabs>
+          <w:tab w:val="num" w:pos="2880"/>
+        </w:tabs>
+        <w:ind w:left="2880" w:hanging="360"/>
+      </w:pPr>
+      <w:rPr>
+        <w:rFonts w:ascii="Wingdings" w:hAnsi="Wingdings" w:hint="default"/>
+        <w:sz w:val="20"/>
+      </w:rPr>
+    </w:lvl>
+    <w:lvl w:ilvl="4" w:tentative="1">
+      <w:start w:val="1"/>
+      <w:numFmt w:val="bullet"/>
+      <w:lvlText w:val=""/>
+      <w:lvlJc w:val="left"/>
+      <w:pPr>
+        <w:tabs>
+          <w:tab w:val="num" w:pos="3600"/>
+        </w:tabs>
+        <w:ind w:left="3600" w:hanging="360"/>
+      </w:pPr>
+      <w:rPr>
+        <w:rFonts w:ascii="Wingdings" w:hAnsi="Wingdings" w:hint="default"/>
+        <w:sz w:val="20"/>
+      </w:rPr>
+    </w:lvl>
+    <w:lvl w:ilvl="5" w:tentative="1">
+      <w:start w:val="1"/>
+      <w:numFmt w:val="bullet"/>
+      <w:lvlText w:val=""/>
+      <w:lvlJc w:val="left"/>
+      <w:pPr>
+        <w:tabs>
+          <w:tab w:val="num" w:pos="4320"/>
+        </w:tabs>
+        <w:ind w:left="4320" w:hanging="360"/>
+      </w:pPr>
+      <w:rPr>
+        <w:rFonts w:ascii="Wingdings" w:hAnsi="Wingdings" w:hint="default"/>
+        <w:sz w:val="20"/>
+      </w:rPr>
+    </w:lvl>
+    <w:lvl w:ilvl="6" w:tentative="1">
+      <w:start w:val="1"/>
+      <w:numFmt w:val="bullet"/>
+      <w:lvlText w:val=""/>
+      <w:lvlJc w:val="left"/>
+      <w:pPr>
+        <w:tabs>
+          <w:tab w:val="num" w:pos="5040"/>
+        </w:tabs>
+        <w:ind w:left="5040" w:hanging="360"/>
+      </w:pPr>
+      <w:rPr>
+        <w:rFonts w:ascii="Wingdings" w:hAnsi="Wingdings" w:hint="default"/>
+        <w:sz w:val="20"/>
+      </w:rPr>
+    </w:lvl>
+    <w:lvl w:ilvl="7" w:tentative="1">
+      <w:start w:val="1"/>
+      <w:numFmt w:val="bullet"/>
+      <w:lvlText w:val=""/>
+      <w:lvlJc w:val="left"/>
+      <w:pPr>
+        <w:tabs>
+          <w:tab w:val="num" w:pos="5760"/>
+        </w:tabs>
+        <w:ind w:left="5760" w:hanging="360"/>
+      </w:pPr>
+      <w:rPr>
+        <w:rFonts w:ascii="Wingdings" w:hAnsi="Wingdings" w:hint="default"/>
+        <w:sz w:val="20"/>
+      </w:rPr>
+    </w:lvl>
+    <w:lvl w:ilvl="8" w:tentative="1">
+      <w:start w:val="1"/>
+      <w:numFmt w:val="bullet"/>
+      <w:lvlText w:val=""/>
+      <w:lvlJc w:val="left"/>
+      <w:pPr>
+        <w:tabs>
+          <w:tab w:val="num" w:pos="6480"/>
+        </w:tabs>
+        <w:ind w:left="6480" w:hanging="360"/>
+      </w:pPr>
+      <w:rPr>
+        <w:rFonts w:ascii="Wingdings" w:hAnsi="Wingdings" w:hint="default"/>
+        <w:sz w:val="20"/>
+      </w:rPr>
+    </w:lvl>
+  </w:abstractNum>
+  <w:abstractNum w:abstractNumId="12" w15:restartNumberingAfterBreak="0">
     <w:nsid w:val="1C4B1A02"/>
     <w:multiLevelType w:val="multilevel"/>
     <w:tmpl w:val="F8D81D82"/>
@@ -35095,7 +37446,7 @@
       </w:rPr>
     </w:lvl>
   </w:abstractNum>
-  <w:abstractNum w:abstractNumId="11" w15:restartNumberingAfterBreak="0">
+  <w:abstractNum w:abstractNumId="13" w15:restartNumberingAfterBreak="0">
     <w:nsid w:val="1DF56945"/>
     <w:multiLevelType w:val="multilevel"/>
     <w:tmpl w:val="973C6394"/>
@@ -35244,7 +37595,7 @@
       </w:rPr>
     </w:lvl>
   </w:abstractNum>
-  <w:abstractNum w:abstractNumId="12" w15:restartNumberingAfterBreak="0">
+  <w:abstractNum w:abstractNumId="14" w15:restartNumberingAfterBreak="0">
     <w:nsid w:val="213F1A27"/>
     <w:multiLevelType w:val="multilevel"/>
     <w:tmpl w:val="F3F244CA"/>
@@ -35393,7 +37744,7 @@
       </w:rPr>
     </w:lvl>
   </w:abstractNum>
-  <w:abstractNum w:abstractNumId="13" w15:restartNumberingAfterBreak="0">
+  <w:abstractNum w:abstractNumId="15" w15:restartNumberingAfterBreak="0">
     <w:nsid w:val="21A56195"/>
     <w:multiLevelType w:val="multilevel"/>
     <w:tmpl w:val="9C4CA68A"/>
@@ -35542,7 +37893,7 @@
       </w:rPr>
     </w:lvl>
   </w:abstractNum>
-  <w:abstractNum w:abstractNumId="14" w15:restartNumberingAfterBreak="0">
+  <w:abstractNum w:abstractNumId="16" w15:restartNumberingAfterBreak="0">
     <w:nsid w:val="22030BFB"/>
     <w:multiLevelType w:val="multilevel"/>
     <w:tmpl w:val="8618E268"/>
@@ -35691,7 +38042,7 @@
       </w:rPr>
     </w:lvl>
   </w:abstractNum>
-  <w:abstractNum w:abstractNumId="15" w15:restartNumberingAfterBreak="0">
+  <w:abstractNum w:abstractNumId="17" w15:restartNumberingAfterBreak="0">
     <w:nsid w:val="23360370"/>
     <w:multiLevelType w:val="multilevel"/>
     <w:tmpl w:val="231C416C"/>
@@ -35840,7 +38191,7 @@
       </w:rPr>
     </w:lvl>
   </w:abstractNum>
-  <w:abstractNum w:abstractNumId="16" w15:restartNumberingAfterBreak="0">
+  <w:abstractNum w:abstractNumId="18" w15:restartNumberingAfterBreak="0">
     <w:nsid w:val="23B229BB"/>
     <w:multiLevelType w:val="multilevel"/>
     <w:tmpl w:val="70503542"/>
@@ -35989,7 +38340,156 @@
       </w:rPr>
     </w:lvl>
   </w:abstractNum>
-  <w:abstractNum w:abstractNumId="17" w15:restartNumberingAfterBreak="0">
+  <w:abstractNum w:abstractNumId="19" w15:restartNumberingAfterBreak="0">
+    <w:nsid w:val="24C95EBB"/>
+    <w:multiLevelType w:val="multilevel"/>
+    <w:tmpl w:val="00122618"/>
+    <w:lvl w:ilvl="0">
+      <w:start w:val="1"/>
+      <w:numFmt w:val="bullet"/>
+      <w:lvlText w:val=""/>
+      <w:lvlJc w:val="left"/>
+      <w:pPr>
+        <w:tabs>
+          <w:tab w:val="num" w:pos="720"/>
+        </w:tabs>
+        <w:ind w:left="720" w:hanging="360"/>
+      </w:pPr>
+      <w:rPr>
+        <w:rFonts w:ascii="Symbol" w:hAnsi="Symbol" w:hint="default"/>
+        <w:sz w:val="20"/>
+      </w:rPr>
+    </w:lvl>
+    <w:lvl w:ilvl="1" w:tentative="1">
+      <w:start w:val="1"/>
+      <w:numFmt w:val="bullet"/>
+      <w:lvlText w:val="o"/>
+      <w:lvlJc w:val="left"/>
+      <w:pPr>
+        <w:tabs>
+          <w:tab w:val="num" w:pos="1440"/>
+        </w:tabs>
+        <w:ind w:left="1440" w:hanging="360"/>
+      </w:pPr>
+      <w:rPr>
+        <w:rFonts w:ascii="Courier New" w:hAnsi="Courier New" w:hint="default"/>
+        <w:sz w:val="20"/>
+      </w:rPr>
+    </w:lvl>
+    <w:lvl w:ilvl="2" w:tentative="1">
+      <w:start w:val="1"/>
+      <w:numFmt w:val="bullet"/>
+      <w:lvlText w:val=""/>
+      <w:lvlJc w:val="left"/>
+      <w:pPr>
+        <w:tabs>
+          <w:tab w:val="num" w:pos="2160"/>
+        </w:tabs>
+        <w:ind w:left="2160" w:hanging="360"/>
+      </w:pPr>
+      <w:rPr>
+        <w:rFonts w:ascii="Wingdings" w:hAnsi="Wingdings" w:hint="default"/>
+        <w:sz w:val="20"/>
+      </w:rPr>
+    </w:lvl>
+    <w:lvl w:ilvl="3" w:tentative="1">
+      <w:start w:val="1"/>
+      <w:numFmt w:val="bullet"/>
+      <w:lvlText w:val=""/>
+      <w:lvlJc w:val="left"/>
+      <w:pPr>
+        <w:tabs>
+          <w:tab w:val="num" w:pos="2880"/>
+        </w:tabs>
+        <w:ind w:left="2880" w:hanging="360"/>
+      </w:pPr>
+      <w:rPr>
+        <w:rFonts w:ascii="Wingdings" w:hAnsi="Wingdings" w:hint="default"/>
+        <w:sz w:val="20"/>
+      </w:rPr>
+    </w:lvl>
+    <w:lvl w:ilvl="4" w:tentative="1">
+      <w:start w:val="1"/>
+      <w:numFmt w:val="bullet"/>
+      <w:lvlText w:val=""/>
+      <w:lvlJc w:val="left"/>
+      <w:pPr>
+        <w:tabs>
+          <w:tab w:val="num" w:pos="3600"/>
+        </w:tabs>
+        <w:ind w:left="3600" w:hanging="360"/>
+      </w:pPr>
+      <w:rPr>
+        <w:rFonts w:ascii="Wingdings" w:hAnsi="Wingdings" w:hint="default"/>
+        <w:sz w:val="20"/>
+      </w:rPr>
+    </w:lvl>
+    <w:lvl w:ilvl="5" w:tentative="1">
+      <w:start w:val="1"/>
+      <w:numFmt w:val="bullet"/>
+      <w:lvlText w:val=""/>
+      <w:lvlJc w:val="left"/>
+      <w:pPr>
+        <w:tabs>
+          <w:tab w:val="num" w:pos="4320"/>
+        </w:tabs>
+        <w:ind w:left="4320" w:hanging="360"/>
+      </w:pPr>
+      <w:rPr>
+        <w:rFonts w:ascii="Wingdings" w:hAnsi="Wingdings" w:hint="default"/>
+        <w:sz w:val="20"/>
+      </w:rPr>
+    </w:lvl>
+    <w:lvl w:ilvl="6" w:tentative="1">
+      <w:start w:val="1"/>
+      <w:numFmt w:val="bullet"/>
+      <w:lvlText w:val=""/>
+      <w:lvlJc w:val="left"/>
+      <w:pPr>
+        <w:tabs>
+          <w:tab w:val="num" w:pos="5040"/>
+        </w:tabs>
+        <w:ind w:left="5040" w:hanging="360"/>
+      </w:pPr>
+      <w:rPr>
+        <w:rFonts w:ascii="Wingdings" w:hAnsi="Wingdings" w:hint="default"/>
+        <w:sz w:val="20"/>
+      </w:rPr>
+    </w:lvl>
+    <w:lvl w:ilvl="7" w:tentative="1">
+      <w:start w:val="1"/>
+      <w:numFmt w:val="bullet"/>
+      <w:lvlText w:val=""/>
+      <w:lvlJc w:val="left"/>
+      <w:pPr>
+        <w:tabs>
+          <w:tab w:val="num" w:pos="5760"/>
+        </w:tabs>
+        <w:ind w:left="5760" w:hanging="360"/>
+      </w:pPr>
+      <w:rPr>
+        <w:rFonts w:ascii="Wingdings" w:hAnsi="Wingdings" w:hint="default"/>
+        <w:sz w:val="20"/>
+      </w:rPr>
+    </w:lvl>
+    <w:lvl w:ilvl="8" w:tentative="1">
+      <w:start w:val="1"/>
+      <w:numFmt w:val="bullet"/>
+      <w:lvlText w:val=""/>
+      <w:lvlJc w:val="left"/>
+      <w:pPr>
+        <w:tabs>
+          <w:tab w:val="num" w:pos="6480"/>
+        </w:tabs>
+        <w:ind w:left="6480" w:hanging="360"/>
+      </w:pPr>
+      <w:rPr>
+        <w:rFonts w:ascii="Wingdings" w:hAnsi="Wingdings" w:hint="default"/>
+        <w:sz w:val="20"/>
+      </w:rPr>
+    </w:lvl>
+  </w:abstractNum>
+  <w:abstractNum w:abstractNumId="20" w15:restartNumberingAfterBreak="0">
     <w:nsid w:val="258757DD"/>
     <w:multiLevelType w:val="multilevel"/>
     <w:tmpl w:val="1854D37C"/>
@@ -36138,7 +38638,7 @@
       </w:rPr>
     </w:lvl>
   </w:abstractNum>
-  <w:abstractNum w:abstractNumId="18" w15:restartNumberingAfterBreak="0">
+  <w:abstractNum w:abstractNumId="21" w15:restartNumberingAfterBreak="0">
     <w:nsid w:val="2B825CBE"/>
     <w:multiLevelType w:val="multilevel"/>
     <w:tmpl w:val="40660706"/>
@@ -36287,7 +38787,7 @@
       </w:rPr>
     </w:lvl>
   </w:abstractNum>
-  <w:abstractNum w:abstractNumId="19" w15:restartNumberingAfterBreak="0">
+  <w:abstractNum w:abstractNumId="22" w15:restartNumberingAfterBreak="0">
     <w:nsid w:val="2BD94C4E"/>
     <w:multiLevelType w:val="multilevel"/>
     <w:tmpl w:val="46823DF8"/>
@@ -36436,7 +38936,7 @@
       </w:rPr>
     </w:lvl>
   </w:abstractNum>
-  <w:abstractNum w:abstractNumId="20" w15:restartNumberingAfterBreak="0">
+  <w:abstractNum w:abstractNumId="23" w15:restartNumberingAfterBreak="0">
     <w:nsid w:val="2EE843F6"/>
     <w:multiLevelType w:val="multilevel"/>
     <w:tmpl w:val="01FC941E"/>
@@ -36585,7 +39085,7 @@
       </w:rPr>
     </w:lvl>
   </w:abstractNum>
-  <w:abstractNum w:abstractNumId="21" w15:restartNumberingAfterBreak="0">
+  <w:abstractNum w:abstractNumId="24" w15:restartNumberingAfterBreak="0">
     <w:nsid w:val="33631CED"/>
     <w:multiLevelType w:val="multilevel"/>
     <w:tmpl w:val="D040AA66"/>
@@ -36734,7 +39234,7 @@
       </w:rPr>
     </w:lvl>
   </w:abstractNum>
-  <w:abstractNum w:abstractNumId="22" w15:restartNumberingAfterBreak="0">
+  <w:abstractNum w:abstractNumId="25" w15:restartNumberingAfterBreak="0">
     <w:nsid w:val="33743408"/>
     <w:multiLevelType w:val="multilevel"/>
     <w:tmpl w:val="C5CCCDE8"/>
@@ -36883,7 +39383,7 @@
       </w:rPr>
     </w:lvl>
   </w:abstractNum>
-  <w:abstractNum w:abstractNumId="23" w15:restartNumberingAfterBreak="0">
+  <w:abstractNum w:abstractNumId="26" w15:restartNumberingAfterBreak="0">
     <w:nsid w:val="33F20A20"/>
     <w:multiLevelType w:val="multilevel"/>
     <w:tmpl w:val="3F8C3D00"/>
@@ -37032,7 +39532,7 @@
       </w:rPr>
     </w:lvl>
   </w:abstractNum>
-  <w:abstractNum w:abstractNumId="24" w15:restartNumberingAfterBreak="0">
+  <w:abstractNum w:abstractNumId="27" w15:restartNumberingAfterBreak="0">
     <w:nsid w:val="34D22142"/>
     <w:multiLevelType w:val="multilevel"/>
     <w:tmpl w:val="4A9CA6CC"/>
@@ -37181,7 +39681,7 @@
       </w:rPr>
     </w:lvl>
   </w:abstractNum>
-  <w:abstractNum w:abstractNumId="25" w15:restartNumberingAfterBreak="0">
+  <w:abstractNum w:abstractNumId="28" w15:restartNumberingAfterBreak="0">
     <w:nsid w:val="35EE2711"/>
     <w:multiLevelType w:val="multilevel"/>
     <w:tmpl w:val="EB56E0CE"/>
@@ -37298,7 +39798,7 @@
       </w:rPr>
     </w:lvl>
   </w:abstractNum>
-  <w:abstractNum w:abstractNumId="26" w15:restartNumberingAfterBreak="0">
+  <w:abstractNum w:abstractNumId="29" w15:restartNumberingAfterBreak="0">
     <w:nsid w:val="38CD42F6"/>
     <w:multiLevelType w:val="multilevel"/>
     <w:tmpl w:val="4614FFAE"/>
@@ -37447,7 +39947,7 @@
       </w:rPr>
     </w:lvl>
   </w:abstractNum>
-  <w:abstractNum w:abstractNumId="27" w15:restartNumberingAfterBreak="0">
+  <w:abstractNum w:abstractNumId="30" w15:restartNumberingAfterBreak="0">
     <w:nsid w:val="3A894987"/>
     <w:multiLevelType w:val="multilevel"/>
     <w:tmpl w:val="EE4EA72C"/>
@@ -37596,7 +40096,7 @@
       </w:rPr>
     </w:lvl>
   </w:abstractNum>
-  <w:abstractNum w:abstractNumId="28" w15:restartNumberingAfterBreak="0">
+  <w:abstractNum w:abstractNumId="31" w15:restartNumberingAfterBreak="0">
     <w:nsid w:val="3B3B7599"/>
     <w:multiLevelType w:val="multilevel"/>
     <w:tmpl w:val="90B050CA"/>
@@ -37745,7 +40245,7 @@
       </w:rPr>
     </w:lvl>
   </w:abstractNum>
-  <w:abstractNum w:abstractNumId="29" w15:restartNumberingAfterBreak="0">
+  <w:abstractNum w:abstractNumId="32" w15:restartNumberingAfterBreak="0">
     <w:nsid w:val="3B7B2E50"/>
     <w:multiLevelType w:val="multilevel"/>
     <w:tmpl w:val="CA2C82BE"/>
@@ -37894,7 +40394,7 @@
       </w:rPr>
     </w:lvl>
   </w:abstractNum>
-  <w:abstractNum w:abstractNumId="30" w15:restartNumberingAfterBreak="0">
+  <w:abstractNum w:abstractNumId="33" w15:restartNumberingAfterBreak="0">
     <w:nsid w:val="3BAC6DF9"/>
     <w:multiLevelType w:val="multilevel"/>
     <w:tmpl w:val="82E4F2CC"/>
@@ -38043,7 +40543,7 @@
       </w:rPr>
     </w:lvl>
   </w:abstractNum>
-  <w:abstractNum w:abstractNumId="31" w15:restartNumberingAfterBreak="0">
+  <w:abstractNum w:abstractNumId="34" w15:restartNumberingAfterBreak="0">
     <w:nsid w:val="3E590FB3"/>
     <w:multiLevelType w:val="hybridMultilevel"/>
     <w:tmpl w:val="041E66FE"/>
@@ -38156,7 +40656,7 @@
       </w:rPr>
     </w:lvl>
   </w:abstractNum>
-  <w:abstractNum w:abstractNumId="32" w15:restartNumberingAfterBreak="0">
+  <w:abstractNum w:abstractNumId="35" w15:restartNumberingAfterBreak="0">
     <w:nsid w:val="3E713741"/>
     <w:multiLevelType w:val="multilevel"/>
     <w:tmpl w:val="CC7E9D68"/>
@@ -38305,7 +40805,7 @@
       </w:rPr>
     </w:lvl>
   </w:abstractNum>
-  <w:abstractNum w:abstractNumId="33" w15:restartNumberingAfterBreak="0">
+  <w:abstractNum w:abstractNumId="36" w15:restartNumberingAfterBreak="0">
     <w:nsid w:val="402D4EDC"/>
     <w:multiLevelType w:val="multilevel"/>
     <w:tmpl w:val="062AB65A"/>
@@ -38454,7 +40954,305 @@
       </w:rPr>
     </w:lvl>
   </w:abstractNum>
-  <w:abstractNum w:abstractNumId="34" w15:restartNumberingAfterBreak="0">
+  <w:abstractNum w:abstractNumId="37" w15:restartNumberingAfterBreak="0">
+    <w:nsid w:val="425B5C88"/>
+    <w:multiLevelType w:val="multilevel"/>
+    <w:tmpl w:val="19AC31DE"/>
+    <w:lvl w:ilvl="0">
+      <w:start w:val="1"/>
+      <w:numFmt w:val="bullet"/>
+      <w:lvlText w:val=""/>
+      <w:lvlJc w:val="left"/>
+      <w:pPr>
+        <w:tabs>
+          <w:tab w:val="num" w:pos="720"/>
+        </w:tabs>
+        <w:ind w:left="720" w:hanging="360"/>
+      </w:pPr>
+      <w:rPr>
+        <w:rFonts w:ascii="Symbol" w:hAnsi="Symbol" w:hint="default"/>
+        <w:sz w:val="20"/>
+      </w:rPr>
+    </w:lvl>
+    <w:lvl w:ilvl="1" w:tentative="1">
+      <w:start w:val="1"/>
+      <w:numFmt w:val="bullet"/>
+      <w:lvlText w:val="o"/>
+      <w:lvlJc w:val="left"/>
+      <w:pPr>
+        <w:tabs>
+          <w:tab w:val="num" w:pos="1440"/>
+        </w:tabs>
+        <w:ind w:left="1440" w:hanging="360"/>
+      </w:pPr>
+      <w:rPr>
+        <w:rFonts w:ascii="Courier New" w:hAnsi="Courier New" w:hint="default"/>
+        <w:sz w:val="20"/>
+      </w:rPr>
+    </w:lvl>
+    <w:lvl w:ilvl="2" w:tentative="1">
+      <w:start w:val="1"/>
+      <w:numFmt w:val="bullet"/>
+      <w:lvlText w:val=""/>
+      <w:lvlJc w:val="left"/>
+      <w:pPr>
+        <w:tabs>
+          <w:tab w:val="num" w:pos="2160"/>
+        </w:tabs>
+        <w:ind w:left="2160" w:hanging="360"/>
+      </w:pPr>
+      <w:rPr>
+        <w:rFonts w:ascii="Wingdings" w:hAnsi="Wingdings" w:hint="default"/>
+        <w:sz w:val="20"/>
+      </w:rPr>
+    </w:lvl>
+    <w:lvl w:ilvl="3" w:tentative="1">
+      <w:start w:val="1"/>
+      <w:numFmt w:val="bullet"/>
+      <w:lvlText w:val=""/>
+      <w:lvlJc w:val="left"/>
+      <w:pPr>
+        <w:tabs>
+          <w:tab w:val="num" w:pos="2880"/>
+        </w:tabs>
+        <w:ind w:left="2880" w:hanging="360"/>
+      </w:pPr>
+      <w:rPr>
+        <w:rFonts w:ascii="Wingdings" w:hAnsi="Wingdings" w:hint="default"/>
+        <w:sz w:val="20"/>
+      </w:rPr>
+    </w:lvl>
+    <w:lvl w:ilvl="4" w:tentative="1">
+      <w:start w:val="1"/>
+      <w:numFmt w:val="bullet"/>
+      <w:lvlText w:val=""/>
+      <w:lvlJc w:val="left"/>
+      <w:pPr>
+        <w:tabs>
+          <w:tab w:val="num" w:pos="3600"/>
+        </w:tabs>
+        <w:ind w:left="3600" w:hanging="360"/>
+      </w:pPr>
+      <w:rPr>
+        <w:rFonts w:ascii="Wingdings" w:hAnsi="Wingdings" w:hint="default"/>
+        <w:sz w:val="20"/>
+      </w:rPr>
+    </w:lvl>
+    <w:lvl w:ilvl="5" w:tentative="1">
+      <w:start w:val="1"/>
+      <w:numFmt w:val="bullet"/>
+      <w:lvlText w:val=""/>
+      <w:lvlJc w:val="left"/>
+      <w:pPr>
+        <w:tabs>
+          <w:tab w:val="num" w:pos="4320"/>
+        </w:tabs>
+        <w:ind w:left="4320" w:hanging="360"/>
+      </w:pPr>
+      <w:rPr>
+        <w:rFonts w:ascii="Wingdings" w:hAnsi="Wingdings" w:hint="default"/>
+        <w:sz w:val="20"/>
+      </w:rPr>
+    </w:lvl>
+    <w:lvl w:ilvl="6" w:tentative="1">
+      <w:start w:val="1"/>
+      <w:numFmt w:val="bullet"/>
+      <w:lvlText w:val=""/>
+      <w:lvlJc w:val="left"/>
+      <w:pPr>
+        <w:tabs>
+          <w:tab w:val="num" w:pos="5040"/>
+        </w:tabs>
+        <w:ind w:left="5040" w:hanging="360"/>
+      </w:pPr>
+      <w:rPr>
+        <w:rFonts w:ascii="Wingdings" w:hAnsi="Wingdings" w:hint="default"/>
+        <w:sz w:val="20"/>
+      </w:rPr>
+    </w:lvl>
+    <w:lvl w:ilvl="7" w:tentative="1">
+      <w:start w:val="1"/>
+      <w:numFmt w:val="bullet"/>
+      <w:lvlText w:val=""/>
+      <w:lvlJc w:val="left"/>
+      <w:pPr>
+        <w:tabs>
+          <w:tab w:val="num" w:pos="5760"/>
+        </w:tabs>
+        <w:ind w:left="5760" w:hanging="360"/>
+      </w:pPr>
+      <w:rPr>
+        <w:rFonts w:ascii="Wingdings" w:hAnsi="Wingdings" w:hint="default"/>
+        <w:sz w:val="20"/>
+      </w:rPr>
+    </w:lvl>
+    <w:lvl w:ilvl="8" w:tentative="1">
+      <w:start w:val="1"/>
+      <w:numFmt w:val="bullet"/>
+      <w:lvlText w:val=""/>
+      <w:lvlJc w:val="left"/>
+      <w:pPr>
+        <w:tabs>
+          <w:tab w:val="num" w:pos="6480"/>
+        </w:tabs>
+        <w:ind w:left="6480" w:hanging="360"/>
+      </w:pPr>
+      <w:rPr>
+        <w:rFonts w:ascii="Wingdings" w:hAnsi="Wingdings" w:hint="default"/>
+        <w:sz w:val="20"/>
+      </w:rPr>
+    </w:lvl>
+  </w:abstractNum>
+  <w:abstractNum w:abstractNumId="38" w15:restartNumberingAfterBreak="0">
+    <w:nsid w:val="42992543"/>
+    <w:multiLevelType w:val="multilevel"/>
+    <w:tmpl w:val="4D82E7F0"/>
+    <w:lvl w:ilvl="0">
+      <w:start w:val="1"/>
+      <w:numFmt w:val="bullet"/>
+      <w:lvlText w:val=""/>
+      <w:lvlJc w:val="left"/>
+      <w:pPr>
+        <w:tabs>
+          <w:tab w:val="num" w:pos="720"/>
+        </w:tabs>
+        <w:ind w:left="720" w:hanging="360"/>
+      </w:pPr>
+      <w:rPr>
+        <w:rFonts w:ascii="Symbol" w:hAnsi="Symbol" w:hint="default"/>
+        <w:sz w:val="20"/>
+      </w:rPr>
+    </w:lvl>
+    <w:lvl w:ilvl="1" w:tentative="1">
+      <w:start w:val="1"/>
+      <w:numFmt w:val="bullet"/>
+      <w:lvlText w:val="o"/>
+      <w:lvlJc w:val="left"/>
+      <w:pPr>
+        <w:tabs>
+          <w:tab w:val="num" w:pos="1440"/>
+        </w:tabs>
+        <w:ind w:left="1440" w:hanging="360"/>
+      </w:pPr>
+      <w:rPr>
+        <w:rFonts w:ascii="Courier New" w:hAnsi="Courier New" w:hint="default"/>
+        <w:sz w:val="20"/>
+      </w:rPr>
+    </w:lvl>
+    <w:lvl w:ilvl="2" w:tentative="1">
+      <w:start w:val="1"/>
+      <w:numFmt w:val="bullet"/>
+      <w:lvlText w:val=""/>
+      <w:lvlJc w:val="left"/>
+      <w:pPr>
+        <w:tabs>
+          <w:tab w:val="num" w:pos="2160"/>
+        </w:tabs>
+        <w:ind w:left="2160" w:hanging="360"/>
+      </w:pPr>
+      <w:rPr>
+        <w:rFonts w:ascii="Wingdings" w:hAnsi="Wingdings" w:hint="default"/>
+        <w:sz w:val="20"/>
+      </w:rPr>
+    </w:lvl>
+    <w:lvl w:ilvl="3" w:tentative="1">
+      <w:start w:val="1"/>
+      <w:numFmt w:val="bullet"/>
+      <w:lvlText w:val=""/>
+      <w:lvlJc w:val="left"/>
+      <w:pPr>
+        <w:tabs>
+          <w:tab w:val="num" w:pos="2880"/>
+        </w:tabs>
+        <w:ind w:left="2880" w:hanging="360"/>
+      </w:pPr>
+      <w:rPr>
+        <w:rFonts w:ascii="Wingdings" w:hAnsi="Wingdings" w:hint="default"/>
+        <w:sz w:val="20"/>
+      </w:rPr>
+    </w:lvl>
+    <w:lvl w:ilvl="4" w:tentative="1">
+      <w:start w:val="1"/>
+      <w:numFmt w:val="bullet"/>
+      <w:lvlText w:val=""/>
+      <w:lvlJc w:val="left"/>
+      <w:pPr>
+        <w:tabs>
+          <w:tab w:val="num" w:pos="3600"/>
+        </w:tabs>
+        <w:ind w:left="3600" w:hanging="360"/>
+      </w:pPr>
+      <w:rPr>
+        <w:rFonts w:ascii="Wingdings" w:hAnsi="Wingdings" w:hint="default"/>
+        <w:sz w:val="20"/>
+      </w:rPr>
+    </w:lvl>
+    <w:lvl w:ilvl="5" w:tentative="1">
+      <w:start w:val="1"/>
+      <w:numFmt w:val="bullet"/>
+      <w:lvlText w:val=""/>
+      <w:lvlJc w:val="left"/>
+      <w:pPr>
+        <w:tabs>
+          <w:tab w:val="num" w:pos="4320"/>
+        </w:tabs>
+        <w:ind w:left="4320" w:hanging="360"/>
+      </w:pPr>
+      <w:rPr>
+        <w:rFonts w:ascii="Wingdings" w:hAnsi="Wingdings" w:hint="default"/>
+        <w:sz w:val="20"/>
+      </w:rPr>
+    </w:lvl>
+    <w:lvl w:ilvl="6" w:tentative="1">
+      <w:start w:val="1"/>
+      <w:numFmt w:val="bullet"/>
+      <w:lvlText w:val=""/>
+      <w:lvlJc w:val="left"/>
+      <w:pPr>
+        <w:tabs>
+          <w:tab w:val="num" w:pos="5040"/>
+        </w:tabs>
+        <w:ind w:left="5040" w:hanging="360"/>
+      </w:pPr>
+      <w:rPr>
+        <w:rFonts w:ascii="Wingdings" w:hAnsi="Wingdings" w:hint="default"/>
+        <w:sz w:val="20"/>
+      </w:rPr>
+    </w:lvl>
+    <w:lvl w:ilvl="7" w:tentative="1">
+      <w:start w:val="1"/>
+      <w:numFmt w:val="bullet"/>
+      <w:lvlText w:val=""/>
+      <w:lvlJc w:val="left"/>
+      <w:pPr>
+        <w:tabs>
+          <w:tab w:val="num" w:pos="5760"/>
+        </w:tabs>
+        <w:ind w:left="5760" w:hanging="360"/>
+      </w:pPr>
+      <w:rPr>
+        <w:rFonts w:ascii="Wingdings" w:hAnsi="Wingdings" w:hint="default"/>
+        <w:sz w:val="20"/>
+      </w:rPr>
+    </w:lvl>
+    <w:lvl w:ilvl="8" w:tentative="1">
+      <w:start w:val="1"/>
+      <w:numFmt w:val="bullet"/>
+      <w:lvlText w:val=""/>
+      <w:lvlJc w:val="left"/>
+      <w:pPr>
+        <w:tabs>
+          <w:tab w:val="num" w:pos="6480"/>
+        </w:tabs>
+        <w:ind w:left="6480" w:hanging="360"/>
+      </w:pPr>
+      <w:rPr>
+        <w:rFonts w:ascii="Wingdings" w:hAnsi="Wingdings" w:hint="default"/>
+        <w:sz w:val="20"/>
+      </w:rPr>
+    </w:lvl>
+  </w:abstractNum>
+  <w:abstractNum w:abstractNumId="39" w15:restartNumberingAfterBreak="0">
     <w:nsid w:val="44232E31"/>
     <w:multiLevelType w:val="multilevel"/>
     <w:tmpl w:val="B518DDAC"/>
@@ -38603,7 +41401,7 @@
       </w:rPr>
     </w:lvl>
   </w:abstractNum>
-  <w:abstractNum w:abstractNumId="35" w15:restartNumberingAfterBreak="0">
+  <w:abstractNum w:abstractNumId="40" w15:restartNumberingAfterBreak="0">
     <w:nsid w:val="452C5CFB"/>
     <w:multiLevelType w:val="multilevel"/>
     <w:tmpl w:val="96EC5FD8"/>
@@ -38752,7 +41550,7 @@
       </w:rPr>
     </w:lvl>
   </w:abstractNum>
-  <w:abstractNum w:abstractNumId="36" w15:restartNumberingAfterBreak="0">
+  <w:abstractNum w:abstractNumId="41" w15:restartNumberingAfterBreak="0">
     <w:nsid w:val="4A3F1A3A"/>
     <w:multiLevelType w:val="multilevel"/>
     <w:tmpl w:val="C5E44C40"/>
@@ -38901,7 +41699,7 @@
       </w:rPr>
     </w:lvl>
   </w:abstractNum>
-  <w:abstractNum w:abstractNumId="37" w15:restartNumberingAfterBreak="0">
+  <w:abstractNum w:abstractNumId="42" w15:restartNumberingAfterBreak="0">
     <w:nsid w:val="4B692F8C"/>
     <w:multiLevelType w:val="multilevel"/>
     <w:tmpl w:val="ACAE2D96"/>
@@ -39050,7 +41848,7 @@
       </w:rPr>
     </w:lvl>
   </w:abstractNum>
-  <w:abstractNum w:abstractNumId="38" w15:restartNumberingAfterBreak="0">
+  <w:abstractNum w:abstractNumId="43" w15:restartNumberingAfterBreak="0">
     <w:nsid w:val="4C005805"/>
     <w:multiLevelType w:val="multilevel"/>
     <w:tmpl w:val="05642E6E"/>
@@ -39199,7 +41997,156 @@
       </w:rPr>
     </w:lvl>
   </w:abstractNum>
-  <w:abstractNum w:abstractNumId="39" w15:restartNumberingAfterBreak="0">
+  <w:abstractNum w:abstractNumId="44" w15:restartNumberingAfterBreak="0">
+    <w:nsid w:val="4C6C02EE"/>
+    <w:multiLevelType w:val="multilevel"/>
+    <w:tmpl w:val="180AC04E"/>
+    <w:lvl w:ilvl="0">
+      <w:start w:val="1"/>
+      <w:numFmt w:val="bullet"/>
+      <w:lvlText w:val=""/>
+      <w:lvlJc w:val="left"/>
+      <w:pPr>
+        <w:tabs>
+          <w:tab w:val="num" w:pos="720"/>
+        </w:tabs>
+        <w:ind w:left="720" w:hanging="360"/>
+      </w:pPr>
+      <w:rPr>
+        <w:rFonts w:ascii="Symbol" w:hAnsi="Symbol" w:hint="default"/>
+        <w:sz w:val="20"/>
+      </w:rPr>
+    </w:lvl>
+    <w:lvl w:ilvl="1" w:tentative="1">
+      <w:start w:val="1"/>
+      <w:numFmt w:val="bullet"/>
+      <w:lvlText w:val="o"/>
+      <w:lvlJc w:val="left"/>
+      <w:pPr>
+        <w:tabs>
+          <w:tab w:val="num" w:pos="1440"/>
+        </w:tabs>
+        <w:ind w:left="1440" w:hanging="360"/>
+      </w:pPr>
+      <w:rPr>
+        <w:rFonts w:ascii="Courier New" w:hAnsi="Courier New" w:hint="default"/>
+        <w:sz w:val="20"/>
+      </w:rPr>
+    </w:lvl>
+    <w:lvl w:ilvl="2" w:tentative="1">
+      <w:start w:val="1"/>
+      <w:numFmt w:val="bullet"/>
+      <w:lvlText w:val=""/>
+      <w:lvlJc w:val="left"/>
+      <w:pPr>
+        <w:tabs>
+          <w:tab w:val="num" w:pos="2160"/>
+        </w:tabs>
+        <w:ind w:left="2160" w:hanging="360"/>
+      </w:pPr>
+      <w:rPr>
+        <w:rFonts w:ascii="Wingdings" w:hAnsi="Wingdings" w:hint="default"/>
+        <w:sz w:val="20"/>
+      </w:rPr>
+    </w:lvl>
+    <w:lvl w:ilvl="3" w:tentative="1">
+      <w:start w:val="1"/>
+      <w:numFmt w:val="bullet"/>
+      <w:lvlText w:val=""/>
+      <w:lvlJc w:val="left"/>
+      <w:pPr>
+        <w:tabs>
+          <w:tab w:val="num" w:pos="2880"/>
+        </w:tabs>
+        <w:ind w:left="2880" w:hanging="360"/>
+      </w:pPr>
+      <w:rPr>
+        <w:rFonts w:ascii="Wingdings" w:hAnsi="Wingdings" w:hint="default"/>
+        <w:sz w:val="20"/>
+      </w:rPr>
+    </w:lvl>
+    <w:lvl w:ilvl="4" w:tentative="1">
+      <w:start w:val="1"/>
+      <w:numFmt w:val="bullet"/>
+      <w:lvlText w:val=""/>
+      <w:lvlJc w:val="left"/>
+      <w:pPr>
+        <w:tabs>
+          <w:tab w:val="num" w:pos="3600"/>
+        </w:tabs>
+        <w:ind w:left="3600" w:hanging="360"/>
+      </w:pPr>
+      <w:rPr>
+        <w:rFonts w:ascii="Wingdings" w:hAnsi="Wingdings" w:hint="default"/>
+        <w:sz w:val="20"/>
+      </w:rPr>
+    </w:lvl>
+    <w:lvl w:ilvl="5" w:tentative="1">
+      <w:start w:val="1"/>
+      <w:numFmt w:val="bullet"/>
+      <w:lvlText w:val=""/>
+      <w:lvlJc w:val="left"/>
+      <w:pPr>
+        <w:tabs>
+          <w:tab w:val="num" w:pos="4320"/>
+        </w:tabs>
+        <w:ind w:left="4320" w:hanging="360"/>
+      </w:pPr>
+      <w:rPr>
+        <w:rFonts w:ascii="Wingdings" w:hAnsi="Wingdings" w:hint="default"/>
+        <w:sz w:val="20"/>
+      </w:rPr>
+    </w:lvl>
+    <w:lvl w:ilvl="6" w:tentative="1">
+      <w:start w:val="1"/>
+      <w:numFmt w:val="bullet"/>
+      <w:lvlText w:val=""/>
+      <w:lvlJc w:val="left"/>
+      <w:pPr>
+        <w:tabs>
+          <w:tab w:val="num" w:pos="5040"/>
+        </w:tabs>
+        <w:ind w:left="5040" w:hanging="360"/>
+      </w:pPr>
+      <w:rPr>
+        <w:rFonts w:ascii="Wingdings" w:hAnsi="Wingdings" w:hint="default"/>
+        <w:sz w:val="20"/>
+      </w:rPr>
+    </w:lvl>
+    <w:lvl w:ilvl="7" w:tentative="1">
+      <w:start w:val="1"/>
+      <w:numFmt w:val="bullet"/>
+      <w:lvlText w:val=""/>
+      <w:lvlJc w:val="left"/>
+      <w:pPr>
+        <w:tabs>
+          <w:tab w:val="num" w:pos="5760"/>
+        </w:tabs>
+        <w:ind w:left="5760" w:hanging="360"/>
+      </w:pPr>
+      <w:rPr>
+        <w:rFonts w:ascii="Wingdings" w:hAnsi="Wingdings" w:hint="default"/>
+        <w:sz w:val="20"/>
+      </w:rPr>
+    </w:lvl>
+    <w:lvl w:ilvl="8" w:tentative="1">
+      <w:start w:val="1"/>
+      <w:numFmt w:val="bullet"/>
+      <w:lvlText w:val=""/>
+      <w:lvlJc w:val="left"/>
+      <w:pPr>
+        <w:tabs>
+          <w:tab w:val="num" w:pos="6480"/>
+        </w:tabs>
+        <w:ind w:left="6480" w:hanging="360"/>
+      </w:pPr>
+      <w:rPr>
+        <w:rFonts w:ascii="Wingdings" w:hAnsi="Wingdings" w:hint="default"/>
+        <w:sz w:val="20"/>
+      </w:rPr>
+    </w:lvl>
+  </w:abstractNum>
+  <w:abstractNum w:abstractNumId="45" w15:restartNumberingAfterBreak="0">
     <w:nsid w:val="4F3C63E1"/>
     <w:multiLevelType w:val="multilevel"/>
     <w:tmpl w:val="F874081C"/>
@@ -39348,7 +42295,156 @@
       </w:rPr>
     </w:lvl>
   </w:abstractNum>
-  <w:abstractNum w:abstractNumId="40" w15:restartNumberingAfterBreak="0">
+  <w:abstractNum w:abstractNumId="46" w15:restartNumberingAfterBreak="0">
+    <w:nsid w:val="4F8F7149"/>
+    <w:multiLevelType w:val="multilevel"/>
+    <w:tmpl w:val="7D165C6C"/>
+    <w:lvl w:ilvl="0">
+      <w:start w:val="1"/>
+      <w:numFmt w:val="bullet"/>
+      <w:lvlText w:val=""/>
+      <w:lvlJc w:val="left"/>
+      <w:pPr>
+        <w:tabs>
+          <w:tab w:val="num" w:pos="720"/>
+        </w:tabs>
+        <w:ind w:left="720" w:hanging="360"/>
+      </w:pPr>
+      <w:rPr>
+        <w:rFonts w:ascii="Symbol" w:hAnsi="Symbol" w:hint="default"/>
+        <w:sz w:val="20"/>
+      </w:rPr>
+    </w:lvl>
+    <w:lvl w:ilvl="1" w:tentative="1">
+      <w:start w:val="1"/>
+      <w:numFmt w:val="bullet"/>
+      <w:lvlText w:val="o"/>
+      <w:lvlJc w:val="left"/>
+      <w:pPr>
+        <w:tabs>
+          <w:tab w:val="num" w:pos="1440"/>
+        </w:tabs>
+        <w:ind w:left="1440" w:hanging="360"/>
+      </w:pPr>
+      <w:rPr>
+        <w:rFonts w:ascii="Courier New" w:hAnsi="Courier New" w:hint="default"/>
+        <w:sz w:val="20"/>
+      </w:rPr>
+    </w:lvl>
+    <w:lvl w:ilvl="2" w:tentative="1">
+      <w:start w:val="1"/>
+      <w:numFmt w:val="bullet"/>
+      <w:lvlText w:val=""/>
+      <w:lvlJc w:val="left"/>
+      <w:pPr>
+        <w:tabs>
+          <w:tab w:val="num" w:pos="2160"/>
+        </w:tabs>
+        <w:ind w:left="2160" w:hanging="360"/>
+      </w:pPr>
+      <w:rPr>
+        <w:rFonts w:ascii="Wingdings" w:hAnsi="Wingdings" w:hint="default"/>
+        <w:sz w:val="20"/>
+      </w:rPr>
+    </w:lvl>
+    <w:lvl w:ilvl="3" w:tentative="1">
+      <w:start w:val="1"/>
+      <w:numFmt w:val="bullet"/>
+      <w:lvlText w:val=""/>
+      <w:lvlJc w:val="left"/>
+      <w:pPr>
+        <w:tabs>
+          <w:tab w:val="num" w:pos="2880"/>
+        </w:tabs>
+        <w:ind w:left="2880" w:hanging="360"/>
+      </w:pPr>
+      <w:rPr>
+        <w:rFonts w:ascii="Wingdings" w:hAnsi="Wingdings" w:hint="default"/>
+        <w:sz w:val="20"/>
+      </w:rPr>
+    </w:lvl>
+    <w:lvl w:ilvl="4" w:tentative="1">
+      <w:start w:val="1"/>
+      <w:numFmt w:val="bullet"/>
+      <w:lvlText w:val=""/>
+      <w:lvlJc w:val="left"/>
+      <w:pPr>
+        <w:tabs>
+          <w:tab w:val="num" w:pos="3600"/>
+        </w:tabs>
+        <w:ind w:left="3600" w:hanging="360"/>
+      </w:pPr>
+      <w:rPr>
+        <w:rFonts w:ascii="Wingdings" w:hAnsi="Wingdings" w:hint="default"/>
+        <w:sz w:val="20"/>
+      </w:rPr>
+    </w:lvl>
+    <w:lvl w:ilvl="5" w:tentative="1">
+      <w:start w:val="1"/>
+      <w:numFmt w:val="bullet"/>
+      <w:lvlText w:val=""/>
+      <w:lvlJc w:val="left"/>
+      <w:pPr>
+        <w:tabs>
+          <w:tab w:val="num" w:pos="4320"/>
+        </w:tabs>
+        <w:ind w:left="4320" w:hanging="360"/>
+      </w:pPr>
+      <w:rPr>
+        <w:rFonts w:ascii="Wingdings" w:hAnsi="Wingdings" w:hint="default"/>
+        <w:sz w:val="20"/>
+      </w:rPr>
+    </w:lvl>
+    <w:lvl w:ilvl="6" w:tentative="1">
+      <w:start w:val="1"/>
+      <w:numFmt w:val="bullet"/>
+      <w:lvlText w:val=""/>
+      <w:lvlJc w:val="left"/>
+      <w:pPr>
+        <w:tabs>
+          <w:tab w:val="num" w:pos="5040"/>
+        </w:tabs>
+        <w:ind w:left="5040" w:hanging="360"/>
+      </w:pPr>
+      <w:rPr>
+        <w:rFonts w:ascii="Wingdings" w:hAnsi="Wingdings" w:hint="default"/>
+        <w:sz w:val="20"/>
+      </w:rPr>
+    </w:lvl>
+    <w:lvl w:ilvl="7" w:tentative="1">
+      <w:start w:val="1"/>
+      <w:numFmt w:val="bullet"/>
+      <w:lvlText w:val=""/>
+      <w:lvlJc w:val="left"/>
+      <w:pPr>
+        <w:tabs>
+          <w:tab w:val="num" w:pos="5760"/>
+        </w:tabs>
+        <w:ind w:left="5760" w:hanging="360"/>
+      </w:pPr>
+      <w:rPr>
+        <w:rFonts w:ascii="Wingdings" w:hAnsi="Wingdings" w:hint="default"/>
+        <w:sz w:val="20"/>
+      </w:rPr>
+    </w:lvl>
+    <w:lvl w:ilvl="8" w:tentative="1">
+      <w:start w:val="1"/>
+      <w:numFmt w:val="bullet"/>
+      <w:lvlText w:val=""/>
+      <w:lvlJc w:val="left"/>
+      <w:pPr>
+        <w:tabs>
+          <w:tab w:val="num" w:pos="6480"/>
+        </w:tabs>
+        <w:ind w:left="6480" w:hanging="360"/>
+      </w:pPr>
+      <w:rPr>
+        <w:rFonts w:ascii="Wingdings" w:hAnsi="Wingdings" w:hint="default"/>
+        <w:sz w:val="20"/>
+      </w:rPr>
+    </w:lvl>
+  </w:abstractNum>
+  <w:abstractNum w:abstractNumId="47" w15:restartNumberingAfterBreak="0">
     <w:nsid w:val="55EC0BDA"/>
     <w:multiLevelType w:val="multilevel"/>
     <w:tmpl w:val="D0807778"/>
@@ -39497,7 +42593,156 @@
       </w:rPr>
     </w:lvl>
   </w:abstractNum>
-  <w:abstractNum w:abstractNumId="41" w15:restartNumberingAfterBreak="0">
+  <w:abstractNum w:abstractNumId="48" w15:restartNumberingAfterBreak="0">
+    <w:nsid w:val="571F04ED"/>
+    <w:multiLevelType w:val="multilevel"/>
+    <w:tmpl w:val="57DCED0E"/>
+    <w:lvl w:ilvl="0">
+      <w:start w:val="1"/>
+      <w:numFmt w:val="bullet"/>
+      <w:lvlText w:val=""/>
+      <w:lvlJc w:val="left"/>
+      <w:pPr>
+        <w:tabs>
+          <w:tab w:val="num" w:pos="720"/>
+        </w:tabs>
+        <w:ind w:left="720" w:hanging="360"/>
+      </w:pPr>
+      <w:rPr>
+        <w:rFonts w:ascii="Symbol" w:hAnsi="Symbol" w:hint="default"/>
+        <w:sz w:val="20"/>
+      </w:rPr>
+    </w:lvl>
+    <w:lvl w:ilvl="1" w:tentative="1">
+      <w:start w:val="1"/>
+      <w:numFmt w:val="bullet"/>
+      <w:lvlText w:val="o"/>
+      <w:lvlJc w:val="left"/>
+      <w:pPr>
+        <w:tabs>
+          <w:tab w:val="num" w:pos="1440"/>
+        </w:tabs>
+        <w:ind w:left="1440" w:hanging="360"/>
+      </w:pPr>
+      <w:rPr>
+        <w:rFonts w:ascii="Courier New" w:hAnsi="Courier New" w:hint="default"/>
+        <w:sz w:val="20"/>
+      </w:rPr>
+    </w:lvl>
+    <w:lvl w:ilvl="2" w:tentative="1">
+      <w:start w:val="1"/>
+      <w:numFmt w:val="bullet"/>
+      <w:lvlText w:val=""/>
+      <w:lvlJc w:val="left"/>
+      <w:pPr>
+        <w:tabs>
+          <w:tab w:val="num" w:pos="2160"/>
+        </w:tabs>
+        <w:ind w:left="2160" w:hanging="360"/>
+      </w:pPr>
+      <w:rPr>
+        <w:rFonts w:ascii="Wingdings" w:hAnsi="Wingdings" w:hint="default"/>
+        <w:sz w:val="20"/>
+      </w:rPr>
+    </w:lvl>
+    <w:lvl w:ilvl="3" w:tentative="1">
+      <w:start w:val="1"/>
+      <w:numFmt w:val="bullet"/>
+      <w:lvlText w:val=""/>
+      <w:lvlJc w:val="left"/>
+      <w:pPr>
+        <w:tabs>
+          <w:tab w:val="num" w:pos="2880"/>
+        </w:tabs>
+        <w:ind w:left="2880" w:hanging="360"/>
+      </w:pPr>
+      <w:rPr>
+        <w:rFonts w:ascii="Wingdings" w:hAnsi="Wingdings" w:hint="default"/>
+        <w:sz w:val="20"/>
+      </w:rPr>
+    </w:lvl>
+    <w:lvl w:ilvl="4" w:tentative="1">
+      <w:start w:val="1"/>
+      <w:numFmt w:val="bullet"/>
+      <w:lvlText w:val=""/>
+      <w:lvlJc w:val="left"/>
+      <w:pPr>
+        <w:tabs>
+          <w:tab w:val="num" w:pos="3600"/>
+        </w:tabs>
+        <w:ind w:left="3600" w:hanging="360"/>
+      </w:pPr>
+      <w:rPr>
+        <w:rFonts w:ascii="Wingdings" w:hAnsi="Wingdings" w:hint="default"/>
+        <w:sz w:val="20"/>
+      </w:rPr>
+    </w:lvl>
+    <w:lvl w:ilvl="5" w:tentative="1">
+      <w:start w:val="1"/>
+      <w:numFmt w:val="bullet"/>
+      <w:lvlText w:val=""/>
+      <w:lvlJc w:val="left"/>
+      <w:pPr>
+        <w:tabs>
+          <w:tab w:val="num" w:pos="4320"/>
+        </w:tabs>
+        <w:ind w:left="4320" w:hanging="360"/>
+      </w:pPr>
+      <w:rPr>
+        <w:rFonts w:ascii="Wingdings" w:hAnsi="Wingdings" w:hint="default"/>
+        <w:sz w:val="20"/>
+      </w:rPr>
+    </w:lvl>
+    <w:lvl w:ilvl="6" w:tentative="1">
+      <w:start w:val="1"/>
+      <w:numFmt w:val="bullet"/>
+      <w:lvlText w:val=""/>
+      <w:lvlJc w:val="left"/>
+      <w:pPr>
+        <w:tabs>
+          <w:tab w:val="num" w:pos="5040"/>
+        </w:tabs>
+        <w:ind w:left="5040" w:hanging="360"/>
+      </w:pPr>
+      <w:rPr>
+        <w:rFonts w:ascii="Wingdings" w:hAnsi="Wingdings" w:hint="default"/>
+        <w:sz w:val="20"/>
+      </w:rPr>
+    </w:lvl>
+    <w:lvl w:ilvl="7" w:tentative="1">
+      <w:start w:val="1"/>
+      <w:numFmt w:val="bullet"/>
+      <w:lvlText w:val=""/>
+      <w:lvlJc w:val="left"/>
+      <w:pPr>
+        <w:tabs>
+          <w:tab w:val="num" w:pos="5760"/>
+        </w:tabs>
+        <w:ind w:left="5760" w:hanging="360"/>
+      </w:pPr>
+      <w:rPr>
+        <w:rFonts w:ascii="Wingdings" w:hAnsi="Wingdings" w:hint="default"/>
+        <w:sz w:val="20"/>
+      </w:rPr>
+    </w:lvl>
+    <w:lvl w:ilvl="8" w:tentative="1">
+      <w:start w:val="1"/>
+      <w:numFmt w:val="bullet"/>
+      <w:lvlText w:val=""/>
+      <w:lvlJc w:val="left"/>
+      <w:pPr>
+        <w:tabs>
+          <w:tab w:val="num" w:pos="6480"/>
+        </w:tabs>
+        <w:ind w:left="6480" w:hanging="360"/>
+      </w:pPr>
+      <w:rPr>
+        <w:rFonts w:ascii="Wingdings" w:hAnsi="Wingdings" w:hint="default"/>
+        <w:sz w:val="20"/>
+      </w:rPr>
+    </w:lvl>
+  </w:abstractNum>
+  <w:abstractNum w:abstractNumId="49" w15:restartNumberingAfterBreak="0">
     <w:nsid w:val="5B9C2731"/>
     <w:multiLevelType w:val="multilevel"/>
     <w:tmpl w:val="882686B2"/>
@@ -39646,7 +42891,7 @@
       </w:rPr>
     </w:lvl>
   </w:abstractNum>
-  <w:abstractNum w:abstractNumId="42" w15:restartNumberingAfterBreak="0">
+  <w:abstractNum w:abstractNumId="50" w15:restartNumberingAfterBreak="0">
     <w:nsid w:val="5BA87A9F"/>
     <w:multiLevelType w:val="multilevel"/>
     <w:tmpl w:val="F2460E90"/>
@@ -39795,7 +43040,7 @@
       </w:rPr>
     </w:lvl>
   </w:abstractNum>
-  <w:abstractNum w:abstractNumId="43" w15:restartNumberingAfterBreak="0">
+  <w:abstractNum w:abstractNumId="51" w15:restartNumberingAfterBreak="0">
     <w:nsid w:val="610B1F1B"/>
     <w:multiLevelType w:val="hybridMultilevel"/>
     <w:tmpl w:val="FE42F452"/>
@@ -39908,7 +43153,7 @@
       </w:rPr>
     </w:lvl>
   </w:abstractNum>
-  <w:abstractNum w:abstractNumId="44" w15:restartNumberingAfterBreak="0">
+  <w:abstractNum w:abstractNumId="52" w15:restartNumberingAfterBreak="0">
     <w:nsid w:val="61AD6CC4"/>
     <w:multiLevelType w:val="multilevel"/>
     <w:tmpl w:val="D23E12D2"/>
@@ -40057,7 +43302,7 @@
       </w:rPr>
     </w:lvl>
   </w:abstractNum>
-  <w:abstractNum w:abstractNumId="45" w15:restartNumberingAfterBreak="0">
+  <w:abstractNum w:abstractNumId="53" w15:restartNumberingAfterBreak="0">
     <w:nsid w:val="69273B07"/>
     <w:multiLevelType w:val="multilevel"/>
     <w:tmpl w:val="53509674"/>
@@ -40206,7 +43451,7 @@
       </w:rPr>
     </w:lvl>
   </w:abstractNum>
-  <w:abstractNum w:abstractNumId="46" w15:restartNumberingAfterBreak="0">
+  <w:abstractNum w:abstractNumId="54" w15:restartNumberingAfterBreak="0">
     <w:nsid w:val="6980231C"/>
     <w:multiLevelType w:val="multilevel"/>
     <w:tmpl w:val="59381804"/>
@@ -40355,7 +43600,7 @@
       </w:rPr>
     </w:lvl>
   </w:abstractNum>
-  <w:abstractNum w:abstractNumId="47" w15:restartNumberingAfterBreak="0">
+  <w:abstractNum w:abstractNumId="55" w15:restartNumberingAfterBreak="0">
     <w:nsid w:val="69CD3D24"/>
     <w:multiLevelType w:val="multilevel"/>
     <w:tmpl w:val="873455E0"/>
@@ -40504,7 +43749,7 @@
       </w:rPr>
     </w:lvl>
   </w:abstractNum>
-  <w:abstractNum w:abstractNumId="48" w15:restartNumberingAfterBreak="0">
+  <w:abstractNum w:abstractNumId="56" w15:restartNumberingAfterBreak="0">
     <w:nsid w:val="6A76704A"/>
     <w:multiLevelType w:val="multilevel"/>
     <w:tmpl w:val="443E8000"/>
@@ -40653,7 +43898,156 @@
       </w:rPr>
     </w:lvl>
   </w:abstractNum>
-  <w:abstractNum w:abstractNumId="49" w15:restartNumberingAfterBreak="0">
+  <w:abstractNum w:abstractNumId="57" w15:restartNumberingAfterBreak="0">
+    <w:nsid w:val="6E5741CB"/>
+    <w:multiLevelType w:val="multilevel"/>
+    <w:tmpl w:val="98FC9DCC"/>
+    <w:lvl w:ilvl="0">
+      <w:start w:val="1"/>
+      <w:numFmt w:val="bullet"/>
+      <w:lvlText w:val=""/>
+      <w:lvlJc w:val="left"/>
+      <w:pPr>
+        <w:tabs>
+          <w:tab w:val="num" w:pos="720"/>
+        </w:tabs>
+        <w:ind w:left="720" w:hanging="360"/>
+      </w:pPr>
+      <w:rPr>
+        <w:rFonts w:ascii="Symbol" w:hAnsi="Symbol" w:hint="default"/>
+        <w:sz w:val="20"/>
+      </w:rPr>
+    </w:lvl>
+    <w:lvl w:ilvl="1" w:tentative="1">
+      <w:start w:val="1"/>
+      <w:numFmt w:val="bullet"/>
+      <w:lvlText w:val="o"/>
+      <w:lvlJc w:val="left"/>
+      <w:pPr>
+        <w:tabs>
+          <w:tab w:val="num" w:pos="1440"/>
+        </w:tabs>
+        <w:ind w:left="1440" w:hanging="360"/>
+      </w:pPr>
+      <w:rPr>
+        <w:rFonts w:ascii="Courier New" w:hAnsi="Courier New" w:hint="default"/>
+        <w:sz w:val="20"/>
+      </w:rPr>
+    </w:lvl>
+    <w:lvl w:ilvl="2" w:tentative="1">
+      <w:start w:val="1"/>
+      <w:numFmt w:val="bullet"/>
+      <w:lvlText w:val=""/>
+      <w:lvlJc w:val="left"/>
+      <w:pPr>
+        <w:tabs>
+          <w:tab w:val="num" w:pos="2160"/>
+        </w:tabs>
+        <w:ind w:left="2160" w:hanging="360"/>
+      </w:pPr>
+      <w:rPr>
+        <w:rFonts w:ascii="Wingdings" w:hAnsi="Wingdings" w:hint="default"/>
+        <w:sz w:val="20"/>
+      </w:rPr>
+    </w:lvl>
+    <w:lvl w:ilvl="3" w:tentative="1">
+      <w:start w:val="1"/>
+      <w:numFmt w:val="bullet"/>
+      <w:lvlText w:val=""/>
+      <w:lvlJc w:val="left"/>
+      <w:pPr>
+        <w:tabs>
+          <w:tab w:val="num" w:pos="2880"/>
+        </w:tabs>
+        <w:ind w:left="2880" w:hanging="360"/>
+      </w:pPr>
+      <w:rPr>
+        <w:rFonts w:ascii="Wingdings" w:hAnsi="Wingdings" w:hint="default"/>
+        <w:sz w:val="20"/>
+      </w:rPr>
+    </w:lvl>
+    <w:lvl w:ilvl="4" w:tentative="1">
+      <w:start w:val="1"/>
+      <w:numFmt w:val="bullet"/>
+      <w:lvlText w:val=""/>
+      <w:lvlJc w:val="left"/>
+      <w:pPr>
+        <w:tabs>
+          <w:tab w:val="num" w:pos="3600"/>
+        </w:tabs>
+        <w:ind w:left="3600" w:hanging="360"/>
+      </w:pPr>
+      <w:rPr>
+        <w:rFonts w:ascii="Wingdings" w:hAnsi="Wingdings" w:hint="default"/>
+        <w:sz w:val="20"/>
+      </w:rPr>
+    </w:lvl>
+    <w:lvl w:ilvl="5" w:tentative="1">
+      <w:start w:val="1"/>
+      <w:numFmt w:val="bullet"/>
+      <w:lvlText w:val=""/>
+      <w:lvlJc w:val="left"/>
+      <w:pPr>
+        <w:tabs>
+          <w:tab w:val="num" w:pos="4320"/>
+        </w:tabs>
+        <w:ind w:left="4320" w:hanging="360"/>
+      </w:pPr>
+      <w:rPr>
+        <w:rFonts w:ascii="Wingdings" w:hAnsi="Wingdings" w:hint="default"/>
+        <w:sz w:val="20"/>
+      </w:rPr>
+    </w:lvl>
+    <w:lvl w:ilvl="6" w:tentative="1">
+      <w:start w:val="1"/>
+      <w:numFmt w:val="bullet"/>
+      <w:lvlText w:val=""/>
+      <w:lvlJc w:val="left"/>
+      <w:pPr>
+        <w:tabs>
+          <w:tab w:val="num" w:pos="5040"/>
+        </w:tabs>
+        <w:ind w:left="5040" w:hanging="360"/>
+      </w:pPr>
+      <w:rPr>
+        <w:rFonts w:ascii="Wingdings" w:hAnsi="Wingdings" w:hint="default"/>
+        <w:sz w:val="20"/>
+      </w:rPr>
+    </w:lvl>
+    <w:lvl w:ilvl="7" w:tentative="1">
+      <w:start w:val="1"/>
+      <w:numFmt w:val="bullet"/>
+      <w:lvlText w:val=""/>
+      <w:lvlJc w:val="left"/>
+      <w:pPr>
+        <w:tabs>
+          <w:tab w:val="num" w:pos="5760"/>
+        </w:tabs>
+        <w:ind w:left="5760" w:hanging="360"/>
+      </w:pPr>
+      <w:rPr>
+        <w:rFonts w:ascii="Wingdings" w:hAnsi="Wingdings" w:hint="default"/>
+        <w:sz w:val="20"/>
+      </w:rPr>
+    </w:lvl>
+    <w:lvl w:ilvl="8" w:tentative="1">
+      <w:start w:val="1"/>
+      <w:numFmt w:val="bullet"/>
+      <w:lvlText w:val=""/>
+      <w:lvlJc w:val="left"/>
+      <w:pPr>
+        <w:tabs>
+          <w:tab w:val="num" w:pos="6480"/>
+        </w:tabs>
+        <w:ind w:left="6480" w:hanging="360"/>
+      </w:pPr>
+      <w:rPr>
+        <w:rFonts w:ascii="Wingdings" w:hAnsi="Wingdings" w:hint="default"/>
+        <w:sz w:val="20"/>
+      </w:rPr>
+    </w:lvl>
+  </w:abstractNum>
+  <w:abstractNum w:abstractNumId="58" w15:restartNumberingAfterBreak="0">
     <w:nsid w:val="6EFB5F52"/>
     <w:multiLevelType w:val="multilevel"/>
     <w:tmpl w:val="322ADE6E"/>
@@ -40802,7 +44196,7 @@
       </w:rPr>
     </w:lvl>
   </w:abstractNum>
-  <w:abstractNum w:abstractNumId="50" w15:restartNumberingAfterBreak="0">
+  <w:abstractNum w:abstractNumId="59" w15:restartNumberingAfterBreak="0">
     <w:nsid w:val="70BE6E5F"/>
     <w:multiLevelType w:val="multilevel"/>
     <w:tmpl w:val="F752D162"/>
@@ -40951,7 +44345,7 @@
       </w:rPr>
     </w:lvl>
   </w:abstractNum>
-  <w:abstractNum w:abstractNumId="51" w15:restartNumberingAfterBreak="0">
+  <w:abstractNum w:abstractNumId="60" w15:restartNumberingAfterBreak="0">
     <w:nsid w:val="71272841"/>
     <w:multiLevelType w:val="multilevel"/>
     <w:tmpl w:val="2626E566"/>
@@ -41100,7 +44494,305 @@
       </w:rPr>
     </w:lvl>
   </w:abstractNum>
-  <w:abstractNum w:abstractNumId="52" w15:restartNumberingAfterBreak="0">
+  <w:abstractNum w:abstractNumId="61" w15:restartNumberingAfterBreak="0">
+    <w:nsid w:val="744C66A5"/>
+    <w:multiLevelType w:val="multilevel"/>
+    <w:tmpl w:val="463608E8"/>
+    <w:lvl w:ilvl="0">
+      <w:start w:val="1"/>
+      <w:numFmt w:val="bullet"/>
+      <w:lvlText w:val=""/>
+      <w:lvlJc w:val="left"/>
+      <w:pPr>
+        <w:tabs>
+          <w:tab w:val="num" w:pos="720"/>
+        </w:tabs>
+        <w:ind w:left="720" w:hanging="360"/>
+      </w:pPr>
+      <w:rPr>
+        <w:rFonts w:ascii="Symbol" w:hAnsi="Symbol" w:hint="default"/>
+        <w:sz w:val="20"/>
+      </w:rPr>
+    </w:lvl>
+    <w:lvl w:ilvl="1" w:tentative="1">
+      <w:start w:val="1"/>
+      <w:numFmt w:val="bullet"/>
+      <w:lvlText w:val="o"/>
+      <w:lvlJc w:val="left"/>
+      <w:pPr>
+        <w:tabs>
+          <w:tab w:val="num" w:pos="1440"/>
+        </w:tabs>
+        <w:ind w:left="1440" w:hanging="360"/>
+      </w:pPr>
+      <w:rPr>
+        <w:rFonts w:ascii="Courier New" w:hAnsi="Courier New" w:hint="default"/>
+        <w:sz w:val="20"/>
+      </w:rPr>
+    </w:lvl>
+    <w:lvl w:ilvl="2" w:tentative="1">
+      <w:start w:val="1"/>
+      <w:numFmt w:val="bullet"/>
+      <w:lvlText w:val=""/>
+      <w:lvlJc w:val="left"/>
+      <w:pPr>
+        <w:tabs>
+          <w:tab w:val="num" w:pos="2160"/>
+        </w:tabs>
+        <w:ind w:left="2160" w:hanging="360"/>
+      </w:pPr>
+      <w:rPr>
+        <w:rFonts w:ascii="Wingdings" w:hAnsi="Wingdings" w:hint="default"/>
+        <w:sz w:val="20"/>
+      </w:rPr>
+    </w:lvl>
+    <w:lvl w:ilvl="3" w:tentative="1">
+      <w:start w:val="1"/>
+      <w:numFmt w:val="bullet"/>
+      <w:lvlText w:val=""/>
+      <w:lvlJc w:val="left"/>
+      <w:pPr>
+        <w:tabs>
+          <w:tab w:val="num" w:pos="2880"/>
+        </w:tabs>
+        <w:ind w:left="2880" w:hanging="360"/>
+      </w:pPr>
+      <w:rPr>
+        <w:rFonts w:ascii="Wingdings" w:hAnsi="Wingdings" w:hint="default"/>
+        <w:sz w:val="20"/>
+      </w:rPr>
+    </w:lvl>
+    <w:lvl w:ilvl="4" w:tentative="1">
+      <w:start w:val="1"/>
+      <w:numFmt w:val="bullet"/>
+      <w:lvlText w:val=""/>
+      <w:lvlJc w:val="left"/>
+      <w:pPr>
+        <w:tabs>
+          <w:tab w:val="num" w:pos="3600"/>
+        </w:tabs>
+        <w:ind w:left="3600" w:hanging="360"/>
+      </w:pPr>
+      <w:rPr>
+        <w:rFonts w:ascii="Wingdings" w:hAnsi="Wingdings" w:hint="default"/>
+        <w:sz w:val="20"/>
+      </w:rPr>
+    </w:lvl>
+    <w:lvl w:ilvl="5" w:tentative="1">
+      <w:start w:val="1"/>
+      <w:numFmt w:val="bullet"/>
+      <w:lvlText w:val=""/>
+      <w:lvlJc w:val="left"/>
+      <w:pPr>
+        <w:tabs>
+          <w:tab w:val="num" w:pos="4320"/>
+        </w:tabs>
+        <w:ind w:left="4320" w:hanging="360"/>
+      </w:pPr>
+      <w:rPr>
+        <w:rFonts w:ascii="Wingdings" w:hAnsi="Wingdings" w:hint="default"/>
+        <w:sz w:val="20"/>
+      </w:rPr>
+    </w:lvl>
+    <w:lvl w:ilvl="6" w:tentative="1">
+      <w:start w:val="1"/>
+      <w:numFmt w:val="bullet"/>
+      <w:lvlText w:val=""/>
+      <w:lvlJc w:val="left"/>
+      <w:pPr>
+        <w:tabs>
+          <w:tab w:val="num" w:pos="5040"/>
+        </w:tabs>
+        <w:ind w:left="5040" w:hanging="360"/>
+      </w:pPr>
+      <w:rPr>
+        <w:rFonts w:ascii="Wingdings" w:hAnsi="Wingdings" w:hint="default"/>
+        <w:sz w:val="20"/>
+      </w:rPr>
+    </w:lvl>
+    <w:lvl w:ilvl="7" w:tentative="1">
+      <w:start w:val="1"/>
+      <w:numFmt w:val="bullet"/>
+      <w:lvlText w:val=""/>
+      <w:lvlJc w:val="left"/>
+      <w:pPr>
+        <w:tabs>
+          <w:tab w:val="num" w:pos="5760"/>
+        </w:tabs>
+        <w:ind w:left="5760" w:hanging="360"/>
+      </w:pPr>
+      <w:rPr>
+        <w:rFonts w:ascii="Wingdings" w:hAnsi="Wingdings" w:hint="default"/>
+        <w:sz w:val="20"/>
+      </w:rPr>
+    </w:lvl>
+    <w:lvl w:ilvl="8" w:tentative="1">
+      <w:start w:val="1"/>
+      <w:numFmt w:val="bullet"/>
+      <w:lvlText w:val=""/>
+      <w:lvlJc w:val="left"/>
+      <w:pPr>
+        <w:tabs>
+          <w:tab w:val="num" w:pos="6480"/>
+        </w:tabs>
+        <w:ind w:left="6480" w:hanging="360"/>
+      </w:pPr>
+      <w:rPr>
+        <w:rFonts w:ascii="Wingdings" w:hAnsi="Wingdings" w:hint="default"/>
+        <w:sz w:val="20"/>
+      </w:rPr>
+    </w:lvl>
+  </w:abstractNum>
+  <w:abstractNum w:abstractNumId="62" w15:restartNumberingAfterBreak="0">
+    <w:nsid w:val="75BD171E"/>
+    <w:multiLevelType w:val="multilevel"/>
+    <w:tmpl w:val="082E3B4E"/>
+    <w:lvl w:ilvl="0">
+      <w:start w:val="1"/>
+      <w:numFmt w:val="bullet"/>
+      <w:lvlText w:val=""/>
+      <w:lvlJc w:val="left"/>
+      <w:pPr>
+        <w:tabs>
+          <w:tab w:val="num" w:pos="720"/>
+        </w:tabs>
+        <w:ind w:left="720" w:hanging="360"/>
+      </w:pPr>
+      <w:rPr>
+        <w:rFonts w:ascii="Symbol" w:hAnsi="Symbol" w:hint="default"/>
+        <w:sz w:val="20"/>
+      </w:rPr>
+    </w:lvl>
+    <w:lvl w:ilvl="1" w:tentative="1">
+      <w:start w:val="1"/>
+      <w:numFmt w:val="bullet"/>
+      <w:lvlText w:val="o"/>
+      <w:lvlJc w:val="left"/>
+      <w:pPr>
+        <w:tabs>
+          <w:tab w:val="num" w:pos="1440"/>
+        </w:tabs>
+        <w:ind w:left="1440" w:hanging="360"/>
+      </w:pPr>
+      <w:rPr>
+        <w:rFonts w:ascii="Courier New" w:hAnsi="Courier New" w:hint="default"/>
+        <w:sz w:val="20"/>
+      </w:rPr>
+    </w:lvl>
+    <w:lvl w:ilvl="2" w:tentative="1">
+      <w:start w:val="1"/>
+      <w:numFmt w:val="bullet"/>
+      <w:lvlText w:val=""/>
+      <w:lvlJc w:val="left"/>
+      <w:pPr>
+        <w:tabs>
+          <w:tab w:val="num" w:pos="2160"/>
+        </w:tabs>
+        <w:ind w:left="2160" w:hanging="360"/>
+      </w:pPr>
+      <w:rPr>
+        <w:rFonts w:ascii="Wingdings" w:hAnsi="Wingdings" w:hint="default"/>
+        <w:sz w:val="20"/>
+      </w:rPr>
+    </w:lvl>
+    <w:lvl w:ilvl="3" w:tentative="1">
+      <w:start w:val="1"/>
+      <w:numFmt w:val="bullet"/>
+      <w:lvlText w:val=""/>
+      <w:lvlJc w:val="left"/>
+      <w:pPr>
+        <w:tabs>
+          <w:tab w:val="num" w:pos="2880"/>
+        </w:tabs>
+        <w:ind w:left="2880" w:hanging="360"/>
+      </w:pPr>
+      <w:rPr>
+        <w:rFonts w:ascii="Wingdings" w:hAnsi="Wingdings" w:hint="default"/>
+        <w:sz w:val="20"/>
+      </w:rPr>
+    </w:lvl>
+    <w:lvl w:ilvl="4" w:tentative="1">
+      <w:start w:val="1"/>
+      <w:numFmt w:val="bullet"/>
+      <w:lvlText w:val=""/>
+      <w:lvlJc w:val="left"/>
+      <w:pPr>
+        <w:tabs>
+          <w:tab w:val="num" w:pos="3600"/>
+        </w:tabs>
+        <w:ind w:left="3600" w:hanging="360"/>
+      </w:pPr>
+      <w:rPr>
+        <w:rFonts w:ascii="Wingdings" w:hAnsi="Wingdings" w:hint="default"/>
+        <w:sz w:val="20"/>
+      </w:rPr>
+    </w:lvl>
+    <w:lvl w:ilvl="5" w:tentative="1">
+      <w:start w:val="1"/>
+      <w:numFmt w:val="bullet"/>
+      <w:lvlText w:val=""/>
+      <w:lvlJc w:val="left"/>
+      <w:pPr>
+        <w:tabs>
+          <w:tab w:val="num" w:pos="4320"/>
+        </w:tabs>
+        <w:ind w:left="4320" w:hanging="360"/>
+      </w:pPr>
+      <w:rPr>
+        <w:rFonts w:ascii="Wingdings" w:hAnsi="Wingdings" w:hint="default"/>
+        <w:sz w:val="20"/>
+      </w:rPr>
+    </w:lvl>
+    <w:lvl w:ilvl="6" w:tentative="1">
+      <w:start w:val="1"/>
+      <w:numFmt w:val="bullet"/>
+      <w:lvlText w:val=""/>
+      <w:lvlJc w:val="left"/>
+      <w:pPr>
+        <w:tabs>
+          <w:tab w:val="num" w:pos="5040"/>
+        </w:tabs>
+        <w:ind w:left="5040" w:hanging="360"/>
+      </w:pPr>
+      <w:rPr>
+        <w:rFonts w:ascii="Wingdings" w:hAnsi="Wingdings" w:hint="default"/>
+        <w:sz w:val="20"/>
+      </w:rPr>
+    </w:lvl>
+    <w:lvl w:ilvl="7" w:tentative="1">
+      <w:start w:val="1"/>
+      <w:numFmt w:val="bullet"/>
+      <w:lvlText w:val=""/>
+      <w:lvlJc w:val="left"/>
+      <w:pPr>
+        <w:tabs>
+          <w:tab w:val="num" w:pos="5760"/>
+        </w:tabs>
+        <w:ind w:left="5760" w:hanging="360"/>
+      </w:pPr>
+      <w:rPr>
+        <w:rFonts w:ascii="Wingdings" w:hAnsi="Wingdings" w:hint="default"/>
+        <w:sz w:val="20"/>
+      </w:rPr>
+    </w:lvl>
+    <w:lvl w:ilvl="8" w:tentative="1">
+      <w:start w:val="1"/>
+      <w:numFmt w:val="bullet"/>
+      <w:lvlText w:val=""/>
+      <w:lvlJc w:val="left"/>
+      <w:pPr>
+        <w:tabs>
+          <w:tab w:val="num" w:pos="6480"/>
+        </w:tabs>
+        <w:ind w:left="6480" w:hanging="360"/>
+      </w:pPr>
+      <w:rPr>
+        <w:rFonts w:ascii="Wingdings" w:hAnsi="Wingdings" w:hint="default"/>
+        <w:sz w:val="20"/>
+      </w:rPr>
+    </w:lvl>
+  </w:abstractNum>
+  <w:abstractNum w:abstractNumId="63" w15:restartNumberingAfterBreak="0">
     <w:nsid w:val="75E75F2E"/>
     <w:multiLevelType w:val="multilevel"/>
     <w:tmpl w:val="6340E4D2"/>
@@ -41249,7 +44941,156 @@
       </w:rPr>
     </w:lvl>
   </w:abstractNum>
-  <w:abstractNum w:abstractNumId="53" w15:restartNumberingAfterBreak="0">
+  <w:abstractNum w:abstractNumId="64" w15:restartNumberingAfterBreak="0">
+    <w:nsid w:val="767C441D"/>
+    <w:multiLevelType w:val="multilevel"/>
+    <w:tmpl w:val="81004730"/>
+    <w:lvl w:ilvl="0">
+      <w:start w:val="1"/>
+      <w:numFmt w:val="bullet"/>
+      <w:lvlText w:val=""/>
+      <w:lvlJc w:val="left"/>
+      <w:pPr>
+        <w:tabs>
+          <w:tab w:val="num" w:pos="720"/>
+        </w:tabs>
+        <w:ind w:left="720" w:hanging="360"/>
+      </w:pPr>
+      <w:rPr>
+        <w:rFonts w:ascii="Symbol" w:hAnsi="Symbol" w:hint="default"/>
+        <w:sz w:val="20"/>
+      </w:rPr>
+    </w:lvl>
+    <w:lvl w:ilvl="1" w:tentative="1">
+      <w:start w:val="1"/>
+      <w:numFmt w:val="bullet"/>
+      <w:lvlText w:val="o"/>
+      <w:lvlJc w:val="left"/>
+      <w:pPr>
+        <w:tabs>
+          <w:tab w:val="num" w:pos="1440"/>
+        </w:tabs>
+        <w:ind w:left="1440" w:hanging="360"/>
+      </w:pPr>
+      <w:rPr>
+        <w:rFonts w:ascii="Courier New" w:hAnsi="Courier New" w:hint="default"/>
+        <w:sz w:val="20"/>
+      </w:rPr>
+    </w:lvl>
+    <w:lvl w:ilvl="2" w:tentative="1">
+      <w:start w:val="1"/>
+      <w:numFmt w:val="bullet"/>
+      <w:lvlText w:val=""/>
+      <w:lvlJc w:val="left"/>
+      <w:pPr>
+        <w:tabs>
+          <w:tab w:val="num" w:pos="2160"/>
+        </w:tabs>
+        <w:ind w:left="2160" w:hanging="360"/>
+      </w:pPr>
+      <w:rPr>
+        <w:rFonts w:ascii="Wingdings" w:hAnsi="Wingdings" w:hint="default"/>
+        <w:sz w:val="20"/>
+      </w:rPr>
+    </w:lvl>
+    <w:lvl w:ilvl="3" w:tentative="1">
+      <w:start w:val="1"/>
+      <w:numFmt w:val="bullet"/>
+      <w:lvlText w:val=""/>
+      <w:lvlJc w:val="left"/>
+      <w:pPr>
+        <w:tabs>
+          <w:tab w:val="num" w:pos="2880"/>
+        </w:tabs>
+        <w:ind w:left="2880" w:hanging="360"/>
+      </w:pPr>
+      <w:rPr>
+        <w:rFonts w:ascii="Wingdings" w:hAnsi="Wingdings" w:hint="default"/>
+        <w:sz w:val="20"/>
+      </w:rPr>
+    </w:lvl>
+    <w:lvl w:ilvl="4" w:tentative="1">
+      <w:start w:val="1"/>
+      <w:numFmt w:val="bullet"/>
+      <w:lvlText w:val=""/>
+      <w:lvlJc w:val="left"/>
+      <w:pPr>
+        <w:tabs>
+          <w:tab w:val="num" w:pos="3600"/>
+        </w:tabs>
+        <w:ind w:left="3600" w:hanging="360"/>
+      </w:pPr>
+      <w:rPr>
+        <w:rFonts w:ascii="Wingdings" w:hAnsi="Wingdings" w:hint="default"/>
+        <w:sz w:val="20"/>
+      </w:rPr>
+    </w:lvl>
+    <w:lvl w:ilvl="5" w:tentative="1">
+      <w:start w:val="1"/>
+      <w:numFmt w:val="bullet"/>
+      <w:lvlText w:val=""/>
+      <w:lvlJc w:val="left"/>
+      <w:pPr>
+        <w:tabs>
+          <w:tab w:val="num" w:pos="4320"/>
+        </w:tabs>
+        <w:ind w:left="4320" w:hanging="360"/>
+      </w:pPr>
+      <w:rPr>
+        <w:rFonts w:ascii="Wingdings" w:hAnsi="Wingdings" w:hint="default"/>
+        <w:sz w:val="20"/>
+      </w:rPr>
+    </w:lvl>
+    <w:lvl w:ilvl="6" w:tentative="1">
+      <w:start w:val="1"/>
+      <w:numFmt w:val="bullet"/>
+      <w:lvlText w:val=""/>
+      <w:lvlJc w:val="left"/>
+      <w:pPr>
+        <w:tabs>
+          <w:tab w:val="num" w:pos="5040"/>
+        </w:tabs>
+        <w:ind w:left="5040" w:hanging="360"/>
+      </w:pPr>
+      <w:rPr>
+        <w:rFonts w:ascii="Wingdings" w:hAnsi="Wingdings" w:hint="default"/>
+        <w:sz w:val="20"/>
+      </w:rPr>
+    </w:lvl>
+    <w:lvl w:ilvl="7" w:tentative="1">
+      <w:start w:val="1"/>
+      <w:numFmt w:val="bullet"/>
+      <w:lvlText w:val=""/>
+      <w:lvlJc w:val="left"/>
+      <w:pPr>
+        <w:tabs>
+          <w:tab w:val="num" w:pos="5760"/>
+        </w:tabs>
+        <w:ind w:left="5760" w:hanging="360"/>
+      </w:pPr>
+      <w:rPr>
+        <w:rFonts w:ascii="Wingdings" w:hAnsi="Wingdings" w:hint="default"/>
+        <w:sz w:val="20"/>
+      </w:rPr>
+    </w:lvl>
+    <w:lvl w:ilvl="8" w:tentative="1">
+      <w:start w:val="1"/>
+      <w:numFmt w:val="bullet"/>
+      <w:lvlText w:val=""/>
+      <w:lvlJc w:val="left"/>
+      <w:pPr>
+        <w:tabs>
+          <w:tab w:val="num" w:pos="6480"/>
+        </w:tabs>
+        <w:ind w:left="6480" w:hanging="360"/>
+      </w:pPr>
+      <w:rPr>
+        <w:rFonts w:ascii="Wingdings" w:hAnsi="Wingdings" w:hint="default"/>
+        <w:sz w:val="20"/>
+      </w:rPr>
+    </w:lvl>
+  </w:abstractNum>
+  <w:abstractNum w:abstractNumId="65" w15:restartNumberingAfterBreak="0">
     <w:nsid w:val="77541D00"/>
     <w:multiLevelType w:val="multilevel"/>
     <w:tmpl w:val="A44CA480"/>
@@ -41398,7 +45239,7 @@
       </w:rPr>
     </w:lvl>
   </w:abstractNum>
-  <w:abstractNum w:abstractNumId="54" w15:restartNumberingAfterBreak="0">
+  <w:abstractNum w:abstractNumId="66" w15:restartNumberingAfterBreak="0">
     <w:nsid w:val="78510EAF"/>
     <w:multiLevelType w:val="multilevel"/>
     <w:tmpl w:val="EF6EF292"/>
@@ -41547,7 +45388,7 @@
       </w:rPr>
     </w:lvl>
   </w:abstractNum>
-  <w:abstractNum w:abstractNumId="55" w15:restartNumberingAfterBreak="0">
+  <w:abstractNum w:abstractNumId="67" w15:restartNumberingAfterBreak="0">
     <w:nsid w:val="7A904C10"/>
     <w:multiLevelType w:val="multilevel"/>
     <w:tmpl w:val="AD66B278"/>
@@ -41696,7 +45537,7 @@
       </w:rPr>
     </w:lvl>
   </w:abstractNum>
-  <w:abstractNum w:abstractNumId="56" w15:restartNumberingAfterBreak="0">
+  <w:abstractNum w:abstractNumId="68" w15:restartNumberingAfterBreak="0">
     <w:nsid w:val="7AC642ED"/>
     <w:multiLevelType w:val="multilevel"/>
     <w:tmpl w:val="9FD663EE"/>
@@ -41846,177 +45687,213 @@
     </w:lvl>
   </w:abstractNum>
   <w:num w:numId="1" w16cid:durableId="1071973697">
-    <w:abstractNumId w:val="25"/>
+    <w:abstractNumId w:val="28"/>
   </w:num>
   <w:num w:numId="2" w16cid:durableId="1242829558">
     <w:abstractNumId w:val="8"/>
   </w:num>
   <w:num w:numId="3" w16cid:durableId="1561205426">
-    <w:abstractNumId w:val="43"/>
+    <w:abstractNumId w:val="51"/>
   </w:num>
   <w:num w:numId="4" w16cid:durableId="427892381">
     <w:abstractNumId w:val="7"/>
   </w:num>
   <w:num w:numId="5" w16cid:durableId="132603511">
+    <w:abstractNumId w:val="34"/>
+  </w:num>
+  <w:num w:numId="6" w16cid:durableId="1365211125">
+    <w:abstractNumId w:val="41"/>
+  </w:num>
+  <w:num w:numId="7" w16cid:durableId="1444037688">
+    <w:abstractNumId w:val="26"/>
+  </w:num>
+  <w:num w:numId="8" w16cid:durableId="1812599328">
+    <w:abstractNumId w:val="47"/>
+  </w:num>
+  <w:num w:numId="9" w16cid:durableId="335498359">
+    <w:abstractNumId w:val="67"/>
+  </w:num>
+  <w:num w:numId="10" w16cid:durableId="1898857928">
+    <w:abstractNumId w:val="23"/>
+  </w:num>
+  <w:num w:numId="11" w16cid:durableId="1226647398">
+    <w:abstractNumId w:val="39"/>
+  </w:num>
+  <w:num w:numId="12" w16cid:durableId="934561080">
+    <w:abstractNumId w:val="16"/>
+  </w:num>
+  <w:num w:numId="13" w16cid:durableId="483817047">
+    <w:abstractNumId w:val="32"/>
+  </w:num>
+  <w:num w:numId="14" w16cid:durableId="766853223">
+    <w:abstractNumId w:val="42"/>
+  </w:num>
+  <w:num w:numId="15" w16cid:durableId="1973175638">
+    <w:abstractNumId w:val="63"/>
+  </w:num>
+  <w:num w:numId="16" w16cid:durableId="1316450989">
+    <w:abstractNumId w:val="24"/>
+  </w:num>
+  <w:num w:numId="17" w16cid:durableId="766316802">
+    <w:abstractNumId w:val="29"/>
+  </w:num>
+  <w:num w:numId="18" w16cid:durableId="1464542733">
     <w:abstractNumId w:val="31"/>
   </w:num>
-  <w:num w:numId="6" w16cid:durableId="1365211125">
+  <w:num w:numId="19" w16cid:durableId="21980192">
+    <w:abstractNumId w:val="60"/>
+  </w:num>
+  <w:num w:numId="20" w16cid:durableId="1658147830">
+    <w:abstractNumId w:val="55"/>
+  </w:num>
+  <w:num w:numId="21" w16cid:durableId="1927037380">
+    <w:abstractNumId w:val="50"/>
+  </w:num>
+  <w:num w:numId="22" w16cid:durableId="667706966">
     <w:abstractNumId w:val="36"/>
   </w:num>
-  <w:num w:numId="7" w16cid:durableId="1444037688">
-    <w:abstractNumId w:val="23"/>
-  </w:num>
-  <w:num w:numId="8" w16cid:durableId="1812599328">
-    <w:abstractNumId w:val="40"/>
-  </w:num>
-  <w:num w:numId="9" w16cid:durableId="335498359">
-    <w:abstractNumId w:val="55"/>
-  </w:num>
-  <w:num w:numId="10" w16cid:durableId="1898857928">
-    <w:abstractNumId w:val="20"/>
-  </w:num>
-  <w:num w:numId="11" w16cid:durableId="1226647398">
-    <w:abstractNumId w:val="34"/>
-  </w:num>
-  <w:num w:numId="12" w16cid:durableId="934561080">
-    <w:abstractNumId w:val="14"/>
-  </w:num>
-  <w:num w:numId="13" w16cid:durableId="483817047">
-    <w:abstractNumId w:val="29"/>
-  </w:num>
-  <w:num w:numId="14" w16cid:durableId="766853223">
-    <w:abstractNumId w:val="37"/>
-  </w:num>
-  <w:num w:numId="15" w16cid:durableId="1973175638">
-    <w:abstractNumId w:val="52"/>
-  </w:num>
-  <w:num w:numId="16" w16cid:durableId="1316450989">
-    <w:abstractNumId w:val="21"/>
-  </w:num>
-  <w:num w:numId="17" w16cid:durableId="766316802">
-    <w:abstractNumId w:val="26"/>
-  </w:num>
-  <w:num w:numId="18" w16cid:durableId="1464542733">
-    <w:abstractNumId w:val="28"/>
-  </w:num>
-  <w:num w:numId="19" w16cid:durableId="21980192">
-    <w:abstractNumId w:val="51"/>
-  </w:num>
-  <w:num w:numId="20" w16cid:durableId="1658147830">
-    <w:abstractNumId w:val="47"/>
-  </w:num>
-  <w:num w:numId="21" w16cid:durableId="1927037380">
-    <w:abstractNumId w:val="42"/>
-  </w:num>
-  <w:num w:numId="22" w16cid:durableId="667706966">
-    <w:abstractNumId w:val="33"/>
-  </w:num>
   <w:num w:numId="23" w16cid:durableId="1313020479">
-    <w:abstractNumId w:val="38"/>
+    <w:abstractNumId w:val="43"/>
   </w:num>
   <w:num w:numId="24" w16cid:durableId="238712499">
     <w:abstractNumId w:val="6"/>
   </w:num>
   <w:num w:numId="25" w16cid:durableId="97413447">
-    <w:abstractNumId w:val="56"/>
+    <w:abstractNumId w:val="68"/>
   </w:num>
   <w:num w:numId="26" w16cid:durableId="1138688623">
-    <w:abstractNumId w:val="16"/>
+    <w:abstractNumId w:val="18"/>
   </w:num>
   <w:num w:numId="27" w16cid:durableId="765420002">
-    <w:abstractNumId w:val="45"/>
+    <w:abstractNumId w:val="53"/>
   </w:num>
   <w:num w:numId="28" w16cid:durableId="562133151">
-    <w:abstractNumId w:val="53"/>
+    <w:abstractNumId w:val="65"/>
   </w:num>
   <w:num w:numId="29" w16cid:durableId="1747920884">
-    <w:abstractNumId w:val="18"/>
+    <w:abstractNumId w:val="21"/>
   </w:num>
   <w:num w:numId="30" w16cid:durableId="1032153785">
-    <w:abstractNumId w:val="54"/>
+    <w:abstractNumId w:val="66"/>
   </w:num>
   <w:num w:numId="31" w16cid:durableId="1807315102">
     <w:abstractNumId w:val="3"/>
   </w:num>
   <w:num w:numId="32" w16cid:durableId="711156763">
+    <w:abstractNumId w:val="12"/>
+  </w:num>
+  <w:num w:numId="33" w16cid:durableId="1889144801">
+    <w:abstractNumId w:val="30"/>
+  </w:num>
+  <w:num w:numId="34" w16cid:durableId="1747074227">
+    <w:abstractNumId w:val="58"/>
+  </w:num>
+  <w:num w:numId="35" w16cid:durableId="15743182">
+    <w:abstractNumId w:val="56"/>
+  </w:num>
+  <w:num w:numId="36" w16cid:durableId="1928297240">
+    <w:abstractNumId w:val="25"/>
+  </w:num>
+  <w:num w:numId="37" w16cid:durableId="1122381164">
     <w:abstractNumId w:val="10"/>
   </w:num>
-  <w:num w:numId="33" w16cid:durableId="1889144801">
-    <w:abstractNumId w:val="27"/>
-  </w:num>
-  <w:num w:numId="34" w16cid:durableId="1747074227">
-    <w:abstractNumId w:val="49"/>
-  </w:num>
-  <w:num w:numId="35" w16cid:durableId="15743182">
-    <w:abstractNumId w:val="48"/>
-  </w:num>
-  <w:num w:numId="36" w16cid:durableId="1928297240">
-    <w:abstractNumId w:val="22"/>
-  </w:num>
-  <w:num w:numId="37" w16cid:durableId="1122381164">
-    <w:abstractNumId w:val="9"/>
-  </w:num>
   <w:num w:numId="38" w16cid:durableId="1216503339">
-    <w:abstractNumId w:val="11"/>
+    <w:abstractNumId w:val="13"/>
   </w:num>
   <w:num w:numId="39" w16cid:durableId="1304190936">
-    <w:abstractNumId w:val="46"/>
+    <w:abstractNumId w:val="54"/>
   </w:num>
   <w:num w:numId="40" w16cid:durableId="779572787">
-    <w:abstractNumId w:val="15"/>
+    <w:abstractNumId w:val="17"/>
   </w:num>
   <w:num w:numId="41" w16cid:durableId="900602316">
-    <w:abstractNumId w:val="24"/>
+    <w:abstractNumId w:val="27"/>
   </w:num>
   <w:num w:numId="42" w16cid:durableId="1214267907">
     <w:abstractNumId w:val="2"/>
   </w:num>
   <w:num w:numId="43" w16cid:durableId="1758554597">
-    <w:abstractNumId w:val="19"/>
+    <w:abstractNumId w:val="22"/>
   </w:num>
   <w:num w:numId="44" w16cid:durableId="638388550">
-    <w:abstractNumId w:val="32"/>
+    <w:abstractNumId w:val="35"/>
   </w:num>
   <w:num w:numId="45" w16cid:durableId="750665570">
-    <w:abstractNumId w:val="50"/>
+    <w:abstractNumId w:val="59"/>
   </w:num>
   <w:num w:numId="46" w16cid:durableId="785275402">
-    <w:abstractNumId w:val="35"/>
+    <w:abstractNumId w:val="40"/>
   </w:num>
   <w:num w:numId="47" w16cid:durableId="383257913">
-    <w:abstractNumId w:val="30"/>
+    <w:abstractNumId w:val="33"/>
   </w:num>
   <w:num w:numId="48" w16cid:durableId="1876497634">
     <w:abstractNumId w:val="0"/>
   </w:num>
   <w:num w:numId="49" w16cid:durableId="42601338">
-    <w:abstractNumId w:val="41"/>
+    <w:abstractNumId w:val="49"/>
   </w:num>
   <w:num w:numId="50" w16cid:durableId="2028093174">
-    <w:abstractNumId w:val="17"/>
+    <w:abstractNumId w:val="20"/>
   </w:num>
   <w:num w:numId="51" w16cid:durableId="1019434373">
-    <w:abstractNumId w:val="13"/>
+    <w:abstractNumId w:val="15"/>
   </w:num>
   <w:num w:numId="52" w16cid:durableId="453982901">
     <w:abstractNumId w:val="5"/>
   </w:num>
   <w:num w:numId="53" w16cid:durableId="684136158">
-    <w:abstractNumId w:val="44"/>
+    <w:abstractNumId w:val="52"/>
   </w:num>
   <w:num w:numId="54" w16cid:durableId="1592355270">
     <w:abstractNumId w:val="1"/>
   </w:num>
   <w:num w:numId="55" w16cid:durableId="758983847">
-    <w:abstractNumId w:val="12"/>
+    <w:abstractNumId w:val="14"/>
   </w:num>
   <w:num w:numId="56" w16cid:durableId="1210530064">
-    <w:abstractNumId w:val="39"/>
+    <w:abstractNumId w:val="45"/>
   </w:num>
   <w:num w:numId="57" w16cid:durableId="1868330939">
     <w:abstractNumId w:val="4"/>
   </w:num>
-  <w:numIdMacAtCleanup w:val="57"/>
+  <w:num w:numId="58" w16cid:durableId="209730518">
+    <w:abstractNumId w:val="44"/>
+  </w:num>
+  <w:num w:numId="59" w16cid:durableId="886458100">
+    <w:abstractNumId w:val="37"/>
+  </w:num>
+  <w:num w:numId="60" w16cid:durableId="35397967">
+    <w:abstractNumId w:val="46"/>
+  </w:num>
+  <w:num w:numId="61" w16cid:durableId="1618636323">
+    <w:abstractNumId w:val="11"/>
+  </w:num>
+  <w:num w:numId="62" w16cid:durableId="1973244239">
+    <w:abstractNumId w:val="61"/>
+  </w:num>
+  <w:num w:numId="63" w16cid:durableId="936714154">
+    <w:abstractNumId w:val="9"/>
+  </w:num>
+  <w:num w:numId="64" w16cid:durableId="418868771">
+    <w:abstractNumId w:val="57"/>
+  </w:num>
+  <w:num w:numId="65" w16cid:durableId="963925201">
+    <w:abstractNumId w:val="62"/>
+  </w:num>
+  <w:num w:numId="66" w16cid:durableId="1520659082">
+    <w:abstractNumId w:val="19"/>
+  </w:num>
+  <w:num w:numId="67" w16cid:durableId="934217129">
+    <w:abstractNumId w:val="64"/>
+  </w:num>
+  <w:num w:numId="68" w16cid:durableId="868184487">
+    <w:abstractNumId w:val="38"/>
+  </w:num>
+  <w:num w:numId="69" w16cid:durableId="1976326395">
+    <w:abstractNumId w:val="48"/>
+  </w:num>
+  <w:numIdMacAtCleanup w:val="69"/>
 </w:numbering>
 </file>
 

</xml_diff>